<commit_message>
Actualiza tema HERRIZ y estilos
</commit_message>
<xml_diff>
--- a/src/Documentacion/BIS011APPSY-Themes_HERRIZ-2026_09_25-v1_00.docx
+++ b/src/Documentacion/BIS011APPSY-Themes_HERRIZ-2026_09_25-v1_00.docx
@@ -84,7 +84,7 @@
       </w:pPr>
       <w:bookmarkStart w:id="0" w:name="_Toc382542072"/>
       <w:bookmarkStart w:id="1" w:name="_Toc225856305"/>
-      <w:bookmarkStart w:id="2" w:name="_Toc230692648"/>
+      <w:bookmarkStart w:id="2" w:name="_Toc241479878"/>
       <w:r>
         <w:rPr>
           <w:rFonts w:ascii="Arial" w:hAnsi="Arial" w:cs="Arial"/>
@@ -94,7 +94,7 @@
           <w:szCs w:val="40"/>
           <w:lang w:eastAsia="es-ES"/>
         </w:rPr>
-        <w:t>Planning</w:t>
+        <w:t>Theme</w:t>
       </w:r>
       <w:r>
         <w:rPr>
@@ -105,7 +105,7 @@
           <w:szCs w:val="40"/>
           <w:lang w:eastAsia="es-ES"/>
         </w:rPr>
-        <w:t xml:space="preserve"> de </w:t>
+        <w:t xml:space="preserve"> </w:t>
       </w:r>
       <w:r>
         <w:rPr>
@@ -116,8 +116,10 @@
           <w:szCs w:val="40"/>
           <w:lang w:eastAsia="es-ES"/>
         </w:rPr>
-        <w:t>trabajo</w:t>
-      </w:r>
+        <w:t>Turismo</w:t>
+      </w:r>
+      <w:bookmarkEnd w:id="0"/>
+      <w:bookmarkEnd w:id="1"/>
       <w:r>
         <w:rPr>
           <w:rFonts w:ascii="Arial" w:hAnsi="Arial" w:cs="Arial"/>
@@ -127,52 +129,6 @@
           <w:szCs w:val="40"/>
           <w:lang w:eastAsia="es-ES"/>
         </w:rPr>
-        <w:t xml:space="preserve"> </w:t>
-      </w:r>
-      <w:r>
-        <w:rPr>
-          <w:rFonts w:ascii="Arial" w:hAnsi="Arial" w:cs="Arial"/>
-          <w:b/>
-          <w:bCs/>
-          <w:sz w:val="40"/>
-          <w:szCs w:val="40"/>
-          <w:lang w:eastAsia="es-ES"/>
-        </w:rPr>
-        <w:t>Desarrollo Theme</w:t>
-      </w:r>
-      <w:r>
-        <w:rPr>
-          <w:rFonts w:ascii="Arial" w:hAnsi="Arial" w:cs="Arial"/>
-          <w:b/>
-          <w:bCs/>
-          <w:sz w:val="40"/>
-          <w:szCs w:val="40"/>
-          <w:lang w:eastAsia="es-ES"/>
-        </w:rPr>
-        <w:t xml:space="preserve"> </w:t>
-      </w:r>
-      <w:r>
-        <w:rPr>
-          <w:rFonts w:ascii="Arial" w:hAnsi="Arial" w:cs="Arial"/>
-          <w:b/>
-          <w:bCs/>
-          <w:sz w:val="40"/>
-          <w:szCs w:val="40"/>
-          <w:lang w:eastAsia="es-ES"/>
-        </w:rPr>
-        <w:t>Turismo</w:t>
-      </w:r>
-      <w:bookmarkEnd w:id="0"/>
-      <w:bookmarkEnd w:id="1"/>
-      <w:r>
-        <w:rPr>
-          <w:rFonts w:ascii="Arial" w:hAnsi="Arial" w:cs="Arial"/>
-          <w:b/>
-          <w:bCs/>
-          <w:sz w:val="40"/>
-          <w:szCs w:val="40"/>
-          <w:lang w:eastAsia="es-ES"/>
-        </w:rPr>
         <w:t xml:space="preserve"> (HERRIZ)</w:t>
       </w:r>
       <w:bookmarkEnd w:id="2"/>
@@ -265,7 +221,7 @@
           <w:szCs w:val="24"/>
           <w:lang w:eastAsia="es-ES"/>
         </w:rPr>
-        <w:t>05/06/2026</w:t>
+        <w:t>30/09/2026</w:t>
       </w:r>
       <w:r>
         <w:rPr>
@@ -335,14 +291,14 @@
           <w:r>
             <w:fldChar w:fldCharType="separate"/>
           </w:r>
-          <w:hyperlink w:anchor="_Toc230692648" w:history="1">
+          <w:hyperlink w:anchor="_Toc241479878" w:history="1">
             <w:r>
               <w:rPr>
                 <w:rStyle w:val="Hipervnculo"/>
                 <w:rFonts w:ascii="Arial" w:hAnsi="Arial" w:cs="Arial"/>
                 <w:lang w:eastAsia="es-ES"/>
               </w:rPr>
-              <w:t>Planning de trabajo Desarrollo Theme Turismo (HERRIZ)</w:t>
+              <w:t>Theme Turismo (HERRIZ)</w:t>
             </w:r>
             <w:r>
               <w:rPr>
@@ -360,7 +316,7 @@
               <w:rPr>
                 <w:webHidden/>
               </w:rPr>
-              <w:instrText xml:space="preserve"> PAGEREF _Toc230692648 \h </w:instrText>
+              <w:instrText xml:space="preserve"> PAGEREF _Toc241479878 \h </w:instrText>
             </w:r>
             <w:r>
               <w:rPr>
@@ -406,12 +362,12 @@
               <w14:ligatures w14:val="standardContextual"/>
             </w:rPr>
           </w:pPr>
-          <w:hyperlink w:anchor="_Toc230692649" w:history="1">
+          <w:hyperlink w:anchor="_Toc241479879" w:history="1">
             <w:r>
               <w:rPr>
                 <w:rStyle w:val="Hipervnculo"/>
               </w:rPr>
-              <w:t>Planning trabajo theme HERRIZ</w:t>
+              <w:t>Desarrollo theme HERRIZ</w:t>
             </w:r>
             <w:r>
               <w:rPr>
@@ -429,7 +385,7 @@
               <w:rPr>
                 <w:webHidden/>
               </w:rPr>
-              <w:instrText xml:space="preserve"> PAGEREF _Toc230692649 \h </w:instrText>
+              <w:instrText xml:space="preserve"> PAGEREF _Toc241479879 \h </w:instrText>
             </w:r>
             <w:r>
               <w:rPr>
@@ -476,7 +432,7 @@
               <w14:ligatures w14:val="standardContextual"/>
             </w:rPr>
           </w:pPr>
-          <w:hyperlink w:anchor="_Toc230692650" w:history="1">
+          <w:hyperlink w:anchor="_Toc241479880" w:history="1">
             <w:r>
               <w:rPr>
                 <w:rStyle w:val="Hipervnculo"/>
@@ -520,7 +476,7 @@
               <w:rPr>
                 <w:webHidden/>
               </w:rPr>
-              <w:instrText xml:space="preserve"> PAGEREF _Toc230692650 \h </w:instrText>
+              <w:instrText xml:space="preserve"> PAGEREF _Toc241479880 \h </w:instrText>
             </w:r>
             <w:r>
               <w:rPr>
@@ -567,7 +523,7 @@
               <w14:ligatures w14:val="standardContextual"/>
             </w:rPr>
           </w:pPr>
-          <w:hyperlink w:anchor="_Toc230692651" w:history="1">
+          <w:hyperlink w:anchor="_Toc241479881" w:history="1">
             <w:r>
               <w:rPr>
                 <w:rStyle w:val="Hipervnculo"/>
@@ -593,7 +549,7 @@
               <w:rPr>
                 <w:rStyle w:val="Hipervnculo"/>
               </w:rPr>
-              <w:t>Planning detallado</w:t>
+              <w:t>Desarrollo</w:t>
             </w:r>
             <w:r>
               <w:rPr>
@@ -611,7 +567,7 @@
               <w:rPr>
                 <w:webHidden/>
               </w:rPr>
-              <w:instrText xml:space="preserve"> PAGEREF _Toc230692651 \h </w:instrText>
+              <w:instrText xml:space="preserve"> PAGEREF _Toc241479881 \h </w:instrText>
             </w:r>
             <w:r>
               <w:rPr>
@@ -655,7 +611,7 @@
               <w14:ligatures w14:val="standardContextual"/>
             </w:rPr>
           </w:pPr>
-          <w:hyperlink w:anchor="_Toc230692652" w:history="1">
+          <w:hyperlink w:anchor="_Toc241479882" w:history="1">
             <w:r>
               <w:rPr>
                 <w:rStyle w:val="Hipervnculo"/>
@@ -678,7 +634,7 @@
               <w:rPr>
                 <w:rStyle w:val="Hipervnculo"/>
               </w:rPr>
-              <w:t>F0 — CORE. Setup técnico y arquitectura</w:t>
+              <w:t>CORE. Setup técnico y arquitectura</w:t>
             </w:r>
             <w:r>
               <w:rPr>
@@ -696,7 +652,7 @@
               <w:rPr>
                 <w:webHidden/>
               </w:rPr>
-              <w:instrText xml:space="preserve"> PAGEREF _Toc230692652 \h </w:instrText>
+              <w:instrText xml:space="preserve"> PAGEREF _Toc241479882 \h </w:instrText>
             </w:r>
             <w:r>
               <w:rPr>
@@ -738,7 +694,7 @@
               <w14:ligatures w14:val="standardContextual"/>
             </w:rPr>
           </w:pPr>
-          <w:hyperlink w:anchor="_Toc230692653" w:history="1">
+          <w:hyperlink w:anchor="_Toc241479883" w:history="1">
             <w:r>
               <w:rPr>
                 <w:rStyle w:val="Hipervnculo"/>
@@ -777,7 +733,7 @@
               <w:rPr>
                 <w:webHidden/>
               </w:rPr>
-              <w:instrText xml:space="preserve"> PAGEREF _Toc230692653 \h </w:instrText>
+              <w:instrText xml:space="preserve"> PAGEREF _Toc241479883 \h </w:instrText>
             </w:r>
             <w:r>
               <w:rPr>
@@ -819,7 +775,7 @@
               <w14:ligatures w14:val="standardContextual"/>
             </w:rPr>
           </w:pPr>
-          <w:hyperlink w:anchor="_Toc230692654" w:history="1">
+          <w:hyperlink w:anchor="_Toc241479884" w:history="1">
             <w:r>
               <w:rPr>
                 <w:rStyle w:val="Hipervnculo"/>
@@ -858,7 +814,7 @@
               <w:rPr>
                 <w:webHidden/>
               </w:rPr>
-              <w:instrText xml:space="preserve"> PAGEREF _Toc230692654 \h </w:instrText>
+              <w:instrText xml:space="preserve"> PAGEREF _Toc241479884 \h </w:instrText>
             </w:r>
             <w:r>
               <w:rPr>
@@ -875,7 +831,7 @@
               <w:rPr>
                 <w:webHidden/>
               </w:rPr>
-              <w:t>6</w:t>
+              <w:t>5</w:t>
             </w:r>
             <w:r>
               <w:rPr>
@@ -900,7 +856,7 @@
               <w14:ligatures w14:val="standardContextual"/>
             </w:rPr>
           </w:pPr>
-          <w:hyperlink w:anchor="_Toc230692655" w:history="1">
+          <w:hyperlink w:anchor="_Toc241479885" w:history="1">
             <w:r>
               <w:rPr>
                 <w:rStyle w:val="Hipervnculo"/>
@@ -939,7 +895,7 @@
               <w:rPr>
                 <w:webHidden/>
               </w:rPr>
-              <w:instrText xml:space="preserve"> PAGEREF _Toc230692655 \h </w:instrText>
+              <w:instrText xml:space="preserve"> PAGEREF _Toc241479885 \h </w:instrText>
             </w:r>
             <w:r>
               <w:rPr>
@@ -956,7 +912,7 @@
               <w:rPr>
                 <w:webHidden/>
               </w:rPr>
-              <w:t>6</w:t>
+              <w:t>7</w:t>
             </w:r>
             <w:r>
               <w:rPr>
@@ -983,7 +939,7 @@
               <w14:ligatures w14:val="standardContextual"/>
             </w:rPr>
           </w:pPr>
-          <w:hyperlink w:anchor="_Toc230692656" w:history="1">
+          <w:hyperlink w:anchor="_Toc241479886" w:history="1">
             <w:r>
               <w:rPr>
                 <w:rStyle w:val="Hipervnculo"/>
@@ -1026,7 +982,7 @@
               <w:rPr>
                 <w:webHidden/>
               </w:rPr>
-              <w:instrText xml:space="preserve"> PAGEREF _Toc230692656 \h </w:instrText>
+              <w:instrText xml:space="preserve"> PAGEREF _Toc241479886 \h </w:instrText>
             </w:r>
             <w:r>
               <w:rPr>
@@ -1068,7 +1024,7 @@
               <w14:ligatures w14:val="standardContextual"/>
             </w:rPr>
           </w:pPr>
-          <w:hyperlink w:anchor="_Toc230692657" w:history="1">
+          <w:hyperlink w:anchor="_Toc241479887" w:history="1">
             <w:r>
               <w:rPr>
                 <w:rStyle w:val="Hipervnculo"/>
@@ -1107,7 +1063,7 @@
               <w:rPr>
                 <w:webHidden/>
               </w:rPr>
-              <w:instrText xml:space="preserve"> PAGEREF _Toc230692657 \h </w:instrText>
+              <w:instrText xml:space="preserve"> PAGEREF _Toc241479887 \h </w:instrText>
             </w:r>
             <w:r>
               <w:rPr>
@@ -1151,7 +1107,7 @@
               <w14:ligatures w14:val="standardContextual"/>
             </w:rPr>
           </w:pPr>
-          <w:hyperlink w:anchor="_Toc230692658" w:history="1">
+          <w:hyperlink w:anchor="_Toc241479888" w:history="1">
             <w:r>
               <w:rPr>
                 <w:rStyle w:val="Hipervnculo"/>
@@ -1206,7 +1162,7 @@
               <w:rPr>
                 <w:webHidden/>
               </w:rPr>
-              <w:instrText xml:space="preserve"> PAGEREF _Toc230692658 \h </w:instrText>
+              <w:instrText xml:space="preserve"> PAGEREF _Toc241479888 \h </w:instrText>
             </w:r>
             <w:r>
               <w:rPr>
@@ -1250,7 +1206,7 @@
               <w14:ligatures w14:val="standardContextual"/>
             </w:rPr>
           </w:pPr>
-          <w:hyperlink w:anchor="_Toc230692659" w:history="1">
+          <w:hyperlink w:anchor="_Toc241479889" w:history="1">
             <w:r>
               <w:rPr>
                 <w:rStyle w:val="Hipervnculo"/>
@@ -1291,7 +1247,7 @@
               <w:rPr>
                 <w:webHidden/>
               </w:rPr>
-              <w:instrText xml:space="preserve"> PAGEREF _Toc230692659 \h </w:instrText>
+              <w:instrText xml:space="preserve"> PAGEREF _Toc241479889 \h </w:instrText>
             </w:r>
             <w:r>
               <w:rPr>
@@ -1308,7 +1264,7 @@
               <w:rPr>
                 <w:webHidden/>
               </w:rPr>
-              <w:t>8</w:t>
+              <w:t>9</w:t>
             </w:r>
             <w:r>
               <w:rPr>
@@ -1333,7 +1289,7 @@
               <w14:ligatures w14:val="standardContextual"/>
             </w:rPr>
           </w:pPr>
-          <w:hyperlink w:anchor="_Toc230692660" w:history="1">
+          <w:hyperlink w:anchor="_Toc241479890" w:history="1">
             <w:r>
               <w:rPr>
                 <w:rStyle w:val="Hipervnculo"/>
@@ -1372,7 +1328,7 @@
               <w:rPr>
                 <w:webHidden/>
               </w:rPr>
-              <w:instrText xml:space="preserve"> PAGEREF _Toc230692660 \h </w:instrText>
+              <w:instrText xml:space="preserve"> PAGEREF _Toc241479890 \h </w:instrText>
             </w:r>
             <w:r>
               <w:rPr>
@@ -1414,7 +1370,7 @@
               <w14:ligatures w14:val="standardContextual"/>
             </w:rPr>
           </w:pPr>
-          <w:hyperlink w:anchor="_Toc230692661" w:history="1">
+          <w:hyperlink w:anchor="_Toc241479891" w:history="1">
             <w:r>
               <w:rPr>
                 <w:rStyle w:val="Hipervnculo"/>
@@ -1453,7 +1409,7 @@
               <w:rPr>
                 <w:webHidden/>
               </w:rPr>
-              <w:instrText xml:space="preserve"> PAGEREF _Toc230692661 \h </w:instrText>
+              <w:instrText xml:space="preserve"> PAGEREF _Toc241479891 \h </w:instrText>
             </w:r>
             <w:r>
               <w:rPr>
@@ -1497,7 +1453,7 @@
               <w14:ligatures w14:val="standardContextual"/>
             </w:rPr>
           </w:pPr>
-          <w:hyperlink w:anchor="_Toc230692662" w:history="1">
+          <w:hyperlink w:anchor="_Toc241479892" w:history="1">
             <w:r>
               <w:rPr>
                 <w:rStyle w:val="Hipervnculo"/>
@@ -1540,7 +1496,7 @@
               <w:rPr>
                 <w:webHidden/>
               </w:rPr>
-              <w:instrText xml:space="preserve"> PAGEREF _Toc230692662 \h </w:instrText>
+              <w:instrText xml:space="preserve"> PAGEREF _Toc241479892 \h </w:instrText>
             </w:r>
             <w:r>
               <w:rPr>
@@ -1557,7 +1513,7 @@
               <w:rPr>
                 <w:webHidden/>
               </w:rPr>
-              <w:t>9</w:t>
+              <w:t>10</w:t>
             </w:r>
             <w:r>
               <w:rPr>
@@ -1584,7 +1540,7 @@
               <w14:ligatures w14:val="standardContextual"/>
             </w:rPr>
           </w:pPr>
-          <w:hyperlink w:anchor="_Toc230692663" w:history="1">
+          <w:hyperlink w:anchor="_Toc241479893" w:history="1">
             <w:r>
               <w:rPr>
                 <w:rStyle w:val="Hipervnculo"/>
@@ -1625,7 +1581,7 @@
               <w:rPr>
                 <w:webHidden/>
               </w:rPr>
-              <w:instrText xml:space="preserve"> PAGEREF _Toc230692663 \h </w:instrText>
+              <w:instrText xml:space="preserve"> PAGEREF _Toc241479893 \h </w:instrText>
             </w:r>
             <w:r>
               <w:rPr>
@@ -1642,7 +1598,7 @@
               <w:rPr>
                 <w:webHidden/>
               </w:rPr>
-              <w:t>10</w:t>
+              <w:t>11</w:t>
             </w:r>
             <w:r>
               <w:rPr>
@@ -1669,7 +1625,7 @@
               <w14:ligatures w14:val="standardContextual"/>
             </w:rPr>
           </w:pPr>
-          <w:hyperlink w:anchor="_Toc230692664" w:history="1">
+          <w:hyperlink w:anchor="_Toc241479894" w:history="1">
             <w:r>
               <w:rPr>
                 <w:rStyle w:val="Hipervnculo"/>
@@ -1710,7 +1666,7 @@
               <w:rPr>
                 <w:webHidden/>
               </w:rPr>
-              <w:instrText xml:space="preserve"> PAGEREF _Toc230692664 \h </w:instrText>
+              <w:instrText xml:space="preserve"> PAGEREF _Toc241479894 \h </w:instrText>
             </w:r>
             <w:r>
               <w:rPr>
@@ -1752,7 +1708,7 @@
               <w14:ligatures w14:val="standardContextual"/>
             </w:rPr>
           </w:pPr>
-          <w:hyperlink w:anchor="_Toc230692665" w:history="1">
+          <w:hyperlink w:anchor="_Toc241479895" w:history="1">
             <w:r>
               <w:rPr>
                 <w:rStyle w:val="Hipervnculo"/>
@@ -1791,7 +1747,7 @@
               <w:rPr>
                 <w:webHidden/>
               </w:rPr>
-              <w:instrText xml:space="preserve"> PAGEREF _Toc230692665 \h </w:instrText>
+              <w:instrText xml:space="preserve"> PAGEREF _Toc241479895 \h </w:instrText>
             </w:r>
             <w:r>
               <w:rPr>
@@ -1833,7 +1789,7 @@
               <w14:ligatures w14:val="standardContextual"/>
             </w:rPr>
           </w:pPr>
-          <w:hyperlink w:anchor="_Toc230692666" w:history="1">
+          <w:hyperlink w:anchor="_Toc241479896" w:history="1">
             <w:r>
               <w:rPr>
                 <w:rStyle w:val="Hipervnculo"/>
@@ -1872,7 +1828,7 @@
               <w:rPr>
                 <w:webHidden/>
               </w:rPr>
-              <w:instrText xml:space="preserve"> PAGEREF _Toc230692666 \h </w:instrText>
+              <w:instrText xml:space="preserve"> PAGEREF _Toc241479896 \h </w:instrText>
             </w:r>
             <w:r>
               <w:rPr>
@@ -1890,6 +1846,97 @@
                 <w:webHidden/>
               </w:rPr>
               <w:t>11</w:t>
+            </w:r>
+            <w:r>
+              <w:rPr>
+                <w:webHidden/>
+              </w:rPr>
+              <w:fldChar w:fldCharType="end"/>
+            </w:r>
+          </w:hyperlink>
+        </w:p>
+        <w:p>
+          <w:pPr>
+            <w:pStyle w:val="TDC1"/>
+            <w:tabs>
+              <w:tab w:val="left" w:pos="570"/>
+              <w:tab w:val="right" w:leader="dot" w:pos="9060"/>
+            </w:tabs>
+            <w:rPr>
+              <w:rFonts w:asciiTheme="minorHAnsi" w:eastAsiaTheme="minorEastAsia" w:hAnsiTheme="minorHAnsi"/>
+              <w:b w:val="0"/>
+              <w:bCs w:val="0"/>
+              <w:caps w:val="0"/>
+              <w:color w:val="auto"/>
+              <w:kern w:val="2"/>
+              <w:sz w:val="24"/>
+              <w:szCs w:val="24"/>
+              <w:lang w:eastAsia="es-ES"/>
+              <w14:ligatures w14:val="standardContextual"/>
+            </w:rPr>
+          </w:pPr>
+          <w:hyperlink w:anchor="_Toc241479897" w:history="1">
+            <w:r>
+              <w:rPr>
+                <w:rStyle w:val="Hipervnculo"/>
+              </w:rPr>
+              <w:t>3</w:t>
+            </w:r>
+            <w:r>
+              <w:rPr>
+                <w:rFonts w:asciiTheme="minorHAnsi" w:eastAsiaTheme="minorEastAsia" w:hAnsiTheme="minorHAnsi"/>
+                <w:b w:val="0"/>
+                <w:bCs w:val="0"/>
+                <w:caps w:val="0"/>
+                <w:color w:val="auto"/>
+                <w:kern w:val="2"/>
+                <w:sz w:val="24"/>
+                <w:szCs w:val="24"/>
+                <w:lang w:eastAsia="es-ES"/>
+                <w14:ligatures w14:val="standardContextual"/>
+              </w:rPr>
+              <w:tab/>
+            </w:r>
+            <w:r>
+              <w:rPr>
+                <w:rStyle w:val="Hipervnculo"/>
+              </w:rPr>
+              <w:t>Notas proceso</w:t>
+            </w:r>
+            <w:r>
+              <w:rPr>
+                <w:webHidden/>
+              </w:rPr>
+              <w:tab/>
+            </w:r>
+            <w:r>
+              <w:rPr>
+                <w:webHidden/>
+              </w:rPr>
+              <w:fldChar w:fldCharType="begin"/>
+            </w:r>
+            <w:r>
+              <w:rPr>
+                <w:webHidden/>
+              </w:rPr>
+              <w:instrText xml:space="preserve"> PAGEREF _Toc241479897 \h </w:instrText>
+            </w:r>
+            <w:r>
+              <w:rPr>
+                <w:webHidden/>
+              </w:rPr>
+            </w:r>
+            <w:r>
+              <w:rPr>
+                <w:webHidden/>
+              </w:rPr>
+              <w:fldChar w:fldCharType="separate"/>
+            </w:r>
+            <w:r>
+              <w:rPr>
+                <w:webHidden/>
+              </w:rPr>
+              <w:t>12</w:t>
             </w:r>
             <w:r>
               <w:rPr>
@@ -1912,7 +1959,6 @@
             </w:rPr>
           </w:pPr>
           <w:r>
-            <w:lastRenderedPageBreak/>
             <w:fldChar w:fldCharType="end"/>
           </w:r>
         </w:p>
@@ -1968,21 +2014,8 @@
       </w:pPr>
     </w:p>
     <w:p>
-      <w:pPr>
-        <w:pStyle w:val="Ttulocas"/>
-      </w:pPr>
-      <w:bookmarkStart w:id="3" w:name="_Toc230692649"/>
       <w:r>
         <w:lastRenderedPageBreak/>
-        <w:t>Planning trabajo</w:t>
-      </w:r>
-      <w:r>
-        <w:t xml:space="preserve"> theme HERRIZ</w:t>
-      </w:r>
-      <w:bookmarkEnd w:id="3"/>
-    </w:p>
-    <w:p>
-      <w:r>
         <w:t>Este documento define el plan de trabajo detallado para el desarrollo frontend del sistema de themes de portales de turismo</w:t>
       </w:r>
       <w:r>
@@ -2247,487 +2280,149 @@
         <w:t xml:space="preserve"> Componentes = contenido visual</w:t>
       </w:r>
     </w:p>
+    <w:p/>
     <w:p>
       <w:pPr>
         <w:pStyle w:val="Ttulo1"/>
       </w:pPr>
-      <w:bookmarkStart w:id="4" w:name="_Toc230692650"/>
-      <w:r>
-        <w:t>Fases</w:t>
+      <w:bookmarkStart w:id="3" w:name="_Toc241479881"/>
+      <w:r>
+        <w:lastRenderedPageBreak/>
+        <w:t>Desarrollo</w:t>
+      </w:r>
+      <w:bookmarkEnd w:id="3"/>
+    </w:p>
+    <w:p>
+      <w:pPr>
+        <w:pStyle w:val="Ttulo2"/>
+      </w:pPr>
+      <w:bookmarkStart w:id="4" w:name="_Toc241479882"/>
+      <w:r>
+        <w:t xml:space="preserve">CORE. </w:t>
+      </w:r>
+      <w:r>
+        <w:t>Setup técnico y arquitectura</w:t>
       </w:r>
       <w:bookmarkEnd w:id="4"/>
     </w:p>
     <w:p>
-      <w:r>
-        <w:t>El desarrollo se ha dividido en fases con entregables claros:</w:t>
-      </w:r>
-    </w:p>
-    <w:tbl>
-      <w:tblPr>
-        <w:tblW w:w="0" w:type="auto"/>
-        <w:tblLook w:val="04A0" w:firstRow="1" w:lastRow="0" w:firstColumn="1" w:lastColumn="0" w:noHBand="0" w:noVBand="1"/>
-      </w:tblPr>
-      <w:tblGrid>
-        <w:gridCol w:w="2880"/>
-        <w:gridCol w:w="2880"/>
-        <w:gridCol w:w="2880"/>
-      </w:tblGrid>
-      <w:tr>
-        <w:tc>
-          <w:tcPr>
-            <w:tcW w:w="2880" w:type="dxa"/>
-          </w:tcPr>
-          <w:p>
-            <w:r>
-              <w:lastRenderedPageBreak/>
-              <w:t>Fase</w:t>
-            </w:r>
-          </w:p>
-        </w:tc>
-        <w:tc>
-          <w:tcPr>
-            <w:tcW w:w="2880" w:type="dxa"/>
-          </w:tcPr>
-          <w:p>
-            <w:r>
-              <w:t>Nombre</w:t>
-            </w:r>
-          </w:p>
-        </w:tc>
-        <w:tc>
-          <w:tcPr>
-            <w:tcW w:w="2880" w:type="dxa"/>
-          </w:tcPr>
-          <w:p>
-            <w:pPr>
-              <w:jc w:val="left"/>
-            </w:pPr>
-            <w:r>
-              <w:t>Alcance</w:t>
-            </w:r>
-          </w:p>
-        </w:tc>
-      </w:tr>
-      <w:tr>
-        <w:tc>
-          <w:tcPr>
-            <w:tcW w:w="2880" w:type="dxa"/>
-          </w:tcPr>
-          <w:p>
-            <w:r>
-              <w:t>F0</w:t>
-            </w:r>
-          </w:p>
-        </w:tc>
-        <w:tc>
-          <w:tcPr>
-            <w:tcW w:w="2880" w:type="dxa"/>
-          </w:tcPr>
-          <w:p>
-            <w:pPr>
-              <w:rPr>
-                <w:b/>
-                <w:bCs/>
-              </w:rPr>
-            </w:pPr>
-            <w:r>
-              <w:rPr>
-                <w:b/>
-                <w:bCs/>
-              </w:rPr>
-              <w:t>Core</w:t>
-            </w:r>
-          </w:p>
-        </w:tc>
-        <w:tc>
-          <w:tcPr>
-            <w:tcW w:w="2880" w:type="dxa"/>
-          </w:tcPr>
-          <w:p>
-            <w:pPr>
-              <w:jc w:val="left"/>
-            </w:pPr>
-            <w:r>
-              <w:t>Entorno, arquitectura, base UI</w:t>
-            </w:r>
-          </w:p>
-        </w:tc>
-      </w:tr>
-      <w:tr>
-        <w:tc>
-          <w:tcPr>
-            <w:tcW w:w="2880" w:type="dxa"/>
-          </w:tcPr>
-          <w:p>
-            <w:r>
-              <w:t>F1</w:t>
-            </w:r>
-          </w:p>
-        </w:tc>
-        <w:tc>
-          <w:tcPr>
-            <w:tcW w:w="2880" w:type="dxa"/>
-          </w:tcPr>
-          <w:p>
-            <w:pPr>
-              <w:rPr>
-                <w:b/>
-                <w:bCs/>
-              </w:rPr>
-            </w:pPr>
-            <w:r>
-              <w:rPr>
-                <w:b/>
-                <w:bCs/>
-              </w:rPr>
-              <w:t>B</w:t>
-            </w:r>
-            <w:r>
-              <w:rPr>
-                <w:b/>
-                <w:bCs/>
-              </w:rPr>
-              <w:t>ase</w:t>
-            </w:r>
-          </w:p>
-        </w:tc>
-        <w:tc>
-          <w:tcPr>
-            <w:tcW w:w="2880" w:type="dxa"/>
-          </w:tcPr>
-          <w:p>
-            <w:pPr>
-              <w:jc w:val="left"/>
-              <w:rPr>
-                <w:lang w:val="en-US"/>
-              </w:rPr>
-            </w:pPr>
-            <w:r>
-              <w:rPr>
-                <w:lang w:val="en-US"/>
-              </w:rPr>
-              <w:t>Master page. Header y f</w:t>
-            </w:r>
-            <w:r>
-              <w:rPr>
-                <w:lang w:val="en-US"/>
-              </w:rPr>
-              <w:t>ooter</w:t>
-            </w:r>
-          </w:p>
-        </w:tc>
-      </w:tr>
-      <w:tr>
-        <w:tc>
-          <w:tcPr>
-            <w:tcW w:w="2880" w:type="dxa"/>
-          </w:tcPr>
-          <w:p>
-            <w:r>
-              <w:t>F2</w:t>
-            </w:r>
-          </w:p>
-        </w:tc>
-        <w:tc>
-          <w:tcPr>
-            <w:tcW w:w="2880" w:type="dxa"/>
-          </w:tcPr>
-          <w:p>
-            <w:pPr>
-              <w:rPr>
-                <w:b/>
-                <w:bCs/>
-              </w:rPr>
-            </w:pPr>
-            <w:r>
-              <w:rPr>
-                <w:b/>
-                <w:bCs/>
-              </w:rPr>
-              <w:t>Piloto</w:t>
-            </w:r>
-          </w:p>
-        </w:tc>
-        <w:tc>
-          <w:tcPr>
-            <w:tcW w:w="2880" w:type="dxa"/>
-          </w:tcPr>
-          <w:p>
-            <w:pPr>
-              <w:jc w:val="left"/>
-            </w:pPr>
-            <w:r>
-              <w:t xml:space="preserve">Home, listado y detalle migrados </w:t>
-            </w:r>
-          </w:p>
-        </w:tc>
-      </w:tr>
-      <w:tr>
-        <w:tc>
-          <w:tcPr>
-            <w:tcW w:w="2880" w:type="dxa"/>
-          </w:tcPr>
-          <w:p>
-            <w:r>
-              <w:t>F3</w:t>
-            </w:r>
-          </w:p>
-        </w:tc>
-        <w:tc>
-          <w:tcPr>
-            <w:tcW w:w="2880" w:type="dxa"/>
-          </w:tcPr>
-          <w:p>
-            <w:pPr>
-              <w:rPr>
-                <w:b/>
-                <w:bCs/>
-              </w:rPr>
-            </w:pPr>
-            <w:r>
-              <w:rPr>
-                <w:b/>
-                <w:bCs/>
-              </w:rPr>
-              <w:t>Propuesta</w:t>
-            </w:r>
-          </w:p>
-        </w:tc>
-        <w:tc>
-          <w:tcPr>
-            <w:tcW w:w="2880" w:type="dxa"/>
-          </w:tcPr>
-          <w:p>
-            <w:pPr>
-              <w:jc w:val="left"/>
-            </w:pPr>
-            <w:r>
-              <w:t>Home, listado y detalle propuesta y componentes listados</w:t>
-            </w:r>
-          </w:p>
-        </w:tc>
-      </w:tr>
-      <w:tr>
-        <w:tc>
-          <w:tcPr>
-            <w:tcW w:w="2880" w:type="dxa"/>
-          </w:tcPr>
-          <w:p>
-            <w:r>
-              <w:t>F4</w:t>
-            </w:r>
-          </w:p>
-        </w:tc>
-        <w:tc>
-          <w:tcPr>
-            <w:tcW w:w="2880" w:type="dxa"/>
-          </w:tcPr>
-          <w:p>
-            <w:pPr>
-              <w:rPr>
-                <w:b/>
-                <w:bCs/>
-              </w:rPr>
-            </w:pPr>
-            <w:r>
-              <w:rPr>
-                <w:b/>
-                <w:bCs/>
-              </w:rPr>
-              <w:t>Theming</w:t>
-            </w:r>
-          </w:p>
-        </w:tc>
-        <w:tc>
-          <w:tcPr>
-            <w:tcW w:w="2880" w:type="dxa"/>
-          </w:tcPr>
-          <w:p>
-            <w:pPr>
-              <w:jc w:val="left"/>
-            </w:pPr>
-            <w:r>
-              <w:t>Coincidente con prototipo Plenztia (Default) y Artea</w:t>
-            </w:r>
-          </w:p>
-        </w:tc>
-      </w:tr>
-      <w:tr>
-        <w:tc>
-          <w:tcPr>
-            <w:tcW w:w="2880" w:type="dxa"/>
-          </w:tcPr>
-          <w:p>
-            <w:r>
-              <w:t>F5</w:t>
-            </w:r>
-          </w:p>
-        </w:tc>
-        <w:tc>
-          <w:tcPr>
-            <w:tcW w:w="2880" w:type="dxa"/>
-          </w:tcPr>
-          <w:p>
-            <w:pPr>
-              <w:rPr>
-                <w:b/>
-                <w:bCs/>
-              </w:rPr>
-            </w:pPr>
-            <w:r>
-              <w:rPr>
-                <w:b/>
-                <w:bCs/>
-              </w:rPr>
-              <w:t>Variantes detalles</w:t>
-            </w:r>
-          </w:p>
-        </w:tc>
-        <w:tc>
-          <w:tcPr>
-            <w:tcW w:w="2880" w:type="dxa"/>
-          </w:tcPr>
-          <w:p>
-            <w:pPr>
-              <w:jc w:val="left"/>
-            </w:pPr>
-            <w:r>
-              <w:t>Creación variaciones diferentes tipos de detalle</w:t>
-            </w:r>
-          </w:p>
-        </w:tc>
-      </w:tr>
-      <w:tr>
-        <w:tc>
-          <w:tcPr>
-            <w:tcW w:w="2880" w:type="dxa"/>
-          </w:tcPr>
-          <w:p>
-            <w:r>
-              <w:t>F6</w:t>
-            </w:r>
-          </w:p>
-        </w:tc>
-        <w:tc>
-          <w:tcPr>
-            <w:tcW w:w="2880" w:type="dxa"/>
-          </w:tcPr>
-          <w:p>
-            <w:r>
-              <w:t xml:space="preserve">QA </w:t>
-            </w:r>
-            <w:r>
-              <w:t>&amp; documentación</w:t>
-            </w:r>
-          </w:p>
-        </w:tc>
-        <w:tc>
-          <w:tcPr>
-            <w:tcW w:w="2880" w:type="dxa"/>
-          </w:tcPr>
-          <w:p>
-            <w:pPr>
-              <w:jc w:val="left"/>
-            </w:pPr>
-            <w:r>
-              <w:t>Testing, accesibilidad, documentación</w:t>
-            </w:r>
-          </w:p>
-        </w:tc>
-      </w:tr>
-    </w:tbl>
-    <w:p/>
-    <w:p>
-      <w:pPr>
-        <w:pStyle w:val="Ttulo1"/>
-      </w:pPr>
-      <w:bookmarkStart w:id="5" w:name="_Toc230692651"/>
-      <w:r>
-        <w:t>Planning detallado</w:t>
+      <w:pPr>
+        <w:pStyle w:val="Ttulo3"/>
+      </w:pPr>
+      <w:bookmarkStart w:id="5" w:name="_Toc241479883"/>
+      <w:r>
+        <w:t>Objetivo</w:t>
       </w:r>
       <w:bookmarkEnd w:id="5"/>
     </w:p>
     <w:p>
-      <w:pPr>
-        <w:pStyle w:val="Ttulo2"/>
-      </w:pPr>
-      <w:bookmarkStart w:id="6" w:name="_Toc230692652"/>
-      <w:r>
-        <w:t xml:space="preserve">F0 — </w:t>
-      </w:r>
-      <w:r>
-        <w:t xml:space="preserve">CORE. </w:t>
-      </w:r>
-      <w:r>
-        <w:t>Setup técnico y arquitectura</w:t>
-      </w:r>
-      <w:bookmarkEnd w:id="6"/>
-    </w:p>
-    <w:p>
-      <w:pPr>
-        <w:pStyle w:val="Ttulo3"/>
-      </w:pPr>
-      <w:bookmarkStart w:id="7" w:name="_Toc230692653"/>
-      <w:r>
-        <w:t>Objetivo</w:t>
-      </w:r>
-      <w:bookmarkEnd w:id="7"/>
-    </w:p>
-    <w:p>
-      <w:r>
-        <w:t xml:space="preserve">Dejar </w:t>
+      <w:r>
+        <w:t>El</w:t>
       </w:r>
       <w:r>
         <w:rPr>
           <w:b/>
           <w:bCs/>
         </w:rPr>
-        <w:t xml:space="preserve">preparado el entorno para </w:t>
+        <w:t xml:space="preserve"> entorno</w:t>
       </w:r>
       <w:r>
         <w:rPr>
           <w:b/>
           <w:bCs/>
         </w:rPr>
-        <w:t xml:space="preserve">iterar y </w:t>
+        <w:t xml:space="preserve"> </w:t>
+      </w:r>
+      <w:r>
+        <w:t>está</w:t>
       </w:r>
       <w:r>
         <w:rPr>
           <w:b/>
           <w:bCs/>
         </w:rPr>
-        <w:t>escalar</w:t>
+        <w:t xml:space="preserve"> preparado</w:t>
       </w:r>
       <w:r>
         <w:rPr>
           <w:b/>
           <w:bCs/>
         </w:rPr>
+        <w:t xml:space="preserve"> para </w:t>
+      </w:r>
+      <w:r>
+        <w:rPr>
+          <w:b/>
+          <w:bCs/>
+        </w:rPr>
+        <w:t xml:space="preserve">iterar y </w:t>
+      </w:r>
+      <w:r>
+        <w:rPr>
+          <w:b/>
+          <w:bCs/>
+        </w:rPr>
+        <w:t>escalar</w:t>
+      </w:r>
+      <w:r>
+        <w:rPr>
+          <w:b/>
+          <w:bCs/>
+        </w:rPr>
         <w:t xml:space="preserve"> de forma ágil y practica </w:t>
       </w:r>
       <w:r>
-        <w:t>para todos los</w:t>
-      </w:r>
-      <w:r>
-        <w:t xml:space="preserve"> desarrolladores</w:t>
+        <w:t>tanto</w:t>
+      </w:r>
+      <w:r>
+        <w:rPr>
+          <w:b/>
+          <w:bCs/>
+        </w:rPr>
+        <w:t xml:space="preserve"> </w:t>
+      </w:r>
+      <w:r>
+        <w:t>para</w:t>
+      </w:r>
+      <w:r>
+        <w:t xml:space="preserve"> desarrollo coo para gestores de contenido</w:t>
       </w:r>
       <w:r>
         <w:t>.</w:t>
       </w:r>
-      <w:r>
-        <w:t xml:space="preserve"> Intentaremos ir entregando MPV a partir de la fase 2.</w:t>
+    </w:p>
+    <w:p>
+      <w:r>
+        <w:rPr>
+          <w:lang w:val="en-US"/>
+        </w:rPr>
+        <w:t xml:space="preserve">Repositorio ( C:\Teknei\ThemeTurismo\backups\custom_web ) y entornos de desarrollo ( </w:t>
+      </w:r>
+      <w:r>
+        <w:rPr>
+          <w:rFonts w:ascii="Times New Roman" w:eastAsia="Times New Roman" w:hAnsi="Times New Roman" w:cs="Times New Roman"/>
+          <w:i/>
+          <w:color w:val="auto"/>
+          <w:sz w:val="24"/>
+          <w:szCs w:val="24"/>
+          <w:lang w:val="en-US"/>
+        </w:rPr>
+        <w:t xml:space="preserve"> </w:t>
+      </w:r>
+      <w:r>
+        <w:rPr>
+          <w:lang w:val="en-US"/>
+        </w:rPr>
+        <w:t>C:\Program Files\Common Files\Microsoft Shared\Web Server</w:t>
       </w:r>
     </w:p>
     <w:p>
       <w:pPr>
         <w:pStyle w:val="Ttulo3"/>
       </w:pPr>
-      <w:bookmarkStart w:id="8" w:name="_Toc230692654"/>
-      <w:r>
-        <w:lastRenderedPageBreak/>
-        <w:t>Tareas</w:t>
-      </w:r>
-      <w:bookmarkEnd w:id="8"/>
+      <w:r>
+        <w:t>Arquitectura</w:t>
+      </w:r>
     </w:p>
     <w:p>
       <w:pPr>
@@ -2736,9 +2431,13 @@
           <w:ilvl w:val="0"/>
           <w:numId w:val="2"/>
         </w:numPr>
-      </w:pPr>
-      <w:r>
-        <w:t>Definir estructura de carpetas (Style Library)</w:t>
+        <w:jc w:val="left"/>
+      </w:pPr>
+      <w:r>
+        <w:t xml:space="preserve">La carpeta del proyecto en integración se encuentra en </w:t>
+      </w:r>
+      <w:r>
+        <w:t>Extentions\16\TEMPLATE\LAYOUTS\Turismo2013.Files\custom_web )</w:t>
       </w:r>
     </w:p>
     <w:p>
@@ -2750,10 +2449,126 @@
         </w:numPr>
       </w:pPr>
       <w:r>
-        <w:t>Definir Repositorio y entornos</w:t>
-      </w:r>
-      <w:r>
-        <w:t xml:space="preserve"> de desarrollo, pre etc.</w:t>
+        <w:t>Creación librerías comunes</w:t>
+      </w:r>
+    </w:p>
+    <w:p>
+      <w:pPr>
+        <w:pStyle w:val="Prrafodelista"/>
+        <w:numPr>
+          <w:ilvl w:val="1"/>
+          <w:numId w:val="2"/>
+        </w:numPr>
+      </w:pPr>
+      <w:r>
+        <w:t xml:space="preserve">assets </w:t>
+      </w:r>
+    </w:p>
+    <w:p>
+      <w:pPr>
+        <w:pStyle w:val="Prrafodelista"/>
+        <w:numPr>
+          <w:ilvl w:val="1"/>
+          <w:numId w:val="2"/>
+        </w:numPr>
+      </w:pPr>
+      <w:r>
+        <w:t>Css</w:t>
+      </w:r>
+    </w:p>
+    <w:p>
+      <w:pPr>
+        <w:pStyle w:val="Prrafodelista"/>
+        <w:numPr>
+          <w:ilvl w:val="2"/>
+          <w:numId w:val="2"/>
+        </w:numPr>
+      </w:pPr>
+      <w:r>
+        <w:t>Layout</w:t>
+      </w:r>
+    </w:p>
+    <w:p>
+      <w:pPr>
+        <w:pStyle w:val="Prrafodelista"/>
+        <w:numPr>
+          <w:ilvl w:val="2"/>
+          <w:numId w:val="2"/>
+        </w:numPr>
+      </w:pPr>
+      <w:r>
+        <w:t>componentes</w:t>
+      </w:r>
+    </w:p>
+    <w:p>
+      <w:r>
+        <w:t xml:space="preserve">Creación archivos </w:t>
+      </w:r>
+      <w:r>
+        <w:t xml:space="preserve">de estructura </w:t>
+      </w:r>
+      <w:r>
+        <w:t>comunes</w:t>
+      </w:r>
+      <w:r>
+        <w:t xml:space="preserve"> (sharepoint)</w:t>
+      </w:r>
+    </w:p>
+    <w:p>
+      <w:pPr>
+        <w:pStyle w:val="Prrafodelista"/>
+        <w:numPr>
+          <w:ilvl w:val="1"/>
+          <w:numId w:val="2"/>
+        </w:numPr>
+      </w:pPr>
+      <w:r>
+        <w:t xml:space="preserve">Master </w:t>
+      </w:r>
+    </w:p>
+    <w:p>
+      <w:pPr>
+        <w:pStyle w:val="Prrafodelista"/>
+        <w:numPr>
+          <w:ilvl w:val="1"/>
+          <w:numId w:val="2"/>
+        </w:numPr>
+      </w:pPr>
+      <w:r>
+        <w:t>Layout home</w:t>
+      </w:r>
+      <w:r>
+        <w:t xml:space="preserve"> </w:t>
+      </w:r>
+    </w:p>
+    <w:p>
+      <w:pPr>
+        <w:pStyle w:val="Prrafodelista"/>
+        <w:numPr>
+          <w:ilvl w:val="1"/>
+          <w:numId w:val="2"/>
+        </w:numPr>
+        <w:rPr>
+          <w:lang w:val="en-US"/>
+        </w:rPr>
+      </w:pPr>
+      <w:r>
+        <w:rPr>
+          <w:lang w:val="en-US"/>
+        </w:rPr>
+        <w:t xml:space="preserve">Layout listado </w:t>
+      </w:r>
+    </w:p>
+    <w:p>
+      <w:pPr>
+        <w:pStyle w:val="Prrafodelista"/>
+        <w:numPr>
+          <w:ilvl w:val="1"/>
+          <w:numId w:val="2"/>
+        </w:numPr>
+      </w:pPr>
+      <w:r>
+        <w:t>Laytout detalle</w:t>
       </w:r>
     </w:p>
     <w:p>
@@ -2764,726 +2579,86 @@
           <w:numId w:val="2"/>
         </w:numPr>
       </w:pPr>
-      <w:commentRangeStart w:id="9"/>
-      <w:r>
-        <w:t>Configurar pipeline CSS (LESS/SASS si aplica)</w:t>
-      </w:r>
-      <w:commentRangeEnd w:id="9"/>
-      <w:r>
-        <w:rPr>
-          <w:rStyle w:val="Refdecomentario"/>
-          <w:sz w:val="19"/>
-          <w:szCs w:val="22"/>
-        </w:rPr>
-        <w:commentReference w:id="9"/>
+      <w:r>
+        <w:t xml:space="preserve">Creación librerías theme default </w:t>
       </w:r>
     </w:p>
     <w:p>
       <w:pPr>
         <w:pStyle w:val="Prrafodelista"/>
         <w:numPr>
-          <w:ilvl w:val="0"/>
+          <w:ilvl w:val="1"/>
           <w:numId w:val="2"/>
         </w:numPr>
       </w:pPr>
       <w:r>
-        <w:t>Instalar librerías como</w:t>
-      </w:r>
-      <w:r>
-        <w:t xml:space="preserve"> Bootstrap 5</w:t>
+        <w:t>Css</w:t>
       </w:r>
     </w:p>
     <w:p>
       <w:pPr>
         <w:pStyle w:val="Prrafodelista"/>
         <w:numPr>
-          <w:ilvl w:val="0"/>
+          <w:ilvl w:val="1"/>
           <w:numId w:val="2"/>
         </w:numPr>
       </w:pPr>
       <w:r>
-        <w:t xml:space="preserve">Definir </w:t>
-      </w:r>
-      <w:r>
-        <w:t xml:space="preserve">assets como </w:t>
-      </w:r>
-      <w:r>
-        <w:t>librería/as iconos</w:t>
-      </w:r>
-      <w:r>
-        <w:t>,</w:t>
-      </w:r>
-      <w:r>
-        <w:t xml:space="preserve"> tipografías (Google fonts, carpeta de fuentes …)</w:t>
+        <w:t>Fuentes</w:t>
       </w:r>
     </w:p>
     <w:p>
       <w:pPr>
         <w:pStyle w:val="Prrafodelista"/>
         <w:numPr>
-          <w:ilvl w:val="0"/>
+          <w:ilvl w:val="2"/>
           <w:numId w:val="2"/>
         </w:numPr>
       </w:pPr>
       <w:r>
-        <w:t>Crear base.css vacío</w:t>
+        <w:t>iconos, tipografías</w:t>
       </w:r>
     </w:p>
     <w:p>
       <w:pPr>
         <w:pStyle w:val="Prrafodelista"/>
         <w:numPr>
-          <w:ilvl w:val="0"/>
+          <w:ilvl w:val="2"/>
           <w:numId w:val="2"/>
         </w:numPr>
       </w:pPr>
       <w:r>
-        <w:t>Crear theme base</w:t>
-      </w:r>
-    </w:p>
-    <w:p>
-      <w:r>
-        <w:rPr>
-          <w:rFonts w:ascii="Segoe UI Emoji" w:hAnsi="Segoe UI Emoji" w:cs="Segoe UI Emoji"/>
-        </w:rPr>
-        <w:t>Ejem</w:t>
-      </w:r>
-      <w:r>
-        <w:t>:</w:t>
-      </w:r>
-    </w:p>
-    <w:p>
-      <w:r>
-        <w:t>&lt;!----&gt;</w:t>
-      </w:r>
-    </w:p>
-    <w:p>
-      <w:r>
-        <w:t xml:space="preserve">    /core</w:t>
-      </w:r>
-    </w:p>
-    <w:p>
-      <w:r>
-        <w:t xml:space="preserve">    /components</w:t>
-      </w:r>
-    </w:p>
-    <w:p>
-      <w:r>
-        <w:t xml:space="preserve">    /layout</w:t>
-      </w:r>
-    </w:p>
-    <w:p>
-      <w:r>
-        <w:t xml:space="preserve">    /themes/base</w:t>
-      </w:r>
-    </w:p>
-    <w:p>
-      <w:r>
-        <w:t xml:space="preserve">    /themes/[ayuntamiento]</w:t>
-      </w:r>
-    </w:p>
-    <w:p>
-      <w:pPr>
-        <w:pStyle w:val="Ttulo3"/>
-      </w:pPr>
-      <w:bookmarkStart w:id="10" w:name="_Toc230692655"/>
-      <w:r>
-        <w:t>Base UI (fundaciones del sistema)</w:t>
-      </w:r>
-      <w:bookmarkEnd w:id="10"/>
-    </w:p>
-    <w:p>
-      <w:pPr>
-        <w:pStyle w:val="Prrafodelista"/>
-        <w:numPr>
-          <w:ilvl w:val="0"/>
-          <w:numId w:val="2"/>
-        </w:numPr>
-        <w:rPr>
-          <w:lang w:val="en-US"/>
-        </w:rPr>
-      </w:pPr>
-      <w:r>
-        <w:rPr>
-          <w:lang w:val="en-US"/>
-        </w:rPr>
-        <w:t>Reset CSS</w:t>
-      </w:r>
-    </w:p>
-    <w:p>
-      <w:pPr>
-        <w:pStyle w:val="Prrafodelista"/>
-        <w:numPr>
-          <w:ilvl w:val="0"/>
-          <w:numId w:val="2"/>
-        </w:numPr>
-        <w:rPr>
-          <w:lang w:val="en-US"/>
-        </w:rPr>
-      </w:pPr>
-      <w:r>
-        <w:rPr>
-          <w:lang w:val="en-US"/>
-        </w:rPr>
-        <w:t>Grid / layout base</w:t>
-      </w:r>
-    </w:p>
-    <w:p>
-      <w:pPr>
-        <w:pStyle w:val="Prrafodelista"/>
-        <w:numPr>
-          <w:ilvl w:val="0"/>
-          <w:numId w:val="2"/>
-        </w:numPr>
-      </w:pPr>
-      <w:r>
-        <w:t>Definir variables 1ra parte (figma)</w:t>
-      </w:r>
-    </w:p>
-    <w:p>
-      <w:pPr>
-        <w:pStyle w:val="Prrafodelista"/>
-        <w:numPr>
-          <w:ilvl w:val="0"/>
-          <w:numId w:val="2"/>
-        </w:numPr>
-      </w:pPr>
-      <w:r>
-        <w:t>Espaciado (márgenes, paddings)</w:t>
-      </w:r>
-    </w:p>
-    <w:p>
-      <w:pPr>
-        <w:pStyle w:val="Prrafodelista"/>
-        <w:numPr>
-          <w:ilvl w:val="0"/>
-          <w:numId w:val="2"/>
-        </w:numPr>
-      </w:pPr>
-      <w:r>
-        <w:t>Helpers (clases utilitarias)</w:t>
-      </w:r>
-    </w:p>
-    <w:p>
-      <w:pPr>
-        <w:pStyle w:val="Prrafodelista"/>
-      </w:pPr>
-      <w:r>
-        <w:t>Ejem.</w:t>
-      </w:r>
-    </w:p>
-    <w:p>
-      <w:pPr>
-        <w:pStyle w:val="Prrafodelista"/>
-        <w:rPr>
-          <w:lang w:val="en-US"/>
-        </w:rPr>
-      </w:pPr>
-      <w:r>
-        <w:rPr>
-          <w:lang w:val="en-US"/>
-        </w:rPr>
-        <w:t>// =====================</w:t>
-      </w:r>
-    </w:p>
-    <w:p>
-      <w:pPr>
-        <w:pStyle w:val="Prrafodelista"/>
-        <w:rPr>
-          <w:lang w:val="en-US"/>
-        </w:rPr>
-      </w:pPr>
-      <w:r>
-        <w:rPr>
-          <w:lang w:val="en-US"/>
-        </w:rPr>
-        <w:t>// COLOR SYSTEM</w:t>
-      </w:r>
-    </w:p>
-    <w:p>
-      <w:pPr>
-        <w:pStyle w:val="Prrafodelista"/>
-        <w:rPr>
-          <w:lang w:val="en-US"/>
-        </w:rPr>
-      </w:pPr>
-      <w:r>
-        <w:rPr>
-          <w:lang w:val="en-US"/>
-        </w:rPr>
-        <w:t>// =====================</w:t>
-      </w:r>
-    </w:p>
-    <w:p>
-      <w:pPr>
-        <w:pStyle w:val="Prrafodelista"/>
-        <w:rPr>
-          <w:lang w:val="en-US"/>
-        </w:rPr>
-      </w:pPr>
-      <w:r>
-        <w:rPr>
-          <w:lang w:val="en-US"/>
+        <w:t>fuente x</w:t>
+      </w:r>
+    </w:p>
+    <w:p/>
+    <w:p>
+      <w:pPr>
+        <w:pStyle w:val="Citadestacada"/>
+      </w:pPr>
+      <w:r>
+        <w:rPr>
+          <w:rFonts w:asciiTheme="minorHAnsi" w:hAnsiTheme="minorHAnsi" w:cs="Segoe UI Emoji"/>
         </w:rPr>
         <w:lastRenderedPageBreak/>
-        <w:t>@color-primary: #00</w:t>
-      </w:r>
-      <w:r>
-        <w:rPr>
-          <w:lang w:val="en-US"/>
-        </w:rPr>
-        <w:t>0</w:t>
-      </w:r>
-      <w:r>
-        <w:rPr>
-          <w:lang w:val="en-US"/>
-        </w:rPr>
-        <w:t>;</w:t>
-      </w:r>
-    </w:p>
-    <w:p>
-      <w:pPr>
-        <w:pStyle w:val="Prrafodelista"/>
-        <w:rPr>
-          <w:lang w:val="en-US"/>
-        </w:rPr>
-      </w:pPr>
-      <w:r>
-        <w:rPr>
-          <w:lang w:val="en-US"/>
-        </w:rPr>
-        <w:t>@color-secondary: #00</w:t>
-      </w:r>
-      <w:r>
-        <w:rPr>
-          <w:lang w:val="en-US"/>
-        </w:rPr>
-        <w:t>0</w:t>
-      </w:r>
-      <w:r>
-        <w:rPr>
-          <w:lang w:val="en-US"/>
-        </w:rPr>
-        <w:t>;</w:t>
-      </w:r>
-    </w:p>
-    <w:p>
-      <w:pPr>
-        <w:pStyle w:val="Prrafodelista"/>
-        <w:rPr>
-          <w:lang w:val="en-US"/>
-        </w:rPr>
-      </w:pPr>
-      <w:r>
-        <w:rPr>
-          <w:lang w:val="en-US"/>
-        </w:rPr>
-        <w:t>@color-accent: #</w:t>
-      </w:r>
-      <w:r>
-        <w:rPr>
-          <w:lang w:val="en-US"/>
-        </w:rPr>
-        <w:t>000</w:t>
-      </w:r>
-      <w:r>
-        <w:rPr>
-          <w:lang w:val="en-US"/>
-        </w:rPr>
-        <w:t>;</w:t>
-      </w:r>
-    </w:p>
-    <w:p>
-      <w:pPr>
-        <w:pStyle w:val="Prrafodelista"/>
-        <w:rPr>
-          <w:lang w:val="en-US"/>
-        </w:rPr>
-      </w:pPr>
-      <w:r>
-        <w:rPr>
-          <w:lang w:val="en-US"/>
-        </w:rPr>
-        <w:t>@color-text: #</w:t>
-      </w:r>
-      <w:r>
-        <w:rPr>
-          <w:lang w:val="en-US"/>
-        </w:rPr>
-        <w:t>000</w:t>
-      </w:r>
-      <w:r>
-        <w:rPr>
-          <w:lang w:val="en-US"/>
-        </w:rPr>
-        <w:t>;</w:t>
-      </w:r>
-    </w:p>
-    <w:p>
-      <w:pPr>
-        <w:pStyle w:val="Prrafodelista"/>
-        <w:rPr>
-          <w:lang w:val="en-US"/>
-        </w:rPr>
-      </w:pPr>
-      <w:r>
-        <w:rPr>
-          <w:lang w:val="en-US"/>
-        </w:rPr>
-        <w:t>@color-text-light: #</w:t>
-      </w:r>
-      <w:r>
-        <w:rPr>
-          <w:lang w:val="en-US"/>
-        </w:rPr>
-        <w:t>000</w:t>
-      </w:r>
-      <w:r>
-        <w:rPr>
-          <w:lang w:val="en-US"/>
-        </w:rPr>
-        <w:t>;</w:t>
-      </w:r>
-    </w:p>
-    <w:p>
-      <w:pPr>
-        <w:pStyle w:val="Prrafodelista"/>
-        <w:rPr>
-          <w:lang w:val="en-US"/>
-        </w:rPr>
-      </w:pPr>
-      <w:r>
-        <w:rPr>
-          <w:lang w:val="en-US"/>
-        </w:rPr>
-        <w:t>@color-bg: #</w:t>
-      </w:r>
-      <w:r>
-        <w:rPr>
-          <w:lang w:val="en-US"/>
-        </w:rPr>
-        <w:t>000</w:t>
-      </w:r>
-      <w:r>
-        <w:rPr>
-          <w:lang w:val="en-US"/>
-        </w:rPr>
-        <w:t>;</w:t>
-      </w:r>
-    </w:p>
-    <w:p>
-      <w:pPr>
-        <w:pStyle w:val="Prrafodelista"/>
-        <w:rPr>
-          <w:lang w:val="en-US"/>
-        </w:rPr>
-      </w:pPr>
-      <w:r>
-        <w:rPr>
-          <w:lang w:val="en-US"/>
-        </w:rPr>
-        <w:t>@color-bg-alt: #</w:t>
-      </w:r>
-      <w:r>
-        <w:rPr>
-          <w:lang w:val="en-US"/>
-        </w:rPr>
-        <w:t>000</w:t>
-      </w:r>
-      <w:r>
-        <w:rPr>
-          <w:lang w:val="en-US"/>
-        </w:rPr>
-        <w:t>;</w:t>
-      </w:r>
-    </w:p>
-    <w:p>
-      <w:pPr>
-        <w:pStyle w:val="Prrafodelista"/>
-        <w:rPr>
-          <w:lang w:val="en-US"/>
-        </w:rPr>
-      </w:pPr>
-      <w:r>
-        <w:rPr>
-          <w:lang w:val="en-US"/>
-        </w:rPr>
-        <w:t>// =====================</w:t>
-      </w:r>
-    </w:p>
-    <w:p>
-      <w:pPr>
-        <w:pStyle w:val="Prrafodelista"/>
-        <w:rPr>
-          <w:lang w:val="en-US"/>
-        </w:rPr>
-      </w:pPr>
-      <w:r>
-        <w:rPr>
-          <w:lang w:val="en-US"/>
-        </w:rPr>
-        <w:t>// TYPOGRAPHY</w:t>
-      </w:r>
-    </w:p>
-    <w:p>
-      <w:pPr>
-        <w:pStyle w:val="Prrafodelista"/>
-        <w:rPr>
-          <w:lang w:val="en-US"/>
-        </w:rPr>
-      </w:pPr>
-      <w:r>
-        <w:rPr>
-          <w:lang w:val="en-US"/>
-        </w:rPr>
-        <w:t>// =====================</w:t>
-      </w:r>
-    </w:p>
-    <w:p>
-      <w:pPr>
-        <w:pStyle w:val="Prrafodelista"/>
-        <w:rPr>
-          <w:lang w:val="en-US"/>
-        </w:rPr>
-      </w:pPr>
-      <w:r>
-        <w:rPr>
-          <w:lang w:val="en-US"/>
-        </w:rPr>
-        <w:t>@font-base: '</w:t>
-      </w:r>
-      <w:r>
-        <w:rPr>
-          <w:lang w:val="en-US"/>
-        </w:rPr>
-        <w:t>xx</w:t>
-      </w:r>
-      <w:r>
-        <w:rPr>
-          <w:lang w:val="en-US"/>
-        </w:rPr>
-        <w:t>, Arial, sans-serif;</w:t>
-      </w:r>
-    </w:p>
-    <w:p>
-      <w:pPr>
-        <w:pStyle w:val="Prrafodelista"/>
-        <w:rPr>
-          <w:lang w:val="en-US"/>
-        </w:rPr>
-      </w:pPr>
-      <w:r>
-        <w:rPr>
-          <w:lang w:val="en-US"/>
-        </w:rPr>
-        <w:t>@font-heading: '</w:t>
-      </w:r>
-      <w:r>
-        <w:rPr>
-          <w:lang w:val="en-US"/>
-        </w:rPr>
-        <w:t>xx</w:t>
-      </w:r>
-      <w:r>
-        <w:rPr>
-          <w:lang w:val="en-US"/>
-        </w:rPr>
-        <w:t>', serif;</w:t>
-      </w:r>
-    </w:p>
-    <w:p>
-      <w:pPr>
-        <w:pStyle w:val="Prrafodelista"/>
-        <w:rPr>
-          <w:lang w:val="en-US"/>
-        </w:rPr>
-      </w:pPr>
-      <w:r>
-        <w:rPr>
-          <w:lang w:val="en-US"/>
-        </w:rPr>
-        <w:t>// =====================</w:t>
-      </w:r>
-    </w:p>
-    <w:p>
-      <w:pPr>
-        <w:pStyle w:val="Prrafodelista"/>
-        <w:rPr>
-          <w:lang w:val="en-US"/>
-        </w:rPr>
-      </w:pPr>
-      <w:r>
-        <w:rPr>
-          <w:lang w:val="en-US"/>
-        </w:rPr>
-        <w:t>// SPACING</w:t>
-      </w:r>
-    </w:p>
-    <w:p>
-      <w:pPr>
-        <w:pStyle w:val="Prrafodelista"/>
-        <w:rPr>
-          <w:lang w:val="en-US"/>
-        </w:rPr>
-      </w:pPr>
-      <w:r>
-        <w:rPr>
-          <w:lang w:val="en-US"/>
-        </w:rPr>
-        <w:t>// =====================</w:t>
-      </w:r>
-    </w:p>
-    <w:p>
-      <w:pPr>
-        <w:pStyle w:val="Prrafodelista"/>
-      </w:pPr>
-      <w:r>
-        <w:t>@spacing-xs: 0px;</w:t>
-      </w:r>
-    </w:p>
-    <w:p>
-      <w:pPr>
-        <w:pStyle w:val="Prrafodelista"/>
-      </w:pPr>
-      <w:r>
-        <w:t>@spacing-sm: 0px;</w:t>
-      </w:r>
-    </w:p>
-    <w:p>
-      <w:pPr>
-        <w:pStyle w:val="Prrafodelista"/>
-      </w:pPr>
-      <w:r>
-        <w:t>@spacing-md: 0px;</w:t>
-      </w:r>
-    </w:p>
-    <w:p>
-      <w:pPr>
-        <w:pStyle w:val="Prrafodelista"/>
-      </w:pPr>
-      <w:r>
-        <w:t>@spacing-lg: 0px;</w:t>
-      </w:r>
-    </w:p>
-    <w:p>
-      <w:pPr>
-        <w:pStyle w:val="Prrafodelista"/>
-      </w:pPr>
-      <w:r>
-        <w:t>@spacing-xl: 0px;</w:t>
-      </w:r>
-    </w:p>
-    <w:p>
-      <w:pPr>
-        <w:pStyle w:val="Prrafodelista"/>
-      </w:pPr>
-      <w:r>
-        <w:t>// =====================</w:t>
-      </w:r>
-    </w:p>
-    <w:p>
-      <w:pPr>
-        <w:pStyle w:val="Prrafodelista"/>
-      </w:pPr>
-      <w:r>
-        <w:t>// BORDER</w:t>
-      </w:r>
-    </w:p>
-    <w:p>
-      <w:pPr>
-        <w:pStyle w:val="Prrafodelista"/>
-      </w:pPr>
-      <w:r>
-        <w:t>// =====================</w:t>
-      </w:r>
-    </w:p>
-    <w:p>
-      <w:pPr>
-        <w:pStyle w:val="Prrafodelista"/>
-      </w:pPr>
-      <w:r>
-        <w:t xml:space="preserve">@border-radius: </w:t>
-      </w:r>
-      <w:r>
-        <w:t>10</w:t>
-      </w:r>
-      <w:r>
-        <w:t>px;</w:t>
-      </w:r>
-    </w:p>
-    <w:p>
-      <w:r>
-        <w:rPr>
-          <w:rFonts w:ascii="Segoe UI Emoji" w:hAnsi="Segoe UI Emoji" w:cs="Segoe UI Emoji"/>
-        </w:rPr>
-        <w:t>Archivos e</w:t>
-      </w:r>
-      <w:r>
-        <w:rPr>
-          <w:rFonts w:ascii="Segoe UI Emoji" w:hAnsi="Segoe UI Emoji" w:cs="Segoe UI Emoji"/>
-        </w:rPr>
-        <w:t>jemplo</w:t>
-      </w:r>
-      <w:r>
-        <w:t>:</w:t>
-      </w:r>
-    </w:p>
-    <w:p>
-      <w:pPr>
-        <w:pStyle w:val="Prrafodelista"/>
-        <w:numPr>
-          <w:ilvl w:val="0"/>
-          <w:numId w:val="2"/>
-        </w:numPr>
-        <w:rPr>
-          <w:lang w:val="en-US"/>
-        </w:rPr>
-      </w:pPr>
-      <w:r>
-        <w:rPr>
-          <w:lang w:val="en-US"/>
-        </w:rPr>
-        <w:t>`base.css`</w:t>
-      </w:r>
-    </w:p>
-    <w:p>
-      <w:pPr>
-        <w:pStyle w:val="Prrafodelista"/>
-        <w:numPr>
-          <w:ilvl w:val="0"/>
-          <w:numId w:val="2"/>
-        </w:numPr>
-      </w:pPr>
-      <w:r>
-        <w:t>`layout.css`</w:t>
-      </w:r>
-    </w:p>
-    <w:p>
-      <w:pPr>
-        <w:pStyle w:val="Citadestacada"/>
-      </w:pPr>
+        <w:t>Lo</w:t>
+      </w:r>
       <w:r>
         <w:rPr>
           <w:rFonts w:asciiTheme="minorHAnsi" w:hAnsiTheme="minorHAnsi" w:cs="Segoe UI Emoji"/>
         </w:rPr>
-        <w:t>Lo</w:t>
+        <w:t>s archivos</w:t>
       </w:r>
       <w:r>
         <w:rPr>
           <w:rFonts w:asciiTheme="minorHAnsi" w:hAnsiTheme="minorHAnsi" w:cs="Segoe UI Emoji"/>
         </w:rPr>
-        <w:t>s archivos</w:t>
+        <w:t xml:space="preserve"> que no dependa</w:t>
       </w:r>
       <w:r>
         <w:rPr>
           <w:rFonts w:asciiTheme="minorHAnsi" w:hAnsiTheme="minorHAnsi" w:cs="Segoe UI Emoji"/>
         </w:rPr>
-        <w:t xml:space="preserve"> que no dependa</w:t>
-      </w:r>
-      <w:r>
-        <w:rPr>
-          <w:rFonts w:asciiTheme="minorHAnsi" w:hAnsiTheme="minorHAnsi" w:cs="Segoe UI Emoji"/>
-        </w:rPr>
         <w:t>n</w:t>
       </w:r>
       <w:r>
@@ -3503,12 +2678,11 @@
           <w:lang w:val="en-US"/>
         </w:rPr>
       </w:pPr>
-      <w:bookmarkStart w:id="11" w:name="_Toc230692656"/>
-      <w:r>
-        <w:rPr>
-          <w:lang w:val="en-US"/>
-        </w:rPr>
-        <w:lastRenderedPageBreak/>
+      <w:bookmarkStart w:id="6" w:name="_Toc241479886"/>
+      <w:r>
+        <w:rPr>
+          <w:lang w:val="en-US"/>
+        </w:rPr>
         <w:t>F</w:t>
       </w:r>
       <w:r>
@@ -3529,17 +2703,7 @@
         </w:rPr>
         <w:t>BASE</w:t>
       </w:r>
-      <w:bookmarkEnd w:id="11"/>
-    </w:p>
-    <w:p>
-      <w:pPr>
-        <w:pStyle w:val="Ttulo3"/>
-      </w:pPr>
-      <w:bookmarkStart w:id="12" w:name="_Toc230692657"/>
-      <w:r>
-        <w:t>Master Page</w:t>
-      </w:r>
-      <w:bookmarkEnd w:id="12"/>
+      <w:bookmarkEnd w:id="6"/>
     </w:p>
     <w:p>
       <w:pPr>
@@ -3548,9 +2712,23 @@
           <w:ilvl w:val="0"/>
           <w:numId w:val="4"/>
         </w:numPr>
-      </w:pPr>
-      <w:r>
-        <w:t>Estructura HTML limpia</w:t>
+        <w:rPr>
+          <w:lang w:val="en-US"/>
+        </w:rPr>
+      </w:pPr>
+      <w:r>
+        <w:rPr>
+          <w:lang w:val="en-US"/>
+        </w:rPr>
+        <w:t xml:space="preserve">Master Page </w:t>
+      </w:r>
+      <w:r>
+        <w:rPr>
+          <w:b/>
+          <w:bCs/>
+          <w:lang w:val="en-US"/>
+        </w:rPr>
+        <w:t>HERRIZ_theme.master</w:t>
       </w:r>
     </w:p>
     <w:p>
@@ -3560,15 +2738,9 @@
           <w:ilvl w:val="0"/>
           <w:numId w:val="4"/>
         </w:numPr>
-        <w:rPr>
-          <w:lang w:val="en-US"/>
-        </w:rPr>
-      </w:pPr>
-      <w:r>
-        <w:rPr>
-          <w:lang w:val="en-US"/>
-        </w:rPr>
-        <w:t>Referencias CSS</w:t>
+      </w:pPr>
+      <w:r>
+        <w:t>Estructura HTML limpia</w:t>
       </w:r>
     </w:p>
     <w:p>
@@ -3578,85 +2750,15 @@
           <w:ilvl w:val="0"/>
           <w:numId w:val="4"/>
         </w:numPr>
-      </w:pPr>
-      <w:r>
-        <w:t xml:space="preserve">Zonas: </w:t>
-      </w:r>
-      <w:r>
-        <w:rPr>
-          <w:b/>
-          <w:bCs/>
-        </w:rPr>
-        <w:t>header</w:t>
-      </w:r>
-      <w:r>
-        <w:t xml:space="preserve">, main, </w:t>
-      </w:r>
-      <w:r>
-        <w:rPr>
-          <w:b/>
-          <w:bCs/>
-        </w:rPr>
-        <w:t>footer</w:t>
-      </w:r>
-      <w:r>
-        <w:t xml:space="preserve"> con respectivos </w:t>
-      </w:r>
-      <w:r>
-        <w:t>componentes detallados en el Excel con el timming de desarrollo.</w:t>
-      </w:r>
-    </w:p>
-    <w:p>
-      <w:pPr>
-        <w:pStyle w:val="Ttulo2"/>
-      </w:pPr>
-      <w:bookmarkStart w:id="13" w:name="_Toc230692658"/>
-      <w:r>
-        <w:rPr>
-          <w:lang w:val="en-US"/>
-        </w:rPr>
-        <w:t>F</w:t>
-      </w:r>
-      <w:r>
-        <w:rPr>
-          <w:lang w:val="en-US"/>
-        </w:rPr>
-        <w:t>2</w:t>
-      </w:r>
-      <w:r>
-        <w:rPr>
-          <w:lang w:val="en-US"/>
-        </w:rPr>
-        <w:t xml:space="preserve"> — </w:t>
-      </w:r>
-      <w:r>
-        <w:rPr>
-          <w:rStyle w:val="Ttulo4Car"/>
-          <w:b w:val="0"/>
-          <w:bCs/>
-          <w:i w:val="0"/>
-          <w:iCs w:val="0"/>
-          <w:sz w:val="28"/>
-        </w:rPr>
-        <w:t>PILOTO</w:t>
-      </w:r>
-      <w:r>
-        <w:rPr>
-          <w:lang w:val="en-US"/>
-        </w:rPr>
-        <w:t xml:space="preserve">. </w:t>
-      </w:r>
-      <w:r>
-        <w:rPr>
-          <w:lang w:val="en-US"/>
-        </w:rPr>
-        <w:t>SharePoint Layouts</w:t>
-      </w:r>
-      <w:bookmarkEnd w:id="13"/>
-    </w:p>
-    <w:p>
-      <w:r>
-        <w:t>Existen 2 portales migrados desde producción. Se utilizarán como primer punto de ajuste:</w:t>
+        <w:rPr>
+          <w:lang w:val="en-US"/>
+        </w:rPr>
+      </w:pPr>
+      <w:r>
+        <w:rPr>
+          <w:lang w:val="en-US"/>
+        </w:rPr>
+        <w:t>Referencias CSS</w:t>
       </w:r>
     </w:p>
     <w:p>
@@ -3668,7 +2770,60 @@
         </w:numPr>
       </w:pPr>
       <w:r>
-        <w:t xml:space="preserve">Home </w:t>
+        <w:t xml:space="preserve">Zonas: </w:t>
+      </w:r>
+      <w:r>
+        <w:rPr>
+          <w:b/>
+          <w:bCs/>
+        </w:rPr>
+        <w:t>header</w:t>
+      </w:r>
+      <w:r>
+        <w:t xml:space="preserve">, main, </w:t>
+      </w:r>
+      <w:r>
+        <w:rPr>
+          <w:b/>
+          <w:bCs/>
+        </w:rPr>
+        <w:t>footer</w:t>
+      </w:r>
+      <w:r>
+        <w:t xml:space="preserve"> con respectivos </w:t>
+      </w:r>
+      <w:r>
+        <w:t>componentes detallados en el Excel con el timming de desarrollo.</w:t>
+      </w:r>
+    </w:p>
+    <w:p>
+      <w:pPr>
+        <w:pStyle w:val="Ttulo2"/>
+      </w:pPr>
+      <w:bookmarkStart w:id="7" w:name="_Toc241479888"/>
+      <w:r>
+        <w:rPr>
+          <w:lang w:val="en-US"/>
+        </w:rPr>
+        <w:t>F</w:t>
+      </w:r>
+      <w:r>
+        <w:rPr>
+          <w:lang w:val="en-US"/>
+        </w:rPr>
+        <w:t>2</w:t>
+      </w:r>
+      <w:r>
+        <w:rPr>
+          <w:lang w:val="en-US"/>
+        </w:rPr>
+        <w:t xml:space="preserve"> —SharePoint Layouts</w:t>
+      </w:r>
+      <w:bookmarkEnd w:id="7"/>
+    </w:p>
+    <w:p>
+      <w:r>
+        <w:t>Existen 2 portales migrados desde producción. Se utilizarán como primer punto de ajuste:</w:t>
       </w:r>
     </w:p>
     <w:p>
@@ -3680,7 +2835,42 @@
         </w:numPr>
       </w:pPr>
       <w:r>
-        <w:t xml:space="preserve">Listado eventos </w:t>
+        <w:t xml:space="preserve">Home </w:t>
+      </w:r>
+      <w:r>
+        <w:rPr>
+          <w:b/>
+          <w:bCs/>
+        </w:rPr>
+        <w:t>HERRIZ_home</w:t>
+      </w:r>
+    </w:p>
+    <w:p>
+      <w:pPr>
+        <w:pStyle w:val="Prrafodelista"/>
+        <w:numPr>
+          <w:ilvl w:val="0"/>
+          <w:numId w:val="4"/>
+        </w:numPr>
+      </w:pPr>
+      <w:r>
+        <w:t xml:space="preserve">Listado </w:t>
+      </w:r>
+      <w:r>
+        <w:t>bares</w:t>
+      </w:r>
+      <w:r>
+        <w:t xml:space="preserve"> </w:t>
+      </w:r>
+      <w:r>
+        <w:rPr>
+          <w:b/>
+          <w:bCs/>
+        </w:rPr>
+        <w:t xml:space="preserve">wp-v4_Bares_2026.aspx </w:t>
+      </w:r>
+      <w:r>
+        <w:t>(original 1 planteado)</w:t>
       </w:r>
     </w:p>
     <w:p>
@@ -3697,118 +2887,319 @@
     </w:p>
     <w:p>
       <w:pPr>
+        <w:pStyle w:val="Prrafodelista"/>
+        <w:numPr>
+          <w:ilvl w:val="1"/>
+          <w:numId w:val="5"/>
+        </w:numPr>
+      </w:pPr>
+      <w:r>
+        <w:t xml:space="preserve">Restaurante (nombre archivo) </w:t>
+      </w:r>
+      <w:r>
         <w:rPr>
           <w:b/>
           <w:bCs/>
         </w:rPr>
-      </w:pPr>
-      <w:r>
-        <w:t>Desde Frontend se crearán únicamente</w:t>
-      </w:r>
-      <w:r>
-        <w:t xml:space="preserve"> los</w:t>
-      </w:r>
-      <w:r>
-        <w:t xml:space="preserve"> componentes</w:t>
-      </w:r>
-      <w:r>
-        <w:t xml:space="preserve"> </w:t>
+        <w:t>turismocomer_v4_img_izq_no_menu.aspx</w:t>
+      </w:r>
+    </w:p>
+    <w:p>
+      <w:pPr>
+        <w:pStyle w:val="Prrafodelista"/>
+        <w:numPr>
+          <w:ilvl w:val="1"/>
+          <w:numId w:val="5"/>
+        </w:numPr>
+      </w:pPr>
+      <w:r>
+        <w:t xml:space="preserve">Bar (nombre archivo) </w:t>
       </w:r>
       <w:r>
         <w:rPr>
           <w:b/>
           <w:bCs/>
         </w:rPr>
-        <w:t>esenciales hasta verificar flujo de trabajo, estilos</w:t>
+        <w:t>turismobar_v4_img_izq_no_menu.aspx</w:t>
+      </w:r>
+    </w:p>
+    <w:p>
+      <w:pPr>
+        <w:pStyle w:val="Prrafodelista"/>
+        <w:numPr>
+          <w:ilvl w:val="1"/>
+          <w:numId w:val="5"/>
+        </w:numPr>
+      </w:pPr>
+      <w:r>
+        <w:t xml:space="preserve">Evento (nombre archivo) </w:t>
       </w:r>
       <w:r>
         <w:rPr>
           <w:b/>
           <w:bCs/>
         </w:rPr>
-        <w:t xml:space="preserve"> responsive, accesibilidad, test rápido</w:t>
+        <w:t>wp-v4_Eventos_2026.aspx</w:t>
+      </w:r>
+    </w:p>
+    <w:p>
+      <w:r>
+        <w:t>Desde Frontend se crearán únicamente</w:t>
+      </w:r>
+      <w:r>
+        <w:t xml:space="preserve"> los</w:t>
+      </w:r>
+      <w:r>
+        <w:t xml:space="preserve"> componentes</w:t>
+      </w:r>
+      <w:r>
+        <w:t xml:space="preserve"> </w:t>
       </w:r>
       <w:r>
         <w:rPr>
           <w:b/>
           <w:bCs/>
         </w:rPr>
-        <w:t xml:space="preserve"> etc.</w:t>
+        <w:t>esenciales hasta verificar flujo de trabajo, estilos</w:t>
       </w:r>
       <w:r>
         <w:rPr>
           <w:b/>
           <w:bCs/>
         </w:rPr>
-        <w:t xml:space="preserve"> de los componentes migrados </w:t>
-      </w:r>
-      <w:r>
-        <w:t>de producción.</w:t>
-      </w:r>
-    </w:p>
-    <w:p>
-      <w:pPr>
-        <w:pStyle w:val="Ttulo2"/>
-      </w:pPr>
-      <w:bookmarkStart w:id="14" w:name="_Toc230692659"/>
-      <w:r>
-        <w:t>F</w:t>
-      </w:r>
-      <w:r>
-        <w:t>3</w:t>
-      </w:r>
-      <w:r>
-        <w:t>—</w:t>
-      </w:r>
-      <w:r>
-        <w:t xml:space="preserve"> PROPUESTA</w:t>
-      </w:r>
-      <w:r>
-        <w:t>. Componentes y estructuras propuestas en Figma</w:t>
-      </w:r>
-      <w:bookmarkEnd w:id="14"/>
-    </w:p>
-    <w:p>
-      <w:r>
-        <w:t xml:space="preserve">Se </w:t>
-      </w:r>
-      <w:r>
-        <w:t>priorizarán</w:t>
-      </w:r>
-      <w:r>
-        <w:t xml:space="preserve"> los diferentes ítems </w:t>
-      </w:r>
-      <w:r>
-        <w:t>por</w:t>
-      </w:r>
-      <w:r>
-        <w:t xml:space="preserve"> el</w:t>
-      </w:r>
-      <w:r>
-        <w:t xml:space="preserve"> impacto</w:t>
-      </w:r>
-      <w:r>
-        <w:t>/frecuencia de uso que puedan tener en los diferentes portales.</w:t>
-      </w:r>
-    </w:p>
-    <w:p>
-      <w:pPr>
-        <w:pStyle w:val="Citadestacada"/>
-      </w:pPr>
-      <w:r>
-        <w:t xml:space="preserve">Excel </w:t>
+        <w:t xml:space="preserve"> responsive, accesibilidad, test rápido</w:t>
       </w:r>
       <w:r>
         <w:rPr>
           <w:b/>
           <w:bCs/>
         </w:rPr>
+        <w:t xml:space="preserve"> etc.</w:t>
+      </w:r>
+      <w:r>
+        <w:rPr>
+          <w:b/>
+          <w:bCs/>
+        </w:rPr>
+        <w:t xml:space="preserve"> de los componentes migrados </w:t>
+      </w:r>
+      <w:r>
+        <w:t xml:space="preserve">de </w:t>
+      </w:r>
+      <w:r>
+        <w:t>desa</w:t>
+      </w:r>
+      <w:r>
+        <w:t>.</w:t>
+      </w:r>
+    </w:p>
+    <w:p>
+      <w:pPr>
+        <w:pStyle w:val="Ttulo3"/>
+      </w:pPr>
+      <w:r>
+        <w:t>HERRIZ_home</w:t>
+      </w:r>
+    </w:p>
+    <w:p>
+      <w:r>
+        <w:rPr>
+          <w:highlight w:val="yellow"/>
+        </w:rPr>
+        <w:t>Imagen de WPZ y pequeña descripción</w:t>
+      </w:r>
+    </w:p>
+    <w:p>
+      <w:r>
+        <w:t>1 al 19</w:t>
+      </w:r>
+    </w:p>
+    <w:p>
+      <w:pPr>
+        <w:pStyle w:val="Ttulo3"/>
+      </w:pPr>
+      <w:r>
+        <w:lastRenderedPageBreak/>
+        <w:t>Listado</w:t>
+      </w:r>
+    </w:p>
+    <w:p>
+      <w:r>
+        <w:t>En</w:t>
+      </w:r>
+      <w:r>
+        <w:t xml:space="preserve"> </w:t>
+      </w:r>
+      <w:hyperlink r:id="rId18" w:history="1">
+        <w:r>
+          <w:rPr>
+            <w:rStyle w:val="Hipervnculo"/>
+          </w:rPr>
+          <w:t>http://turi.santurtzi.com/Style%20Library/Forms/AllItems.aspx</w:t>
+        </w:r>
+      </w:hyperlink>
+      <w:r>
+        <w:t xml:space="preserve"> el archivo ItemStyle</w:t>
+      </w:r>
+    </w:p>
+    <w:p>
+      <w:pPr>
+        <w:pStyle w:val="Ttulo3"/>
+      </w:pPr>
+      <w:r>
+        <w:t>Detalle Evento</w:t>
+      </w:r>
+    </w:p>
+    <w:p>
+      <w:r>
+        <w:t>turismocomer_v4_img_izq_no_menu.aspx</w:t>
+      </w:r>
+      <w:r>
+        <w:tab/>
+      </w:r>
+      <w:r>
+        <w:tab/>
+        <w:t>Detalle Restaurante</w:t>
+      </w:r>
+    </w:p>
+    <w:p>
+      <w:r>
+        <w:t>turismobar_v4_img_izq_no_menu.aspx</w:t>
+      </w:r>
+      <w:r>
+        <w:tab/>
+      </w:r>
+      <w:r>
+        <w:tab/>
+        <w:t>Detalle Bar</w:t>
+      </w:r>
+    </w:p>
+    <w:p>
+      <w:r>
+        <w:t>turismoevento_v4_no_menu.aspx</w:t>
+      </w:r>
+      <w:r>
+        <w:tab/>
+      </w:r>
+      <w:r>
+        <w:tab/>
+        <w:t>Detalle Evento</w:t>
+      </w:r>
+    </w:p>
+    <w:p>
+      <w:pPr>
+        <w:rPr>
+          <w:lang w:val="en-US"/>
+        </w:rPr>
+      </w:pPr>
+      <w:r>
+        <w:rPr>
+          <w:lang w:val="en-US"/>
+        </w:rPr>
+        <w:t>wp-v4_Bares_2026.aspx</w:t>
+      </w:r>
+      <w:r>
+        <w:rPr>
+          <w:lang w:val="en-US"/>
+        </w:rPr>
+        <w:tab/>
+        <w:t>https://turismoi.santurtzi.com/es-es/comer2026/bares/Paginas/default.aspx</w:t>
+      </w:r>
+      <w:r>
+        <w:rPr>
+          <w:lang w:val="en-US"/>
+        </w:rPr>
+        <w:tab/>
+        <w:t>Listado Bar</w:t>
+      </w:r>
+    </w:p>
+    <w:p>
+      <w:r>
+        <w:t>wp-v4_Restaurantes_2026.aspx</w:t>
+      </w:r>
+      <w:r>
+        <w:tab/>
+        <w:t>https://turismoi.santurtzi.com/es-es/comer2026/Restaurantes/Paginas/default.aspx</w:t>
+      </w:r>
+      <w:r>
+        <w:tab/>
+        <w:t>Listado Restaurante</w:t>
+      </w:r>
+    </w:p>
+    <w:p>
+      <w:r>
+        <w:t>wp-v4_Eventos_2026.aspx</w:t>
+      </w:r>
+      <w:r>
+        <w:tab/>
+        <w:t>https://turismoi.santurtzi.com/es-es/Agenda2026/Paginas/default.aspx</w:t>
+      </w:r>
+      <w:r>
+        <w:tab/>
+        <w:t>Listado Evento</w:t>
+      </w:r>
+    </w:p>
+    <w:p/>
+    <w:p>
+      <w:pPr>
+        <w:pStyle w:val="Ttulo2"/>
+      </w:pPr>
+      <w:bookmarkStart w:id="8" w:name="_Toc241479889"/>
+      <w:r>
+        <w:t>F</w:t>
+      </w:r>
+      <w:r>
+        <w:t>3</w:t>
+      </w:r>
+      <w:r>
+        <w:t>—</w:t>
+      </w:r>
+      <w:r>
+        <w:t xml:space="preserve">Componentes y estructuras </w:t>
+      </w:r>
+      <w:bookmarkEnd w:id="8"/>
+    </w:p>
+    <w:p>
+      <w:r>
+        <w:t xml:space="preserve">Se </w:t>
+      </w:r>
+      <w:r>
+        <w:t>priorizarán</w:t>
+      </w:r>
+      <w:r>
+        <w:t xml:space="preserve"> los diferentes ítems </w:t>
+      </w:r>
+      <w:r>
+        <w:t>por</w:t>
+      </w:r>
+      <w:r>
+        <w:t xml:space="preserve"> el</w:t>
+      </w:r>
+      <w:r>
+        <w:t xml:space="preserve"> impacto</w:t>
+      </w:r>
+      <w:r>
+        <w:t>/frecuencia de uso que puedan tener en los diferentes portales.</w:t>
+      </w:r>
+    </w:p>
+    <w:p>
+      <w:pPr>
+        <w:pStyle w:val="Citadestacada"/>
+      </w:pPr>
+      <w:r>
+        <w:t xml:space="preserve">Excel </w:t>
+      </w:r>
+      <w:r>
+        <w:rPr>
+          <w:b/>
+          <w:bCs/>
+        </w:rPr>
         <w:t>inventario</w:t>
       </w:r>
       <w:r>
         <w:t xml:space="preserve"> </w:t>
       </w:r>
-      <w:hyperlink r:id="rId22" w:history="1">
+      <w:hyperlink r:id="rId19" w:history="1">
         <w:r>
           <w:rPr>
             <w:rStyle w:val="Hipervnculo"/>
@@ -3822,6 +3213,7 @@
         <w:pStyle w:val="Citadestacada"/>
       </w:pPr>
       <w:r>
+        <w:lastRenderedPageBreak/>
         <w:t xml:space="preserve">Diagrama relaciones mermaid </w:t>
       </w:r>
       <w:r>
@@ -3831,251 +3223,51 @@
     <w:p>
       <w:pPr>
         <w:pStyle w:val="Ttulo3"/>
-      </w:pPr>
-      <w:bookmarkStart w:id="15" w:name="_Toc230692660"/>
-      <w:r>
-        <w:lastRenderedPageBreak/>
-        <w:t>Checklist rápido verificación</w:t>
-      </w:r>
-      <w:r>
-        <w:t xml:space="preserve"> (item)</w:t>
-      </w:r>
-      <w:r>
-        <w:t xml:space="preserve"> de ejemplo</w:t>
-      </w:r>
-      <w:bookmarkEnd w:id="15"/>
-    </w:p>
-    <w:p>
-      <w:pPr>
-        <w:pStyle w:val="Prrafodelista"/>
-        <w:numPr>
-          <w:ilvl w:val="0"/>
-          <w:numId w:val="9"/>
-        </w:numPr>
-      </w:pPr>
-      <w:r>
-        <w:t>Tiene nombre y propósito claro</w:t>
-      </w:r>
-    </w:p>
-    <w:p>
-      <w:pPr>
-        <w:pStyle w:val="Prrafodelista"/>
-        <w:numPr>
-          <w:ilvl w:val="0"/>
-          <w:numId w:val="9"/>
-        </w:numPr>
-      </w:pPr>
-      <w:r>
-        <w:t>HTML limpio (BEM)</w:t>
-      </w:r>
-    </w:p>
-    <w:p>
-      <w:pPr>
-        <w:pStyle w:val="Prrafodelista"/>
-        <w:numPr>
-          <w:ilvl w:val="0"/>
-          <w:numId w:val="9"/>
-        </w:numPr>
-      </w:pPr>
-      <w:r>
-        <w:t>No depende del layout</w:t>
-      </w:r>
-    </w:p>
-    <w:p>
-      <w:pPr>
-        <w:pStyle w:val="Prrafodelista"/>
-        <w:numPr>
-          <w:ilvl w:val="0"/>
-          <w:numId w:val="9"/>
-        </w:numPr>
-      </w:pPr>
-      <w:r>
-        <w:t>Usa variables (ejem. no colores directos)</w:t>
-      </w:r>
-    </w:p>
-    <w:p>
-      <w:pPr>
-        <w:pStyle w:val="Prrafodelista"/>
-        <w:numPr>
-          <w:ilvl w:val="0"/>
-          <w:numId w:val="9"/>
-        </w:numPr>
-      </w:pPr>
-      <w:r>
-        <w:t>Tiene variantes definidas</w:t>
-      </w:r>
-    </w:p>
-    <w:p>
-      <w:pPr>
-        <w:pStyle w:val="Prrafodelista"/>
-        <w:numPr>
-          <w:ilvl w:val="0"/>
-          <w:numId w:val="9"/>
-        </w:numPr>
-      </w:pPr>
-      <w:r>
-        <w:t>Se ha revisado en</w:t>
-      </w:r>
-      <w:r>
-        <w:t xml:space="preserve"> responsive</w:t>
-      </w:r>
-    </w:p>
-    <w:p>
-      <w:pPr>
-        <w:pStyle w:val="Prrafodelista"/>
-        <w:numPr>
-          <w:ilvl w:val="0"/>
-          <w:numId w:val="9"/>
-        </w:numPr>
-      </w:pPr>
-      <w:r>
-        <w:t>Es funcional y la maquetación es correcta</w:t>
-      </w:r>
-      <w:r>
-        <w:t xml:space="preserve"> sin contenido completo</w:t>
-      </w:r>
-    </w:p>
-    <w:p>
-      <w:pPr>
-        <w:pStyle w:val="Prrafodelista"/>
-        <w:numPr>
-          <w:ilvl w:val="0"/>
-          <w:numId w:val="9"/>
-        </w:numPr>
-      </w:pPr>
-      <w:r>
-        <w:t xml:space="preserve">No </w:t>
-      </w:r>
-      <w:r>
-        <w:t xml:space="preserve">interfiere o </w:t>
-      </w:r>
-      <w:r>
-        <w:t>rompe otros componentes</w:t>
+        <w:rPr>
+          <w:lang w:val="en-US"/>
+        </w:rPr>
+      </w:pPr>
+      <w:r>
+        <w:t>Slider → usa cards</w:t>
+      </w:r>
+    </w:p>
+    <w:p>
+      <w:pPr>
+        <w:rPr>
+          <w:lang w:val="en-US"/>
+        </w:rPr>
+      </w:pPr>
+      <w:r>
+        <w:t>xxx</w:t>
       </w:r>
     </w:p>
     <w:p>
       <w:pPr>
         <w:pStyle w:val="Ttulo3"/>
       </w:pPr>
-      <w:bookmarkStart w:id="16" w:name="_Toc230692661"/>
-      <w:r>
-        <w:t>Orden</w:t>
-      </w:r>
-      <w:bookmarkEnd w:id="16"/>
-    </w:p>
-    <w:p>
-      <w:pPr>
-        <w:rPr>
-          <w:b/>
-          <w:bCs/>
-        </w:rPr>
-      </w:pPr>
-      <w:r>
-        <w:rPr>
-          <w:b/>
-          <w:bCs/>
-        </w:rPr>
-        <w:t>Ejem</w:t>
-      </w:r>
-    </w:p>
-    <w:p>
-      <w:pPr>
-        <w:pStyle w:val="Prrafodelista"/>
-        <w:numPr>
-          <w:ilvl w:val="0"/>
-          <w:numId w:val="3"/>
-        </w:numPr>
-      </w:pPr>
-      <w:r>
-        <w:t>C</w:t>
-      </w:r>
-      <w:r>
-        <w:t>ard base → reutilizable en todo</w:t>
-      </w:r>
-    </w:p>
-    <w:p>
-      <w:pPr>
-        <w:pStyle w:val="Prrafodelista"/>
-        <w:numPr>
-          <w:ilvl w:val="0"/>
-          <w:numId w:val="3"/>
-        </w:numPr>
-        <w:rPr>
-          <w:lang w:val="en-US"/>
-        </w:rPr>
-      </w:pPr>
-      <w:r>
-        <w:t>Slider → usa cards</w:t>
-      </w:r>
-    </w:p>
-    <w:p>
-      <w:pPr>
-        <w:pStyle w:val="Prrafodelista"/>
-        <w:numPr>
-          <w:ilvl w:val="0"/>
-          <w:numId w:val="3"/>
-        </w:numPr>
-      </w:pPr>
-      <w:r>
-        <w:rPr>
-          <w:lang w:val="en-US"/>
-        </w:rPr>
+      <w:r>
+        <w:t>Card base → reutilizable en todo</w:t>
+      </w:r>
+    </w:p>
+    <w:p>
+      <w:r>
+        <w:t>Paginación de elementos (configuración WP). Nº de elementos a mostarr en listado</w:t>
+      </w:r>
+    </w:p>
+    <w:p>
+      <w:pPr>
+        <w:pStyle w:val="Ttulo3"/>
+      </w:pPr>
+      <w:r>
         <w:t>Wrapper</w:t>
       </w:r>
       <w:r>
-        <w:rPr>
-          <w:lang w:val="en-US"/>
-        </w:rPr>
         <w:t xml:space="preserve"> → branding fuerte</w:t>
       </w:r>
     </w:p>
     <w:p>
-      <w:pPr>
-        <w:pStyle w:val="Prrafodelista"/>
-        <w:numPr>
-          <w:ilvl w:val="0"/>
-          <w:numId w:val="3"/>
-        </w:numPr>
-      </w:pPr>
-      <w:r>
-        <w:t>Listado → usa cards</w:t>
-      </w:r>
-    </w:p>
-    <w:p>
-      <w:pPr>
-        <w:pStyle w:val="Prrafodelista"/>
-        <w:numPr>
-          <w:ilvl w:val="0"/>
-          <w:numId w:val="3"/>
-        </w:numPr>
-      </w:pPr>
-      <w:r>
-        <w:t>Detalle → Tabs, colapsable</w:t>
-      </w:r>
-      <w:r>
-        <w:t xml:space="preserve"> etc.</w:t>
-      </w:r>
-    </w:p>
-    <w:p>
-      <w:r>
-        <w:t>Posteriormente</w:t>
-      </w:r>
-    </w:p>
-    <w:p>
-      <w:pPr>
-        <w:pStyle w:val="Prrafodelista"/>
-        <w:numPr>
-          <w:ilvl w:val="0"/>
-          <w:numId w:val="4"/>
-        </w:numPr>
-        <w:rPr>
-          <w:b/>
-          <w:bCs/>
-          <w:color w:val="404040" w:themeColor="text1" w:themeTint="BF"/>
-        </w:rPr>
-      </w:pPr>
-      <w:r>
-        <w:t>components.css</w:t>
+      <w:r>
+        <w:t>xxx</w:t>
       </w:r>
     </w:p>
     <w:p>
@@ -4173,14 +3365,14 @@
           <w:lang w:val="en-US"/>
         </w:rPr>
       </w:pPr>
-      <w:bookmarkStart w:id="17" w:name="_Toc230692662"/>
+      <w:bookmarkStart w:id="9" w:name="_Toc241479892"/>
       <w:r>
         <w:rPr>
           <w:lang w:val="en-US"/>
         </w:rPr>
         <w:t>F4 — Theming (multi-ayuntamiento)</w:t>
       </w:r>
-      <w:bookmarkEnd w:id="17"/>
+      <w:bookmarkEnd w:id="9"/>
     </w:p>
     <w:p>
       <w:r>
@@ -4263,7 +3455,6 @@
         </w:numPr>
       </w:pPr>
       <w:r>
-        <w:lastRenderedPageBreak/>
         <w:t>Color primario, secundario, acento e</w:t>
       </w:r>
       <w:r>
@@ -4416,6 +3607,7 @@
         <w:rPr>
           <w:lang w:val="en-US"/>
         </w:rPr>
+        <w:lastRenderedPageBreak/>
         <w:t>$secondary</w:t>
       </w:r>
     </w:p>
@@ -4585,7 +3777,7 @@
       <w:pPr>
         <w:pStyle w:val="Citadestacada"/>
       </w:pPr>
-      <w:commentRangeStart w:id="18"/>
+      <w:commentRangeStart w:id="10"/>
       <w:r>
         <w:t>1 theme completo validado</w:t>
       </w:r>
@@ -4601,28 +3793,28 @@
       <w:r>
         <w:t>patrón replicable</w:t>
       </w:r>
-      <w:commentRangeEnd w:id="18"/>
+      <w:commentRangeEnd w:id="10"/>
       <w:r>
         <w:rPr>
           <w:rStyle w:val="Refdecomentario"/>
           <w:sz w:val="19"/>
           <w:szCs w:val="22"/>
         </w:rPr>
-        <w:commentReference w:id="18"/>
+        <w:commentReference w:id="10"/>
       </w:r>
     </w:p>
     <w:p>
       <w:pPr>
         <w:pStyle w:val="Ttulo2"/>
       </w:pPr>
-      <w:bookmarkStart w:id="19" w:name="_Toc230692663"/>
+      <w:bookmarkStart w:id="11" w:name="_Toc241479893"/>
       <w:r>
         <w:t xml:space="preserve">F5 — </w:t>
       </w:r>
       <w:r>
         <w:t>VARIANTES DETALLES</w:t>
       </w:r>
-      <w:bookmarkEnd w:id="19"/>
+      <w:bookmarkEnd w:id="11"/>
     </w:p>
     <w:p>
       <w:r>
@@ -4638,25 +3830,24 @@
       <w:pPr>
         <w:pStyle w:val="Ttulo2"/>
       </w:pPr>
-      <w:bookmarkStart w:id="20" w:name="_Toc230692664"/>
-      <w:r>
-        <w:lastRenderedPageBreak/>
+      <w:bookmarkStart w:id="12" w:name="_Toc241479894"/>
+      <w:r>
         <w:t xml:space="preserve">F6 — </w:t>
       </w:r>
       <w:r>
         <w:t>QA + documentación</w:t>
       </w:r>
-      <w:bookmarkEnd w:id="20"/>
+      <w:bookmarkEnd w:id="12"/>
     </w:p>
     <w:p>
       <w:pPr>
         <w:pStyle w:val="Ttulo3"/>
       </w:pPr>
-      <w:bookmarkStart w:id="21" w:name="_Toc230692665"/>
+      <w:bookmarkStart w:id="13" w:name="_Toc241479895"/>
       <w:r>
         <w:t>QA</w:t>
       </w:r>
-      <w:bookmarkEnd w:id="21"/>
+      <w:bookmarkEnd w:id="13"/>
     </w:p>
     <w:p>
       <w:r>
@@ -4674,7 +3865,7 @@
       <w:r>
         <w:t>A</w:t>
       </w:r>
-      <w:commentRangeStart w:id="22"/>
+      <w:commentRangeStart w:id="14"/>
       <w:r>
         <w:t xml:space="preserve">ccesibilidad </w:t>
       </w:r>
@@ -4708,14 +3899,14 @@
       <w:r>
         <w:t>onsistencia visual</w:t>
       </w:r>
-      <w:commentRangeEnd w:id="22"/>
+      <w:commentRangeEnd w:id="14"/>
       <w:r>
         <w:rPr>
           <w:rStyle w:val="Refdecomentario"/>
           <w:sz w:val="19"/>
           <w:szCs w:val="22"/>
         </w:rPr>
-        <w:commentReference w:id="22"/>
+        <w:commentReference w:id="14"/>
       </w:r>
     </w:p>
     <w:p>
@@ -4745,14 +3936,14 @@
           <w:rStyle w:val="Ttulo3Car"/>
         </w:rPr>
       </w:pPr>
-      <w:bookmarkStart w:id="23" w:name="_Toc230692666"/>
+      <w:bookmarkStart w:id="15" w:name="_Toc241479896"/>
       <w:r>
         <w:rPr>
           <w:rStyle w:val="Ttulo3Car"/>
         </w:rPr>
         <w:t>Documentación mínima imprescindible</w:t>
       </w:r>
-      <w:bookmarkEnd w:id="23"/>
+      <w:bookmarkEnd w:id="15"/>
     </w:p>
     <w:p>
       <w:r>
@@ -4939,9 +4130,11 @@
       <w:pPr>
         <w:pStyle w:val="Ttulo1"/>
       </w:pPr>
+      <w:bookmarkStart w:id="16" w:name="_Toc241479897"/>
       <w:r>
         <w:t>Notas proceso</w:t>
       </w:r>
+      <w:bookmarkEnd w:id="16"/>
     </w:p>
     <w:p>
       <w:pPr>
@@ -5005,10 +4198,9 @@
     </w:p>
     <w:p>
       <w:r>
-        <w:lastRenderedPageBreak/>
         <w:t xml:space="preserve">Los archivos old están en </w:t>
       </w:r>
-      <w:hyperlink r:id="rId23" w:history="1">
+      <w:hyperlink r:id="rId24" w:history="1">
         <w:r>
           <w:rPr>
             <w:rStyle w:val="Hipervnculo"/>
@@ -5082,6 +4274,7 @@
         <w:rPr>
           <w:lang w:val="en-US"/>
         </w:rPr>
+        <w:lastRenderedPageBreak/>
         <w:t>/ styles/</w:t>
       </w:r>
     </w:p>
@@ -5106,6 +4299,7 @@
       </w:pPr>
       <w:r>
         <w:rPr>
+          <w:noProof/>
           <w:lang w:val="en-US"/>
         </w:rPr>
         <w:drawing>
@@ -5124,7 +4318,7 @@
                     <pic:cNvPicPr/>
                   </pic:nvPicPr>
                   <pic:blipFill>
-                    <a:blip r:embed="rId24"/>
+                    <a:blip r:embed="rId25"/>
                     <a:stretch>
                       <a:fillRect/>
                     </a:stretch>
@@ -5155,13 +4349,7 @@
         <w:rPr>
           <w:lang w:val="en-US"/>
         </w:rPr>
-        <w:t xml:space="preserve">En la version de turismo creada una carpeta similar </w:t>
-      </w:r>
-      <w:r>
-        <w:rPr>
-          <w:lang w:val="en-US"/>
-        </w:rPr>
-        <w:t>C:\Program Files\Common Files\Microsoft Shared\Web Server Extentions\16\TEMPLATE\LAYOUTS\Turismo2013.Files</w:t>
+        <w:t>En la version de turismo creada una carpeta similar C:\Program Files\Common Files\Microsoft Shared\Web Server Extentions\16\TEMPLATE\LAYOUTS\Turismo2013.Files</w:t>
       </w:r>
     </w:p>
     <w:p>
@@ -5251,7 +4439,6 @@
         <w:rPr>
           <w:lang w:val="en-US"/>
         </w:rPr>
-        <w:lastRenderedPageBreak/>
         <w:t>variables</w:t>
       </w:r>
     </w:p>
@@ -5468,13 +4655,14 @@
         <w:rPr>
           <w:lang w:val="en-US"/>
         </w:rPr>
+        <w:lastRenderedPageBreak/>
         <w:t>assets</w:t>
       </w:r>
     </w:p>
     <w:sectPr>
-      <w:footerReference w:type="default" r:id="rId25"/>
-      <w:headerReference w:type="first" r:id="rId26"/>
-      <w:footerReference w:type="first" r:id="rId27"/>
+      <w:footerReference w:type="default" r:id="rId26"/>
+      <w:headerReference w:type="first" r:id="rId27"/>
+      <w:footerReference w:type="first" r:id="rId28"/>
       <w:pgSz w:w="11906" w:h="16838" w:code="9"/>
       <w:pgMar w:top="3459" w:right="1418" w:bottom="1985" w:left="1418" w:header="680" w:footer="340" w:gutter="0"/>
       <w:cols w:space="708"/>
@@ -5486,7 +4674,7 @@
 
 <file path=word/comments.xml><?xml version="1.0" encoding="utf-8"?>
 <w:comments xmlns:wpc="http://schemas.microsoft.com/office/word/2010/wordprocessingCanvas" xmlns:cx="http://schemas.microsoft.com/office/drawing/2014/chartex" xmlns:cx1="http://schemas.microsoft.com/office/drawing/2015/9/8/chartex" xmlns:cx2="http://schemas.microsoft.com/office/drawing/2015/10/21/chartex" xmlns:cx3="http://schemas.microsoft.com/office/drawing/2016/5/9/chartex" xmlns:cx4="http://schemas.microsoft.com/office/drawing/2016/5/10/chartex" xmlns:cx5="http://schemas.microsoft.com/office/drawing/2016/5/11/chartex" xmlns:cx6="http://schemas.microsoft.com/office/drawing/2016/5/12/chartex" xmlns:cx7="http://schemas.microsoft.com/office/drawing/2016/5/13/chartex" xmlns:cx8="http://schemas.microsoft.com/office/drawing/2016/5/14/chartex" xmlns:mc="http://schemas.openxmlformats.org/markup-compatibility/2006" xmlns:aink="http://schemas.microsoft.com/office/drawing/2016/ink" xmlns:am3d="http://schemas.microsoft.com/office/drawing/2017/model3d" xmlns:o="urn:schemas-microsoft-com:office:office" xmlns:oel="http://schemas.microsoft.com/office/2019/extlst" xmlns:r="http://schemas.openxmlformats.org/officeDocument/2006/relationships" xmlns:m="http://schemas.openxmlformats.org/officeDocument/2006/math" xmlns:v="urn:schemas-microsoft-com:vml" xmlns:wp14="http://schemas.microsoft.com/office/word/2010/wordprocessingDrawing" xmlns:wp="http://schemas.openxmlformats.org/drawingml/2006/wordprocessingDrawing" xmlns:w10="urn:schemas-microsoft-com:office:word" xmlns:w="http://schemas.openxmlformats.org/wordprocessingml/2006/main" xmlns:w14="http://schemas.microsoft.com/office/word/2010/wordml" xmlns:w15="http://schemas.microsoft.com/office/word/2012/wordml" xmlns:w16cex="http://schemas.microsoft.com/office/word/2018/wordml/cex" xmlns:w16cid="http://schemas.microsoft.com/office/word/2016/wordml/cid" xmlns:w16="http://schemas.microsoft.com/office/word/2018/wordml" xmlns:w16du="http://schemas.microsoft.com/office/word/2023/wordml/word16du" xmlns:w16sdtdh="http://schemas.microsoft.com/office/word/2020/wordml/sdtdatahash" xmlns:w16sdtfl="http://schemas.microsoft.com/office/word/2024/wordml/sdtformatlock" xmlns:w16se="http://schemas.microsoft.com/office/word/2015/wordml/symex" xmlns:wpg="http://schemas.microsoft.com/office/word/2010/wordprocessingGroup" xmlns:wpi="http://schemas.microsoft.com/office/word/2010/wordprocessingInk" xmlns:wne="http://schemas.microsoft.com/office/word/2006/wordml" xmlns:wps="http://schemas.microsoft.com/office/word/2010/wordprocessingShape" mc:Ignorable="w14 w15 w16se w16cid w16 w16cex w16sdtdh w16sdtfl w16du wp14">
-  <w:comment w:id="9" w:author="Susana Garcia Antolin" w:date="2026-05-13T11:15:00Z" w:initials="SG">
+  <w:comment w:id="10" w:author="Susana Garcia Antolin" w:date="2026-05-18T08:31:00Z" w:initials="SG">
     <w:p>
       <w:pPr>
         <w:pStyle w:val="Textocomentario"/>
@@ -5499,28 +4687,11 @@
         <w:annotationRef/>
       </w:r>
       <w:r>
-        <w:t>LESS nativo de SharePoint o podéis usar SASS con build externo</w:t>
+        <w:t>En qué puntos definimos entregables?</w:t>
       </w:r>
     </w:p>
   </w:comment>
-  <w:comment w:id="18" w:author="Susana Garcia Antolin" w:date="2026-05-18T08:31:00Z" w:initials="SG">
-    <w:p>
-      <w:pPr>
-        <w:pStyle w:val="Textocomentario"/>
-        <w:jc w:val="left"/>
-      </w:pPr>
-      <w:r>
-        <w:rPr>
-          <w:rStyle w:val="Refdecomentario"/>
-        </w:rPr>
-        <w:annotationRef/>
-      </w:r>
-      <w:r>
-        <w:t>En qué puntos definimos entregables?</w:t>
-      </w:r>
-    </w:p>
-  </w:comment>
-  <w:comment w:id="22" w:author="Susana Garcia Antolin" w:date="2026-05-18T08:34:00Z" w:initials="SG">
+  <w:comment w:id="14" w:author="Susana Garcia Antolin" w:date="2026-05-18T08:34:00Z" w:initials="SG">
     <w:p>
       <w:pPr>
         <w:pStyle w:val="Textocomentario"/>
@@ -5559,7 +4730,6 @@
 
 <file path=word/commentsExtended.xml><?xml version="1.0" encoding="utf-8"?>
 <w15:commentsEx xmlns:wpc="http://schemas.microsoft.com/office/word/2010/wordprocessingCanvas" xmlns:cx="http://schemas.microsoft.com/office/drawing/2014/chartex" xmlns:cx1="http://schemas.microsoft.com/office/drawing/2015/9/8/chartex" xmlns:cx2="http://schemas.microsoft.com/office/drawing/2015/10/21/chartex" xmlns:cx3="http://schemas.microsoft.com/office/drawing/2016/5/9/chartex" xmlns:cx4="http://schemas.microsoft.com/office/drawing/2016/5/10/chartex" xmlns:cx5="http://schemas.microsoft.com/office/drawing/2016/5/11/chartex" xmlns:cx6="http://schemas.microsoft.com/office/drawing/2016/5/12/chartex" xmlns:cx7="http://schemas.microsoft.com/office/drawing/2016/5/13/chartex" xmlns:cx8="http://schemas.microsoft.com/office/drawing/2016/5/14/chartex" xmlns:mc="http://schemas.openxmlformats.org/markup-compatibility/2006" xmlns:aink="http://schemas.microsoft.com/office/drawing/2016/ink" xmlns:am3d="http://schemas.microsoft.com/office/drawing/2017/model3d" xmlns:o="urn:schemas-microsoft-com:office:office" xmlns:oel="http://schemas.microsoft.com/office/2019/extlst" xmlns:r="http://schemas.openxmlformats.org/officeDocument/2006/relationships" xmlns:m="http://schemas.openxmlformats.org/officeDocument/2006/math" xmlns:v="urn:schemas-microsoft-com:vml" xmlns:wp14="http://schemas.microsoft.com/office/word/2010/wordprocessingDrawing" xmlns:wp="http://schemas.openxmlformats.org/drawingml/2006/wordprocessingDrawing" xmlns:w10="urn:schemas-microsoft-com:office:word" xmlns:w="http://schemas.openxmlformats.org/wordprocessingml/2006/main" xmlns:w14="http://schemas.microsoft.com/office/word/2010/wordml" xmlns:w15="http://schemas.microsoft.com/office/word/2012/wordml" xmlns:w16cex="http://schemas.microsoft.com/office/word/2018/wordml/cex" xmlns:w16cid="http://schemas.microsoft.com/office/word/2016/wordml/cid" xmlns:w16="http://schemas.microsoft.com/office/word/2018/wordml" xmlns:w16du="http://schemas.microsoft.com/office/word/2023/wordml/word16du" xmlns:w16sdtdh="http://schemas.microsoft.com/office/word/2020/wordml/sdtdatahash" xmlns:w16sdtfl="http://schemas.microsoft.com/office/word/2024/wordml/sdtformatlock" xmlns:w16se="http://schemas.microsoft.com/office/word/2015/wordml/symex" xmlns:wpg="http://schemas.microsoft.com/office/word/2010/wordprocessingGroup" xmlns:wpi="http://schemas.microsoft.com/office/word/2010/wordprocessingInk" xmlns:wne="http://schemas.microsoft.com/office/word/2006/wordml" xmlns:wps="http://schemas.microsoft.com/office/word/2010/wordprocessingShape" mc:Ignorable="w14 w15 w16se w16cid w16 w16cex w16sdtdh w16sdtfl w16du wp14">
-  <w15:commentEx w15:paraId="2C815AE9" w15:done="0"/>
   <w15:commentEx w15:paraId="4EBBA374" w15:done="0"/>
   <w15:commentEx w15:paraId="38A6A896" w15:done="0"/>
 </w15:commentsEx>
@@ -5567,7 +4737,6 @@
 
 <file path=word/commentsExtensible.xml><?xml version="1.0" encoding="utf-8"?>
 <w16cex:commentsExtensible xmlns:wpc="http://schemas.microsoft.com/office/word/2010/wordprocessingCanvas" xmlns:cx="http://schemas.microsoft.com/office/drawing/2014/chartex" xmlns:cx1="http://schemas.microsoft.com/office/drawing/2015/9/8/chartex" xmlns:cx2="http://schemas.microsoft.com/office/drawing/2015/10/21/chartex" xmlns:cx3="http://schemas.microsoft.com/office/drawing/2016/5/9/chartex" xmlns:cx4="http://schemas.microsoft.com/office/drawing/2016/5/10/chartex" xmlns:cx5="http://schemas.microsoft.com/office/drawing/2016/5/11/chartex" xmlns:cx6="http://schemas.microsoft.com/office/drawing/2016/5/12/chartex" xmlns:cx7="http://schemas.microsoft.com/office/drawing/2016/5/13/chartex" xmlns:cx8="http://schemas.microsoft.com/office/drawing/2016/5/14/chartex" xmlns:cr="http://schemas.microsoft.com/office/comments/2020/reactions" xmlns:mc="http://schemas.openxmlformats.org/markup-compatibility/2006" xmlns:aink="http://schemas.microsoft.com/office/drawing/2016/ink" xmlns:am3d="http://schemas.microsoft.com/office/drawing/2017/model3d" xmlns:o="urn:schemas-microsoft-com:office:office" xmlns:oel="http://schemas.microsoft.com/office/2019/extlst" xmlns:r="http://schemas.openxmlformats.org/officeDocument/2006/relationships" xmlns:m="http://schemas.openxmlformats.org/officeDocument/2006/math" xmlns:v="urn:schemas-microsoft-com:vml" xmlns:wp14="http://schemas.microsoft.com/office/word/2010/wordprocessingDrawing" xmlns:wp="http://schemas.openxmlformats.org/drawingml/2006/wordprocessingDrawing" xmlns:w10="urn:schemas-microsoft-com:office:word" xmlns:w="http://schemas.openxmlformats.org/wordprocessingml/2006/main" xmlns:w14="http://schemas.microsoft.com/office/word/2010/wordml" xmlns:w15="http://schemas.microsoft.com/office/word/2012/wordml" xmlns:w16cex="http://schemas.microsoft.com/office/word/2018/wordml/cex" xmlns:w16cid="http://schemas.microsoft.com/office/word/2016/wordml/cid" xmlns:w16="http://schemas.microsoft.com/office/word/2018/wordml" xmlns:w16du="http://schemas.microsoft.com/office/word/2023/wordml/word16du" xmlns:w16sdtdh="http://schemas.microsoft.com/office/word/2020/wordml/sdtdatahash" xmlns:w16sdtfl="http://schemas.microsoft.com/office/word/2024/wordml/sdtformatlock" xmlns:w16se="http://schemas.microsoft.com/office/word/2015/wordml/symex" xmlns:wpg="http://schemas.microsoft.com/office/word/2010/wordprocessingGroup" xmlns:wpi="http://schemas.microsoft.com/office/word/2010/wordprocessingInk" xmlns:wne="http://schemas.microsoft.com/office/word/2006/wordml" xmlns:wps="http://schemas.microsoft.com/office/word/2010/wordprocessingShape" mc:Ignorable="w14 w15 w16se w16cid w16 w16cex w16sdtdh w16sdtfl cr w16du wp14">
-  <w16cex:commentExtensible w16cex:durableId="65ED93BC" w16cex:dateUtc="2026-05-13T09:15:00Z"/>
   <w16cex:commentExtensible w16cex:durableId="6DE7BCD2" w16cex:dateUtc="2026-05-18T06:31:00Z"/>
   <w16cex:commentExtensible w16cex:durableId="2DF58F89" w16cex:dateUtc="2026-05-18T06:34:00Z"/>
 </w16cex:commentsExtensible>
@@ -5575,7 +4744,6 @@
 
 <file path=word/commentsIds.xml><?xml version="1.0" encoding="utf-8"?>
 <w16cid:commentsIds xmlns:wpc="http://schemas.microsoft.com/office/word/2010/wordprocessingCanvas" xmlns:cx="http://schemas.microsoft.com/office/drawing/2014/chartex" xmlns:cx1="http://schemas.microsoft.com/office/drawing/2015/9/8/chartex" xmlns:cx2="http://schemas.microsoft.com/office/drawing/2015/10/21/chartex" xmlns:cx3="http://schemas.microsoft.com/office/drawing/2016/5/9/chartex" xmlns:cx4="http://schemas.microsoft.com/office/drawing/2016/5/10/chartex" xmlns:cx5="http://schemas.microsoft.com/office/drawing/2016/5/11/chartex" xmlns:cx6="http://schemas.microsoft.com/office/drawing/2016/5/12/chartex" xmlns:cx7="http://schemas.microsoft.com/office/drawing/2016/5/13/chartex" xmlns:cx8="http://schemas.microsoft.com/office/drawing/2016/5/14/chartex" xmlns:mc="http://schemas.openxmlformats.org/markup-compatibility/2006" xmlns:aink="http://schemas.microsoft.com/office/drawing/2016/ink" xmlns:am3d="http://schemas.microsoft.com/office/drawing/2017/model3d" xmlns:o="urn:schemas-microsoft-com:office:office" xmlns:oel="http://schemas.microsoft.com/office/2019/extlst" xmlns:r="http://schemas.openxmlformats.org/officeDocument/2006/relationships" xmlns:m="http://schemas.openxmlformats.org/officeDocument/2006/math" xmlns:v="urn:schemas-microsoft-com:vml" xmlns:wp14="http://schemas.microsoft.com/office/word/2010/wordprocessingDrawing" xmlns:wp="http://schemas.openxmlformats.org/drawingml/2006/wordprocessingDrawing" xmlns:w10="urn:schemas-microsoft-com:office:word" xmlns:w="http://schemas.openxmlformats.org/wordprocessingml/2006/main" xmlns:w14="http://schemas.microsoft.com/office/word/2010/wordml" xmlns:w15="http://schemas.microsoft.com/office/word/2012/wordml" xmlns:w16cex="http://schemas.microsoft.com/office/word/2018/wordml/cex" xmlns:w16cid="http://schemas.microsoft.com/office/word/2016/wordml/cid" xmlns:w16="http://schemas.microsoft.com/office/word/2018/wordml" xmlns:w16du="http://schemas.microsoft.com/office/word/2023/wordml/word16du" xmlns:w16sdtdh="http://schemas.microsoft.com/office/word/2020/wordml/sdtdatahash" xmlns:w16sdtfl="http://schemas.microsoft.com/office/word/2024/wordml/sdtformatlock" xmlns:w16se="http://schemas.microsoft.com/office/word/2015/wordml/symex" xmlns:wpg="http://schemas.microsoft.com/office/word/2010/wordprocessingGroup" xmlns:wpi="http://schemas.microsoft.com/office/word/2010/wordprocessingInk" xmlns:wne="http://schemas.microsoft.com/office/word/2006/wordml" xmlns:wps="http://schemas.microsoft.com/office/word/2010/wordprocessingShape" mc:Ignorable="w14 w15 w16se w16cid w16 w16cex w16sdtdh w16sdtfl w16du wp14">
-  <w16cid:commentId w16cid:paraId="2C815AE9" w16cid:durableId="65ED93BC"/>
   <w16cid:commentId w16cid:paraId="4EBBA374" w16cid:durableId="6DE7BCD2"/>
   <w16cid:commentId w16cid:paraId="38A6A896" w16cid:durableId="2DF58F89"/>
 </w16cid:commentsIds>
@@ -5712,7 +4880,7 @@
           <w:szCs w:val="19"/>
           <w:lang w:eastAsia="es-ES"/>
         </w:rPr>
-        <w:t>05/06/2026</w:t>
+        <w:t>30/09/2026</w:t>
       </w:r>
     </w:fldSimple>
     <w:r>
@@ -5909,7 +5077,7 @@
               <w:rPr>
                 <w:rFonts w:eastAsiaTheme="minorEastAsia" w:cs="Times New Roman"/>
               </w:rPr>
-              <w:t>05/06/2026</w:t>
+              <w:t>30/09/2026</w:t>
             </w:r>
           </w:fldSimple>
         </w:p>
@@ -6154,7 +5322,7 @@
               <w:rPr>
                 <w:rFonts w:eastAsiaTheme="minorEastAsia" w:cs="Times New Roman"/>
               </w:rPr>
-              <w:t>05/06/2026</w:t>
+              <w:t>30/09/2026</w:t>
             </w:r>
           </w:fldSimple>
         </w:p>
@@ -8923,6 +8091,118 @@
     </w:lvl>
   </w:abstractNum>
   <w:abstractNum w:abstractNumId="9" w15:restartNumberingAfterBreak="0">
+    <w:nsid w:val="4C5D4087"/>
+    <w:multiLevelType w:val="hybridMultilevel"/>
+    <w:tmpl w:val="F8DE22C0"/>
+    <w:lvl w:ilvl="0" w:tplc="4BFA44D4">
+      <w:numFmt w:val="bullet"/>
+      <w:lvlText w:val="-"/>
+      <w:lvlJc w:val="left"/>
+      <w:pPr>
+        <w:ind w:left="720" w:hanging="360"/>
+      </w:pPr>
+      <w:rPr>
+        <w:rFonts w:ascii="Lato Light" w:eastAsiaTheme="minorHAnsi" w:hAnsi="Lato Light" w:cstheme="minorBidi" w:hint="default"/>
+      </w:rPr>
+    </w:lvl>
+    <w:lvl w:ilvl="1" w:tplc="0C0A0003" w:tentative="1">
+      <w:start w:val="1"/>
+      <w:numFmt w:val="bullet"/>
+      <w:lvlText w:val="o"/>
+      <w:lvlJc w:val="left"/>
+      <w:pPr>
+        <w:ind w:left="1440" w:hanging="360"/>
+      </w:pPr>
+      <w:rPr>
+        <w:rFonts w:ascii="Courier New" w:hAnsi="Courier New" w:cs="Courier New" w:hint="default"/>
+      </w:rPr>
+    </w:lvl>
+    <w:lvl w:ilvl="2" w:tplc="0C0A0005" w:tentative="1">
+      <w:start w:val="1"/>
+      <w:numFmt w:val="bullet"/>
+      <w:lvlText w:val=""/>
+      <w:lvlJc w:val="left"/>
+      <w:pPr>
+        <w:ind w:left="2160" w:hanging="360"/>
+      </w:pPr>
+      <w:rPr>
+        <w:rFonts w:ascii="Wingdings" w:hAnsi="Wingdings" w:hint="default"/>
+      </w:rPr>
+    </w:lvl>
+    <w:lvl w:ilvl="3" w:tplc="0C0A0001" w:tentative="1">
+      <w:start w:val="1"/>
+      <w:numFmt w:val="bullet"/>
+      <w:lvlText w:val=""/>
+      <w:lvlJc w:val="left"/>
+      <w:pPr>
+        <w:ind w:left="2880" w:hanging="360"/>
+      </w:pPr>
+      <w:rPr>
+        <w:rFonts w:ascii="Symbol" w:hAnsi="Symbol" w:hint="default"/>
+      </w:rPr>
+    </w:lvl>
+    <w:lvl w:ilvl="4" w:tplc="0C0A0003" w:tentative="1">
+      <w:start w:val="1"/>
+      <w:numFmt w:val="bullet"/>
+      <w:lvlText w:val="o"/>
+      <w:lvlJc w:val="left"/>
+      <w:pPr>
+        <w:ind w:left="3600" w:hanging="360"/>
+      </w:pPr>
+      <w:rPr>
+        <w:rFonts w:ascii="Courier New" w:hAnsi="Courier New" w:cs="Courier New" w:hint="default"/>
+      </w:rPr>
+    </w:lvl>
+    <w:lvl w:ilvl="5" w:tplc="0C0A0005" w:tentative="1">
+      <w:start w:val="1"/>
+      <w:numFmt w:val="bullet"/>
+      <w:lvlText w:val=""/>
+      <w:lvlJc w:val="left"/>
+      <w:pPr>
+        <w:ind w:left="4320" w:hanging="360"/>
+      </w:pPr>
+      <w:rPr>
+        <w:rFonts w:ascii="Wingdings" w:hAnsi="Wingdings" w:hint="default"/>
+      </w:rPr>
+    </w:lvl>
+    <w:lvl w:ilvl="6" w:tplc="0C0A0001" w:tentative="1">
+      <w:start w:val="1"/>
+      <w:numFmt w:val="bullet"/>
+      <w:lvlText w:val=""/>
+      <w:lvlJc w:val="left"/>
+      <w:pPr>
+        <w:ind w:left="5040" w:hanging="360"/>
+      </w:pPr>
+      <w:rPr>
+        <w:rFonts w:ascii="Symbol" w:hAnsi="Symbol" w:hint="default"/>
+      </w:rPr>
+    </w:lvl>
+    <w:lvl w:ilvl="7" w:tplc="0C0A0003" w:tentative="1">
+      <w:start w:val="1"/>
+      <w:numFmt w:val="bullet"/>
+      <w:lvlText w:val="o"/>
+      <w:lvlJc w:val="left"/>
+      <w:pPr>
+        <w:ind w:left="5760" w:hanging="360"/>
+      </w:pPr>
+      <w:rPr>
+        <w:rFonts w:ascii="Courier New" w:hAnsi="Courier New" w:cs="Courier New" w:hint="default"/>
+      </w:rPr>
+    </w:lvl>
+    <w:lvl w:ilvl="8" w:tplc="0C0A0005" w:tentative="1">
+      <w:start w:val="1"/>
+      <w:numFmt w:val="bullet"/>
+      <w:lvlText w:val=""/>
+      <w:lvlJc w:val="left"/>
+      <w:pPr>
+        <w:ind w:left="6480" w:hanging="360"/>
+      </w:pPr>
+      <w:rPr>
+        <w:rFonts w:ascii="Wingdings" w:hAnsi="Wingdings" w:hint="default"/>
+      </w:rPr>
+    </w:lvl>
+  </w:abstractNum>
+  <w:abstractNum w:abstractNumId="10" w15:restartNumberingAfterBreak="0">
     <w:nsid w:val="51E46256"/>
     <w:multiLevelType w:val="hybridMultilevel"/>
     <w:tmpl w:val="724AFB76"/>
@@ -9035,7 +8315,7 @@
       </w:rPr>
     </w:lvl>
   </w:abstractNum>
-  <w:abstractNum w:abstractNumId="10" w15:restartNumberingAfterBreak="0">
+  <w:abstractNum w:abstractNumId="11" w15:restartNumberingAfterBreak="0">
     <w:nsid w:val="54B43237"/>
     <w:multiLevelType w:val="hybridMultilevel"/>
     <w:tmpl w:val="033A1E16"/>
@@ -9124,7 +8404,7 @@
       </w:pPr>
     </w:lvl>
   </w:abstractNum>
-  <w:abstractNum w:abstractNumId="11" w15:restartNumberingAfterBreak="0">
+  <w:abstractNum w:abstractNumId="12" w15:restartNumberingAfterBreak="0">
     <w:nsid w:val="62E53778"/>
     <w:multiLevelType w:val="hybridMultilevel"/>
     <w:tmpl w:val="A4C464E8"/>
@@ -9140,7 +8420,7 @@
         <w:rFonts w:ascii="Symbol" w:hAnsi="Symbol" w:hint="default"/>
       </w:rPr>
     </w:lvl>
-    <w:lvl w:ilvl="1" w:tplc="0C0A0003" w:tentative="1">
+    <w:lvl w:ilvl="1" w:tplc="0C0A0003">
       <w:start w:val="1"/>
       <w:numFmt w:val="bullet"/>
       <w:lvlText w:val="o"/>
@@ -9152,7 +8432,7 @@
         <w:rFonts w:ascii="Courier New" w:hAnsi="Courier New" w:cs="Courier New" w:hint="default"/>
       </w:rPr>
     </w:lvl>
-    <w:lvl w:ilvl="2" w:tplc="0C0A0005" w:tentative="1">
+    <w:lvl w:ilvl="2" w:tplc="0C0A0005">
       <w:start w:val="1"/>
       <w:numFmt w:val="bullet"/>
       <w:lvlText w:val=""/>
@@ -9237,7 +8517,7 @@
       </w:rPr>
     </w:lvl>
   </w:abstractNum>
-  <w:abstractNum w:abstractNumId="12" w15:restartNumberingAfterBreak="0">
+  <w:abstractNum w:abstractNumId="13" w15:restartNumberingAfterBreak="0">
     <w:nsid w:val="6C764B86"/>
     <w:multiLevelType w:val="multilevel"/>
     <w:tmpl w:val="6C44C6BA"/>
@@ -9360,7 +8640,7 @@
       </w:rPr>
     </w:lvl>
   </w:abstractNum>
-  <w:abstractNum w:abstractNumId="13" w15:restartNumberingAfterBreak="0">
+  <w:abstractNum w:abstractNumId="14" w15:restartNumberingAfterBreak="0">
     <w:nsid w:val="73845B9B"/>
     <w:multiLevelType w:val="hybridMultilevel"/>
     <w:tmpl w:val="2020E5F0"/>
@@ -9473,10 +8753,122 @@
       </w:rPr>
     </w:lvl>
   </w:abstractNum>
-  <w:abstractNum w:abstractNumId="14" w15:restartNumberingAfterBreak="0">
+  <w:abstractNum w:abstractNumId="15" w15:restartNumberingAfterBreak="0">
+    <w:nsid w:val="76916FBC"/>
+    <w:multiLevelType w:val="hybridMultilevel"/>
+    <w:tmpl w:val="3A74DA26"/>
+    <w:lvl w:ilvl="0" w:tplc="BAF617CC">
+      <w:numFmt w:val="bullet"/>
+      <w:lvlText w:val="-"/>
+      <w:lvlJc w:val="left"/>
+      <w:pPr>
+        <w:ind w:left="720" w:hanging="360"/>
+      </w:pPr>
+      <w:rPr>
+        <w:rFonts w:ascii="Lato Light" w:eastAsiaTheme="minorHAnsi" w:hAnsi="Lato Light" w:cstheme="minorBidi" w:hint="default"/>
+      </w:rPr>
+    </w:lvl>
+    <w:lvl w:ilvl="1" w:tplc="0C0A0003" w:tentative="1">
+      <w:start w:val="1"/>
+      <w:numFmt w:val="bullet"/>
+      <w:lvlText w:val="o"/>
+      <w:lvlJc w:val="left"/>
+      <w:pPr>
+        <w:ind w:left="1440" w:hanging="360"/>
+      </w:pPr>
+      <w:rPr>
+        <w:rFonts w:ascii="Courier New" w:hAnsi="Courier New" w:cs="Courier New" w:hint="default"/>
+      </w:rPr>
+    </w:lvl>
+    <w:lvl w:ilvl="2" w:tplc="0C0A0005" w:tentative="1">
+      <w:start w:val="1"/>
+      <w:numFmt w:val="bullet"/>
+      <w:lvlText w:val=""/>
+      <w:lvlJc w:val="left"/>
+      <w:pPr>
+        <w:ind w:left="2160" w:hanging="360"/>
+      </w:pPr>
+      <w:rPr>
+        <w:rFonts w:ascii="Wingdings" w:hAnsi="Wingdings" w:hint="default"/>
+      </w:rPr>
+    </w:lvl>
+    <w:lvl w:ilvl="3" w:tplc="0C0A0001" w:tentative="1">
+      <w:start w:val="1"/>
+      <w:numFmt w:val="bullet"/>
+      <w:lvlText w:val=""/>
+      <w:lvlJc w:val="left"/>
+      <w:pPr>
+        <w:ind w:left="2880" w:hanging="360"/>
+      </w:pPr>
+      <w:rPr>
+        <w:rFonts w:ascii="Symbol" w:hAnsi="Symbol" w:hint="default"/>
+      </w:rPr>
+    </w:lvl>
+    <w:lvl w:ilvl="4" w:tplc="0C0A0003" w:tentative="1">
+      <w:start w:val="1"/>
+      <w:numFmt w:val="bullet"/>
+      <w:lvlText w:val="o"/>
+      <w:lvlJc w:val="left"/>
+      <w:pPr>
+        <w:ind w:left="3600" w:hanging="360"/>
+      </w:pPr>
+      <w:rPr>
+        <w:rFonts w:ascii="Courier New" w:hAnsi="Courier New" w:cs="Courier New" w:hint="default"/>
+      </w:rPr>
+    </w:lvl>
+    <w:lvl w:ilvl="5" w:tplc="0C0A0005" w:tentative="1">
+      <w:start w:val="1"/>
+      <w:numFmt w:val="bullet"/>
+      <w:lvlText w:val=""/>
+      <w:lvlJc w:val="left"/>
+      <w:pPr>
+        <w:ind w:left="4320" w:hanging="360"/>
+      </w:pPr>
+      <w:rPr>
+        <w:rFonts w:ascii="Wingdings" w:hAnsi="Wingdings" w:hint="default"/>
+      </w:rPr>
+    </w:lvl>
+    <w:lvl w:ilvl="6" w:tplc="0C0A0001" w:tentative="1">
+      <w:start w:val="1"/>
+      <w:numFmt w:val="bullet"/>
+      <w:lvlText w:val=""/>
+      <w:lvlJc w:val="left"/>
+      <w:pPr>
+        <w:ind w:left="5040" w:hanging="360"/>
+      </w:pPr>
+      <w:rPr>
+        <w:rFonts w:ascii="Symbol" w:hAnsi="Symbol" w:hint="default"/>
+      </w:rPr>
+    </w:lvl>
+    <w:lvl w:ilvl="7" w:tplc="0C0A0003" w:tentative="1">
+      <w:start w:val="1"/>
+      <w:numFmt w:val="bullet"/>
+      <w:lvlText w:val="o"/>
+      <w:lvlJc w:val="left"/>
+      <w:pPr>
+        <w:ind w:left="5760" w:hanging="360"/>
+      </w:pPr>
+      <w:rPr>
+        <w:rFonts w:ascii="Courier New" w:hAnsi="Courier New" w:cs="Courier New" w:hint="default"/>
+      </w:rPr>
+    </w:lvl>
+    <w:lvl w:ilvl="8" w:tplc="0C0A0005" w:tentative="1">
+      <w:start w:val="1"/>
+      <w:numFmt w:val="bullet"/>
+      <w:lvlText w:val=""/>
+      <w:lvlJc w:val="left"/>
+      <w:pPr>
+        <w:ind w:left="6480" w:hanging="360"/>
+      </w:pPr>
+      <w:rPr>
+        <w:rFonts w:ascii="Wingdings" w:hAnsi="Wingdings" w:hint="default"/>
+      </w:rPr>
+    </w:lvl>
+  </w:abstractNum>
+  <w:abstractNum w:abstractNumId="16" w15:restartNumberingAfterBreak="0">
     <w:nsid w:val="78342E1B"/>
     <w:multiLevelType w:val="hybridMultilevel"/>
-    <w:tmpl w:val="183E7900"/>
+    <w:tmpl w:val="9198F01A"/>
     <w:lvl w:ilvl="0" w:tplc="0C0A0001">
       <w:start w:val="1"/>
       <w:numFmt w:val="bullet"/>
@@ -9489,7 +8881,7 @@
         <w:rFonts w:ascii="Symbol" w:hAnsi="Symbol" w:hint="default"/>
       </w:rPr>
     </w:lvl>
-    <w:lvl w:ilvl="1" w:tplc="0C0A0003" w:tentative="1">
+    <w:lvl w:ilvl="1" w:tplc="0C0A0003">
       <w:start w:val="1"/>
       <w:numFmt w:val="bullet"/>
       <w:lvlText w:val="o"/>
@@ -9501,7 +8893,7 @@
         <w:rFonts w:ascii="Courier New" w:hAnsi="Courier New" w:cs="Courier New" w:hint="default"/>
       </w:rPr>
     </w:lvl>
-    <w:lvl w:ilvl="2" w:tplc="0C0A0005" w:tentative="1">
+    <w:lvl w:ilvl="2" w:tplc="0C0A0005">
       <w:start w:val="1"/>
       <w:numFmt w:val="bullet"/>
       <w:lvlText w:val=""/>
@@ -9513,7 +8905,7 @@
         <w:rFonts w:ascii="Wingdings" w:hAnsi="Wingdings" w:hint="default"/>
       </w:rPr>
     </w:lvl>
-    <w:lvl w:ilvl="3" w:tplc="0C0A0001" w:tentative="1">
+    <w:lvl w:ilvl="3" w:tplc="0C0A0001">
       <w:start w:val="1"/>
       <w:numFmt w:val="bullet"/>
       <w:lvlText w:val=""/>
@@ -9587,19 +8979,19 @@
     </w:lvl>
   </w:abstractNum>
   <w:num w:numId="1" w16cid:durableId="1167285273">
-    <w:abstractNumId w:val="12"/>
+    <w:abstractNumId w:val="13"/>
   </w:num>
   <w:num w:numId="2" w16cid:durableId="866917483">
-    <w:abstractNumId w:val="14"/>
+    <w:abstractNumId w:val="16"/>
   </w:num>
   <w:num w:numId="3" w16cid:durableId="337462446">
+    <w:abstractNumId w:val="11"/>
+  </w:num>
+  <w:num w:numId="4" w16cid:durableId="31730038">
     <w:abstractNumId w:val="10"/>
   </w:num>
-  <w:num w:numId="4" w16cid:durableId="31730038">
-    <w:abstractNumId w:val="9"/>
-  </w:num>
   <w:num w:numId="5" w16cid:durableId="1970432789">
-    <w:abstractNumId w:val="11"/>
+    <w:abstractNumId w:val="12"/>
   </w:num>
   <w:num w:numId="6" w16cid:durableId="1984000869">
     <w:abstractNumId w:val="6"/>
@@ -9611,7 +9003,7 @@
     <w:abstractNumId w:val="4"/>
   </w:num>
   <w:num w:numId="9" w16cid:durableId="740294721">
-    <w:abstractNumId w:val="13"/>
+    <w:abstractNumId w:val="14"/>
   </w:num>
   <w:num w:numId="10" w16cid:durableId="1789427043">
     <w:abstractNumId w:val="1"/>
@@ -9630,6 +9022,42 @@
   </w:num>
   <w:num w:numId="15" w16cid:durableId="1132358753">
     <w:abstractNumId w:val="0"/>
+  </w:num>
+  <w:num w:numId="16" w16cid:durableId="364647242">
+    <w:abstractNumId w:val="9"/>
+  </w:num>
+  <w:num w:numId="17" w16cid:durableId="175190157">
+    <w:abstractNumId w:val="15"/>
+  </w:num>
+  <w:num w:numId="18" w16cid:durableId="51194656">
+    <w:abstractNumId w:val="13"/>
+    <w:lvlOverride w:ilvl="0">
+      <w:startOverride w:val="1"/>
+    </w:lvlOverride>
+    <w:lvlOverride w:ilvl="1">
+      <w:startOverride w:val="1"/>
+    </w:lvlOverride>
+    <w:lvlOverride w:ilvl="2">
+      <w:startOverride w:val="1"/>
+    </w:lvlOverride>
+    <w:lvlOverride w:ilvl="3">
+      <w:startOverride w:val="1"/>
+    </w:lvlOverride>
+    <w:lvlOverride w:ilvl="4">
+      <w:startOverride w:val="1"/>
+    </w:lvlOverride>
+    <w:lvlOverride w:ilvl="5">
+      <w:startOverride w:val="1"/>
+    </w:lvlOverride>
+    <w:lvlOverride w:ilvl="6">
+      <w:startOverride w:val="1"/>
+    </w:lvlOverride>
+    <w:lvlOverride w:ilvl="7">
+      <w:startOverride w:val="1"/>
+    </w:lvlOverride>
+    <w:lvlOverride w:ilvl="8">
+      <w:startOverride w:val="1"/>
+    </w:lvlOverride>
   </w:num>
   <w:numIdMacAtCleanup w:val="9"/>
 </w:numbering>
@@ -10292,6 +9720,7 @@
   <w:style w:type="character" w:default="1" w:styleId="Fuentedeprrafopredeter">
     <w:name w:val="Default Paragraph Font"/>
     <w:uiPriority w:val="1"/>
+    <w:semiHidden/>
     <w:unhideWhenUsed/>
   </w:style>
   <w:style w:type="table" w:default="1" w:styleId="Tablanormal">
@@ -11270,6 +10699,15 @@
 </file>
 
 <file path=customXml/item1.xml><?xml version="1.0" encoding="utf-8"?>
+<?mso-contentType ?>
+<FormTemplates xmlns="http://schemas.microsoft.com/sharepoint/v3/contenttype/forms">
+  <Display>DocumentLibraryForm</Display>
+  <Edit>DocumentLibraryForm</Edit>
+  <New>DocumentLibraryForm</New>
+</FormTemplates>
+</file>
+
+<file path=customXml/item2.xml><?xml version="1.0" encoding="utf-8"?>
 <ct:contentTypeSchema xmlns:ct="http://schemas.microsoft.com/office/2006/metadata/contentType" xmlns:ma="http://schemas.microsoft.com/office/2006/metadata/properties/metaAttributes" ct:_="" ma:_="" ma:contentTypeName="Document" ma:contentTypeID="0x0101002A728C99327E314A9E3D8507B9892F0B" ma:contentTypeVersion="13" ma:contentTypeDescription="Create a new document." ma:contentTypeScope="" ma:versionID="b5fc1c0635d4e73da9275d771ca38336">
   <xsd:schema xmlns:xsd="http://www.w3.org/2001/XMLSchema" xmlns:xs="http://www.w3.org/2001/XMLSchema" xmlns:p="http://schemas.microsoft.com/office/2006/metadata/properties" xmlns:ns2="46feb8f5-d8ea-4df4-b5f6-409aa75778c2" xmlns:ns3="b8fa4ece-32bd-494d-92b0-3bc11d82a592" targetNamespace="http://schemas.microsoft.com/office/2006/metadata/properties" ma:root="true" ma:fieldsID="ac607f1556679ed7368537c7e370bd02" ns2:_="" ns3:_="">
     <xsd:import namespace="46feb8f5-d8ea-4df4-b5f6-409aa75778c2"/>
@@ -11492,20 +10930,7 @@
 </ct:contentTypeSchema>
 </file>
 
-<file path=customXml/item2.xml><?xml version="1.0" encoding="utf-8"?>
-<?mso-contentType ?>
-<FormTemplates xmlns="http://schemas.microsoft.com/sharepoint/v3/contenttype/forms">
-  <Display>DocumentLibraryForm</Display>
-  <Edit>DocumentLibraryForm</Edit>
-  <New>DocumentLibraryForm</New>
-</FormTemplates>
-</file>
-
 <file path=customXml/item3.xml><?xml version="1.0" encoding="utf-8"?>
-<b:Sources xmlns:b="http://schemas.openxmlformats.org/officeDocument/2006/bibliography" xmlns="http://schemas.openxmlformats.org/officeDocument/2006/bibliography" SelectedStyle="\IEEE2006OfficeOnline.xsl" StyleName="IEEE 2006"/>
-</file>
-
-<file path=customXml/item4.xml><?xml version="1.0" encoding="utf-8"?>
 <p:properties xmlns:p="http://schemas.microsoft.com/office/2006/metadata/properties" xmlns:xsi="http://www.w3.org/2001/XMLSchema-instance" xmlns:pc="http://schemas.microsoft.com/office/infopath/2007/PartnerControls">
   <documentManagement>
     <TaxCatchAll xmlns="b8fa4ece-32bd-494d-92b0-3bc11d82a592" xsi:nil="true"/>
@@ -11523,7 +10948,19 @@
 </p:properties>
 </file>
 
+<file path=customXml/item4.xml><?xml version="1.0" encoding="utf-8"?>
+<b:Sources xmlns:b="http://schemas.openxmlformats.org/officeDocument/2006/bibliography" xmlns="http://schemas.openxmlformats.org/officeDocument/2006/bibliography" SelectedStyle="\IEEE2006OfficeOnline.xsl" StyleName="IEEE 2006"/>
+</file>
+
 <file path=customXml/itemProps1.xml><?xml version="1.0" encoding="utf-8"?>
+<ds:datastoreItem xmlns:ds="http://schemas.openxmlformats.org/officeDocument/2006/customXml" ds:itemID="{E3963B16-0441-459F-953A-186BC3218329}">
+  <ds:schemaRefs>
+    <ds:schemaRef ds:uri="http://schemas.microsoft.com/sharepoint/v3/contenttype/forms"/>
+  </ds:schemaRefs>
+</ds:datastoreItem>
+</file>
+
+<file path=customXml/itemProps2.xml><?xml version="1.0" encoding="utf-8"?>
 <ds:datastoreItem xmlns:ds="http://schemas.openxmlformats.org/officeDocument/2006/customXml" ds:itemID="{5BD0AF32-4E47-430D-984B-E5355CDE6BD6}">
   <ds:schemaRefs>
     <ds:schemaRef ds:uri="http://schemas.microsoft.com/office/2006/metadata/contentType"/>
@@ -11542,23 +10979,7 @@
 </ds:datastoreItem>
 </file>
 
-<file path=customXml/itemProps2.xml><?xml version="1.0" encoding="utf-8"?>
-<ds:datastoreItem xmlns:ds="http://schemas.openxmlformats.org/officeDocument/2006/customXml" ds:itemID="{E3963B16-0441-459F-953A-186BC3218329}">
-  <ds:schemaRefs>
-    <ds:schemaRef ds:uri="http://schemas.microsoft.com/sharepoint/v3/contenttype/forms"/>
-  </ds:schemaRefs>
-</ds:datastoreItem>
-</file>
-
 <file path=customXml/itemProps3.xml><?xml version="1.0" encoding="utf-8"?>
-<ds:datastoreItem xmlns:ds="http://schemas.openxmlformats.org/officeDocument/2006/customXml" ds:itemID="{D5F18D91-3107-4E1C-8DD9-D0BC21D9FE26}">
-  <ds:schemaRefs>
-    <ds:schemaRef ds:uri="http://schemas.openxmlformats.org/officeDocument/2006/bibliography"/>
-  </ds:schemaRefs>
-</ds:datastoreItem>
-</file>
-
-<file path=customXml/itemProps4.xml><?xml version="1.0" encoding="utf-8"?>
 <ds:datastoreItem xmlns:ds="http://schemas.openxmlformats.org/officeDocument/2006/customXml" ds:itemID="{104AAB3F-039F-4529-A0CD-BBCC52A5D8C9}">
   <ds:schemaRefs>
     <ds:schemaRef ds:uri="http://schemas.microsoft.com/office/2006/metadata/properties"/>
@@ -11567,4 +10988,12 @@
     <ds:schemaRef ds:uri="46feb8f5-d8ea-4df4-b5f6-409aa75778c2"/>
   </ds:schemaRefs>
 </ds:datastoreItem>
+</file>
+
+<file path=customXml/itemProps4.xml><?xml version="1.0" encoding="utf-8"?>
+<ds:datastoreItem xmlns:ds="http://schemas.openxmlformats.org/officeDocument/2006/customXml" ds:itemID="{D5F18D91-3107-4E1C-8DD9-D0BC21D9FE26}">
+  <ds:schemaRefs>
+    <ds:schemaRef ds:uri="http://schemas.openxmlformats.org/officeDocument/2006/bibliography"/>
+  </ds:schemaRefs>
+</ds:datastoreItem>
 </file>
</xml_diff>

<commit_message>
ajustes en nuevo equipo, guardar ajustes hechos. pie master. buscador, layout home , rrss old, css y otros
</commit_message>
<xml_diff>
--- a/src/Documentacion/BIS011APPSY-Themes_HERRIZ-2026_09_25-v1_00.docx
+++ b/src/Documentacion/BIS011APPSY-Themes_HERRIZ-2026_09_25-v1_00.docx
@@ -3141,6 +3141,24 @@
     </w:p>
     <w:p/>
     <w:p>
+      <w:r>
+        <w:t>Otros aspectos a tener en cuenta:</w:t>
+      </w:r>
+    </w:p>
+    <w:p>
+      <w:pPr>
+        <w:pStyle w:val="Prrafodelista"/>
+        <w:numPr>
+          <w:ilvl w:val="0"/>
+          <w:numId w:val="19"/>
+        </w:numPr>
+      </w:pPr>
+      <w:r>
+        <w:t>Resolución y proporción imágenes</w:t>
+      </w:r>
+    </w:p>
+    <w:p/>
+    <w:p>
       <w:pPr>
         <w:pStyle w:val="Ttulo2"/>
       </w:pPr>
@@ -3187,6 +3205,7 @@
         <w:pStyle w:val="Citadestacada"/>
       </w:pPr>
       <w:r>
+        <w:lastRenderedPageBreak/>
         <w:t xml:space="preserve">Excel </w:t>
       </w:r>
       <w:r>
@@ -3213,7 +3232,6 @@
         <w:pStyle w:val="Citadestacada"/>
       </w:pPr>
       <w:r>
-        <w:lastRenderedPageBreak/>
         <w:t xml:space="preserve">Diagrama relaciones mermaid </w:t>
       </w:r>
       <w:r>
@@ -3485,6 +3503,7 @@
         </w:numPr>
       </w:pPr>
       <w:r>
+        <w:lastRenderedPageBreak/>
         <w:t>Iconos</w:t>
       </w:r>
     </w:p>
@@ -3607,7 +3626,6 @@
         <w:rPr>
           <w:lang w:val="en-US"/>
         </w:rPr>
-        <w:lastRenderedPageBreak/>
         <w:t>$secondary</w:t>
       </w:r>
     </w:p>
@@ -3832,6 +3850,7 @@
       </w:pPr>
       <w:bookmarkStart w:id="12" w:name="_Toc241479894"/>
       <w:r>
+        <w:lastRenderedPageBreak/>
         <w:t xml:space="preserve">F6 — </w:t>
       </w:r>
       <w:r>
@@ -4198,6 +4217,7 @@
     </w:p>
     <w:p>
       <w:r>
+        <w:lastRenderedPageBreak/>
         <w:t xml:space="preserve">Los archivos old están en </w:t>
       </w:r>
       <w:hyperlink r:id="rId24" w:history="1">
@@ -4274,7 +4294,6 @@
         <w:rPr>
           <w:lang w:val="en-US"/>
         </w:rPr>
-        <w:lastRenderedPageBreak/>
         <w:t>/ styles/</w:t>
       </w:r>
     </w:p>
@@ -4439,6 +4458,7 @@
         <w:rPr>
           <w:lang w:val="en-US"/>
         </w:rPr>
+        <w:lastRenderedPageBreak/>
         <w:t>variables</w:t>
       </w:r>
     </w:p>
@@ -4655,7 +4675,6 @@
         <w:rPr>
           <w:lang w:val="en-US"/>
         </w:rPr>
-        <w:lastRenderedPageBreak/>
         <w:t>assets</w:t>
       </w:r>
     </w:p>
@@ -7865,6 +7884,118 @@
     </w:lvl>
   </w:abstractNum>
   <w:abstractNum w:abstractNumId="7" w15:restartNumberingAfterBreak="0">
+    <w:nsid w:val="415E7DFC"/>
+    <w:multiLevelType w:val="hybridMultilevel"/>
+    <w:tmpl w:val="93E060FE"/>
+    <w:lvl w:ilvl="0" w:tplc="B0703FD0">
+      <w:numFmt w:val="bullet"/>
+      <w:lvlText w:val="-"/>
+      <w:lvlJc w:val="left"/>
+      <w:pPr>
+        <w:ind w:left="720" w:hanging="360"/>
+      </w:pPr>
+      <w:rPr>
+        <w:rFonts w:ascii="Lato Light" w:eastAsiaTheme="minorHAnsi" w:hAnsi="Lato Light" w:cstheme="minorBidi" w:hint="default"/>
+      </w:rPr>
+    </w:lvl>
+    <w:lvl w:ilvl="1" w:tplc="0C0A0003" w:tentative="1">
+      <w:start w:val="1"/>
+      <w:numFmt w:val="bullet"/>
+      <w:lvlText w:val="o"/>
+      <w:lvlJc w:val="left"/>
+      <w:pPr>
+        <w:ind w:left="1440" w:hanging="360"/>
+      </w:pPr>
+      <w:rPr>
+        <w:rFonts w:ascii="Courier New" w:hAnsi="Courier New" w:cs="Courier New" w:hint="default"/>
+      </w:rPr>
+    </w:lvl>
+    <w:lvl w:ilvl="2" w:tplc="0C0A0005" w:tentative="1">
+      <w:start w:val="1"/>
+      <w:numFmt w:val="bullet"/>
+      <w:lvlText w:val=""/>
+      <w:lvlJc w:val="left"/>
+      <w:pPr>
+        <w:ind w:left="2160" w:hanging="360"/>
+      </w:pPr>
+      <w:rPr>
+        <w:rFonts w:ascii="Wingdings" w:hAnsi="Wingdings" w:hint="default"/>
+      </w:rPr>
+    </w:lvl>
+    <w:lvl w:ilvl="3" w:tplc="0C0A0001" w:tentative="1">
+      <w:start w:val="1"/>
+      <w:numFmt w:val="bullet"/>
+      <w:lvlText w:val=""/>
+      <w:lvlJc w:val="left"/>
+      <w:pPr>
+        <w:ind w:left="2880" w:hanging="360"/>
+      </w:pPr>
+      <w:rPr>
+        <w:rFonts w:ascii="Symbol" w:hAnsi="Symbol" w:hint="default"/>
+      </w:rPr>
+    </w:lvl>
+    <w:lvl w:ilvl="4" w:tplc="0C0A0003" w:tentative="1">
+      <w:start w:val="1"/>
+      <w:numFmt w:val="bullet"/>
+      <w:lvlText w:val="o"/>
+      <w:lvlJc w:val="left"/>
+      <w:pPr>
+        <w:ind w:left="3600" w:hanging="360"/>
+      </w:pPr>
+      <w:rPr>
+        <w:rFonts w:ascii="Courier New" w:hAnsi="Courier New" w:cs="Courier New" w:hint="default"/>
+      </w:rPr>
+    </w:lvl>
+    <w:lvl w:ilvl="5" w:tplc="0C0A0005" w:tentative="1">
+      <w:start w:val="1"/>
+      <w:numFmt w:val="bullet"/>
+      <w:lvlText w:val=""/>
+      <w:lvlJc w:val="left"/>
+      <w:pPr>
+        <w:ind w:left="4320" w:hanging="360"/>
+      </w:pPr>
+      <w:rPr>
+        <w:rFonts w:ascii="Wingdings" w:hAnsi="Wingdings" w:hint="default"/>
+      </w:rPr>
+    </w:lvl>
+    <w:lvl w:ilvl="6" w:tplc="0C0A0001" w:tentative="1">
+      <w:start w:val="1"/>
+      <w:numFmt w:val="bullet"/>
+      <w:lvlText w:val=""/>
+      <w:lvlJc w:val="left"/>
+      <w:pPr>
+        <w:ind w:left="5040" w:hanging="360"/>
+      </w:pPr>
+      <w:rPr>
+        <w:rFonts w:ascii="Symbol" w:hAnsi="Symbol" w:hint="default"/>
+      </w:rPr>
+    </w:lvl>
+    <w:lvl w:ilvl="7" w:tplc="0C0A0003" w:tentative="1">
+      <w:start w:val="1"/>
+      <w:numFmt w:val="bullet"/>
+      <w:lvlText w:val="o"/>
+      <w:lvlJc w:val="left"/>
+      <w:pPr>
+        <w:ind w:left="5760" w:hanging="360"/>
+      </w:pPr>
+      <w:rPr>
+        <w:rFonts w:ascii="Courier New" w:hAnsi="Courier New" w:cs="Courier New" w:hint="default"/>
+      </w:rPr>
+    </w:lvl>
+    <w:lvl w:ilvl="8" w:tplc="0C0A0005" w:tentative="1">
+      <w:start w:val="1"/>
+      <w:numFmt w:val="bullet"/>
+      <w:lvlText w:val=""/>
+      <w:lvlJc w:val="left"/>
+      <w:pPr>
+        <w:ind w:left="6480" w:hanging="360"/>
+      </w:pPr>
+      <w:rPr>
+        <w:rFonts w:ascii="Wingdings" w:hAnsi="Wingdings" w:hint="default"/>
+      </w:rPr>
+    </w:lvl>
+  </w:abstractNum>
+  <w:abstractNum w:abstractNumId="8" w15:restartNumberingAfterBreak="0">
     <w:nsid w:val="42630A62"/>
     <w:multiLevelType w:val="hybridMultilevel"/>
     <w:tmpl w:val="269ED854"/>
@@ -7977,7 +8108,7 @@
       </w:rPr>
     </w:lvl>
   </w:abstractNum>
-  <w:abstractNum w:abstractNumId="8" w15:restartNumberingAfterBreak="0">
+  <w:abstractNum w:abstractNumId="9" w15:restartNumberingAfterBreak="0">
     <w:nsid w:val="48923C3E"/>
     <w:multiLevelType w:val="hybridMultilevel"/>
     <w:tmpl w:val="BBC03118"/>
@@ -8090,7 +8221,7 @@
       </w:rPr>
     </w:lvl>
   </w:abstractNum>
-  <w:abstractNum w:abstractNumId="9" w15:restartNumberingAfterBreak="0">
+  <w:abstractNum w:abstractNumId="10" w15:restartNumberingAfterBreak="0">
     <w:nsid w:val="4C5D4087"/>
     <w:multiLevelType w:val="hybridMultilevel"/>
     <w:tmpl w:val="F8DE22C0"/>
@@ -8202,7 +8333,7 @@
       </w:rPr>
     </w:lvl>
   </w:abstractNum>
-  <w:abstractNum w:abstractNumId="10" w15:restartNumberingAfterBreak="0">
+  <w:abstractNum w:abstractNumId="11" w15:restartNumberingAfterBreak="0">
     <w:nsid w:val="51E46256"/>
     <w:multiLevelType w:val="hybridMultilevel"/>
     <w:tmpl w:val="724AFB76"/>
@@ -8315,7 +8446,7 @@
       </w:rPr>
     </w:lvl>
   </w:abstractNum>
-  <w:abstractNum w:abstractNumId="11" w15:restartNumberingAfterBreak="0">
+  <w:abstractNum w:abstractNumId="12" w15:restartNumberingAfterBreak="0">
     <w:nsid w:val="54B43237"/>
     <w:multiLevelType w:val="hybridMultilevel"/>
     <w:tmpl w:val="033A1E16"/>
@@ -8404,7 +8535,7 @@
       </w:pPr>
     </w:lvl>
   </w:abstractNum>
-  <w:abstractNum w:abstractNumId="12" w15:restartNumberingAfterBreak="0">
+  <w:abstractNum w:abstractNumId="13" w15:restartNumberingAfterBreak="0">
     <w:nsid w:val="62E53778"/>
     <w:multiLevelType w:val="hybridMultilevel"/>
     <w:tmpl w:val="A4C464E8"/>
@@ -8517,7 +8648,7 @@
       </w:rPr>
     </w:lvl>
   </w:abstractNum>
-  <w:abstractNum w:abstractNumId="13" w15:restartNumberingAfterBreak="0">
+  <w:abstractNum w:abstractNumId="14" w15:restartNumberingAfterBreak="0">
     <w:nsid w:val="6C764B86"/>
     <w:multiLevelType w:val="multilevel"/>
     <w:tmpl w:val="6C44C6BA"/>
@@ -8640,7 +8771,7 @@
       </w:rPr>
     </w:lvl>
   </w:abstractNum>
-  <w:abstractNum w:abstractNumId="14" w15:restartNumberingAfterBreak="0">
+  <w:abstractNum w:abstractNumId="15" w15:restartNumberingAfterBreak="0">
     <w:nsid w:val="73845B9B"/>
     <w:multiLevelType w:val="hybridMultilevel"/>
     <w:tmpl w:val="2020E5F0"/>
@@ -8753,7 +8884,7 @@
       </w:rPr>
     </w:lvl>
   </w:abstractNum>
-  <w:abstractNum w:abstractNumId="15" w15:restartNumberingAfterBreak="0">
+  <w:abstractNum w:abstractNumId="16" w15:restartNumberingAfterBreak="0">
     <w:nsid w:val="76916FBC"/>
     <w:multiLevelType w:val="hybridMultilevel"/>
     <w:tmpl w:val="3A74DA26"/>
@@ -8865,7 +8996,7 @@
       </w:rPr>
     </w:lvl>
   </w:abstractNum>
-  <w:abstractNum w:abstractNumId="16" w15:restartNumberingAfterBreak="0">
+  <w:abstractNum w:abstractNumId="17" w15:restartNumberingAfterBreak="0">
     <w:nsid w:val="78342E1B"/>
     <w:multiLevelType w:val="hybridMultilevel"/>
     <w:tmpl w:val="9198F01A"/>
@@ -8979,31 +9110,31 @@
     </w:lvl>
   </w:abstractNum>
   <w:num w:numId="1" w16cid:durableId="1167285273">
-    <w:abstractNumId w:val="13"/>
+    <w:abstractNumId w:val="14"/>
   </w:num>
   <w:num w:numId="2" w16cid:durableId="866917483">
-    <w:abstractNumId w:val="16"/>
+    <w:abstractNumId w:val="17"/>
   </w:num>
   <w:num w:numId="3" w16cid:durableId="337462446">
+    <w:abstractNumId w:val="12"/>
+  </w:num>
+  <w:num w:numId="4" w16cid:durableId="31730038">
     <w:abstractNumId w:val="11"/>
   </w:num>
-  <w:num w:numId="4" w16cid:durableId="31730038">
-    <w:abstractNumId w:val="10"/>
-  </w:num>
   <w:num w:numId="5" w16cid:durableId="1970432789">
-    <w:abstractNumId w:val="12"/>
+    <w:abstractNumId w:val="13"/>
   </w:num>
   <w:num w:numId="6" w16cid:durableId="1984000869">
     <w:abstractNumId w:val="6"/>
   </w:num>
   <w:num w:numId="7" w16cid:durableId="356320651">
-    <w:abstractNumId w:val="7"/>
+    <w:abstractNumId w:val="8"/>
   </w:num>
   <w:num w:numId="8" w16cid:durableId="1150636658">
     <w:abstractNumId w:val="4"/>
   </w:num>
   <w:num w:numId="9" w16cid:durableId="740294721">
-    <w:abstractNumId w:val="14"/>
+    <w:abstractNumId w:val="15"/>
   </w:num>
   <w:num w:numId="10" w16cid:durableId="1789427043">
     <w:abstractNumId w:val="1"/>
@@ -9012,7 +9143,7 @@
     <w:abstractNumId w:val="3"/>
   </w:num>
   <w:num w:numId="12" w16cid:durableId="1123186621">
-    <w:abstractNumId w:val="8"/>
+    <w:abstractNumId w:val="9"/>
   </w:num>
   <w:num w:numId="13" w16cid:durableId="754279682">
     <w:abstractNumId w:val="2"/>
@@ -9024,13 +9155,13 @@
     <w:abstractNumId w:val="0"/>
   </w:num>
   <w:num w:numId="16" w16cid:durableId="364647242">
-    <w:abstractNumId w:val="9"/>
+    <w:abstractNumId w:val="10"/>
   </w:num>
   <w:num w:numId="17" w16cid:durableId="175190157">
-    <w:abstractNumId w:val="15"/>
+    <w:abstractNumId w:val="16"/>
   </w:num>
   <w:num w:numId="18" w16cid:durableId="51194656">
-    <w:abstractNumId w:val="13"/>
+    <w:abstractNumId w:val="14"/>
     <w:lvlOverride w:ilvl="0">
       <w:startOverride w:val="1"/>
     </w:lvlOverride>
@@ -9058,6 +9189,9 @@
     <w:lvlOverride w:ilvl="8">
       <w:startOverride w:val="1"/>
     </w:lvlOverride>
+  </w:num>
+  <w:num w:numId="19" w16cid:durableId="1993826108">
+    <w:abstractNumId w:val="7"/>
   </w:num>
   <w:numIdMacAtCleanup w:val="9"/>
 </w:numbering>
@@ -10699,15 +10833,6 @@
 </file>
 
 <file path=customXml/item1.xml><?xml version="1.0" encoding="utf-8"?>
-<?mso-contentType ?>
-<FormTemplates xmlns="http://schemas.microsoft.com/sharepoint/v3/contenttype/forms">
-  <Display>DocumentLibraryForm</Display>
-  <Edit>DocumentLibraryForm</Edit>
-  <New>DocumentLibraryForm</New>
-</FormTemplates>
-</file>
-
-<file path=customXml/item2.xml><?xml version="1.0" encoding="utf-8"?>
 <ct:contentTypeSchema xmlns:ct="http://schemas.microsoft.com/office/2006/metadata/contentType" xmlns:ma="http://schemas.microsoft.com/office/2006/metadata/properties/metaAttributes" ct:_="" ma:_="" ma:contentTypeName="Document" ma:contentTypeID="0x0101002A728C99327E314A9E3D8507B9892F0B" ma:contentTypeVersion="13" ma:contentTypeDescription="Create a new document." ma:contentTypeScope="" ma:versionID="b5fc1c0635d4e73da9275d771ca38336">
   <xsd:schema xmlns:xsd="http://www.w3.org/2001/XMLSchema" xmlns:xs="http://www.w3.org/2001/XMLSchema" xmlns:p="http://schemas.microsoft.com/office/2006/metadata/properties" xmlns:ns2="46feb8f5-d8ea-4df4-b5f6-409aa75778c2" xmlns:ns3="b8fa4ece-32bd-494d-92b0-3bc11d82a592" targetNamespace="http://schemas.microsoft.com/office/2006/metadata/properties" ma:root="true" ma:fieldsID="ac607f1556679ed7368537c7e370bd02" ns2:_="" ns3:_="">
     <xsd:import namespace="46feb8f5-d8ea-4df4-b5f6-409aa75778c2"/>
@@ -10930,7 +11055,20 @@
 </ct:contentTypeSchema>
 </file>
 
+<file path=customXml/item2.xml><?xml version="1.0" encoding="utf-8"?>
+<?mso-contentType ?>
+<FormTemplates xmlns="http://schemas.microsoft.com/sharepoint/v3/contenttype/forms">
+  <Display>DocumentLibraryForm</Display>
+  <Edit>DocumentLibraryForm</Edit>
+  <New>DocumentLibraryForm</New>
+</FormTemplates>
+</file>
+
 <file path=customXml/item3.xml><?xml version="1.0" encoding="utf-8"?>
+<b:Sources xmlns:b="http://schemas.openxmlformats.org/officeDocument/2006/bibliography" xmlns="http://schemas.openxmlformats.org/officeDocument/2006/bibliography" SelectedStyle="\IEEE2006OfficeOnline.xsl" StyleName="IEEE 2006"/>
+</file>
+
+<file path=customXml/item4.xml><?xml version="1.0" encoding="utf-8"?>
 <p:properties xmlns:p="http://schemas.microsoft.com/office/2006/metadata/properties" xmlns:xsi="http://www.w3.org/2001/XMLSchema-instance" xmlns:pc="http://schemas.microsoft.com/office/infopath/2007/PartnerControls">
   <documentManagement>
     <TaxCatchAll xmlns="b8fa4ece-32bd-494d-92b0-3bc11d82a592" xsi:nil="true"/>
@@ -10948,19 +11086,7 @@
 </p:properties>
 </file>
 
-<file path=customXml/item4.xml><?xml version="1.0" encoding="utf-8"?>
-<b:Sources xmlns:b="http://schemas.openxmlformats.org/officeDocument/2006/bibliography" xmlns="http://schemas.openxmlformats.org/officeDocument/2006/bibliography" SelectedStyle="\IEEE2006OfficeOnline.xsl" StyleName="IEEE 2006"/>
-</file>
-
 <file path=customXml/itemProps1.xml><?xml version="1.0" encoding="utf-8"?>
-<ds:datastoreItem xmlns:ds="http://schemas.openxmlformats.org/officeDocument/2006/customXml" ds:itemID="{E3963B16-0441-459F-953A-186BC3218329}">
-  <ds:schemaRefs>
-    <ds:schemaRef ds:uri="http://schemas.microsoft.com/sharepoint/v3/contenttype/forms"/>
-  </ds:schemaRefs>
-</ds:datastoreItem>
-</file>
-
-<file path=customXml/itemProps2.xml><?xml version="1.0" encoding="utf-8"?>
 <ds:datastoreItem xmlns:ds="http://schemas.openxmlformats.org/officeDocument/2006/customXml" ds:itemID="{5BD0AF32-4E47-430D-984B-E5355CDE6BD6}">
   <ds:schemaRefs>
     <ds:schemaRef ds:uri="http://schemas.microsoft.com/office/2006/metadata/contentType"/>
@@ -10979,7 +11105,23 @@
 </ds:datastoreItem>
 </file>
 
+<file path=customXml/itemProps2.xml><?xml version="1.0" encoding="utf-8"?>
+<ds:datastoreItem xmlns:ds="http://schemas.openxmlformats.org/officeDocument/2006/customXml" ds:itemID="{E3963B16-0441-459F-953A-186BC3218329}">
+  <ds:schemaRefs>
+    <ds:schemaRef ds:uri="http://schemas.microsoft.com/sharepoint/v3/contenttype/forms"/>
+  </ds:schemaRefs>
+</ds:datastoreItem>
+</file>
+
 <file path=customXml/itemProps3.xml><?xml version="1.0" encoding="utf-8"?>
+<ds:datastoreItem xmlns:ds="http://schemas.openxmlformats.org/officeDocument/2006/customXml" ds:itemID="{D5F18D91-3107-4E1C-8DD9-D0BC21D9FE26}">
+  <ds:schemaRefs>
+    <ds:schemaRef ds:uri="http://schemas.openxmlformats.org/officeDocument/2006/bibliography"/>
+  </ds:schemaRefs>
+</ds:datastoreItem>
+</file>
+
+<file path=customXml/itemProps4.xml><?xml version="1.0" encoding="utf-8"?>
 <ds:datastoreItem xmlns:ds="http://schemas.openxmlformats.org/officeDocument/2006/customXml" ds:itemID="{104AAB3F-039F-4529-A0CD-BBCC52A5D8C9}">
   <ds:schemaRefs>
     <ds:schemaRef ds:uri="http://schemas.microsoft.com/office/2006/metadata/properties"/>
@@ -10988,12 +11130,4 @@
     <ds:schemaRef ds:uri="46feb8f5-d8ea-4df4-b5f6-409aa75778c2"/>
   </ds:schemaRefs>
 </ds:datastoreItem>
-</file>
-
-<file path=customXml/itemProps4.xml><?xml version="1.0" encoding="utf-8"?>
-<ds:datastoreItem xmlns:ds="http://schemas.openxmlformats.org/officeDocument/2006/customXml" ds:itemID="{D5F18D91-3107-4E1C-8DD9-D0BC21D9FE26}">
-  <ds:schemaRefs>
-    <ds:schemaRef ds:uri="http://schemas.openxmlformats.org/officeDocument/2006/bibliography"/>
-  </ds:schemaRefs>
-</ds:datastoreItem>
 </file>
</xml_diff>

<commit_message>
ajustes galería old, actualización docus gestión, docu, detalle patrimonio
</commit_message>
<xml_diff>
--- a/src/Documentacion/BIS011APPSY-Themes_HERRIZ-2026_09_25-v1_00.docx
+++ b/src/Documentacion/BIS011APPSY-Themes_HERRIZ-2026_09_25-v1_00.docx
@@ -84,7 +84,7 @@
       </w:pPr>
       <w:bookmarkStart w:id="0" w:name="_Toc382542072"/>
       <w:bookmarkStart w:id="1" w:name="_Toc225856305"/>
-      <w:bookmarkStart w:id="2" w:name="_Toc241479878"/>
+      <w:bookmarkStart w:id="2" w:name="_Toc242090578"/>
       <w:r>
         <w:rPr>
           <w:rFonts w:ascii="Arial" w:hAnsi="Arial" w:cs="Arial"/>
@@ -221,7 +221,7 @@
           <w:szCs w:val="24"/>
           <w:lang w:eastAsia="es-ES"/>
         </w:rPr>
-        <w:t>30/09/2026</w:t>
+        <w:t>05/10/2026</w:t>
       </w:r>
       <w:r>
         <w:rPr>
@@ -291,7 +291,7 @@
           <w:r>
             <w:fldChar w:fldCharType="separate"/>
           </w:r>
-          <w:hyperlink w:anchor="_Toc241479878" w:history="1">
+          <w:hyperlink w:anchor="_Toc242090578" w:history="1">
             <w:r>
               <w:rPr>
                 <w:rStyle w:val="Hipervnculo"/>
@@ -316,7 +316,7 @@
               <w:rPr>
                 <w:webHidden/>
               </w:rPr>
-              <w:instrText xml:space="preserve"> PAGEREF _Toc241479878 \h </w:instrText>
+              <w:instrText xml:space="preserve"> PAGEREF _Toc242090578 \h </w:instrText>
             </w:r>
             <w:r>
               <w:rPr>
@@ -334,75 +334,6 @@
                 <w:webHidden/>
               </w:rPr>
               <w:t>1</w:t>
-            </w:r>
-            <w:r>
-              <w:rPr>
-                <w:webHidden/>
-              </w:rPr>
-              <w:fldChar w:fldCharType="end"/>
-            </w:r>
-          </w:hyperlink>
-        </w:p>
-        <w:p>
-          <w:pPr>
-            <w:pStyle w:val="TDC1"/>
-            <w:tabs>
-              <w:tab w:val="right" w:leader="dot" w:pos="9060"/>
-            </w:tabs>
-            <w:rPr>
-              <w:rFonts w:asciiTheme="minorHAnsi" w:eastAsiaTheme="minorEastAsia" w:hAnsiTheme="minorHAnsi"/>
-              <w:b w:val="0"/>
-              <w:bCs w:val="0"/>
-              <w:caps w:val="0"/>
-              <w:color w:val="auto"/>
-              <w:kern w:val="2"/>
-              <w:sz w:val="24"/>
-              <w:szCs w:val="24"/>
-              <w:lang w:eastAsia="es-ES"/>
-              <w14:ligatures w14:val="standardContextual"/>
-            </w:rPr>
-          </w:pPr>
-          <w:hyperlink w:anchor="_Toc241479879" w:history="1">
-            <w:r>
-              <w:rPr>
-                <w:rStyle w:val="Hipervnculo"/>
-              </w:rPr>
-              <w:t>Desarrollo theme HERRIZ</w:t>
-            </w:r>
-            <w:r>
-              <w:rPr>
-                <w:webHidden/>
-              </w:rPr>
-              <w:tab/>
-            </w:r>
-            <w:r>
-              <w:rPr>
-                <w:webHidden/>
-              </w:rPr>
-              <w:fldChar w:fldCharType="begin"/>
-            </w:r>
-            <w:r>
-              <w:rPr>
-                <w:webHidden/>
-              </w:rPr>
-              <w:instrText xml:space="preserve"> PAGEREF _Toc241479879 \h </w:instrText>
-            </w:r>
-            <w:r>
-              <w:rPr>
-                <w:webHidden/>
-              </w:rPr>
-            </w:r>
-            <w:r>
-              <w:rPr>
-                <w:webHidden/>
-              </w:rPr>
-              <w:fldChar w:fldCharType="separate"/>
-            </w:r>
-            <w:r>
-              <w:rPr>
-                <w:webHidden/>
-              </w:rPr>
-              <w:t>4</w:t>
             </w:r>
             <w:r>
               <w:rPr>
@@ -432,7 +363,7 @@
               <w14:ligatures w14:val="standardContextual"/>
             </w:rPr>
           </w:pPr>
-          <w:hyperlink w:anchor="_Toc241479880" w:history="1">
+          <w:hyperlink w:anchor="_Toc242090579" w:history="1">
             <w:r>
               <w:rPr>
                 <w:rStyle w:val="Hipervnculo"/>
@@ -458,7 +389,7 @@
               <w:rPr>
                 <w:rStyle w:val="Hipervnculo"/>
               </w:rPr>
-              <w:t>Fases</w:t>
+              <w:t>Desarrollo</w:t>
             </w:r>
             <w:r>
               <w:rPr>
@@ -476,7 +407,7 @@
               <w:rPr>
                 <w:webHidden/>
               </w:rPr>
-              <w:instrText xml:space="preserve"> PAGEREF _Toc241479880 \h </w:instrText>
+              <w:instrText xml:space="preserve"> PAGEREF _Toc242090579 \h </w:instrText>
             </w:r>
             <w:r>
               <w:rPr>
@@ -493,7 +424,1418 @@
               <w:rPr>
                 <w:webHidden/>
               </w:rPr>
-              <w:t>4</w:t>
+              <w:t>5</w:t>
+            </w:r>
+            <w:r>
+              <w:rPr>
+                <w:webHidden/>
+              </w:rPr>
+              <w:fldChar w:fldCharType="end"/>
+            </w:r>
+          </w:hyperlink>
+        </w:p>
+        <w:p>
+          <w:pPr>
+            <w:pStyle w:val="TDC2"/>
+            <w:tabs>
+              <w:tab w:val="left" w:pos="1200"/>
+              <w:tab w:val="right" w:leader="dot" w:pos="9060"/>
+            </w:tabs>
+            <w:rPr>
+              <w:rFonts w:asciiTheme="minorHAnsi" w:eastAsiaTheme="minorEastAsia" w:hAnsiTheme="minorHAnsi"/>
+              <w:color w:val="auto"/>
+              <w:kern w:val="2"/>
+              <w:sz w:val="24"/>
+              <w:szCs w:val="24"/>
+              <w:lang w:eastAsia="es-ES"/>
+              <w14:ligatures w14:val="standardContextual"/>
+            </w:rPr>
+          </w:pPr>
+          <w:hyperlink w:anchor="_Toc242090580" w:history="1">
+            <w:r>
+              <w:rPr>
+                <w:rStyle w:val="Hipervnculo"/>
+              </w:rPr>
+              <w:t>1.1</w:t>
+            </w:r>
+            <w:r>
+              <w:rPr>
+                <w:rFonts w:asciiTheme="minorHAnsi" w:eastAsiaTheme="minorEastAsia" w:hAnsiTheme="minorHAnsi"/>
+                <w:color w:val="auto"/>
+                <w:kern w:val="2"/>
+                <w:sz w:val="24"/>
+                <w:szCs w:val="24"/>
+                <w:lang w:eastAsia="es-ES"/>
+                <w14:ligatures w14:val="standardContextual"/>
+              </w:rPr>
+              <w:tab/>
+            </w:r>
+            <w:r>
+              <w:rPr>
+                <w:rStyle w:val="Hipervnculo"/>
+              </w:rPr>
+              <w:t>CORE. Setup técnico y arquitectura</w:t>
+            </w:r>
+            <w:r>
+              <w:rPr>
+                <w:webHidden/>
+              </w:rPr>
+              <w:tab/>
+            </w:r>
+            <w:r>
+              <w:rPr>
+                <w:webHidden/>
+              </w:rPr>
+              <w:fldChar w:fldCharType="begin"/>
+            </w:r>
+            <w:r>
+              <w:rPr>
+                <w:webHidden/>
+              </w:rPr>
+              <w:instrText xml:space="preserve"> PAGEREF _Toc242090580 \h </w:instrText>
+            </w:r>
+            <w:r>
+              <w:rPr>
+                <w:webHidden/>
+              </w:rPr>
+            </w:r>
+            <w:r>
+              <w:rPr>
+                <w:webHidden/>
+              </w:rPr>
+              <w:fldChar w:fldCharType="separate"/>
+            </w:r>
+            <w:r>
+              <w:rPr>
+                <w:webHidden/>
+              </w:rPr>
+              <w:t>5</w:t>
+            </w:r>
+            <w:r>
+              <w:rPr>
+                <w:webHidden/>
+              </w:rPr>
+              <w:fldChar w:fldCharType="end"/>
+            </w:r>
+          </w:hyperlink>
+        </w:p>
+        <w:p>
+          <w:pPr>
+            <w:pStyle w:val="TDC3"/>
+            <w:tabs>
+              <w:tab w:val="left" w:pos="1200"/>
+              <w:tab w:val="right" w:leader="dot" w:pos="9060"/>
+            </w:tabs>
+            <w:rPr>
+              <w:rFonts w:asciiTheme="minorHAnsi" w:eastAsiaTheme="minorEastAsia" w:hAnsiTheme="minorHAnsi"/>
+              <w:color w:val="auto"/>
+              <w:kern w:val="2"/>
+              <w:lang w:eastAsia="es-ES"/>
+              <w14:ligatures w14:val="standardContextual"/>
+            </w:rPr>
+          </w:pPr>
+          <w:hyperlink w:anchor="_Toc242090581" w:history="1">
+            <w:r>
+              <w:rPr>
+                <w:rStyle w:val="Hipervnculo"/>
+              </w:rPr>
+              <w:t>1.1.1</w:t>
+            </w:r>
+            <w:r>
+              <w:rPr>
+                <w:rFonts w:asciiTheme="minorHAnsi" w:eastAsiaTheme="minorEastAsia" w:hAnsiTheme="minorHAnsi"/>
+                <w:color w:val="auto"/>
+                <w:kern w:val="2"/>
+                <w:lang w:eastAsia="es-ES"/>
+                <w14:ligatures w14:val="standardContextual"/>
+              </w:rPr>
+              <w:tab/>
+            </w:r>
+            <w:r>
+              <w:rPr>
+                <w:rStyle w:val="Hipervnculo"/>
+              </w:rPr>
+              <w:t>Objetivo</w:t>
+            </w:r>
+            <w:r>
+              <w:rPr>
+                <w:webHidden/>
+              </w:rPr>
+              <w:tab/>
+            </w:r>
+            <w:r>
+              <w:rPr>
+                <w:webHidden/>
+              </w:rPr>
+              <w:fldChar w:fldCharType="begin"/>
+            </w:r>
+            <w:r>
+              <w:rPr>
+                <w:webHidden/>
+              </w:rPr>
+              <w:instrText xml:space="preserve"> PAGEREF _Toc242090581 \h </w:instrText>
+            </w:r>
+            <w:r>
+              <w:rPr>
+                <w:webHidden/>
+              </w:rPr>
+            </w:r>
+            <w:r>
+              <w:rPr>
+                <w:webHidden/>
+              </w:rPr>
+              <w:fldChar w:fldCharType="separate"/>
+            </w:r>
+            <w:r>
+              <w:rPr>
+                <w:webHidden/>
+              </w:rPr>
+              <w:t>5</w:t>
+            </w:r>
+            <w:r>
+              <w:rPr>
+                <w:webHidden/>
+              </w:rPr>
+              <w:fldChar w:fldCharType="end"/>
+            </w:r>
+          </w:hyperlink>
+        </w:p>
+        <w:p>
+          <w:pPr>
+            <w:pStyle w:val="TDC3"/>
+            <w:tabs>
+              <w:tab w:val="left" w:pos="1200"/>
+              <w:tab w:val="right" w:leader="dot" w:pos="9060"/>
+            </w:tabs>
+            <w:rPr>
+              <w:rFonts w:asciiTheme="minorHAnsi" w:eastAsiaTheme="minorEastAsia" w:hAnsiTheme="minorHAnsi"/>
+              <w:color w:val="auto"/>
+              <w:kern w:val="2"/>
+              <w:lang w:eastAsia="es-ES"/>
+              <w14:ligatures w14:val="standardContextual"/>
+            </w:rPr>
+          </w:pPr>
+          <w:hyperlink w:anchor="_Toc242090582" w:history="1">
+            <w:r>
+              <w:rPr>
+                <w:rStyle w:val="Hipervnculo"/>
+              </w:rPr>
+              <w:t>1.1.2</w:t>
+            </w:r>
+            <w:r>
+              <w:rPr>
+                <w:rFonts w:asciiTheme="minorHAnsi" w:eastAsiaTheme="minorEastAsia" w:hAnsiTheme="minorHAnsi"/>
+                <w:color w:val="auto"/>
+                <w:kern w:val="2"/>
+                <w:lang w:eastAsia="es-ES"/>
+                <w14:ligatures w14:val="standardContextual"/>
+              </w:rPr>
+              <w:tab/>
+            </w:r>
+            <w:r>
+              <w:rPr>
+                <w:rStyle w:val="Hipervnculo"/>
+              </w:rPr>
+              <w:t>Arquitectura</w:t>
+            </w:r>
+            <w:r>
+              <w:rPr>
+                <w:webHidden/>
+              </w:rPr>
+              <w:tab/>
+            </w:r>
+            <w:r>
+              <w:rPr>
+                <w:webHidden/>
+              </w:rPr>
+              <w:fldChar w:fldCharType="begin"/>
+            </w:r>
+            <w:r>
+              <w:rPr>
+                <w:webHidden/>
+              </w:rPr>
+              <w:instrText xml:space="preserve"> PAGEREF _Toc242090582 \h </w:instrText>
+            </w:r>
+            <w:r>
+              <w:rPr>
+                <w:webHidden/>
+              </w:rPr>
+            </w:r>
+            <w:r>
+              <w:rPr>
+                <w:webHidden/>
+              </w:rPr>
+              <w:fldChar w:fldCharType="separate"/>
+            </w:r>
+            <w:r>
+              <w:rPr>
+                <w:webHidden/>
+              </w:rPr>
+              <w:t>5</w:t>
+            </w:r>
+            <w:r>
+              <w:rPr>
+                <w:webHidden/>
+              </w:rPr>
+              <w:fldChar w:fldCharType="end"/>
+            </w:r>
+          </w:hyperlink>
+        </w:p>
+        <w:p>
+          <w:pPr>
+            <w:pStyle w:val="TDC2"/>
+            <w:tabs>
+              <w:tab w:val="left" w:pos="1200"/>
+              <w:tab w:val="right" w:leader="dot" w:pos="9060"/>
+            </w:tabs>
+            <w:rPr>
+              <w:rFonts w:asciiTheme="minorHAnsi" w:eastAsiaTheme="minorEastAsia" w:hAnsiTheme="minorHAnsi"/>
+              <w:color w:val="auto"/>
+              <w:kern w:val="2"/>
+              <w:sz w:val="24"/>
+              <w:szCs w:val="24"/>
+              <w:lang w:eastAsia="es-ES"/>
+              <w14:ligatures w14:val="standardContextual"/>
+            </w:rPr>
+          </w:pPr>
+          <w:hyperlink w:anchor="_Toc242090583" w:history="1">
+            <w:r>
+              <w:rPr>
+                <w:rStyle w:val="Hipervnculo"/>
+                <w:lang w:val="en-US"/>
+              </w:rPr>
+              <w:t>1.2</w:t>
+            </w:r>
+            <w:r>
+              <w:rPr>
+                <w:rFonts w:asciiTheme="minorHAnsi" w:eastAsiaTheme="minorEastAsia" w:hAnsiTheme="minorHAnsi"/>
+                <w:color w:val="auto"/>
+                <w:kern w:val="2"/>
+                <w:sz w:val="24"/>
+                <w:szCs w:val="24"/>
+                <w:lang w:eastAsia="es-ES"/>
+                <w14:ligatures w14:val="standardContextual"/>
+              </w:rPr>
+              <w:tab/>
+            </w:r>
+            <w:r>
+              <w:rPr>
+                <w:rStyle w:val="Hipervnculo"/>
+                <w:lang w:val="en-US"/>
+              </w:rPr>
+              <w:t>F1 — BASE</w:t>
+            </w:r>
+            <w:r>
+              <w:rPr>
+                <w:webHidden/>
+              </w:rPr>
+              <w:tab/>
+            </w:r>
+            <w:r>
+              <w:rPr>
+                <w:webHidden/>
+              </w:rPr>
+              <w:fldChar w:fldCharType="begin"/>
+            </w:r>
+            <w:r>
+              <w:rPr>
+                <w:webHidden/>
+              </w:rPr>
+              <w:instrText xml:space="preserve"> PAGEREF _Toc242090583 \h </w:instrText>
+            </w:r>
+            <w:r>
+              <w:rPr>
+                <w:webHidden/>
+              </w:rPr>
+            </w:r>
+            <w:r>
+              <w:rPr>
+                <w:webHidden/>
+              </w:rPr>
+              <w:fldChar w:fldCharType="separate"/>
+            </w:r>
+            <w:r>
+              <w:rPr>
+                <w:webHidden/>
+              </w:rPr>
+              <w:t>6</w:t>
+            </w:r>
+            <w:r>
+              <w:rPr>
+                <w:webHidden/>
+              </w:rPr>
+              <w:fldChar w:fldCharType="end"/>
+            </w:r>
+          </w:hyperlink>
+        </w:p>
+        <w:p>
+          <w:pPr>
+            <w:pStyle w:val="TDC2"/>
+            <w:tabs>
+              <w:tab w:val="left" w:pos="1200"/>
+              <w:tab w:val="right" w:leader="dot" w:pos="9060"/>
+            </w:tabs>
+            <w:rPr>
+              <w:rFonts w:asciiTheme="minorHAnsi" w:eastAsiaTheme="minorEastAsia" w:hAnsiTheme="minorHAnsi"/>
+              <w:color w:val="auto"/>
+              <w:kern w:val="2"/>
+              <w:sz w:val="24"/>
+              <w:szCs w:val="24"/>
+              <w:lang w:eastAsia="es-ES"/>
+              <w14:ligatures w14:val="standardContextual"/>
+            </w:rPr>
+          </w:pPr>
+          <w:hyperlink w:anchor="_Toc242090584" w:history="1">
+            <w:r>
+              <w:rPr>
+                <w:rStyle w:val="Hipervnculo"/>
+              </w:rPr>
+              <w:t>1.3</w:t>
+            </w:r>
+            <w:r>
+              <w:rPr>
+                <w:rFonts w:asciiTheme="minorHAnsi" w:eastAsiaTheme="minorEastAsia" w:hAnsiTheme="minorHAnsi"/>
+                <w:color w:val="auto"/>
+                <w:kern w:val="2"/>
+                <w:sz w:val="24"/>
+                <w:szCs w:val="24"/>
+                <w:lang w:eastAsia="es-ES"/>
+                <w14:ligatures w14:val="standardContextual"/>
+              </w:rPr>
+              <w:tab/>
+            </w:r>
+            <w:r>
+              <w:rPr>
+                <w:rStyle w:val="Hipervnculo"/>
+                <w:lang w:val="en-US"/>
+              </w:rPr>
+              <w:t>F2 —SharePoint Layouts</w:t>
+            </w:r>
+            <w:r>
+              <w:rPr>
+                <w:webHidden/>
+              </w:rPr>
+              <w:tab/>
+            </w:r>
+            <w:r>
+              <w:rPr>
+                <w:webHidden/>
+              </w:rPr>
+              <w:fldChar w:fldCharType="begin"/>
+            </w:r>
+            <w:r>
+              <w:rPr>
+                <w:webHidden/>
+              </w:rPr>
+              <w:instrText xml:space="preserve"> PAGEREF _Toc242090584 \h </w:instrText>
+            </w:r>
+            <w:r>
+              <w:rPr>
+                <w:webHidden/>
+              </w:rPr>
+            </w:r>
+            <w:r>
+              <w:rPr>
+                <w:webHidden/>
+              </w:rPr>
+              <w:fldChar w:fldCharType="separate"/>
+            </w:r>
+            <w:r>
+              <w:rPr>
+                <w:webHidden/>
+              </w:rPr>
+              <w:t>6</w:t>
+            </w:r>
+            <w:r>
+              <w:rPr>
+                <w:webHidden/>
+              </w:rPr>
+              <w:fldChar w:fldCharType="end"/>
+            </w:r>
+          </w:hyperlink>
+        </w:p>
+        <w:p>
+          <w:pPr>
+            <w:pStyle w:val="TDC3"/>
+            <w:tabs>
+              <w:tab w:val="left" w:pos="1200"/>
+              <w:tab w:val="right" w:leader="dot" w:pos="9060"/>
+            </w:tabs>
+            <w:rPr>
+              <w:rFonts w:asciiTheme="minorHAnsi" w:eastAsiaTheme="minorEastAsia" w:hAnsiTheme="minorHAnsi"/>
+              <w:color w:val="auto"/>
+              <w:kern w:val="2"/>
+              <w:lang w:eastAsia="es-ES"/>
+              <w14:ligatures w14:val="standardContextual"/>
+            </w:rPr>
+          </w:pPr>
+          <w:hyperlink w:anchor="_Toc242090585" w:history="1">
+            <w:r>
+              <w:rPr>
+                <w:rStyle w:val="Hipervnculo"/>
+              </w:rPr>
+              <w:t>1.3.1</w:t>
+            </w:r>
+            <w:r>
+              <w:rPr>
+                <w:rFonts w:asciiTheme="minorHAnsi" w:eastAsiaTheme="minorEastAsia" w:hAnsiTheme="minorHAnsi"/>
+                <w:color w:val="auto"/>
+                <w:kern w:val="2"/>
+                <w:lang w:eastAsia="es-ES"/>
+                <w14:ligatures w14:val="standardContextual"/>
+              </w:rPr>
+              <w:tab/>
+            </w:r>
+            <w:r>
+              <w:rPr>
+                <w:rStyle w:val="Hipervnculo"/>
+              </w:rPr>
+              <w:t>HERRIZ_home</w:t>
+            </w:r>
+            <w:r>
+              <w:rPr>
+                <w:webHidden/>
+              </w:rPr>
+              <w:tab/>
+            </w:r>
+            <w:r>
+              <w:rPr>
+                <w:webHidden/>
+              </w:rPr>
+              <w:fldChar w:fldCharType="begin"/>
+            </w:r>
+            <w:r>
+              <w:rPr>
+                <w:webHidden/>
+              </w:rPr>
+              <w:instrText xml:space="preserve"> PAGEREF _Toc242090585 \h </w:instrText>
+            </w:r>
+            <w:r>
+              <w:rPr>
+                <w:webHidden/>
+              </w:rPr>
+            </w:r>
+            <w:r>
+              <w:rPr>
+                <w:webHidden/>
+              </w:rPr>
+              <w:fldChar w:fldCharType="separate"/>
+            </w:r>
+            <w:r>
+              <w:rPr>
+                <w:webHidden/>
+              </w:rPr>
+              <w:t>6</w:t>
+            </w:r>
+            <w:r>
+              <w:rPr>
+                <w:webHidden/>
+              </w:rPr>
+              <w:fldChar w:fldCharType="end"/>
+            </w:r>
+          </w:hyperlink>
+        </w:p>
+        <w:p>
+          <w:pPr>
+            <w:pStyle w:val="TDC3"/>
+            <w:tabs>
+              <w:tab w:val="left" w:pos="1200"/>
+              <w:tab w:val="right" w:leader="dot" w:pos="9060"/>
+            </w:tabs>
+            <w:rPr>
+              <w:rFonts w:asciiTheme="minorHAnsi" w:eastAsiaTheme="minorEastAsia" w:hAnsiTheme="minorHAnsi"/>
+              <w:color w:val="auto"/>
+              <w:kern w:val="2"/>
+              <w:lang w:eastAsia="es-ES"/>
+              <w14:ligatures w14:val="standardContextual"/>
+            </w:rPr>
+          </w:pPr>
+          <w:hyperlink w:anchor="_Toc242090586" w:history="1">
+            <w:r>
+              <w:rPr>
+                <w:rStyle w:val="Hipervnculo"/>
+              </w:rPr>
+              <w:t>1.3.2</w:t>
+            </w:r>
+            <w:r>
+              <w:rPr>
+                <w:rFonts w:asciiTheme="minorHAnsi" w:eastAsiaTheme="minorEastAsia" w:hAnsiTheme="minorHAnsi"/>
+                <w:color w:val="auto"/>
+                <w:kern w:val="2"/>
+                <w:lang w:eastAsia="es-ES"/>
+                <w14:ligatures w14:val="standardContextual"/>
+              </w:rPr>
+              <w:tab/>
+            </w:r>
+            <w:r>
+              <w:rPr>
+                <w:rStyle w:val="Hipervnculo"/>
+              </w:rPr>
+              <w:t>Listado</w:t>
+            </w:r>
+            <w:r>
+              <w:rPr>
+                <w:webHidden/>
+              </w:rPr>
+              <w:tab/>
+            </w:r>
+            <w:r>
+              <w:rPr>
+                <w:webHidden/>
+              </w:rPr>
+              <w:fldChar w:fldCharType="begin"/>
+            </w:r>
+            <w:r>
+              <w:rPr>
+                <w:webHidden/>
+              </w:rPr>
+              <w:instrText xml:space="preserve"> PAGEREF _Toc242090586 \h </w:instrText>
+            </w:r>
+            <w:r>
+              <w:rPr>
+                <w:webHidden/>
+              </w:rPr>
+            </w:r>
+            <w:r>
+              <w:rPr>
+                <w:webHidden/>
+              </w:rPr>
+              <w:fldChar w:fldCharType="separate"/>
+            </w:r>
+            <w:r>
+              <w:rPr>
+                <w:webHidden/>
+              </w:rPr>
+              <w:t>7</w:t>
+            </w:r>
+            <w:r>
+              <w:rPr>
+                <w:webHidden/>
+              </w:rPr>
+              <w:fldChar w:fldCharType="end"/>
+            </w:r>
+          </w:hyperlink>
+        </w:p>
+        <w:p>
+          <w:pPr>
+            <w:pStyle w:val="TDC3"/>
+            <w:tabs>
+              <w:tab w:val="left" w:pos="1200"/>
+              <w:tab w:val="right" w:leader="dot" w:pos="9060"/>
+            </w:tabs>
+            <w:rPr>
+              <w:rFonts w:asciiTheme="minorHAnsi" w:eastAsiaTheme="minorEastAsia" w:hAnsiTheme="minorHAnsi"/>
+              <w:color w:val="auto"/>
+              <w:kern w:val="2"/>
+              <w:lang w:eastAsia="es-ES"/>
+              <w14:ligatures w14:val="standardContextual"/>
+            </w:rPr>
+          </w:pPr>
+          <w:hyperlink w:anchor="_Toc242090587" w:history="1">
+            <w:r>
+              <w:rPr>
+                <w:rStyle w:val="Hipervnculo"/>
+              </w:rPr>
+              <w:t>1.3.3</w:t>
+            </w:r>
+            <w:r>
+              <w:rPr>
+                <w:rFonts w:asciiTheme="minorHAnsi" w:eastAsiaTheme="minorEastAsia" w:hAnsiTheme="minorHAnsi"/>
+                <w:color w:val="auto"/>
+                <w:kern w:val="2"/>
+                <w:lang w:eastAsia="es-ES"/>
+                <w14:ligatures w14:val="standardContextual"/>
+              </w:rPr>
+              <w:tab/>
+            </w:r>
+            <w:r>
+              <w:rPr>
+                <w:rStyle w:val="Hipervnculo"/>
+              </w:rPr>
+              <w:t>Detalle Evento</w:t>
+            </w:r>
+            <w:r>
+              <w:rPr>
+                <w:webHidden/>
+              </w:rPr>
+              <w:tab/>
+            </w:r>
+            <w:r>
+              <w:rPr>
+                <w:webHidden/>
+              </w:rPr>
+              <w:fldChar w:fldCharType="begin"/>
+            </w:r>
+            <w:r>
+              <w:rPr>
+                <w:webHidden/>
+              </w:rPr>
+              <w:instrText xml:space="preserve"> PAGEREF _Toc242090587 \h </w:instrText>
+            </w:r>
+            <w:r>
+              <w:rPr>
+                <w:webHidden/>
+              </w:rPr>
+            </w:r>
+            <w:r>
+              <w:rPr>
+                <w:webHidden/>
+              </w:rPr>
+              <w:fldChar w:fldCharType="separate"/>
+            </w:r>
+            <w:r>
+              <w:rPr>
+                <w:webHidden/>
+              </w:rPr>
+              <w:t>7</w:t>
+            </w:r>
+            <w:r>
+              <w:rPr>
+                <w:webHidden/>
+              </w:rPr>
+              <w:fldChar w:fldCharType="end"/>
+            </w:r>
+          </w:hyperlink>
+        </w:p>
+        <w:p>
+          <w:pPr>
+            <w:pStyle w:val="TDC2"/>
+            <w:tabs>
+              <w:tab w:val="left" w:pos="1200"/>
+              <w:tab w:val="right" w:leader="dot" w:pos="9060"/>
+            </w:tabs>
+            <w:rPr>
+              <w:rFonts w:asciiTheme="minorHAnsi" w:eastAsiaTheme="minorEastAsia" w:hAnsiTheme="minorHAnsi"/>
+              <w:color w:val="auto"/>
+              <w:kern w:val="2"/>
+              <w:sz w:val="24"/>
+              <w:szCs w:val="24"/>
+              <w:lang w:eastAsia="es-ES"/>
+              <w14:ligatures w14:val="standardContextual"/>
+            </w:rPr>
+          </w:pPr>
+          <w:hyperlink w:anchor="_Toc242090588" w:history="1">
+            <w:r>
+              <w:rPr>
+                <w:rStyle w:val="Hipervnculo"/>
+              </w:rPr>
+              <w:t>1.4</w:t>
+            </w:r>
+            <w:r>
+              <w:rPr>
+                <w:rFonts w:asciiTheme="minorHAnsi" w:eastAsiaTheme="minorEastAsia" w:hAnsiTheme="minorHAnsi"/>
+                <w:color w:val="auto"/>
+                <w:kern w:val="2"/>
+                <w:sz w:val="24"/>
+                <w:szCs w:val="24"/>
+                <w:lang w:eastAsia="es-ES"/>
+                <w14:ligatures w14:val="standardContextual"/>
+              </w:rPr>
+              <w:tab/>
+            </w:r>
+            <w:r>
+              <w:rPr>
+                <w:rStyle w:val="Hipervnculo"/>
+              </w:rPr>
+              <w:t>F3—Componentes y estructuras</w:t>
+            </w:r>
+            <w:r>
+              <w:rPr>
+                <w:webHidden/>
+              </w:rPr>
+              <w:tab/>
+            </w:r>
+            <w:r>
+              <w:rPr>
+                <w:webHidden/>
+              </w:rPr>
+              <w:fldChar w:fldCharType="begin"/>
+            </w:r>
+            <w:r>
+              <w:rPr>
+                <w:webHidden/>
+              </w:rPr>
+              <w:instrText xml:space="preserve"> PAGEREF _Toc242090588 \h </w:instrText>
+            </w:r>
+            <w:r>
+              <w:rPr>
+                <w:webHidden/>
+              </w:rPr>
+            </w:r>
+            <w:r>
+              <w:rPr>
+                <w:webHidden/>
+              </w:rPr>
+              <w:fldChar w:fldCharType="separate"/>
+            </w:r>
+            <w:r>
+              <w:rPr>
+                <w:webHidden/>
+              </w:rPr>
+              <w:t>7</w:t>
+            </w:r>
+            <w:r>
+              <w:rPr>
+                <w:webHidden/>
+              </w:rPr>
+              <w:fldChar w:fldCharType="end"/>
+            </w:r>
+          </w:hyperlink>
+        </w:p>
+        <w:p>
+          <w:pPr>
+            <w:pStyle w:val="TDC3"/>
+            <w:tabs>
+              <w:tab w:val="left" w:pos="1200"/>
+              <w:tab w:val="right" w:leader="dot" w:pos="9060"/>
+            </w:tabs>
+            <w:rPr>
+              <w:rFonts w:asciiTheme="minorHAnsi" w:eastAsiaTheme="minorEastAsia" w:hAnsiTheme="minorHAnsi"/>
+              <w:color w:val="auto"/>
+              <w:kern w:val="2"/>
+              <w:lang w:eastAsia="es-ES"/>
+              <w14:ligatures w14:val="standardContextual"/>
+            </w:rPr>
+          </w:pPr>
+          <w:hyperlink w:anchor="_Toc242090589" w:history="1">
+            <w:r>
+              <w:rPr>
+                <w:rStyle w:val="Hipervnculo"/>
+                <w:lang w:val="en-US"/>
+              </w:rPr>
+              <w:t>1.4.1</w:t>
+            </w:r>
+            <w:r>
+              <w:rPr>
+                <w:rFonts w:asciiTheme="minorHAnsi" w:eastAsiaTheme="minorEastAsia" w:hAnsiTheme="minorHAnsi"/>
+                <w:color w:val="auto"/>
+                <w:kern w:val="2"/>
+                <w:lang w:eastAsia="es-ES"/>
+                <w14:ligatures w14:val="standardContextual"/>
+              </w:rPr>
+              <w:tab/>
+            </w:r>
+            <w:r>
+              <w:rPr>
+                <w:rStyle w:val="Hipervnculo"/>
+              </w:rPr>
+              <w:t>Slider → usa cards</w:t>
+            </w:r>
+            <w:r>
+              <w:rPr>
+                <w:webHidden/>
+              </w:rPr>
+              <w:tab/>
+            </w:r>
+            <w:r>
+              <w:rPr>
+                <w:webHidden/>
+              </w:rPr>
+              <w:fldChar w:fldCharType="begin"/>
+            </w:r>
+            <w:r>
+              <w:rPr>
+                <w:webHidden/>
+              </w:rPr>
+              <w:instrText xml:space="preserve"> PAGEREF _Toc242090589 \h </w:instrText>
+            </w:r>
+            <w:r>
+              <w:rPr>
+                <w:webHidden/>
+              </w:rPr>
+            </w:r>
+            <w:r>
+              <w:rPr>
+                <w:webHidden/>
+              </w:rPr>
+              <w:fldChar w:fldCharType="separate"/>
+            </w:r>
+            <w:r>
+              <w:rPr>
+                <w:webHidden/>
+              </w:rPr>
+              <w:t>8</w:t>
+            </w:r>
+            <w:r>
+              <w:rPr>
+                <w:webHidden/>
+              </w:rPr>
+              <w:fldChar w:fldCharType="end"/>
+            </w:r>
+          </w:hyperlink>
+        </w:p>
+        <w:p>
+          <w:pPr>
+            <w:pStyle w:val="TDC3"/>
+            <w:tabs>
+              <w:tab w:val="left" w:pos="1200"/>
+              <w:tab w:val="right" w:leader="dot" w:pos="9060"/>
+            </w:tabs>
+            <w:rPr>
+              <w:rFonts w:asciiTheme="minorHAnsi" w:eastAsiaTheme="minorEastAsia" w:hAnsiTheme="minorHAnsi"/>
+              <w:color w:val="auto"/>
+              <w:kern w:val="2"/>
+              <w:lang w:eastAsia="es-ES"/>
+              <w14:ligatures w14:val="standardContextual"/>
+            </w:rPr>
+          </w:pPr>
+          <w:hyperlink w:anchor="_Toc242090590" w:history="1">
+            <w:r>
+              <w:rPr>
+                <w:rStyle w:val="Hipervnculo"/>
+              </w:rPr>
+              <w:t>1.4.2</w:t>
+            </w:r>
+            <w:r>
+              <w:rPr>
+                <w:rFonts w:asciiTheme="minorHAnsi" w:eastAsiaTheme="minorEastAsia" w:hAnsiTheme="minorHAnsi"/>
+                <w:color w:val="auto"/>
+                <w:kern w:val="2"/>
+                <w:lang w:eastAsia="es-ES"/>
+                <w14:ligatures w14:val="standardContextual"/>
+              </w:rPr>
+              <w:tab/>
+            </w:r>
+            <w:r>
+              <w:rPr>
+                <w:rStyle w:val="Hipervnculo"/>
+              </w:rPr>
+              <w:t>Card base → reutilizable en todo</w:t>
+            </w:r>
+            <w:r>
+              <w:rPr>
+                <w:webHidden/>
+              </w:rPr>
+              <w:tab/>
+            </w:r>
+            <w:r>
+              <w:rPr>
+                <w:webHidden/>
+              </w:rPr>
+              <w:fldChar w:fldCharType="begin"/>
+            </w:r>
+            <w:r>
+              <w:rPr>
+                <w:webHidden/>
+              </w:rPr>
+              <w:instrText xml:space="preserve"> PAGEREF _Toc242090590 \h </w:instrText>
+            </w:r>
+            <w:r>
+              <w:rPr>
+                <w:webHidden/>
+              </w:rPr>
+            </w:r>
+            <w:r>
+              <w:rPr>
+                <w:webHidden/>
+              </w:rPr>
+              <w:fldChar w:fldCharType="separate"/>
+            </w:r>
+            <w:r>
+              <w:rPr>
+                <w:webHidden/>
+              </w:rPr>
+              <w:t>8</w:t>
+            </w:r>
+            <w:r>
+              <w:rPr>
+                <w:webHidden/>
+              </w:rPr>
+              <w:fldChar w:fldCharType="end"/>
+            </w:r>
+          </w:hyperlink>
+        </w:p>
+        <w:p>
+          <w:pPr>
+            <w:pStyle w:val="TDC3"/>
+            <w:tabs>
+              <w:tab w:val="left" w:pos="1200"/>
+              <w:tab w:val="right" w:leader="dot" w:pos="9060"/>
+            </w:tabs>
+            <w:rPr>
+              <w:rFonts w:asciiTheme="minorHAnsi" w:eastAsiaTheme="minorEastAsia" w:hAnsiTheme="minorHAnsi"/>
+              <w:color w:val="auto"/>
+              <w:kern w:val="2"/>
+              <w:lang w:eastAsia="es-ES"/>
+              <w14:ligatures w14:val="standardContextual"/>
+            </w:rPr>
+          </w:pPr>
+          <w:hyperlink w:anchor="_Toc242090591" w:history="1">
+            <w:r>
+              <w:rPr>
+                <w:rStyle w:val="Hipervnculo"/>
+              </w:rPr>
+              <w:t>1.4.3</w:t>
+            </w:r>
+            <w:r>
+              <w:rPr>
+                <w:rFonts w:asciiTheme="minorHAnsi" w:eastAsiaTheme="minorEastAsia" w:hAnsiTheme="minorHAnsi"/>
+                <w:color w:val="auto"/>
+                <w:kern w:val="2"/>
+                <w:lang w:eastAsia="es-ES"/>
+                <w14:ligatures w14:val="standardContextual"/>
+              </w:rPr>
+              <w:tab/>
+            </w:r>
+            <w:r>
+              <w:rPr>
+                <w:rStyle w:val="Hipervnculo"/>
+              </w:rPr>
+              <w:t>Wrapper → branding fuerte</w:t>
+            </w:r>
+            <w:r>
+              <w:rPr>
+                <w:webHidden/>
+              </w:rPr>
+              <w:tab/>
+            </w:r>
+            <w:r>
+              <w:rPr>
+                <w:webHidden/>
+              </w:rPr>
+              <w:fldChar w:fldCharType="begin"/>
+            </w:r>
+            <w:r>
+              <w:rPr>
+                <w:webHidden/>
+              </w:rPr>
+              <w:instrText xml:space="preserve"> PAGEREF _Toc242090591 \h </w:instrText>
+            </w:r>
+            <w:r>
+              <w:rPr>
+                <w:webHidden/>
+              </w:rPr>
+            </w:r>
+            <w:r>
+              <w:rPr>
+                <w:webHidden/>
+              </w:rPr>
+              <w:fldChar w:fldCharType="separate"/>
+            </w:r>
+            <w:r>
+              <w:rPr>
+                <w:webHidden/>
+              </w:rPr>
+              <w:t>8</w:t>
+            </w:r>
+            <w:r>
+              <w:rPr>
+                <w:webHidden/>
+              </w:rPr>
+              <w:fldChar w:fldCharType="end"/>
+            </w:r>
+          </w:hyperlink>
+        </w:p>
+        <w:p>
+          <w:pPr>
+            <w:pStyle w:val="TDC2"/>
+            <w:tabs>
+              <w:tab w:val="left" w:pos="1200"/>
+              <w:tab w:val="right" w:leader="dot" w:pos="9060"/>
+            </w:tabs>
+            <w:rPr>
+              <w:rFonts w:asciiTheme="minorHAnsi" w:eastAsiaTheme="minorEastAsia" w:hAnsiTheme="minorHAnsi"/>
+              <w:color w:val="auto"/>
+              <w:kern w:val="2"/>
+              <w:sz w:val="24"/>
+              <w:szCs w:val="24"/>
+              <w:lang w:eastAsia="es-ES"/>
+              <w14:ligatures w14:val="standardContextual"/>
+            </w:rPr>
+          </w:pPr>
+          <w:hyperlink w:anchor="_Toc242090592" w:history="1">
+            <w:r>
+              <w:rPr>
+                <w:rStyle w:val="Hipervnculo"/>
+                <w:lang w:val="en-US"/>
+              </w:rPr>
+              <w:t>1.5</w:t>
+            </w:r>
+            <w:r>
+              <w:rPr>
+                <w:rFonts w:asciiTheme="minorHAnsi" w:eastAsiaTheme="minorEastAsia" w:hAnsiTheme="minorHAnsi"/>
+                <w:color w:val="auto"/>
+                <w:kern w:val="2"/>
+                <w:sz w:val="24"/>
+                <w:szCs w:val="24"/>
+                <w:lang w:eastAsia="es-ES"/>
+                <w14:ligatures w14:val="standardContextual"/>
+              </w:rPr>
+              <w:tab/>
+            </w:r>
+            <w:r>
+              <w:rPr>
+                <w:rStyle w:val="Hipervnculo"/>
+                <w:lang w:val="en-US"/>
+              </w:rPr>
+              <w:t>F4 — Theming (multi-ayuntamiento)</w:t>
+            </w:r>
+            <w:r>
+              <w:rPr>
+                <w:webHidden/>
+              </w:rPr>
+              <w:tab/>
+            </w:r>
+            <w:r>
+              <w:rPr>
+                <w:webHidden/>
+              </w:rPr>
+              <w:fldChar w:fldCharType="begin"/>
+            </w:r>
+            <w:r>
+              <w:rPr>
+                <w:webHidden/>
+              </w:rPr>
+              <w:instrText xml:space="preserve"> PAGEREF _Toc242090592 \h </w:instrText>
+            </w:r>
+            <w:r>
+              <w:rPr>
+                <w:webHidden/>
+              </w:rPr>
+            </w:r>
+            <w:r>
+              <w:rPr>
+                <w:webHidden/>
+              </w:rPr>
+              <w:fldChar w:fldCharType="separate"/>
+            </w:r>
+            <w:r>
+              <w:rPr>
+                <w:webHidden/>
+              </w:rPr>
+              <w:t>8</w:t>
+            </w:r>
+            <w:r>
+              <w:rPr>
+                <w:webHidden/>
+              </w:rPr>
+              <w:fldChar w:fldCharType="end"/>
+            </w:r>
+          </w:hyperlink>
+        </w:p>
+        <w:p>
+          <w:pPr>
+            <w:pStyle w:val="TDC2"/>
+            <w:tabs>
+              <w:tab w:val="left" w:pos="1200"/>
+              <w:tab w:val="right" w:leader="dot" w:pos="9060"/>
+            </w:tabs>
+            <w:rPr>
+              <w:rFonts w:asciiTheme="minorHAnsi" w:eastAsiaTheme="minorEastAsia" w:hAnsiTheme="minorHAnsi"/>
+              <w:color w:val="auto"/>
+              <w:kern w:val="2"/>
+              <w:sz w:val="24"/>
+              <w:szCs w:val="24"/>
+              <w:lang w:eastAsia="es-ES"/>
+              <w14:ligatures w14:val="standardContextual"/>
+            </w:rPr>
+          </w:pPr>
+          <w:hyperlink w:anchor="_Toc242090593" w:history="1">
+            <w:r>
+              <w:rPr>
+                <w:rStyle w:val="Hipervnculo"/>
+              </w:rPr>
+              <w:t>1.6</w:t>
+            </w:r>
+            <w:r>
+              <w:rPr>
+                <w:rFonts w:asciiTheme="minorHAnsi" w:eastAsiaTheme="minorEastAsia" w:hAnsiTheme="minorHAnsi"/>
+                <w:color w:val="auto"/>
+                <w:kern w:val="2"/>
+                <w:sz w:val="24"/>
+                <w:szCs w:val="24"/>
+                <w:lang w:eastAsia="es-ES"/>
+                <w14:ligatures w14:val="standardContextual"/>
+              </w:rPr>
+              <w:tab/>
+            </w:r>
+            <w:r>
+              <w:rPr>
+                <w:rStyle w:val="Hipervnculo"/>
+              </w:rPr>
+              <w:t>F5 — VARIANTES DETALLES</w:t>
+            </w:r>
+            <w:r>
+              <w:rPr>
+                <w:webHidden/>
+              </w:rPr>
+              <w:tab/>
+            </w:r>
+            <w:r>
+              <w:rPr>
+                <w:webHidden/>
+              </w:rPr>
+              <w:fldChar w:fldCharType="begin"/>
+            </w:r>
+            <w:r>
+              <w:rPr>
+                <w:webHidden/>
+              </w:rPr>
+              <w:instrText xml:space="preserve"> PAGEREF _Toc242090593 \h </w:instrText>
+            </w:r>
+            <w:r>
+              <w:rPr>
+                <w:webHidden/>
+              </w:rPr>
+            </w:r>
+            <w:r>
+              <w:rPr>
+                <w:webHidden/>
+              </w:rPr>
+              <w:fldChar w:fldCharType="separate"/>
+            </w:r>
+            <w:r>
+              <w:rPr>
+                <w:webHidden/>
+              </w:rPr>
+              <w:t>9</w:t>
+            </w:r>
+            <w:r>
+              <w:rPr>
+                <w:webHidden/>
+              </w:rPr>
+              <w:fldChar w:fldCharType="end"/>
+            </w:r>
+          </w:hyperlink>
+        </w:p>
+        <w:p>
+          <w:pPr>
+            <w:pStyle w:val="TDC2"/>
+            <w:tabs>
+              <w:tab w:val="left" w:pos="1200"/>
+              <w:tab w:val="right" w:leader="dot" w:pos="9060"/>
+            </w:tabs>
+            <w:rPr>
+              <w:rFonts w:asciiTheme="minorHAnsi" w:eastAsiaTheme="minorEastAsia" w:hAnsiTheme="minorHAnsi"/>
+              <w:color w:val="auto"/>
+              <w:kern w:val="2"/>
+              <w:sz w:val="24"/>
+              <w:szCs w:val="24"/>
+              <w:lang w:eastAsia="es-ES"/>
+              <w14:ligatures w14:val="standardContextual"/>
+            </w:rPr>
+          </w:pPr>
+          <w:hyperlink w:anchor="_Toc242090594" w:history="1">
+            <w:r>
+              <w:rPr>
+                <w:rStyle w:val="Hipervnculo"/>
+              </w:rPr>
+              <w:t>1.7</w:t>
+            </w:r>
+            <w:r>
+              <w:rPr>
+                <w:rFonts w:asciiTheme="minorHAnsi" w:eastAsiaTheme="minorEastAsia" w:hAnsiTheme="minorHAnsi"/>
+                <w:color w:val="auto"/>
+                <w:kern w:val="2"/>
+                <w:sz w:val="24"/>
+                <w:szCs w:val="24"/>
+                <w:lang w:eastAsia="es-ES"/>
+                <w14:ligatures w14:val="standardContextual"/>
+              </w:rPr>
+              <w:tab/>
+            </w:r>
+            <w:r>
+              <w:rPr>
+                <w:rStyle w:val="Hipervnculo"/>
+              </w:rPr>
+              <w:t>F6 — QA + documentación</w:t>
+            </w:r>
+            <w:r>
+              <w:rPr>
+                <w:webHidden/>
+              </w:rPr>
+              <w:tab/>
+            </w:r>
+            <w:r>
+              <w:rPr>
+                <w:webHidden/>
+              </w:rPr>
+              <w:fldChar w:fldCharType="begin"/>
+            </w:r>
+            <w:r>
+              <w:rPr>
+                <w:webHidden/>
+              </w:rPr>
+              <w:instrText xml:space="preserve"> PAGEREF _Toc242090594 \h </w:instrText>
+            </w:r>
+            <w:r>
+              <w:rPr>
+                <w:webHidden/>
+              </w:rPr>
+            </w:r>
+            <w:r>
+              <w:rPr>
+                <w:webHidden/>
+              </w:rPr>
+              <w:fldChar w:fldCharType="separate"/>
+            </w:r>
+            <w:r>
+              <w:rPr>
+                <w:webHidden/>
+              </w:rPr>
+              <w:t>10</w:t>
+            </w:r>
+            <w:r>
+              <w:rPr>
+                <w:webHidden/>
+              </w:rPr>
+              <w:fldChar w:fldCharType="end"/>
+            </w:r>
+          </w:hyperlink>
+        </w:p>
+        <w:p>
+          <w:pPr>
+            <w:pStyle w:val="TDC3"/>
+            <w:tabs>
+              <w:tab w:val="left" w:pos="1200"/>
+              <w:tab w:val="right" w:leader="dot" w:pos="9060"/>
+            </w:tabs>
+            <w:rPr>
+              <w:rFonts w:asciiTheme="minorHAnsi" w:eastAsiaTheme="minorEastAsia" w:hAnsiTheme="minorHAnsi"/>
+              <w:color w:val="auto"/>
+              <w:kern w:val="2"/>
+              <w:lang w:eastAsia="es-ES"/>
+              <w14:ligatures w14:val="standardContextual"/>
+            </w:rPr>
+          </w:pPr>
+          <w:hyperlink w:anchor="_Toc242090595" w:history="1">
+            <w:r>
+              <w:rPr>
+                <w:rStyle w:val="Hipervnculo"/>
+              </w:rPr>
+              <w:t>1.7.1</w:t>
+            </w:r>
+            <w:r>
+              <w:rPr>
+                <w:rFonts w:asciiTheme="minorHAnsi" w:eastAsiaTheme="minorEastAsia" w:hAnsiTheme="minorHAnsi"/>
+                <w:color w:val="auto"/>
+                <w:kern w:val="2"/>
+                <w:lang w:eastAsia="es-ES"/>
+                <w14:ligatures w14:val="standardContextual"/>
+              </w:rPr>
+              <w:tab/>
+            </w:r>
+            <w:r>
+              <w:rPr>
+                <w:rStyle w:val="Hipervnculo"/>
+              </w:rPr>
+              <w:t>QA</w:t>
+            </w:r>
+            <w:r>
+              <w:rPr>
+                <w:webHidden/>
+              </w:rPr>
+              <w:tab/>
+            </w:r>
+            <w:r>
+              <w:rPr>
+                <w:webHidden/>
+              </w:rPr>
+              <w:fldChar w:fldCharType="begin"/>
+            </w:r>
+            <w:r>
+              <w:rPr>
+                <w:webHidden/>
+              </w:rPr>
+              <w:instrText xml:space="preserve"> PAGEREF _Toc242090595 \h </w:instrText>
+            </w:r>
+            <w:r>
+              <w:rPr>
+                <w:webHidden/>
+              </w:rPr>
+            </w:r>
+            <w:r>
+              <w:rPr>
+                <w:webHidden/>
+              </w:rPr>
+              <w:fldChar w:fldCharType="separate"/>
+            </w:r>
+            <w:r>
+              <w:rPr>
+                <w:webHidden/>
+              </w:rPr>
+              <w:t>10</w:t>
+            </w:r>
+            <w:r>
+              <w:rPr>
+                <w:webHidden/>
+              </w:rPr>
+              <w:fldChar w:fldCharType="end"/>
+            </w:r>
+          </w:hyperlink>
+        </w:p>
+        <w:p>
+          <w:pPr>
+            <w:pStyle w:val="TDC3"/>
+            <w:tabs>
+              <w:tab w:val="left" w:pos="1200"/>
+              <w:tab w:val="right" w:leader="dot" w:pos="9060"/>
+            </w:tabs>
+            <w:rPr>
+              <w:rFonts w:asciiTheme="minorHAnsi" w:eastAsiaTheme="minorEastAsia" w:hAnsiTheme="minorHAnsi"/>
+              <w:color w:val="auto"/>
+              <w:kern w:val="2"/>
+              <w:lang w:eastAsia="es-ES"/>
+              <w14:ligatures w14:val="standardContextual"/>
+            </w:rPr>
+          </w:pPr>
+          <w:hyperlink w:anchor="_Toc242090596" w:history="1">
+            <w:r>
+              <w:rPr>
+                <w:rStyle w:val="Hipervnculo"/>
+              </w:rPr>
+              <w:t>1.7.2</w:t>
+            </w:r>
+            <w:r>
+              <w:rPr>
+                <w:rFonts w:asciiTheme="minorHAnsi" w:eastAsiaTheme="minorEastAsia" w:hAnsiTheme="minorHAnsi"/>
+                <w:color w:val="auto"/>
+                <w:kern w:val="2"/>
+                <w:lang w:eastAsia="es-ES"/>
+                <w14:ligatures w14:val="standardContextual"/>
+              </w:rPr>
+              <w:tab/>
+            </w:r>
+            <w:r>
+              <w:rPr>
+                <w:rStyle w:val="Hipervnculo"/>
+              </w:rPr>
+              <w:t>Documentación mínima imprescindible</w:t>
+            </w:r>
+            <w:r>
+              <w:rPr>
+                <w:webHidden/>
+              </w:rPr>
+              <w:tab/>
+            </w:r>
+            <w:r>
+              <w:rPr>
+                <w:webHidden/>
+              </w:rPr>
+              <w:fldChar w:fldCharType="begin"/>
+            </w:r>
+            <w:r>
+              <w:rPr>
+                <w:webHidden/>
+              </w:rPr>
+              <w:instrText xml:space="preserve"> PAGEREF _Toc242090596 \h </w:instrText>
+            </w:r>
+            <w:r>
+              <w:rPr>
+                <w:webHidden/>
+              </w:rPr>
+            </w:r>
+            <w:r>
+              <w:rPr>
+                <w:webHidden/>
+              </w:rPr>
+              <w:fldChar w:fldCharType="separate"/>
+            </w:r>
+            <w:r>
+              <w:rPr>
+                <w:webHidden/>
+              </w:rPr>
+              <w:t>10</w:t>
             </w:r>
             <w:r>
               <w:rPr>
@@ -523,7 +1865,7 @@
               <w14:ligatures w14:val="standardContextual"/>
             </w:rPr>
           </w:pPr>
-          <w:hyperlink w:anchor="_Toc241479881" w:history="1">
+          <w:hyperlink w:anchor="_Toc242090597" w:history="1">
             <w:r>
               <w:rPr>
                 <w:rStyle w:val="Hipervnculo"/>
@@ -549,7 +1891,7 @@
               <w:rPr>
                 <w:rStyle w:val="Hipervnculo"/>
               </w:rPr>
-              <w:t>Desarrollo</w:t>
+              <w:t>Notas proceso</w:t>
             </w:r>
             <w:r>
               <w:rPr>
@@ -567,7 +1909,7 @@
               <w:rPr>
                 <w:webHidden/>
               </w:rPr>
-              <w:instrText xml:space="preserve"> PAGEREF _Toc241479881 \h </w:instrText>
+              <w:instrText xml:space="preserve"> PAGEREF _Toc242090597 \h </w:instrText>
             </w:r>
             <w:r>
               <w:rPr>
@@ -584,1359 +1926,7 @@
               <w:rPr>
                 <w:webHidden/>
               </w:rPr>
-              <w:t>5</w:t>
-            </w:r>
-            <w:r>
-              <w:rPr>
-                <w:webHidden/>
-              </w:rPr>
-              <w:fldChar w:fldCharType="end"/>
-            </w:r>
-          </w:hyperlink>
-        </w:p>
-        <w:p>
-          <w:pPr>
-            <w:pStyle w:val="TDC2"/>
-            <w:tabs>
-              <w:tab w:val="left" w:pos="1200"/>
-              <w:tab w:val="right" w:leader="dot" w:pos="9060"/>
-            </w:tabs>
-            <w:rPr>
-              <w:rFonts w:asciiTheme="minorHAnsi" w:eastAsiaTheme="minorEastAsia" w:hAnsiTheme="minorHAnsi"/>
-              <w:color w:val="auto"/>
-              <w:kern w:val="2"/>
-              <w:sz w:val="24"/>
-              <w:szCs w:val="24"/>
-              <w:lang w:eastAsia="es-ES"/>
-              <w14:ligatures w14:val="standardContextual"/>
-            </w:rPr>
-          </w:pPr>
-          <w:hyperlink w:anchor="_Toc241479882" w:history="1">
-            <w:r>
-              <w:rPr>
-                <w:rStyle w:val="Hipervnculo"/>
-              </w:rPr>
-              <w:t>2.1</w:t>
-            </w:r>
-            <w:r>
-              <w:rPr>
-                <w:rFonts w:asciiTheme="minorHAnsi" w:eastAsiaTheme="minorEastAsia" w:hAnsiTheme="minorHAnsi"/>
-                <w:color w:val="auto"/>
-                <w:kern w:val="2"/>
-                <w:sz w:val="24"/>
-                <w:szCs w:val="24"/>
-                <w:lang w:eastAsia="es-ES"/>
-                <w14:ligatures w14:val="standardContextual"/>
-              </w:rPr>
-              <w:tab/>
-            </w:r>
-            <w:r>
-              <w:rPr>
-                <w:rStyle w:val="Hipervnculo"/>
-              </w:rPr>
-              <w:t>CORE. Setup técnico y arquitectura</w:t>
-            </w:r>
-            <w:r>
-              <w:rPr>
-                <w:webHidden/>
-              </w:rPr>
-              <w:tab/>
-            </w:r>
-            <w:r>
-              <w:rPr>
-                <w:webHidden/>
-              </w:rPr>
-              <w:fldChar w:fldCharType="begin"/>
-            </w:r>
-            <w:r>
-              <w:rPr>
-                <w:webHidden/>
-              </w:rPr>
-              <w:instrText xml:space="preserve"> PAGEREF _Toc241479882 \h </w:instrText>
-            </w:r>
-            <w:r>
-              <w:rPr>
-                <w:webHidden/>
-              </w:rPr>
-            </w:r>
-            <w:r>
-              <w:rPr>
-                <w:webHidden/>
-              </w:rPr>
-              <w:fldChar w:fldCharType="separate"/>
-            </w:r>
-            <w:r>
-              <w:rPr>
-                <w:webHidden/>
-              </w:rPr>
-              <w:t>5</w:t>
-            </w:r>
-            <w:r>
-              <w:rPr>
-                <w:webHidden/>
-              </w:rPr>
-              <w:fldChar w:fldCharType="end"/>
-            </w:r>
-          </w:hyperlink>
-        </w:p>
-        <w:p>
-          <w:pPr>
-            <w:pStyle w:val="TDC3"/>
-            <w:tabs>
-              <w:tab w:val="left" w:pos="1200"/>
-              <w:tab w:val="right" w:leader="dot" w:pos="9060"/>
-            </w:tabs>
-            <w:rPr>
-              <w:rFonts w:asciiTheme="minorHAnsi" w:eastAsiaTheme="minorEastAsia" w:hAnsiTheme="minorHAnsi"/>
-              <w:color w:val="auto"/>
-              <w:kern w:val="2"/>
-              <w:lang w:eastAsia="es-ES"/>
-              <w14:ligatures w14:val="standardContextual"/>
-            </w:rPr>
-          </w:pPr>
-          <w:hyperlink w:anchor="_Toc241479883" w:history="1">
-            <w:r>
-              <w:rPr>
-                <w:rStyle w:val="Hipervnculo"/>
-              </w:rPr>
-              <w:t>2.1.1</w:t>
-            </w:r>
-            <w:r>
-              <w:rPr>
-                <w:rFonts w:asciiTheme="minorHAnsi" w:eastAsiaTheme="minorEastAsia" w:hAnsiTheme="minorHAnsi"/>
-                <w:color w:val="auto"/>
-                <w:kern w:val="2"/>
-                <w:lang w:eastAsia="es-ES"/>
-                <w14:ligatures w14:val="standardContextual"/>
-              </w:rPr>
-              <w:tab/>
-            </w:r>
-            <w:r>
-              <w:rPr>
-                <w:rStyle w:val="Hipervnculo"/>
-              </w:rPr>
-              <w:t>Objetivo</w:t>
-            </w:r>
-            <w:r>
-              <w:rPr>
-                <w:webHidden/>
-              </w:rPr>
-              <w:tab/>
-            </w:r>
-            <w:r>
-              <w:rPr>
-                <w:webHidden/>
-              </w:rPr>
-              <w:fldChar w:fldCharType="begin"/>
-            </w:r>
-            <w:r>
-              <w:rPr>
-                <w:webHidden/>
-              </w:rPr>
-              <w:instrText xml:space="preserve"> PAGEREF _Toc241479883 \h </w:instrText>
-            </w:r>
-            <w:r>
-              <w:rPr>
-                <w:webHidden/>
-              </w:rPr>
-            </w:r>
-            <w:r>
-              <w:rPr>
-                <w:webHidden/>
-              </w:rPr>
-              <w:fldChar w:fldCharType="separate"/>
-            </w:r>
-            <w:r>
-              <w:rPr>
-                <w:webHidden/>
-              </w:rPr>
-              <w:t>5</w:t>
-            </w:r>
-            <w:r>
-              <w:rPr>
-                <w:webHidden/>
-              </w:rPr>
-              <w:fldChar w:fldCharType="end"/>
-            </w:r>
-          </w:hyperlink>
-        </w:p>
-        <w:p>
-          <w:pPr>
-            <w:pStyle w:val="TDC3"/>
-            <w:tabs>
-              <w:tab w:val="left" w:pos="1200"/>
-              <w:tab w:val="right" w:leader="dot" w:pos="9060"/>
-            </w:tabs>
-            <w:rPr>
-              <w:rFonts w:asciiTheme="minorHAnsi" w:eastAsiaTheme="minorEastAsia" w:hAnsiTheme="minorHAnsi"/>
-              <w:color w:val="auto"/>
-              <w:kern w:val="2"/>
-              <w:lang w:eastAsia="es-ES"/>
-              <w14:ligatures w14:val="standardContextual"/>
-            </w:rPr>
-          </w:pPr>
-          <w:hyperlink w:anchor="_Toc241479884" w:history="1">
-            <w:r>
-              <w:rPr>
-                <w:rStyle w:val="Hipervnculo"/>
-              </w:rPr>
-              <w:t>2.1.2</w:t>
-            </w:r>
-            <w:r>
-              <w:rPr>
-                <w:rFonts w:asciiTheme="minorHAnsi" w:eastAsiaTheme="minorEastAsia" w:hAnsiTheme="minorHAnsi"/>
-                <w:color w:val="auto"/>
-                <w:kern w:val="2"/>
-                <w:lang w:eastAsia="es-ES"/>
-                <w14:ligatures w14:val="standardContextual"/>
-              </w:rPr>
-              <w:tab/>
-            </w:r>
-            <w:r>
-              <w:rPr>
-                <w:rStyle w:val="Hipervnculo"/>
-              </w:rPr>
-              <w:t>Tareas</w:t>
-            </w:r>
-            <w:r>
-              <w:rPr>
-                <w:webHidden/>
-              </w:rPr>
-              <w:tab/>
-            </w:r>
-            <w:r>
-              <w:rPr>
-                <w:webHidden/>
-              </w:rPr>
-              <w:fldChar w:fldCharType="begin"/>
-            </w:r>
-            <w:r>
-              <w:rPr>
-                <w:webHidden/>
-              </w:rPr>
-              <w:instrText xml:space="preserve"> PAGEREF _Toc241479884 \h </w:instrText>
-            </w:r>
-            <w:r>
-              <w:rPr>
-                <w:webHidden/>
-              </w:rPr>
-            </w:r>
-            <w:r>
-              <w:rPr>
-                <w:webHidden/>
-              </w:rPr>
-              <w:fldChar w:fldCharType="separate"/>
-            </w:r>
-            <w:r>
-              <w:rPr>
-                <w:webHidden/>
-              </w:rPr>
-              <w:t>5</w:t>
-            </w:r>
-            <w:r>
-              <w:rPr>
-                <w:webHidden/>
-              </w:rPr>
-              <w:fldChar w:fldCharType="end"/>
-            </w:r>
-          </w:hyperlink>
-        </w:p>
-        <w:p>
-          <w:pPr>
-            <w:pStyle w:val="TDC3"/>
-            <w:tabs>
-              <w:tab w:val="left" w:pos="1200"/>
-              <w:tab w:val="right" w:leader="dot" w:pos="9060"/>
-            </w:tabs>
-            <w:rPr>
-              <w:rFonts w:asciiTheme="minorHAnsi" w:eastAsiaTheme="minorEastAsia" w:hAnsiTheme="minorHAnsi"/>
-              <w:color w:val="auto"/>
-              <w:kern w:val="2"/>
-              <w:lang w:eastAsia="es-ES"/>
-              <w14:ligatures w14:val="standardContextual"/>
-            </w:rPr>
-          </w:pPr>
-          <w:hyperlink w:anchor="_Toc241479885" w:history="1">
-            <w:r>
-              <w:rPr>
-                <w:rStyle w:val="Hipervnculo"/>
-              </w:rPr>
-              <w:t>2.1.3</w:t>
-            </w:r>
-            <w:r>
-              <w:rPr>
-                <w:rFonts w:asciiTheme="minorHAnsi" w:eastAsiaTheme="minorEastAsia" w:hAnsiTheme="minorHAnsi"/>
-                <w:color w:val="auto"/>
-                <w:kern w:val="2"/>
-                <w:lang w:eastAsia="es-ES"/>
-                <w14:ligatures w14:val="standardContextual"/>
-              </w:rPr>
-              <w:tab/>
-            </w:r>
-            <w:r>
-              <w:rPr>
-                <w:rStyle w:val="Hipervnculo"/>
-              </w:rPr>
-              <w:t>Base UI (fundaciones del sistema)</w:t>
-            </w:r>
-            <w:r>
-              <w:rPr>
-                <w:webHidden/>
-              </w:rPr>
-              <w:tab/>
-            </w:r>
-            <w:r>
-              <w:rPr>
-                <w:webHidden/>
-              </w:rPr>
-              <w:fldChar w:fldCharType="begin"/>
-            </w:r>
-            <w:r>
-              <w:rPr>
-                <w:webHidden/>
-              </w:rPr>
-              <w:instrText xml:space="preserve"> PAGEREF _Toc241479885 \h </w:instrText>
-            </w:r>
-            <w:r>
-              <w:rPr>
-                <w:webHidden/>
-              </w:rPr>
-            </w:r>
-            <w:r>
-              <w:rPr>
-                <w:webHidden/>
-              </w:rPr>
-              <w:fldChar w:fldCharType="separate"/>
-            </w:r>
-            <w:r>
-              <w:rPr>
-                <w:webHidden/>
-              </w:rPr>
-              <w:t>7</w:t>
-            </w:r>
-            <w:r>
-              <w:rPr>
-                <w:webHidden/>
-              </w:rPr>
-              <w:fldChar w:fldCharType="end"/>
-            </w:r>
-          </w:hyperlink>
-        </w:p>
-        <w:p>
-          <w:pPr>
-            <w:pStyle w:val="TDC2"/>
-            <w:tabs>
-              <w:tab w:val="left" w:pos="1200"/>
-              <w:tab w:val="right" w:leader="dot" w:pos="9060"/>
-            </w:tabs>
-            <w:rPr>
-              <w:rFonts w:asciiTheme="minorHAnsi" w:eastAsiaTheme="minorEastAsia" w:hAnsiTheme="minorHAnsi"/>
-              <w:color w:val="auto"/>
-              <w:kern w:val="2"/>
-              <w:sz w:val="24"/>
-              <w:szCs w:val="24"/>
-              <w:lang w:eastAsia="es-ES"/>
-              <w14:ligatures w14:val="standardContextual"/>
-            </w:rPr>
-          </w:pPr>
-          <w:hyperlink w:anchor="_Toc241479886" w:history="1">
-            <w:r>
-              <w:rPr>
-                <w:rStyle w:val="Hipervnculo"/>
-                <w:lang w:val="en-US"/>
-              </w:rPr>
-              <w:t>2.2</w:t>
-            </w:r>
-            <w:r>
-              <w:rPr>
-                <w:rFonts w:asciiTheme="minorHAnsi" w:eastAsiaTheme="minorEastAsia" w:hAnsiTheme="minorHAnsi"/>
-                <w:color w:val="auto"/>
-                <w:kern w:val="2"/>
-                <w:sz w:val="24"/>
-                <w:szCs w:val="24"/>
-                <w:lang w:eastAsia="es-ES"/>
-                <w14:ligatures w14:val="standardContextual"/>
-              </w:rPr>
-              <w:tab/>
-            </w:r>
-            <w:r>
-              <w:rPr>
-                <w:rStyle w:val="Hipervnculo"/>
-                <w:lang w:val="en-US"/>
-              </w:rPr>
-              <w:t>F1 — BASE</w:t>
-            </w:r>
-            <w:r>
-              <w:rPr>
-                <w:webHidden/>
-              </w:rPr>
-              <w:tab/>
-            </w:r>
-            <w:r>
-              <w:rPr>
-                <w:webHidden/>
-              </w:rPr>
-              <w:fldChar w:fldCharType="begin"/>
-            </w:r>
-            <w:r>
-              <w:rPr>
-                <w:webHidden/>
-              </w:rPr>
-              <w:instrText xml:space="preserve"> PAGEREF _Toc241479886 \h </w:instrText>
-            </w:r>
-            <w:r>
-              <w:rPr>
-                <w:webHidden/>
-              </w:rPr>
-            </w:r>
-            <w:r>
-              <w:rPr>
-                <w:webHidden/>
-              </w:rPr>
-              <w:fldChar w:fldCharType="separate"/>
-            </w:r>
-            <w:r>
-              <w:rPr>
-                <w:webHidden/>
-              </w:rPr>
-              <w:t>8</w:t>
-            </w:r>
-            <w:r>
-              <w:rPr>
-                <w:webHidden/>
-              </w:rPr>
-              <w:fldChar w:fldCharType="end"/>
-            </w:r>
-          </w:hyperlink>
-        </w:p>
-        <w:p>
-          <w:pPr>
-            <w:pStyle w:val="TDC3"/>
-            <w:tabs>
-              <w:tab w:val="left" w:pos="1200"/>
-              <w:tab w:val="right" w:leader="dot" w:pos="9060"/>
-            </w:tabs>
-            <w:rPr>
-              <w:rFonts w:asciiTheme="minorHAnsi" w:eastAsiaTheme="minorEastAsia" w:hAnsiTheme="minorHAnsi"/>
-              <w:color w:val="auto"/>
-              <w:kern w:val="2"/>
-              <w:lang w:eastAsia="es-ES"/>
-              <w14:ligatures w14:val="standardContextual"/>
-            </w:rPr>
-          </w:pPr>
-          <w:hyperlink w:anchor="_Toc241479887" w:history="1">
-            <w:r>
-              <w:rPr>
-                <w:rStyle w:val="Hipervnculo"/>
-              </w:rPr>
-              <w:t>2.2.1</w:t>
-            </w:r>
-            <w:r>
-              <w:rPr>
-                <w:rFonts w:asciiTheme="minorHAnsi" w:eastAsiaTheme="minorEastAsia" w:hAnsiTheme="minorHAnsi"/>
-                <w:color w:val="auto"/>
-                <w:kern w:val="2"/>
-                <w:lang w:eastAsia="es-ES"/>
-                <w14:ligatures w14:val="standardContextual"/>
-              </w:rPr>
-              <w:tab/>
-            </w:r>
-            <w:r>
-              <w:rPr>
-                <w:rStyle w:val="Hipervnculo"/>
-              </w:rPr>
-              <w:t>Master Page</w:t>
-            </w:r>
-            <w:r>
-              <w:rPr>
-                <w:webHidden/>
-              </w:rPr>
-              <w:tab/>
-            </w:r>
-            <w:r>
-              <w:rPr>
-                <w:webHidden/>
-              </w:rPr>
-              <w:fldChar w:fldCharType="begin"/>
-            </w:r>
-            <w:r>
-              <w:rPr>
-                <w:webHidden/>
-              </w:rPr>
-              <w:instrText xml:space="preserve"> PAGEREF _Toc241479887 \h </w:instrText>
-            </w:r>
-            <w:r>
-              <w:rPr>
-                <w:webHidden/>
-              </w:rPr>
-            </w:r>
-            <w:r>
-              <w:rPr>
-                <w:webHidden/>
-              </w:rPr>
-              <w:fldChar w:fldCharType="separate"/>
-            </w:r>
-            <w:r>
-              <w:rPr>
-                <w:webHidden/>
-              </w:rPr>
-              <w:t>8</w:t>
-            </w:r>
-            <w:r>
-              <w:rPr>
-                <w:webHidden/>
-              </w:rPr>
-              <w:fldChar w:fldCharType="end"/>
-            </w:r>
-          </w:hyperlink>
-        </w:p>
-        <w:p>
-          <w:pPr>
-            <w:pStyle w:val="TDC2"/>
-            <w:tabs>
-              <w:tab w:val="left" w:pos="1200"/>
-              <w:tab w:val="right" w:leader="dot" w:pos="9060"/>
-            </w:tabs>
-            <w:rPr>
-              <w:rFonts w:asciiTheme="minorHAnsi" w:eastAsiaTheme="minorEastAsia" w:hAnsiTheme="minorHAnsi"/>
-              <w:color w:val="auto"/>
-              <w:kern w:val="2"/>
-              <w:sz w:val="24"/>
-              <w:szCs w:val="24"/>
-              <w:lang w:eastAsia="es-ES"/>
-              <w14:ligatures w14:val="standardContextual"/>
-            </w:rPr>
-          </w:pPr>
-          <w:hyperlink w:anchor="_Toc241479888" w:history="1">
-            <w:r>
-              <w:rPr>
-                <w:rStyle w:val="Hipervnculo"/>
-              </w:rPr>
-              <w:t>2.3</w:t>
-            </w:r>
-            <w:r>
-              <w:rPr>
-                <w:rFonts w:asciiTheme="minorHAnsi" w:eastAsiaTheme="minorEastAsia" w:hAnsiTheme="minorHAnsi"/>
-                <w:color w:val="auto"/>
-                <w:kern w:val="2"/>
-                <w:sz w:val="24"/>
-                <w:szCs w:val="24"/>
-                <w:lang w:eastAsia="es-ES"/>
-                <w14:ligatures w14:val="standardContextual"/>
-              </w:rPr>
-              <w:tab/>
-            </w:r>
-            <w:r>
-              <w:rPr>
-                <w:rStyle w:val="Hipervnculo"/>
-                <w:lang w:val="en-US"/>
-              </w:rPr>
-              <w:t xml:space="preserve">F2 — </w:t>
-            </w:r>
-            <w:r>
-              <w:rPr>
-                <w:rStyle w:val="Hipervnculo"/>
-              </w:rPr>
-              <w:t>PILOTO</w:t>
-            </w:r>
-            <w:r>
-              <w:rPr>
-                <w:rStyle w:val="Hipervnculo"/>
-                <w:lang w:val="en-US"/>
-              </w:rPr>
-              <w:t>. SharePoint Layouts</w:t>
-            </w:r>
-            <w:r>
-              <w:rPr>
-                <w:webHidden/>
-              </w:rPr>
-              <w:tab/>
-            </w:r>
-            <w:r>
-              <w:rPr>
-                <w:webHidden/>
-              </w:rPr>
-              <w:fldChar w:fldCharType="begin"/>
-            </w:r>
-            <w:r>
-              <w:rPr>
-                <w:webHidden/>
-              </w:rPr>
-              <w:instrText xml:space="preserve"> PAGEREF _Toc241479888 \h </w:instrText>
-            </w:r>
-            <w:r>
-              <w:rPr>
-                <w:webHidden/>
-              </w:rPr>
-            </w:r>
-            <w:r>
-              <w:rPr>
-                <w:webHidden/>
-              </w:rPr>
-              <w:fldChar w:fldCharType="separate"/>
-            </w:r>
-            <w:r>
-              <w:rPr>
-                <w:webHidden/>
-              </w:rPr>
-              <w:t>8</w:t>
-            </w:r>
-            <w:r>
-              <w:rPr>
-                <w:webHidden/>
-              </w:rPr>
-              <w:fldChar w:fldCharType="end"/>
-            </w:r>
-          </w:hyperlink>
-        </w:p>
-        <w:p>
-          <w:pPr>
-            <w:pStyle w:val="TDC2"/>
-            <w:tabs>
-              <w:tab w:val="left" w:pos="1200"/>
-              <w:tab w:val="right" w:leader="dot" w:pos="9060"/>
-            </w:tabs>
-            <w:rPr>
-              <w:rFonts w:asciiTheme="minorHAnsi" w:eastAsiaTheme="minorEastAsia" w:hAnsiTheme="minorHAnsi"/>
-              <w:color w:val="auto"/>
-              <w:kern w:val="2"/>
-              <w:sz w:val="24"/>
-              <w:szCs w:val="24"/>
-              <w:lang w:eastAsia="es-ES"/>
-              <w14:ligatures w14:val="standardContextual"/>
-            </w:rPr>
-          </w:pPr>
-          <w:hyperlink w:anchor="_Toc241479889" w:history="1">
-            <w:r>
-              <w:rPr>
-                <w:rStyle w:val="Hipervnculo"/>
-              </w:rPr>
-              <w:t>2.4</w:t>
-            </w:r>
-            <w:r>
-              <w:rPr>
-                <w:rFonts w:asciiTheme="minorHAnsi" w:eastAsiaTheme="minorEastAsia" w:hAnsiTheme="minorHAnsi"/>
-                <w:color w:val="auto"/>
-                <w:kern w:val="2"/>
-                <w:sz w:val="24"/>
-                <w:szCs w:val="24"/>
-                <w:lang w:eastAsia="es-ES"/>
-                <w14:ligatures w14:val="standardContextual"/>
-              </w:rPr>
-              <w:tab/>
-            </w:r>
-            <w:r>
-              <w:rPr>
-                <w:rStyle w:val="Hipervnculo"/>
-              </w:rPr>
-              <w:t>F3— PROPUESTA. Componentes y estructuras propuestas en Figma</w:t>
-            </w:r>
-            <w:r>
-              <w:rPr>
-                <w:webHidden/>
-              </w:rPr>
-              <w:tab/>
-            </w:r>
-            <w:r>
-              <w:rPr>
-                <w:webHidden/>
-              </w:rPr>
-              <w:fldChar w:fldCharType="begin"/>
-            </w:r>
-            <w:r>
-              <w:rPr>
-                <w:webHidden/>
-              </w:rPr>
-              <w:instrText xml:space="preserve"> PAGEREF _Toc241479889 \h </w:instrText>
-            </w:r>
-            <w:r>
-              <w:rPr>
-                <w:webHidden/>
-              </w:rPr>
-            </w:r>
-            <w:r>
-              <w:rPr>
-                <w:webHidden/>
-              </w:rPr>
-              <w:fldChar w:fldCharType="separate"/>
-            </w:r>
-            <w:r>
-              <w:rPr>
-                <w:webHidden/>
-              </w:rPr>
-              <w:t>9</w:t>
-            </w:r>
-            <w:r>
-              <w:rPr>
-                <w:webHidden/>
-              </w:rPr>
-              <w:fldChar w:fldCharType="end"/>
-            </w:r>
-          </w:hyperlink>
-        </w:p>
-        <w:p>
-          <w:pPr>
-            <w:pStyle w:val="TDC3"/>
-            <w:tabs>
-              <w:tab w:val="left" w:pos="1200"/>
-              <w:tab w:val="right" w:leader="dot" w:pos="9060"/>
-            </w:tabs>
-            <w:rPr>
-              <w:rFonts w:asciiTheme="minorHAnsi" w:eastAsiaTheme="minorEastAsia" w:hAnsiTheme="minorHAnsi"/>
-              <w:color w:val="auto"/>
-              <w:kern w:val="2"/>
-              <w:lang w:eastAsia="es-ES"/>
-              <w14:ligatures w14:val="standardContextual"/>
-            </w:rPr>
-          </w:pPr>
-          <w:hyperlink w:anchor="_Toc241479890" w:history="1">
-            <w:r>
-              <w:rPr>
-                <w:rStyle w:val="Hipervnculo"/>
-              </w:rPr>
-              <w:t>2.4.1</w:t>
-            </w:r>
-            <w:r>
-              <w:rPr>
-                <w:rFonts w:asciiTheme="minorHAnsi" w:eastAsiaTheme="minorEastAsia" w:hAnsiTheme="minorHAnsi"/>
-                <w:color w:val="auto"/>
-                <w:kern w:val="2"/>
-                <w:lang w:eastAsia="es-ES"/>
-                <w14:ligatures w14:val="standardContextual"/>
-              </w:rPr>
-              <w:tab/>
-            </w:r>
-            <w:r>
-              <w:rPr>
-                <w:rStyle w:val="Hipervnculo"/>
-              </w:rPr>
-              <w:t>Checklist rápido verificación (item) de ejemplo</w:t>
-            </w:r>
-            <w:r>
-              <w:rPr>
-                <w:webHidden/>
-              </w:rPr>
-              <w:tab/>
-            </w:r>
-            <w:r>
-              <w:rPr>
-                <w:webHidden/>
-              </w:rPr>
-              <w:fldChar w:fldCharType="begin"/>
-            </w:r>
-            <w:r>
-              <w:rPr>
-                <w:webHidden/>
-              </w:rPr>
-              <w:instrText xml:space="preserve"> PAGEREF _Toc241479890 \h </w:instrText>
-            </w:r>
-            <w:r>
-              <w:rPr>
-                <w:webHidden/>
-              </w:rPr>
-            </w:r>
-            <w:r>
-              <w:rPr>
-                <w:webHidden/>
-              </w:rPr>
-              <w:fldChar w:fldCharType="separate"/>
-            </w:r>
-            <w:r>
-              <w:rPr>
-                <w:webHidden/>
-              </w:rPr>
-              <w:t>9</w:t>
-            </w:r>
-            <w:r>
-              <w:rPr>
-                <w:webHidden/>
-              </w:rPr>
-              <w:fldChar w:fldCharType="end"/>
-            </w:r>
-          </w:hyperlink>
-        </w:p>
-        <w:p>
-          <w:pPr>
-            <w:pStyle w:val="TDC3"/>
-            <w:tabs>
-              <w:tab w:val="left" w:pos="1200"/>
-              <w:tab w:val="right" w:leader="dot" w:pos="9060"/>
-            </w:tabs>
-            <w:rPr>
-              <w:rFonts w:asciiTheme="minorHAnsi" w:eastAsiaTheme="minorEastAsia" w:hAnsiTheme="minorHAnsi"/>
-              <w:color w:val="auto"/>
-              <w:kern w:val="2"/>
-              <w:lang w:eastAsia="es-ES"/>
-              <w14:ligatures w14:val="standardContextual"/>
-            </w:rPr>
-          </w:pPr>
-          <w:hyperlink w:anchor="_Toc241479891" w:history="1">
-            <w:r>
-              <w:rPr>
-                <w:rStyle w:val="Hipervnculo"/>
-              </w:rPr>
-              <w:t>2.4.2</w:t>
-            </w:r>
-            <w:r>
-              <w:rPr>
-                <w:rFonts w:asciiTheme="minorHAnsi" w:eastAsiaTheme="minorEastAsia" w:hAnsiTheme="minorHAnsi"/>
-                <w:color w:val="auto"/>
-                <w:kern w:val="2"/>
-                <w:lang w:eastAsia="es-ES"/>
-                <w14:ligatures w14:val="standardContextual"/>
-              </w:rPr>
-              <w:tab/>
-            </w:r>
-            <w:r>
-              <w:rPr>
-                <w:rStyle w:val="Hipervnculo"/>
-              </w:rPr>
-              <w:t>Orden</w:t>
-            </w:r>
-            <w:r>
-              <w:rPr>
-                <w:webHidden/>
-              </w:rPr>
-              <w:tab/>
-            </w:r>
-            <w:r>
-              <w:rPr>
-                <w:webHidden/>
-              </w:rPr>
-              <w:fldChar w:fldCharType="begin"/>
-            </w:r>
-            <w:r>
-              <w:rPr>
-                <w:webHidden/>
-              </w:rPr>
-              <w:instrText xml:space="preserve"> PAGEREF _Toc241479891 \h </w:instrText>
-            </w:r>
-            <w:r>
-              <w:rPr>
-                <w:webHidden/>
-              </w:rPr>
-            </w:r>
-            <w:r>
-              <w:rPr>
-                <w:webHidden/>
-              </w:rPr>
-              <w:fldChar w:fldCharType="separate"/>
-            </w:r>
-            <w:r>
-              <w:rPr>
-                <w:webHidden/>
-              </w:rPr>
-              <w:t>9</w:t>
-            </w:r>
-            <w:r>
-              <w:rPr>
-                <w:webHidden/>
-              </w:rPr>
-              <w:fldChar w:fldCharType="end"/>
-            </w:r>
-          </w:hyperlink>
-        </w:p>
-        <w:p>
-          <w:pPr>
-            <w:pStyle w:val="TDC2"/>
-            <w:tabs>
-              <w:tab w:val="left" w:pos="1200"/>
-              <w:tab w:val="right" w:leader="dot" w:pos="9060"/>
-            </w:tabs>
-            <w:rPr>
-              <w:rFonts w:asciiTheme="minorHAnsi" w:eastAsiaTheme="minorEastAsia" w:hAnsiTheme="minorHAnsi"/>
-              <w:color w:val="auto"/>
-              <w:kern w:val="2"/>
-              <w:sz w:val="24"/>
-              <w:szCs w:val="24"/>
-              <w:lang w:eastAsia="es-ES"/>
-              <w14:ligatures w14:val="standardContextual"/>
-            </w:rPr>
-          </w:pPr>
-          <w:hyperlink w:anchor="_Toc241479892" w:history="1">
-            <w:r>
-              <w:rPr>
-                <w:rStyle w:val="Hipervnculo"/>
-                <w:lang w:val="en-US"/>
-              </w:rPr>
-              <w:t>2.5</w:t>
-            </w:r>
-            <w:r>
-              <w:rPr>
-                <w:rFonts w:asciiTheme="minorHAnsi" w:eastAsiaTheme="minorEastAsia" w:hAnsiTheme="minorHAnsi"/>
-                <w:color w:val="auto"/>
-                <w:kern w:val="2"/>
-                <w:sz w:val="24"/>
-                <w:szCs w:val="24"/>
-                <w:lang w:eastAsia="es-ES"/>
-                <w14:ligatures w14:val="standardContextual"/>
-              </w:rPr>
-              <w:tab/>
-            </w:r>
-            <w:r>
-              <w:rPr>
-                <w:rStyle w:val="Hipervnculo"/>
-                <w:lang w:val="en-US"/>
-              </w:rPr>
-              <w:t>F4 — Theming (multi-ayuntamiento)</w:t>
-            </w:r>
-            <w:r>
-              <w:rPr>
-                <w:webHidden/>
-              </w:rPr>
-              <w:tab/>
-            </w:r>
-            <w:r>
-              <w:rPr>
-                <w:webHidden/>
-              </w:rPr>
-              <w:fldChar w:fldCharType="begin"/>
-            </w:r>
-            <w:r>
-              <w:rPr>
-                <w:webHidden/>
-              </w:rPr>
-              <w:instrText xml:space="preserve"> PAGEREF _Toc241479892 \h </w:instrText>
-            </w:r>
-            <w:r>
-              <w:rPr>
-                <w:webHidden/>
-              </w:rPr>
-            </w:r>
-            <w:r>
-              <w:rPr>
-                <w:webHidden/>
-              </w:rPr>
-              <w:fldChar w:fldCharType="separate"/>
-            </w:r>
-            <w:r>
-              <w:rPr>
-                <w:webHidden/>
-              </w:rPr>
               <w:t>10</w:t>
-            </w:r>
-            <w:r>
-              <w:rPr>
-                <w:webHidden/>
-              </w:rPr>
-              <w:fldChar w:fldCharType="end"/>
-            </w:r>
-          </w:hyperlink>
-        </w:p>
-        <w:p>
-          <w:pPr>
-            <w:pStyle w:val="TDC2"/>
-            <w:tabs>
-              <w:tab w:val="left" w:pos="1200"/>
-              <w:tab w:val="right" w:leader="dot" w:pos="9060"/>
-            </w:tabs>
-            <w:rPr>
-              <w:rFonts w:asciiTheme="minorHAnsi" w:eastAsiaTheme="minorEastAsia" w:hAnsiTheme="minorHAnsi"/>
-              <w:color w:val="auto"/>
-              <w:kern w:val="2"/>
-              <w:sz w:val="24"/>
-              <w:szCs w:val="24"/>
-              <w:lang w:eastAsia="es-ES"/>
-              <w14:ligatures w14:val="standardContextual"/>
-            </w:rPr>
-          </w:pPr>
-          <w:hyperlink w:anchor="_Toc241479893" w:history="1">
-            <w:r>
-              <w:rPr>
-                <w:rStyle w:val="Hipervnculo"/>
-              </w:rPr>
-              <w:t>2.6</w:t>
-            </w:r>
-            <w:r>
-              <w:rPr>
-                <w:rFonts w:asciiTheme="minorHAnsi" w:eastAsiaTheme="minorEastAsia" w:hAnsiTheme="minorHAnsi"/>
-                <w:color w:val="auto"/>
-                <w:kern w:val="2"/>
-                <w:sz w:val="24"/>
-                <w:szCs w:val="24"/>
-                <w:lang w:eastAsia="es-ES"/>
-                <w14:ligatures w14:val="standardContextual"/>
-              </w:rPr>
-              <w:tab/>
-            </w:r>
-            <w:r>
-              <w:rPr>
-                <w:rStyle w:val="Hipervnculo"/>
-              </w:rPr>
-              <w:t>F5 — VARIANTES DETALLES</w:t>
-            </w:r>
-            <w:r>
-              <w:rPr>
-                <w:webHidden/>
-              </w:rPr>
-              <w:tab/>
-            </w:r>
-            <w:r>
-              <w:rPr>
-                <w:webHidden/>
-              </w:rPr>
-              <w:fldChar w:fldCharType="begin"/>
-            </w:r>
-            <w:r>
-              <w:rPr>
-                <w:webHidden/>
-              </w:rPr>
-              <w:instrText xml:space="preserve"> PAGEREF _Toc241479893 \h </w:instrText>
-            </w:r>
-            <w:r>
-              <w:rPr>
-                <w:webHidden/>
-              </w:rPr>
-            </w:r>
-            <w:r>
-              <w:rPr>
-                <w:webHidden/>
-              </w:rPr>
-              <w:fldChar w:fldCharType="separate"/>
-            </w:r>
-            <w:r>
-              <w:rPr>
-                <w:webHidden/>
-              </w:rPr>
-              <w:t>11</w:t>
-            </w:r>
-            <w:r>
-              <w:rPr>
-                <w:webHidden/>
-              </w:rPr>
-              <w:fldChar w:fldCharType="end"/>
-            </w:r>
-          </w:hyperlink>
-        </w:p>
-        <w:p>
-          <w:pPr>
-            <w:pStyle w:val="TDC2"/>
-            <w:tabs>
-              <w:tab w:val="left" w:pos="1200"/>
-              <w:tab w:val="right" w:leader="dot" w:pos="9060"/>
-            </w:tabs>
-            <w:rPr>
-              <w:rFonts w:asciiTheme="minorHAnsi" w:eastAsiaTheme="minorEastAsia" w:hAnsiTheme="minorHAnsi"/>
-              <w:color w:val="auto"/>
-              <w:kern w:val="2"/>
-              <w:sz w:val="24"/>
-              <w:szCs w:val="24"/>
-              <w:lang w:eastAsia="es-ES"/>
-              <w14:ligatures w14:val="standardContextual"/>
-            </w:rPr>
-          </w:pPr>
-          <w:hyperlink w:anchor="_Toc241479894" w:history="1">
-            <w:r>
-              <w:rPr>
-                <w:rStyle w:val="Hipervnculo"/>
-              </w:rPr>
-              <w:t>2.7</w:t>
-            </w:r>
-            <w:r>
-              <w:rPr>
-                <w:rFonts w:asciiTheme="minorHAnsi" w:eastAsiaTheme="minorEastAsia" w:hAnsiTheme="minorHAnsi"/>
-                <w:color w:val="auto"/>
-                <w:kern w:val="2"/>
-                <w:sz w:val="24"/>
-                <w:szCs w:val="24"/>
-                <w:lang w:eastAsia="es-ES"/>
-                <w14:ligatures w14:val="standardContextual"/>
-              </w:rPr>
-              <w:tab/>
-            </w:r>
-            <w:r>
-              <w:rPr>
-                <w:rStyle w:val="Hipervnculo"/>
-              </w:rPr>
-              <w:t>F6 — QA + documentación</w:t>
-            </w:r>
-            <w:r>
-              <w:rPr>
-                <w:webHidden/>
-              </w:rPr>
-              <w:tab/>
-            </w:r>
-            <w:r>
-              <w:rPr>
-                <w:webHidden/>
-              </w:rPr>
-              <w:fldChar w:fldCharType="begin"/>
-            </w:r>
-            <w:r>
-              <w:rPr>
-                <w:webHidden/>
-              </w:rPr>
-              <w:instrText xml:space="preserve"> PAGEREF _Toc241479894 \h </w:instrText>
-            </w:r>
-            <w:r>
-              <w:rPr>
-                <w:webHidden/>
-              </w:rPr>
-            </w:r>
-            <w:r>
-              <w:rPr>
-                <w:webHidden/>
-              </w:rPr>
-              <w:fldChar w:fldCharType="separate"/>
-            </w:r>
-            <w:r>
-              <w:rPr>
-                <w:webHidden/>
-              </w:rPr>
-              <w:t>11</w:t>
-            </w:r>
-            <w:r>
-              <w:rPr>
-                <w:webHidden/>
-              </w:rPr>
-              <w:fldChar w:fldCharType="end"/>
-            </w:r>
-          </w:hyperlink>
-        </w:p>
-        <w:p>
-          <w:pPr>
-            <w:pStyle w:val="TDC3"/>
-            <w:tabs>
-              <w:tab w:val="left" w:pos="1200"/>
-              <w:tab w:val="right" w:leader="dot" w:pos="9060"/>
-            </w:tabs>
-            <w:rPr>
-              <w:rFonts w:asciiTheme="minorHAnsi" w:eastAsiaTheme="minorEastAsia" w:hAnsiTheme="minorHAnsi"/>
-              <w:color w:val="auto"/>
-              <w:kern w:val="2"/>
-              <w:lang w:eastAsia="es-ES"/>
-              <w14:ligatures w14:val="standardContextual"/>
-            </w:rPr>
-          </w:pPr>
-          <w:hyperlink w:anchor="_Toc241479895" w:history="1">
-            <w:r>
-              <w:rPr>
-                <w:rStyle w:val="Hipervnculo"/>
-              </w:rPr>
-              <w:t>2.7.1</w:t>
-            </w:r>
-            <w:r>
-              <w:rPr>
-                <w:rFonts w:asciiTheme="minorHAnsi" w:eastAsiaTheme="minorEastAsia" w:hAnsiTheme="minorHAnsi"/>
-                <w:color w:val="auto"/>
-                <w:kern w:val="2"/>
-                <w:lang w:eastAsia="es-ES"/>
-                <w14:ligatures w14:val="standardContextual"/>
-              </w:rPr>
-              <w:tab/>
-            </w:r>
-            <w:r>
-              <w:rPr>
-                <w:rStyle w:val="Hipervnculo"/>
-              </w:rPr>
-              <w:t>QA</w:t>
-            </w:r>
-            <w:r>
-              <w:rPr>
-                <w:webHidden/>
-              </w:rPr>
-              <w:tab/>
-            </w:r>
-            <w:r>
-              <w:rPr>
-                <w:webHidden/>
-              </w:rPr>
-              <w:fldChar w:fldCharType="begin"/>
-            </w:r>
-            <w:r>
-              <w:rPr>
-                <w:webHidden/>
-              </w:rPr>
-              <w:instrText xml:space="preserve"> PAGEREF _Toc241479895 \h </w:instrText>
-            </w:r>
-            <w:r>
-              <w:rPr>
-                <w:webHidden/>
-              </w:rPr>
-            </w:r>
-            <w:r>
-              <w:rPr>
-                <w:webHidden/>
-              </w:rPr>
-              <w:fldChar w:fldCharType="separate"/>
-            </w:r>
-            <w:r>
-              <w:rPr>
-                <w:webHidden/>
-              </w:rPr>
-              <w:t>11</w:t>
-            </w:r>
-            <w:r>
-              <w:rPr>
-                <w:webHidden/>
-              </w:rPr>
-              <w:fldChar w:fldCharType="end"/>
-            </w:r>
-          </w:hyperlink>
-        </w:p>
-        <w:p>
-          <w:pPr>
-            <w:pStyle w:val="TDC3"/>
-            <w:tabs>
-              <w:tab w:val="left" w:pos="1200"/>
-              <w:tab w:val="right" w:leader="dot" w:pos="9060"/>
-            </w:tabs>
-            <w:rPr>
-              <w:rFonts w:asciiTheme="minorHAnsi" w:eastAsiaTheme="minorEastAsia" w:hAnsiTheme="minorHAnsi"/>
-              <w:color w:val="auto"/>
-              <w:kern w:val="2"/>
-              <w:lang w:eastAsia="es-ES"/>
-              <w14:ligatures w14:val="standardContextual"/>
-            </w:rPr>
-          </w:pPr>
-          <w:hyperlink w:anchor="_Toc241479896" w:history="1">
-            <w:r>
-              <w:rPr>
-                <w:rStyle w:val="Hipervnculo"/>
-              </w:rPr>
-              <w:t>2.7.2</w:t>
-            </w:r>
-            <w:r>
-              <w:rPr>
-                <w:rFonts w:asciiTheme="minorHAnsi" w:eastAsiaTheme="minorEastAsia" w:hAnsiTheme="minorHAnsi"/>
-                <w:color w:val="auto"/>
-                <w:kern w:val="2"/>
-                <w:lang w:eastAsia="es-ES"/>
-                <w14:ligatures w14:val="standardContextual"/>
-              </w:rPr>
-              <w:tab/>
-            </w:r>
-            <w:r>
-              <w:rPr>
-                <w:rStyle w:val="Hipervnculo"/>
-              </w:rPr>
-              <w:t>Documentación mínima imprescindible</w:t>
-            </w:r>
-            <w:r>
-              <w:rPr>
-                <w:webHidden/>
-              </w:rPr>
-              <w:tab/>
-            </w:r>
-            <w:r>
-              <w:rPr>
-                <w:webHidden/>
-              </w:rPr>
-              <w:fldChar w:fldCharType="begin"/>
-            </w:r>
-            <w:r>
-              <w:rPr>
-                <w:webHidden/>
-              </w:rPr>
-              <w:instrText xml:space="preserve"> PAGEREF _Toc241479896 \h </w:instrText>
-            </w:r>
-            <w:r>
-              <w:rPr>
-                <w:webHidden/>
-              </w:rPr>
-            </w:r>
-            <w:r>
-              <w:rPr>
-                <w:webHidden/>
-              </w:rPr>
-              <w:fldChar w:fldCharType="separate"/>
-            </w:r>
-            <w:r>
-              <w:rPr>
-                <w:webHidden/>
-              </w:rPr>
-              <w:t>11</w:t>
-            </w:r>
-            <w:r>
-              <w:rPr>
-                <w:webHidden/>
-              </w:rPr>
-              <w:fldChar w:fldCharType="end"/>
-            </w:r>
-          </w:hyperlink>
-        </w:p>
-        <w:p>
-          <w:pPr>
-            <w:pStyle w:val="TDC1"/>
-            <w:tabs>
-              <w:tab w:val="left" w:pos="570"/>
-              <w:tab w:val="right" w:leader="dot" w:pos="9060"/>
-            </w:tabs>
-            <w:rPr>
-              <w:rFonts w:asciiTheme="minorHAnsi" w:eastAsiaTheme="minorEastAsia" w:hAnsiTheme="minorHAnsi"/>
-              <w:b w:val="0"/>
-              <w:bCs w:val="0"/>
-              <w:caps w:val="0"/>
-              <w:color w:val="auto"/>
-              <w:kern w:val="2"/>
-              <w:sz w:val="24"/>
-              <w:szCs w:val="24"/>
-              <w:lang w:eastAsia="es-ES"/>
-              <w14:ligatures w14:val="standardContextual"/>
-            </w:rPr>
-          </w:pPr>
-          <w:hyperlink w:anchor="_Toc241479897" w:history="1">
-            <w:r>
-              <w:rPr>
-                <w:rStyle w:val="Hipervnculo"/>
-              </w:rPr>
-              <w:t>3</w:t>
-            </w:r>
-            <w:r>
-              <w:rPr>
-                <w:rFonts w:asciiTheme="minorHAnsi" w:eastAsiaTheme="minorEastAsia" w:hAnsiTheme="minorHAnsi"/>
-                <w:b w:val="0"/>
-                <w:bCs w:val="0"/>
-                <w:caps w:val="0"/>
-                <w:color w:val="auto"/>
-                <w:kern w:val="2"/>
-                <w:sz w:val="24"/>
-                <w:szCs w:val="24"/>
-                <w:lang w:eastAsia="es-ES"/>
-                <w14:ligatures w14:val="standardContextual"/>
-              </w:rPr>
-              <w:tab/>
-            </w:r>
-            <w:r>
-              <w:rPr>
-                <w:rStyle w:val="Hipervnculo"/>
-              </w:rPr>
-              <w:t>Notas proceso</w:t>
-            </w:r>
-            <w:r>
-              <w:rPr>
-                <w:webHidden/>
-              </w:rPr>
-              <w:tab/>
-            </w:r>
-            <w:r>
-              <w:rPr>
-                <w:webHidden/>
-              </w:rPr>
-              <w:fldChar w:fldCharType="begin"/>
-            </w:r>
-            <w:r>
-              <w:rPr>
-                <w:webHidden/>
-              </w:rPr>
-              <w:instrText xml:space="preserve"> PAGEREF _Toc241479897 \h </w:instrText>
-            </w:r>
-            <w:r>
-              <w:rPr>
-                <w:webHidden/>
-              </w:rPr>
-            </w:r>
-            <w:r>
-              <w:rPr>
-                <w:webHidden/>
-              </w:rPr>
-              <w:fldChar w:fldCharType="separate"/>
-            </w:r>
-            <w:r>
-              <w:rPr>
-                <w:webHidden/>
-              </w:rPr>
-              <w:t>12</w:t>
             </w:r>
             <w:r>
               <w:rPr>
@@ -1959,6 +1949,7 @@
             </w:rPr>
           </w:pPr>
           <w:r>
+            <w:lastRenderedPageBreak/>
             <w:fldChar w:fldCharType="end"/>
           </w:r>
         </w:p>
@@ -2285,7 +2276,7 @@
       <w:pPr>
         <w:pStyle w:val="Ttulo1"/>
       </w:pPr>
-      <w:bookmarkStart w:id="3" w:name="_Toc241479881"/>
+      <w:bookmarkStart w:id="3" w:name="_Toc242090579"/>
       <w:r>
         <w:lastRenderedPageBreak/>
         <w:t>Desarrollo</w:t>
@@ -2296,7 +2287,7 @@
       <w:pPr>
         <w:pStyle w:val="Ttulo2"/>
       </w:pPr>
-      <w:bookmarkStart w:id="4" w:name="_Toc241479882"/>
+      <w:bookmarkStart w:id="4" w:name="_Toc242090580"/>
       <w:r>
         <w:t xml:space="preserve">CORE. </w:t>
       </w:r>
@@ -2309,7 +2300,7 @@
       <w:pPr>
         <w:pStyle w:val="Ttulo3"/>
       </w:pPr>
-      <w:bookmarkStart w:id="5" w:name="_Toc241479883"/>
+      <w:bookmarkStart w:id="5" w:name="_Toc242090581"/>
       <w:r>
         <w:t>Objetivo</w:t>
       </w:r>
@@ -2420,9 +2411,11 @@
       <w:pPr>
         <w:pStyle w:val="Ttulo3"/>
       </w:pPr>
+      <w:bookmarkStart w:id="6" w:name="_Toc242090582"/>
       <w:r>
         <w:t>Arquitectura</w:t>
       </w:r>
+      <w:bookmarkEnd w:id="6"/>
     </w:p>
     <w:p>
       <w:pPr>
@@ -2678,7 +2671,7 @@
           <w:lang w:val="en-US"/>
         </w:rPr>
       </w:pPr>
-      <w:bookmarkStart w:id="6" w:name="_Toc241479886"/>
+      <w:bookmarkStart w:id="7" w:name="_Toc242090583"/>
       <w:r>
         <w:rPr>
           <w:lang w:val="en-US"/>
@@ -2703,7 +2696,7 @@
         </w:rPr>
         <w:t>BASE</w:t>
       </w:r>
-      <w:bookmarkEnd w:id="6"/>
+      <w:bookmarkEnd w:id="7"/>
     </w:p>
     <w:p>
       <w:pPr>
@@ -2800,7 +2793,7 @@
       <w:pPr>
         <w:pStyle w:val="Ttulo2"/>
       </w:pPr>
-      <w:bookmarkStart w:id="7" w:name="_Toc241479888"/>
+      <w:bookmarkStart w:id="8" w:name="_Toc242090584"/>
       <w:r>
         <w:rPr>
           <w:lang w:val="en-US"/>
@@ -2819,7 +2812,7 @@
         </w:rPr>
         <w:t xml:space="preserve"> —SharePoint Layouts</w:t>
       </w:r>
-      <w:bookmarkEnd w:id="7"/>
+      <w:bookmarkEnd w:id="8"/>
     </w:p>
     <w:p>
       <w:r>
@@ -2997,9 +2990,11 @@
       <w:pPr>
         <w:pStyle w:val="Ttulo3"/>
       </w:pPr>
+      <w:bookmarkStart w:id="9" w:name="_Toc242090585"/>
       <w:r>
         <w:t>HERRIZ_home</w:t>
       </w:r>
+      <w:bookmarkEnd w:id="9"/>
     </w:p>
     <w:p>
       <w:r>
@@ -3018,10 +3013,12 @@
       <w:pPr>
         <w:pStyle w:val="Ttulo3"/>
       </w:pPr>
+      <w:bookmarkStart w:id="10" w:name="_Toc242090586"/>
       <w:r>
         <w:lastRenderedPageBreak/>
         <w:t>Listado</w:t>
       </w:r>
+      <w:bookmarkEnd w:id="10"/>
     </w:p>
     <w:p>
       <w:r>
@@ -3046,9 +3043,11 @@
       <w:pPr>
         <w:pStyle w:val="Ttulo3"/>
       </w:pPr>
+      <w:bookmarkStart w:id="11" w:name="_Toc242090587"/>
       <w:r>
         <w:t>Detalle Evento</w:t>
       </w:r>
+      <w:bookmarkEnd w:id="11"/>
     </w:p>
     <w:p>
       <w:r>
@@ -3162,7 +3161,7 @@
       <w:pPr>
         <w:pStyle w:val="Ttulo2"/>
       </w:pPr>
-      <w:bookmarkStart w:id="8" w:name="_Toc241479889"/>
+      <w:bookmarkStart w:id="12" w:name="_Toc242090588"/>
       <w:r>
         <w:t>F</w:t>
       </w:r>
@@ -3173,9 +3172,12 @@
         <w:t>—</w:t>
       </w:r>
       <w:r>
-        <w:t xml:space="preserve">Componentes y estructuras </w:t>
-      </w:r>
-      <w:bookmarkEnd w:id="8"/>
+        <w:t>Componentes y estructuras</w:t>
+      </w:r>
+      <w:bookmarkEnd w:id="12"/>
+      <w:r>
+        <w:t xml:space="preserve"> </w:t>
+      </w:r>
     </w:p>
     <w:p>
       <w:r>
@@ -3245,9 +3247,11 @@
           <w:lang w:val="en-US"/>
         </w:rPr>
       </w:pPr>
+      <w:bookmarkStart w:id="13" w:name="_Toc242090589"/>
       <w:r>
         <w:t>Slider → usa cards</w:t>
       </w:r>
+      <w:bookmarkEnd w:id="13"/>
     </w:p>
     <w:p>
       <w:pPr>
@@ -3263,9 +3267,11 @@
       <w:pPr>
         <w:pStyle w:val="Ttulo3"/>
       </w:pPr>
+      <w:bookmarkStart w:id="14" w:name="_Toc242090590"/>
       <w:r>
         <w:t>Card base → reutilizable en todo</w:t>
       </w:r>
+      <w:bookmarkEnd w:id="14"/>
     </w:p>
     <w:p>
       <w:r>
@@ -3276,12 +3282,14 @@
       <w:pPr>
         <w:pStyle w:val="Ttulo3"/>
       </w:pPr>
+      <w:bookmarkStart w:id="15" w:name="_Toc242090591"/>
       <w:r>
         <w:t>Wrapper</w:t>
       </w:r>
       <w:r>
         <w:t xml:space="preserve"> → branding fuerte</w:t>
       </w:r>
+      <w:bookmarkEnd w:id="15"/>
     </w:p>
     <w:p>
       <w:r>
@@ -3383,14 +3391,14 @@
           <w:lang w:val="en-US"/>
         </w:rPr>
       </w:pPr>
-      <w:bookmarkStart w:id="9" w:name="_Toc241479892"/>
+      <w:bookmarkStart w:id="16" w:name="_Toc242090592"/>
       <w:r>
         <w:rPr>
           <w:lang w:val="en-US"/>
         </w:rPr>
         <w:t>F4 — Theming (multi-ayuntamiento)</w:t>
       </w:r>
-      <w:bookmarkEnd w:id="9"/>
+      <w:bookmarkEnd w:id="16"/>
     </w:p>
     <w:p>
       <w:r>
@@ -3795,7 +3803,7 @@
       <w:pPr>
         <w:pStyle w:val="Citadestacada"/>
       </w:pPr>
-      <w:commentRangeStart w:id="10"/>
+      <w:commentRangeStart w:id="17"/>
       <w:r>
         <w:t>1 theme completo validado</w:t>
       </w:r>
@@ -3811,28 +3819,28 @@
       <w:r>
         <w:t>patrón replicable</w:t>
       </w:r>
-      <w:commentRangeEnd w:id="10"/>
+      <w:commentRangeEnd w:id="17"/>
       <w:r>
         <w:rPr>
           <w:rStyle w:val="Refdecomentario"/>
           <w:sz w:val="19"/>
           <w:szCs w:val="22"/>
         </w:rPr>
-        <w:commentReference w:id="10"/>
+        <w:commentReference w:id="17"/>
       </w:r>
     </w:p>
     <w:p>
       <w:pPr>
         <w:pStyle w:val="Ttulo2"/>
       </w:pPr>
-      <w:bookmarkStart w:id="11" w:name="_Toc241479893"/>
+      <w:bookmarkStart w:id="18" w:name="_Toc242090593"/>
       <w:r>
         <w:t xml:space="preserve">F5 — </w:t>
       </w:r>
       <w:r>
         <w:t>VARIANTES DETALLES</w:t>
       </w:r>
-      <w:bookmarkEnd w:id="11"/>
+      <w:bookmarkEnd w:id="18"/>
     </w:p>
     <w:p>
       <w:r>
@@ -3848,25 +3856,100 @@
       <w:pPr>
         <w:pStyle w:val="Ttulo2"/>
       </w:pPr>
-      <w:bookmarkStart w:id="12" w:name="_Toc241479894"/>
+      <w:bookmarkStart w:id="19" w:name="_Toc242090594"/>
       <w:r>
         <w:lastRenderedPageBreak/>
+        <w:t>Componentes</w:t>
+      </w:r>
+    </w:p>
+    <w:p>
+      <w:pPr>
+        <w:pStyle w:val="Ttulo3"/>
+      </w:pPr>
+      <w:r>
+        <w:t>Común</w:t>
+      </w:r>
+    </w:p>
+    <w:p>
+      <w:pPr>
+        <w:pStyle w:val="Ttulo4"/>
+      </w:pPr>
+      <w:r>
+        <w:t>Título</w:t>
+      </w:r>
+    </w:p>
+    <w:p>
+      <w:r>
+        <w:t>Título= “Title;”</w:t>
+      </w:r>
+    </w:p>
+    <w:p>
+      <w:pPr>
+        <w:pStyle w:val="Ttulo4"/>
+      </w:pPr>
+      <w:r>
+        <w:t>Mostrar más</w:t>
+      </w:r>
+    </w:p>
+    <w:p>
+      <w:r>
+        <w:t>xxx</w:t>
+      </w:r>
+    </w:p>
+    <w:p>
+      <w:pPr>
+        <w:pStyle w:val="Ttulo3"/>
+      </w:pPr>
+      <w:r>
+        <w:t>Slider</w:t>
+      </w:r>
+    </w:p>
+    <w:p>
+      <w:r>
+        <w:t>Xx</w:t>
+      </w:r>
+    </w:p>
+    <w:p>
+      <w:r>
+        <w:t>Lista Cards</w:t>
+      </w:r>
+    </w:p>
+    <w:p>
+      <w:r>
+        <w:t>Configuración de wp</w:t>
+      </w:r>
+    </w:p>
+    <w:p>
+      <w:r>
+        <w:t>Galería</w:t>
+      </w:r>
+    </w:p>
+    <w:p>
+      <w:r>
+        <w:t>xx</w:t>
+      </w:r>
+    </w:p>
+    <w:p>
+      <w:pPr>
+        <w:pStyle w:val="Ttulo2"/>
+      </w:pPr>
+      <w:r>
         <w:t xml:space="preserve">F6 — </w:t>
       </w:r>
       <w:r>
         <w:t>QA + documentación</w:t>
       </w:r>
-      <w:bookmarkEnd w:id="12"/>
+      <w:bookmarkEnd w:id="19"/>
     </w:p>
     <w:p>
       <w:pPr>
         <w:pStyle w:val="Ttulo3"/>
       </w:pPr>
-      <w:bookmarkStart w:id="13" w:name="_Toc241479895"/>
+      <w:bookmarkStart w:id="20" w:name="_Toc242090595"/>
       <w:r>
         <w:t>QA</w:t>
       </w:r>
-      <w:bookmarkEnd w:id="13"/>
+      <w:bookmarkEnd w:id="20"/>
     </w:p>
     <w:p>
       <w:r>
@@ -3884,7 +3967,7 @@
       <w:r>
         <w:t>A</w:t>
       </w:r>
-      <w:commentRangeStart w:id="14"/>
+      <w:commentRangeStart w:id="21"/>
       <w:r>
         <w:t xml:space="preserve">ccesibilidad </w:t>
       </w:r>
@@ -3918,14 +4001,14 @@
       <w:r>
         <w:t>onsistencia visual</w:t>
       </w:r>
-      <w:commentRangeEnd w:id="14"/>
+      <w:commentRangeEnd w:id="21"/>
       <w:r>
         <w:rPr>
           <w:rStyle w:val="Refdecomentario"/>
           <w:sz w:val="19"/>
           <w:szCs w:val="22"/>
         </w:rPr>
-        <w:commentReference w:id="14"/>
+        <w:commentReference w:id="21"/>
       </w:r>
     </w:p>
     <w:p>
@@ -3955,14 +4038,15 @@
           <w:rStyle w:val="Ttulo3Car"/>
         </w:rPr>
       </w:pPr>
-      <w:bookmarkStart w:id="15" w:name="_Toc241479896"/>
+      <w:bookmarkStart w:id="22" w:name="_Toc242090596"/>
       <w:r>
         <w:rPr>
           <w:rStyle w:val="Ttulo3Car"/>
         </w:rPr>
+        <w:lastRenderedPageBreak/>
         <w:t>Documentación mínima imprescindible</w:t>
       </w:r>
-      <w:bookmarkEnd w:id="15"/>
+      <w:bookmarkEnd w:id="22"/>
     </w:p>
     <w:p>
       <w:r>
@@ -4149,11 +4233,11 @@
       <w:pPr>
         <w:pStyle w:val="Ttulo1"/>
       </w:pPr>
-      <w:bookmarkStart w:id="16" w:name="_Toc241479897"/>
+      <w:bookmarkStart w:id="23" w:name="_Toc242090597"/>
       <w:r>
         <w:t>Notas proceso</w:t>
       </w:r>
-      <w:bookmarkEnd w:id="16"/>
+      <w:bookmarkEnd w:id="23"/>
     </w:p>
     <w:p>
       <w:pPr>
@@ -4217,7 +4301,6 @@
     </w:p>
     <w:p>
       <w:r>
-        <w:lastRenderedPageBreak/>
         <w:t xml:space="preserve">Los archivos old están en </w:t>
       </w:r>
       <w:hyperlink r:id="rId24" w:history="1">
@@ -4307,6 +4390,7 @@
         <w:rPr>
           <w:lang w:val="en-US"/>
         </w:rPr>
+        <w:lastRenderedPageBreak/>
         <w:t>En sharepoint</w:t>
       </w:r>
     </w:p>
@@ -4458,7 +4542,6 @@
         <w:rPr>
           <w:lang w:val="en-US"/>
         </w:rPr>
-        <w:lastRenderedPageBreak/>
         <w:t>variables</w:t>
       </w:r>
     </w:p>
@@ -4693,7 +4776,7 @@
 
 <file path=word/comments.xml><?xml version="1.0" encoding="utf-8"?>
 <w:comments xmlns:wpc="http://schemas.microsoft.com/office/word/2010/wordprocessingCanvas" xmlns:cx="http://schemas.microsoft.com/office/drawing/2014/chartex" xmlns:cx1="http://schemas.microsoft.com/office/drawing/2015/9/8/chartex" xmlns:cx2="http://schemas.microsoft.com/office/drawing/2015/10/21/chartex" xmlns:cx3="http://schemas.microsoft.com/office/drawing/2016/5/9/chartex" xmlns:cx4="http://schemas.microsoft.com/office/drawing/2016/5/10/chartex" xmlns:cx5="http://schemas.microsoft.com/office/drawing/2016/5/11/chartex" xmlns:cx6="http://schemas.microsoft.com/office/drawing/2016/5/12/chartex" xmlns:cx7="http://schemas.microsoft.com/office/drawing/2016/5/13/chartex" xmlns:cx8="http://schemas.microsoft.com/office/drawing/2016/5/14/chartex" xmlns:mc="http://schemas.openxmlformats.org/markup-compatibility/2006" xmlns:aink="http://schemas.microsoft.com/office/drawing/2016/ink" xmlns:am3d="http://schemas.microsoft.com/office/drawing/2017/model3d" xmlns:o="urn:schemas-microsoft-com:office:office" xmlns:oel="http://schemas.microsoft.com/office/2019/extlst" xmlns:r="http://schemas.openxmlformats.org/officeDocument/2006/relationships" xmlns:m="http://schemas.openxmlformats.org/officeDocument/2006/math" xmlns:v="urn:schemas-microsoft-com:vml" xmlns:wp14="http://schemas.microsoft.com/office/word/2010/wordprocessingDrawing" xmlns:wp="http://schemas.openxmlformats.org/drawingml/2006/wordprocessingDrawing" xmlns:w10="urn:schemas-microsoft-com:office:word" xmlns:w="http://schemas.openxmlformats.org/wordprocessingml/2006/main" xmlns:w14="http://schemas.microsoft.com/office/word/2010/wordml" xmlns:w15="http://schemas.microsoft.com/office/word/2012/wordml" xmlns:w16cex="http://schemas.microsoft.com/office/word/2018/wordml/cex" xmlns:w16cid="http://schemas.microsoft.com/office/word/2016/wordml/cid" xmlns:w16="http://schemas.microsoft.com/office/word/2018/wordml" xmlns:w16du="http://schemas.microsoft.com/office/word/2023/wordml/word16du" xmlns:w16sdtdh="http://schemas.microsoft.com/office/word/2020/wordml/sdtdatahash" xmlns:w16sdtfl="http://schemas.microsoft.com/office/word/2024/wordml/sdtformatlock" xmlns:w16se="http://schemas.microsoft.com/office/word/2015/wordml/symex" xmlns:wpg="http://schemas.microsoft.com/office/word/2010/wordprocessingGroup" xmlns:wpi="http://schemas.microsoft.com/office/word/2010/wordprocessingInk" xmlns:wne="http://schemas.microsoft.com/office/word/2006/wordml" xmlns:wps="http://schemas.microsoft.com/office/word/2010/wordprocessingShape" mc:Ignorable="w14 w15 w16se w16cid w16 w16cex w16sdtdh w16sdtfl w16du wp14">
-  <w:comment w:id="10" w:author="Susana Garcia Antolin" w:date="2026-05-18T08:31:00Z" w:initials="SG">
+  <w:comment w:id="17" w:author="Susana Garcia Antolin" w:date="2026-05-18T08:31:00Z" w:initials="SG">
     <w:p>
       <w:pPr>
         <w:pStyle w:val="Textocomentario"/>
@@ -4710,7 +4793,7 @@
       </w:r>
     </w:p>
   </w:comment>
-  <w:comment w:id="14" w:author="Susana Garcia Antolin" w:date="2026-05-18T08:34:00Z" w:initials="SG">
+  <w:comment w:id="21" w:author="Susana Garcia Antolin" w:date="2026-05-18T08:34:00Z" w:initials="SG">
     <w:p>
       <w:pPr>
         <w:pStyle w:val="Textocomentario"/>
@@ -4899,7 +4982,7 @@
           <w:szCs w:val="19"/>
           <w:lang w:eastAsia="es-ES"/>
         </w:rPr>
-        <w:t>30/09/2026</w:t>
+        <w:t>05/10/2026</w:t>
       </w:r>
     </w:fldSimple>
     <w:r>
@@ -5096,7 +5179,7 @@
               <w:rPr>
                 <w:rFonts w:eastAsiaTheme="minorEastAsia" w:cs="Times New Roman"/>
               </w:rPr>
-              <w:t>30/09/2026</w:t>
+              <w:t>05/10/2026</w:t>
             </w:r>
           </w:fldSimple>
         </w:p>
@@ -5341,7 +5424,7 @@
               <w:rPr>
                 <w:rFonts w:eastAsiaTheme="minorEastAsia" w:cs="Times New Roman"/>
               </w:rPr>
-              <w:t>30/09/2026</w:t>
+              <w:t>05/10/2026</w:t>
             </w:r>
           </w:fldSimple>
         </w:p>
@@ -9192,6 +9275,36 @@
   </w:num>
   <w:num w:numId="19" w16cid:durableId="1993826108">
     <w:abstractNumId w:val="7"/>
+  </w:num>
+  <w:num w:numId="20" w16cid:durableId="1619725015">
+    <w:abstractNumId w:val="14"/>
+    <w:lvlOverride w:ilvl="0">
+      <w:startOverride w:val="1"/>
+    </w:lvlOverride>
+    <w:lvlOverride w:ilvl="1">
+      <w:startOverride w:val="1"/>
+    </w:lvlOverride>
+    <w:lvlOverride w:ilvl="2">
+      <w:startOverride w:val="1"/>
+    </w:lvlOverride>
+    <w:lvlOverride w:ilvl="3">
+      <w:startOverride w:val="1"/>
+    </w:lvlOverride>
+    <w:lvlOverride w:ilvl="4">
+      <w:startOverride w:val="1"/>
+    </w:lvlOverride>
+    <w:lvlOverride w:ilvl="5">
+      <w:startOverride w:val="1"/>
+    </w:lvlOverride>
+    <w:lvlOverride w:ilvl="6">
+      <w:startOverride w:val="1"/>
+    </w:lvlOverride>
+    <w:lvlOverride w:ilvl="7">
+      <w:startOverride w:val="1"/>
+    </w:lvlOverride>
+    <w:lvlOverride w:ilvl="8">
+      <w:startOverride w:val="1"/>
+    </w:lvlOverride>
   </w:num>
   <w:numIdMacAtCleanup w:val="9"/>
 </w:numbering>
@@ -10833,6 +10946,15 @@
 </file>
 
 <file path=customXml/item1.xml><?xml version="1.0" encoding="utf-8"?>
+<?mso-contentType ?>
+<FormTemplates xmlns="http://schemas.microsoft.com/sharepoint/v3/contenttype/forms">
+  <Display>DocumentLibraryForm</Display>
+  <Edit>DocumentLibraryForm</Edit>
+  <New>DocumentLibraryForm</New>
+</FormTemplates>
+</file>
+
+<file path=customXml/item2.xml><?xml version="1.0" encoding="utf-8"?>
 <ct:contentTypeSchema xmlns:ct="http://schemas.microsoft.com/office/2006/metadata/contentType" xmlns:ma="http://schemas.microsoft.com/office/2006/metadata/properties/metaAttributes" ct:_="" ma:_="" ma:contentTypeName="Document" ma:contentTypeID="0x0101002A728C99327E314A9E3D8507B9892F0B" ma:contentTypeVersion="13" ma:contentTypeDescription="Create a new document." ma:contentTypeScope="" ma:versionID="b5fc1c0635d4e73da9275d771ca38336">
   <xsd:schema xmlns:xsd="http://www.w3.org/2001/XMLSchema" xmlns:xs="http://www.w3.org/2001/XMLSchema" xmlns:p="http://schemas.microsoft.com/office/2006/metadata/properties" xmlns:ns2="46feb8f5-d8ea-4df4-b5f6-409aa75778c2" xmlns:ns3="b8fa4ece-32bd-494d-92b0-3bc11d82a592" targetNamespace="http://schemas.microsoft.com/office/2006/metadata/properties" ma:root="true" ma:fieldsID="ac607f1556679ed7368537c7e370bd02" ns2:_="" ns3:_="">
     <xsd:import namespace="46feb8f5-d8ea-4df4-b5f6-409aa75778c2"/>
@@ -11055,20 +11177,7 @@
 </ct:contentTypeSchema>
 </file>
 
-<file path=customXml/item2.xml><?xml version="1.0" encoding="utf-8"?>
-<?mso-contentType ?>
-<FormTemplates xmlns="http://schemas.microsoft.com/sharepoint/v3/contenttype/forms">
-  <Display>DocumentLibraryForm</Display>
-  <Edit>DocumentLibraryForm</Edit>
-  <New>DocumentLibraryForm</New>
-</FormTemplates>
-</file>
-
 <file path=customXml/item3.xml><?xml version="1.0" encoding="utf-8"?>
-<b:Sources xmlns:b="http://schemas.openxmlformats.org/officeDocument/2006/bibliography" xmlns="http://schemas.openxmlformats.org/officeDocument/2006/bibliography" SelectedStyle="\IEEE2006OfficeOnline.xsl" StyleName="IEEE 2006"/>
-</file>
-
-<file path=customXml/item4.xml><?xml version="1.0" encoding="utf-8"?>
 <p:properties xmlns:p="http://schemas.microsoft.com/office/2006/metadata/properties" xmlns:xsi="http://www.w3.org/2001/XMLSchema-instance" xmlns:pc="http://schemas.microsoft.com/office/infopath/2007/PartnerControls">
   <documentManagement>
     <TaxCatchAll xmlns="b8fa4ece-32bd-494d-92b0-3bc11d82a592" xsi:nil="true"/>
@@ -11086,7 +11195,19 @@
 </p:properties>
 </file>
 
+<file path=customXml/item4.xml><?xml version="1.0" encoding="utf-8"?>
+<b:Sources xmlns:b="http://schemas.openxmlformats.org/officeDocument/2006/bibliography" xmlns="http://schemas.openxmlformats.org/officeDocument/2006/bibliography" SelectedStyle="\IEEE2006OfficeOnline.xsl" StyleName="IEEE 2006"/>
+</file>
+
 <file path=customXml/itemProps1.xml><?xml version="1.0" encoding="utf-8"?>
+<ds:datastoreItem xmlns:ds="http://schemas.openxmlformats.org/officeDocument/2006/customXml" ds:itemID="{E3963B16-0441-459F-953A-186BC3218329}">
+  <ds:schemaRefs>
+    <ds:schemaRef ds:uri="http://schemas.microsoft.com/sharepoint/v3/contenttype/forms"/>
+  </ds:schemaRefs>
+</ds:datastoreItem>
+</file>
+
+<file path=customXml/itemProps2.xml><?xml version="1.0" encoding="utf-8"?>
 <ds:datastoreItem xmlns:ds="http://schemas.openxmlformats.org/officeDocument/2006/customXml" ds:itemID="{5BD0AF32-4E47-430D-984B-E5355CDE6BD6}">
   <ds:schemaRefs>
     <ds:schemaRef ds:uri="http://schemas.microsoft.com/office/2006/metadata/contentType"/>
@@ -11105,23 +11226,7 @@
 </ds:datastoreItem>
 </file>
 
-<file path=customXml/itemProps2.xml><?xml version="1.0" encoding="utf-8"?>
-<ds:datastoreItem xmlns:ds="http://schemas.openxmlformats.org/officeDocument/2006/customXml" ds:itemID="{E3963B16-0441-459F-953A-186BC3218329}">
-  <ds:schemaRefs>
-    <ds:schemaRef ds:uri="http://schemas.microsoft.com/sharepoint/v3/contenttype/forms"/>
-  </ds:schemaRefs>
-</ds:datastoreItem>
-</file>
-
 <file path=customXml/itemProps3.xml><?xml version="1.0" encoding="utf-8"?>
-<ds:datastoreItem xmlns:ds="http://schemas.openxmlformats.org/officeDocument/2006/customXml" ds:itemID="{D5F18D91-3107-4E1C-8DD9-D0BC21D9FE26}">
-  <ds:schemaRefs>
-    <ds:schemaRef ds:uri="http://schemas.openxmlformats.org/officeDocument/2006/bibliography"/>
-  </ds:schemaRefs>
-</ds:datastoreItem>
-</file>
-
-<file path=customXml/itemProps4.xml><?xml version="1.0" encoding="utf-8"?>
 <ds:datastoreItem xmlns:ds="http://schemas.openxmlformats.org/officeDocument/2006/customXml" ds:itemID="{104AAB3F-039F-4529-A0CD-BBCC52A5D8C9}">
   <ds:schemaRefs>
     <ds:schemaRef ds:uri="http://schemas.microsoft.com/office/2006/metadata/properties"/>
@@ -11130,4 +11235,12 @@
     <ds:schemaRef ds:uri="46feb8f5-d8ea-4df4-b5f6-409aa75778c2"/>
   </ds:schemaRefs>
 </ds:datastoreItem>
+</file>
+
+<file path=customXml/itemProps4.xml><?xml version="1.0" encoding="utf-8"?>
+<ds:datastoreItem xmlns:ds="http://schemas.openxmlformats.org/officeDocument/2006/customXml" ds:itemID="{D5F18D91-3107-4E1C-8DD9-D0BC21D9FE26}">
+  <ds:schemaRefs>
+    <ds:schemaRef ds:uri="http://schemas.openxmlformats.org/officeDocument/2006/bibliography"/>
+  </ds:schemaRefs>
+</ds:datastoreItem>
 </file>
</xml_diff>

<commit_message>
orden y ajustes estilo detalle patrimonio
</commit_message>
<xml_diff>
--- a/src/Documentacion/BIS011APPSY-Themes_HERRIZ-2026_09_25-v1_00.docx
+++ b/src/Documentacion/BIS011APPSY-Themes_HERRIZ-2026_09_25-v1_00.docx
@@ -3869,6 +3869,12 @@
       <w:r>
         <w:t>Común</w:t>
       </w:r>
+      <w:r>
+        <w:t xml:space="preserve"> </w:t>
+      </w:r>
+      <w:r>
+        <w:t>Configuración de wp</w:t>
+      </w:r>
     </w:p>
     <w:p>
       <w:pPr>
@@ -3910,23 +3916,37 @@
       </w:r>
     </w:p>
     <w:p>
+      <w:pPr>
+        <w:pStyle w:val="Ttulo3"/>
+      </w:pPr>
       <w:r>
         <w:t>Lista Cards</w:t>
       </w:r>
     </w:p>
     <w:p>
       <w:r>
-        <w:t>Configuración de wp</w:t>
-      </w:r>
-    </w:p>
-    <w:p>
+        <w:t>xxx</w:t>
+      </w:r>
+    </w:p>
+    <w:p>
+      <w:pPr>
+        <w:pStyle w:val="Ttulo3"/>
+      </w:pPr>
       <w:r>
         <w:t>Galería</w:t>
       </w:r>
     </w:p>
     <w:p>
       <w:r>
-        <w:t>xx</w:t>
+        <w:t>X</w:t>
+      </w:r>
+      <w:r>
+        <w:t>x</w:t>
+      </w:r>
+    </w:p>
+    <w:p>
+      <w:r>
+        <w:t>Simular masonry?</w:t>
       </w:r>
     </w:p>
     <w:p>
@@ -4020,6 +4040,7 @@
         </w:numPr>
       </w:pPr>
       <w:r>
+        <w:lastRenderedPageBreak/>
         <w:t>Ajustes finales</w:t>
       </w:r>
       <w:r>
@@ -4043,7 +4064,6 @@
         <w:rPr>
           <w:rStyle w:val="Ttulo3Car"/>
         </w:rPr>
-        <w:lastRenderedPageBreak/>
         <w:t>Documentación mínima imprescindible</w:t>
       </w:r>
       <w:bookmarkEnd w:id="22"/>
@@ -4377,6 +4397,7 @@
         <w:rPr>
           <w:lang w:val="en-US"/>
         </w:rPr>
+        <w:lastRenderedPageBreak/>
         <w:t>/ styles/</w:t>
       </w:r>
     </w:p>
@@ -4390,7 +4411,6 @@
         <w:rPr>
           <w:lang w:val="en-US"/>
         </w:rPr>
-        <w:lastRenderedPageBreak/>
         <w:t>En sharepoint</w:t>
       </w:r>
     </w:p>
@@ -4758,6 +4778,7 @@
         <w:rPr>
           <w:lang w:val="en-US"/>
         </w:rPr>
+        <w:lastRenderedPageBreak/>
         <w:t>assets</w:t>
       </w:r>
     </w:p>

</xml_diff>

<commit_message>
ajustes css, docus, código banner
</commit_message>
<xml_diff>
--- a/src/Documentacion/BIS011APPSY-Themes_HERRIZ-2026_09_25-v1_00.docx
+++ b/src/Documentacion/BIS011APPSY-Themes_HERRIZ-2026_09_25-v1_00.docx
@@ -84,7 +84,7 @@
       </w:pPr>
       <w:bookmarkStart w:id="0" w:name="_Toc382542072"/>
       <w:bookmarkStart w:id="1" w:name="_Toc225856305"/>
-      <w:bookmarkStart w:id="2" w:name="_Toc242090578"/>
+      <w:bookmarkStart w:id="2" w:name="_Toc242269324"/>
       <w:r>
         <w:rPr>
           <w:rFonts w:ascii="Arial" w:hAnsi="Arial" w:cs="Arial"/>
@@ -221,7 +221,7 @@
           <w:szCs w:val="24"/>
           <w:lang w:eastAsia="es-ES"/>
         </w:rPr>
-        <w:t>05/10/2026</w:t>
+        <w:t>07/10/2026</w:t>
       </w:r>
       <w:r>
         <w:rPr>
@@ -291,7 +291,7 @@
           <w:r>
             <w:fldChar w:fldCharType="separate"/>
           </w:r>
-          <w:hyperlink w:anchor="_Toc242090578" w:history="1">
+          <w:hyperlink w:anchor="_Toc242269324" w:history="1">
             <w:r>
               <w:rPr>
                 <w:rStyle w:val="Hipervnculo"/>
@@ -316,7 +316,7 @@
               <w:rPr>
                 <w:webHidden/>
               </w:rPr>
-              <w:instrText xml:space="preserve"> PAGEREF _Toc242090578 \h </w:instrText>
+              <w:instrText xml:space="preserve"> PAGEREF _Toc242269324 \h </w:instrText>
             </w:r>
             <w:r>
               <w:rPr>
@@ -363,7 +363,7 @@
               <w14:ligatures w14:val="standardContextual"/>
             </w:rPr>
           </w:pPr>
-          <w:hyperlink w:anchor="_Toc242090579" w:history="1">
+          <w:hyperlink w:anchor="_Toc242269325" w:history="1">
             <w:r>
               <w:rPr>
                 <w:rStyle w:val="Hipervnculo"/>
@@ -407,7 +407,7 @@
               <w:rPr>
                 <w:webHidden/>
               </w:rPr>
-              <w:instrText xml:space="preserve"> PAGEREF _Toc242090579 \h </w:instrText>
+              <w:instrText xml:space="preserve"> PAGEREF _Toc242269325 \h </w:instrText>
             </w:r>
             <w:r>
               <w:rPr>
@@ -451,7 +451,7 @@
               <w14:ligatures w14:val="standardContextual"/>
             </w:rPr>
           </w:pPr>
-          <w:hyperlink w:anchor="_Toc242090580" w:history="1">
+          <w:hyperlink w:anchor="_Toc242269326" w:history="1">
             <w:r>
               <w:rPr>
                 <w:rStyle w:val="Hipervnculo"/>
@@ -492,7 +492,7 @@
               <w:rPr>
                 <w:webHidden/>
               </w:rPr>
-              <w:instrText xml:space="preserve"> PAGEREF _Toc242090580 \h </w:instrText>
+              <w:instrText xml:space="preserve"> PAGEREF _Toc242269326 \h </w:instrText>
             </w:r>
             <w:r>
               <w:rPr>
@@ -534,7 +534,7 @@
               <w14:ligatures w14:val="standardContextual"/>
             </w:rPr>
           </w:pPr>
-          <w:hyperlink w:anchor="_Toc242090581" w:history="1">
+          <w:hyperlink w:anchor="_Toc242269327" w:history="1">
             <w:r>
               <w:rPr>
                 <w:rStyle w:val="Hipervnculo"/>
@@ -573,7 +573,7 @@
               <w:rPr>
                 <w:webHidden/>
               </w:rPr>
-              <w:instrText xml:space="preserve"> PAGEREF _Toc242090581 \h </w:instrText>
+              <w:instrText xml:space="preserve"> PAGEREF _Toc242269327 \h </w:instrText>
             </w:r>
             <w:r>
               <w:rPr>
@@ -615,7 +615,7 @@
               <w14:ligatures w14:val="standardContextual"/>
             </w:rPr>
           </w:pPr>
-          <w:hyperlink w:anchor="_Toc242090582" w:history="1">
+          <w:hyperlink w:anchor="_Toc242269328" w:history="1">
             <w:r>
               <w:rPr>
                 <w:rStyle w:val="Hipervnculo"/>
@@ -654,7 +654,7 @@
               <w:rPr>
                 <w:webHidden/>
               </w:rPr>
-              <w:instrText xml:space="preserve"> PAGEREF _Toc242090582 \h </w:instrText>
+              <w:instrText xml:space="preserve"> PAGEREF _Toc242269328 \h </w:instrText>
             </w:r>
             <w:r>
               <w:rPr>
@@ -698,7 +698,7 @@
               <w14:ligatures w14:val="standardContextual"/>
             </w:rPr>
           </w:pPr>
-          <w:hyperlink w:anchor="_Toc242090583" w:history="1">
+          <w:hyperlink w:anchor="_Toc242269329" w:history="1">
             <w:r>
               <w:rPr>
                 <w:rStyle w:val="Hipervnculo"/>
@@ -741,7 +741,7 @@
               <w:rPr>
                 <w:webHidden/>
               </w:rPr>
-              <w:instrText xml:space="preserve"> PAGEREF _Toc242090583 \h </w:instrText>
+              <w:instrText xml:space="preserve"> PAGEREF _Toc242269329 \h </w:instrText>
             </w:r>
             <w:r>
               <w:rPr>
@@ -785,7 +785,7 @@
               <w14:ligatures w14:val="standardContextual"/>
             </w:rPr>
           </w:pPr>
-          <w:hyperlink w:anchor="_Toc242090584" w:history="1">
+          <w:hyperlink w:anchor="_Toc242269330" w:history="1">
             <w:r>
               <w:rPr>
                 <w:rStyle w:val="Hipervnculo"/>
@@ -827,7 +827,7 @@
               <w:rPr>
                 <w:webHidden/>
               </w:rPr>
-              <w:instrText xml:space="preserve"> PAGEREF _Toc242090584 \h </w:instrText>
+              <w:instrText xml:space="preserve"> PAGEREF _Toc242269330 \h </w:instrText>
             </w:r>
             <w:r>
               <w:rPr>
@@ -869,7 +869,7 @@
               <w14:ligatures w14:val="standardContextual"/>
             </w:rPr>
           </w:pPr>
-          <w:hyperlink w:anchor="_Toc242090585" w:history="1">
+          <w:hyperlink w:anchor="_Toc242269331" w:history="1">
             <w:r>
               <w:rPr>
                 <w:rStyle w:val="Hipervnculo"/>
@@ -908,7 +908,7 @@
               <w:rPr>
                 <w:webHidden/>
               </w:rPr>
-              <w:instrText xml:space="preserve"> PAGEREF _Toc242090585 \h </w:instrText>
+              <w:instrText xml:space="preserve"> PAGEREF _Toc242269331 \h </w:instrText>
             </w:r>
             <w:r>
               <w:rPr>
@@ -950,7 +950,7 @@
               <w14:ligatures w14:val="standardContextual"/>
             </w:rPr>
           </w:pPr>
-          <w:hyperlink w:anchor="_Toc242090586" w:history="1">
+          <w:hyperlink w:anchor="_Toc242269332" w:history="1">
             <w:r>
               <w:rPr>
                 <w:rStyle w:val="Hipervnculo"/>
@@ -989,7 +989,7 @@
               <w:rPr>
                 <w:webHidden/>
               </w:rPr>
-              <w:instrText xml:space="preserve"> PAGEREF _Toc242090586 \h </w:instrText>
+              <w:instrText xml:space="preserve"> PAGEREF _Toc242269332 \h </w:instrText>
             </w:r>
             <w:r>
               <w:rPr>
@@ -1031,7 +1031,7 @@
               <w14:ligatures w14:val="standardContextual"/>
             </w:rPr>
           </w:pPr>
-          <w:hyperlink w:anchor="_Toc242090587" w:history="1">
+          <w:hyperlink w:anchor="_Toc242269333" w:history="1">
             <w:r>
               <w:rPr>
                 <w:rStyle w:val="Hipervnculo"/>
@@ -1070,7 +1070,7 @@
               <w:rPr>
                 <w:webHidden/>
               </w:rPr>
-              <w:instrText xml:space="preserve"> PAGEREF _Toc242090587 \h </w:instrText>
+              <w:instrText xml:space="preserve"> PAGEREF _Toc242269333 \h </w:instrText>
             </w:r>
             <w:r>
               <w:rPr>
@@ -1114,7 +1114,7 @@
               <w14:ligatures w14:val="standardContextual"/>
             </w:rPr>
           </w:pPr>
-          <w:hyperlink w:anchor="_Toc242090588" w:history="1">
+          <w:hyperlink w:anchor="_Toc242269334" w:history="1">
             <w:r>
               <w:rPr>
                 <w:rStyle w:val="Hipervnculo"/>
@@ -1155,7 +1155,7 @@
               <w:rPr>
                 <w:webHidden/>
               </w:rPr>
-              <w:instrText xml:space="preserve"> PAGEREF _Toc242090588 \h </w:instrText>
+              <w:instrText xml:space="preserve"> PAGEREF _Toc242269334 \h </w:instrText>
             </w:r>
             <w:r>
               <w:rPr>
@@ -1197,7 +1197,7 @@
               <w14:ligatures w14:val="standardContextual"/>
             </w:rPr>
           </w:pPr>
-          <w:hyperlink w:anchor="_Toc242090589" w:history="1">
+          <w:hyperlink w:anchor="_Toc242269335" w:history="1">
             <w:r>
               <w:rPr>
                 <w:rStyle w:val="Hipervnculo"/>
@@ -1237,7 +1237,7 @@
               <w:rPr>
                 <w:webHidden/>
               </w:rPr>
-              <w:instrText xml:space="preserve"> PAGEREF _Toc242090589 \h </w:instrText>
+              <w:instrText xml:space="preserve"> PAGEREF _Toc242269335 \h </w:instrText>
             </w:r>
             <w:r>
               <w:rPr>
@@ -1279,7 +1279,7 @@
               <w14:ligatures w14:val="standardContextual"/>
             </w:rPr>
           </w:pPr>
-          <w:hyperlink w:anchor="_Toc242090590" w:history="1">
+          <w:hyperlink w:anchor="_Toc242269336" w:history="1">
             <w:r>
               <w:rPr>
                 <w:rStyle w:val="Hipervnculo"/>
@@ -1318,7 +1318,7 @@
               <w:rPr>
                 <w:webHidden/>
               </w:rPr>
-              <w:instrText xml:space="preserve"> PAGEREF _Toc242090590 \h </w:instrText>
+              <w:instrText xml:space="preserve"> PAGEREF _Toc242269336 \h </w:instrText>
             </w:r>
             <w:r>
               <w:rPr>
@@ -1360,7 +1360,7 @@
               <w14:ligatures w14:val="standardContextual"/>
             </w:rPr>
           </w:pPr>
-          <w:hyperlink w:anchor="_Toc242090591" w:history="1">
+          <w:hyperlink w:anchor="_Toc242269337" w:history="1">
             <w:r>
               <w:rPr>
                 <w:rStyle w:val="Hipervnculo"/>
@@ -1381,7 +1381,7 @@
               <w:rPr>
                 <w:rStyle w:val="Hipervnculo"/>
               </w:rPr>
-              <w:t>Wrapper → branding fuerte</w:t>
+              <w:t>Wrapper / Banner → branding fuerte</w:t>
             </w:r>
             <w:r>
               <w:rPr>
@@ -1399,7 +1399,7 @@
               <w:rPr>
                 <w:webHidden/>
               </w:rPr>
-              <w:instrText xml:space="preserve"> PAGEREF _Toc242090591 \h </w:instrText>
+              <w:instrText xml:space="preserve"> PAGEREF _Toc242269337 \h </w:instrText>
             </w:r>
             <w:r>
               <w:rPr>
@@ -1416,7 +1416,7 @@
               <w:rPr>
                 <w:webHidden/>
               </w:rPr>
-              <w:t>8</w:t>
+              <w:t>10</w:t>
             </w:r>
             <w:r>
               <w:rPr>
@@ -1443,7 +1443,7 @@
               <w14:ligatures w14:val="standardContextual"/>
             </w:rPr>
           </w:pPr>
-          <w:hyperlink w:anchor="_Toc242090592" w:history="1">
+          <w:hyperlink w:anchor="_Toc242269338" w:history="1">
             <w:r>
               <w:rPr>
                 <w:rStyle w:val="Hipervnculo"/>
@@ -1486,7 +1486,7 @@
               <w:rPr>
                 <w:webHidden/>
               </w:rPr>
-              <w:instrText xml:space="preserve"> PAGEREF _Toc242090592 \h </w:instrText>
+              <w:instrText xml:space="preserve"> PAGEREF _Toc242269338 \h </w:instrText>
             </w:r>
             <w:r>
               <w:rPr>
@@ -1503,7 +1503,7 @@
               <w:rPr>
                 <w:webHidden/>
               </w:rPr>
-              <w:t>8</w:t>
+              <w:t>14</w:t>
             </w:r>
             <w:r>
               <w:rPr>
@@ -1530,7 +1530,7 @@
               <w14:ligatures w14:val="standardContextual"/>
             </w:rPr>
           </w:pPr>
-          <w:hyperlink w:anchor="_Toc242090593" w:history="1">
+          <w:hyperlink w:anchor="_Toc242269339" w:history="1">
             <w:r>
               <w:rPr>
                 <w:rStyle w:val="Hipervnculo"/>
@@ -1571,7 +1571,7 @@
               <w:rPr>
                 <w:webHidden/>
               </w:rPr>
-              <w:instrText xml:space="preserve"> PAGEREF _Toc242090593 \h </w:instrText>
+              <w:instrText xml:space="preserve"> PAGEREF _Toc242269339 \h </w:instrText>
             </w:r>
             <w:r>
               <w:rPr>
@@ -1588,7 +1588,7 @@
               <w:rPr>
                 <w:webHidden/>
               </w:rPr>
-              <w:t>9</w:t>
+              <w:t>15</w:t>
             </w:r>
             <w:r>
               <w:rPr>
@@ -1615,7 +1615,7 @@
               <w14:ligatures w14:val="standardContextual"/>
             </w:rPr>
           </w:pPr>
-          <w:hyperlink w:anchor="_Toc242090594" w:history="1">
+          <w:hyperlink w:anchor="_Toc242269340" w:history="1">
             <w:r>
               <w:rPr>
                 <w:rStyle w:val="Hipervnculo"/>
@@ -1638,7 +1638,7 @@
               <w:rPr>
                 <w:rStyle w:val="Hipervnculo"/>
               </w:rPr>
-              <w:t>F6 — QA + documentación</w:t>
+              <w:t>Componentes</w:t>
             </w:r>
             <w:r>
               <w:rPr>
@@ -1656,7 +1656,7 @@
               <w:rPr>
                 <w:webHidden/>
               </w:rPr>
-              <w:instrText xml:space="preserve"> PAGEREF _Toc242090594 \h </w:instrText>
+              <w:instrText xml:space="preserve"> PAGEREF _Toc242269340 \h </w:instrText>
             </w:r>
             <w:r>
               <w:rPr>
@@ -1673,7 +1673,7 @@
               <w:rPr>
                 <w:webHidden/>
               </w:rPr>
-              <w:t>10</w:t>
+              <w:t>15</w:t>
             </w:r>
             <w:r>
               <w:rPr>
@@ -1698,7 +1698,7 @@
               <w14:ligatures w14:val="standardContextual"/>
             </w:rPr>
           </w:pPr>
-          <w:hyperlink w:anchor="_Toc242090595" w:history="1">
+          <w:hyperlink w:anchor="_Toc242269341" w:history="1">
             <w:r>
               <w:rPr>
                 <w:rStyle w:val="Hipervnculo"/>
@@ -1719,7 +1719,7 @@
               <w:rPr>
                 <w:rStyle w:val="Hipervnculo"/>
               </w:rPr>
-              <w:t>QA</w:t>
+              <w:t>Común Configuración de wp</w:t>
             </w:r>
             <w:r>
               <w:rPr>
@@ -1737,7 +1737,7 @@
               <w:rPr>
                 <w:webHidden/>
               </w:rPr>
-              <w:instrText xml:space="preserve"> PAGEREF _Toc242090595 \h </w:instrText>
+              <w:instrText xml:space="preserve"> PAGEREF _Toc242269341 \h </w:instrText>
             </w:r>
             <w:r>
               <w:rPr>
@@ -1754,10 +1754,202 @@
               <w:rPr>
                 <w:webHidden/>
               </w:rPr>
-              <w:t>10</w:t>
-            </w:r>
-            <w:r>
-              <w:rPr>
+              <w:t>15</w:t>
+            </w:r>
+            <w:r>
+              <w:rPr>
+                <w:webHidden/>
+              </w:rPr>
+              <w:fldChar w:fldCharType="end"/>
+            </w:r>
+          </w:hyperlink>
+        </w:p>
+        <w:p>
+          <w:pPr>
+            <w:pStyle w:val="TDC4"/>
+            <w:tabs>
+              <w:tab w:val="left" w:pos="1440"/>
+              <w:tab w:val="right" w:leader="dot" w:pos="9060"/>
+            </w:tabs>
+            <w:rPr>
+              <w:rFonts w:asciiTheme="minorHAnsi" w:eastAsiaTheme="minorEastAsia" w:hAnsiTheme="minorHAnsi"/>
+              <w:noProof/>
+              <w:color w:val="auto"/>
+              <w:kern w:val="2"/>
+              <w:sz w:val="24"/>
+              <w:szCs w:val="24"/>
+              <w:lang w:eastAsia="es-ES"/>
+              <w14:ligatures w14:val="standardContextual"/>
+            </w:rPr>
+          </w:pPr>
+          <w:hyperlink w:anchor="_Toc242269342" w:history="1">
+            <w:r>
+              <w:rPr>
+                <w:rStyle w:val="Hipervnculo"/>
+                <w:noProof/>
+              </w:rPr>
+              <w:t>1.7.1.1</w:t>
+            </w:r>
+            <w:r>
+              <w:rPr>
+                <w:rFonts w:asciiTheme="minorHAnsi" w:eastAsiaTheme="minorEastAsia" w:hAnsiTheme="minorHAnsi"/>
+                <w:noProof/>
+                <w:color w:val="auto"/>
+                <w:kern w:val="2"/>
+                <w:sz w:val="24"/>
+                <w:szCs w:val="24"/>
+                <w:lang w:eastAsia="es-ES"/>
+                <w14:ligatures w14:val="standardContextual"/>
+              </w:rPr>
+              <w:tab/>
+            </w:r>
+            <w:r>
+              <w:rPr>
+                <w:rStyle w:val="Hipervnculo"/>
+                <w:noProof/>
+              </w:rPr>
+              <w:t>Título</w:t>
+            </w:r>
+            <w:r>
+              <w:rPr>
+                <w:noProof/>
+                <w:webHidden/>
+              </w:rPr>
+              <w:tab/>
+            </w:r>
+            <w:r>
+              <w:rPr>
+                <w:noProof/>
+                <w:webHidden/>
+              </w:rPr>
+              <w:fldChar w:fldCharType="begin"/>
+            </w:r>
+            <w:r>
+              <w:rPr>
+                <w:noProof/>
+                <w:webHidden/>
+              </w:rPr>
+              <w:instrText xml:space="preserve"> PAGEREF _Toc242269342 \h </w:instrText>
+            </w:r>
+            <w:r>
+              <w:rPr>
+                <w:noProof/>
+                <w:webHidden/>
+              </w:rPr>
+            </w:r>
+            <w:r>
+              <w:rPr>
+                <w:noProof/>
+                <w:webHidden/>
+              </w:rPr>
+              <w:fldChar w:fldCharType="separate"/>
+            </w:r>
+            <w:r>
+              <w:rPr>
+                <w:noProof/>
+                <w:webHidden/>
+              </w:rPr>
+              <w:t>15</w:t>
+            </w:r>
+            <w:r>
+              <w:rPr>
+                <w:noProof/>
+                <w:webHidden/>
+              </w:rPr>
+              <w:fldChar w:fldCharType="end"/>
+            </w:r>
+          </w:hyperlink>
+        </w:p>
+        <w:p>
+          <w:pPr>
+            <w:pStyle w:val="TDC4"/>
+            <w:tabs>
+              <w:tab w:val="left" w:pos="1440"/>
+              <w:tab w:val="right" w:leader="dot" w:pos="9060"/>
+            </w:tabs>
+            <w:rPr>
+              <w:rFonts w:asciiTheme="minorHAnsi" w:eastAsiaTheme="minorEastAsia" w:hAnsiTheme="minorHAnsi"/>
+              <w:noProof/>
+              <w:color w:val="auto"/>
+              <w:kern w:val="2"/>
+              <w:sz w:val="24"/>
+              <w:szCs w:val="24"/>
+              <w:lang w:eastAsia="es-ES"/>
+              <w14:ligatures w14:val="standardContextual"/>
+            </w:rPr>
+          </w:pPr>
+          <w:hyperlink w:anchor="_Toc242269343" w:history="1">
+            <w:r>
+              <w:rPr>
+                <w:rStyle w:val="Hipervnculo"/>
+                <w:noProof/>
+              </w:rPr>
+              <w:t>1.7.1.2</w:t>
+            </w:r>
+            <w:r>
+              <w:rPr>
+                <w:rFonts w:asciiTheme="minorHAnsi" w:eastAsiaTheme="minorEastAsia" w:hAnsiTheme="minorHAnsi"/>
+                <w:noProof/>
+                <w:color w:val="auto"/>
+                <w:kern w:val="2"/>
+                <w:sz w:val="24"/>
+                <w:szCs w:val="24"/>
+                <w:lang w:eastAsia="es-ES"/>
+                <w14:ligatures w14:val="standardContextual"/>
+              </w:rPr>
+              <w:tab/>
+            </w:r>
+            <w:r>
+              <w:rPr>
+                <w:rStyle w:val="Hipervnculo"/>
+                <w:noProof/>
+              </w:rPr>
+              <w:t>Mostrar más</w:t>
+            </w:r>
+            <w:r>
+              <w:rPr>
+                <w:noProof/>
+                <w:webHidden/>
+              </w:rPr>
+              <w:tab/>
+            </w:r>
+            <w:r>
+              <w:rPr>
+                <w:noProof/>
+                <w:webHidden/>
+              </w:rPr>
+              <w:fldChar w:fldCharType="begin"/>
+            </w:r>
+            <w:r>
+              <w:rPr>
+                <w:noProof/>
+                <w:webHidden/>
+              </w:rPr>
+              <w:instrText xml:space="preserve"> PAGEREF _Toc242269343 \h </w:instrText>
+            </w:r>
+            <w:r>
+              <w:rPr>
+                <w:noProof/>
+                <w:webHidden/>
+              </w:rPr>
+            </w:r>
+            <w:r>
+              <w:rPr>
+                <w:noProof/>
+                <w:webHidden/>
+              </w:rPr>
+              <w:fldChar w:fldCharType="separate"/>
+            </w:r>
+            <w:r>
+              <w:rPr>
+                <w:noProof/>
+                <w:webHidden/>
+              </w:rPr>
+              <w:t>16</w:t>
+            </w:r>
+            <w:r>
+              <w:rPr>
+                <w:noProof/>
                 <w:webHidden/>
               </w:rPr>
               <w:fldChar w:fldCharType="end"/>
@@ -1779,7 +1971,7 @@
               <w14:ligatures w14:val="standardContextual"/>
             </w:rPr>
           </w:pPr>
-          <w:hyperlink w:anchor="_Toc242090596" w:history="1">
+          <w:hyperlink w:anchor="_Toc242269344" w:history="1">
             <w:r>
               <w:rPr>
                 <w:rStyle w:val="Hipervnculo"/>
@@ -1800,6 +1992,415 @@
               <w:rPr>
                 <w:rStyle w:val="Hipervnculo"/>
               </w:rPr>
+              <w:t>Slider</w:t>
+            </w:r>
+            <w:r>
+              <w:rPr>
+                <w:webHidden/>
+              </w:rPr>
+              <w:tab/>
+            </w:r>
+            <w:r>
+              <w:rPr>
+                <w:webHidden/>
+              </w:rPr>
+              <w:fldChar w:fldCharType="begin"/>
+            </w:r>
+            <w:r>
+              <w:rPr>
+                <w:webHidden/>
+              </w:rPr>
+              <w:instrText xml:space="preserve"> PAGEREF _Toc242269344 \h </w:instrText>
+            </w:r>
+            <w:r>
+              <w:rPr>
+                <w:webHidden/>
+              </w:rPr>
+            </w:r>
+            <w:r>
+              <w:rPr>
+                <w:webHidden/>
+              </w:rPr>
+              <w:fldChar w:fldCharType="separate"/>
+            </w:r>
+            <w:r>
+              <w:rPr>
+                <w:webHidden/>
+              </w:rPr>
+              <w:t>16</w:t>
+            </w:r>
+            <w:r>
+              <w:rPr>
+                <w:webHidden/>
+              </w:rPr>
+              <w:fldChar w:fldCharType="end"/>
+            </w:r>
+          </w:hyperlink>
+        </w:p>
+        <w:p>
+          <w:pPr>
+            <w:pStyle w:val="TDC3"/>
+            <w:tabs>
+              <w:tab w:val="left" w:pos="1200"/>
+              <w:tab w:val="right" w:leader="dot" w:pos="9060"/>
+            </w:tabs>
+            <w:rPr>
+              <w:rFonts w:asciiTheme="minorHAnsi" w:eastAsiaTheme="minorEastAsia" w:hAnsiTheme="minorHAnsi"/>
+              <w:color w:val="auto"/>
+              <w:kern w:val="2"/>
+              <w:lang w:eastAsia="es-ES"/>
+              <w14:ligatures w14:val="standardContextual"/>
+            </w:rPr>
+          </w:pPr>
+          <w:hyperlink w:anchor="_Toc242269345" w:history="1">
+            <w:r>
+              <w:rPr>
+                <w:rStyle w:val="Hipervnculo"/>
+              </w:rPr>
+              <w:t>1.7.3</w:t>
+            </w:r>
+            <w:r>
+              <w:rPr>
+                <w:rFonts w:asciiTheme="minorHAnsi" w:eastAsiaTheme="minorEastAsia" w:hAnsiTheme="minorHAnsi"/>
+                <w:color w:val="auto"/>
+                <w:kern w:val="2"/>
+                <w:lang w:eastAsia="es-ES"/>
+                <w14:ligatures w14:val="standardContextual"/>
+              </w:rPr>
+              <w:tab/>
+            </w:r>
+            <w:r>
+              <w:rPr>
+                <w:rStyle w:val="Hipervnculo"/>
+              </w:rPr>
+              <w:t>Lista Cards</w:t>
+            </w:r>
+            <w:r>
+              <w:rPr>
+                <w:webHidden/>
+              </w:rPr>
+              <w:tab/>
+            </w:r>
+            <w:r>
+              <w:rPr>
+                <w:webHidden/>
+              </w:rPr>
+              <w:fldChar w:fldCharType="begin"/>
+            </w:r>
+            <w:r>
+              <w:rPr>
+                <w:webHidden/>
+              </w:rPr>
+              <w:instrText xml:space="preserve"> PAGEREF _Toc242269345 \h </w:instrText>
+            </w:r>
+            <w:r>
+              <w:rPr>
+                <w:webHidden/>
+              </w:rPr>
+            </w:r>
+            <w:r>
+              <w:rPr>
+                <w:webHidden/>
+              </w:rPr>
+              <w:fldChar w:fldCharType="separate"/>
+            </w:r>
+            <w:r>
+              <w:rPr>
+                <w:webHidden/>
+              </w:rPr>
+              <w:t>16</w:t>
+            </w:r>
+            <w:r>
+              <w:rPr>
+                <w:webHidden/>
+              </w:rPr>
+              <w:fldChar w:fldCharType="end"/>
+            </w:r>
+          </w:hyperlink>
+        </w:p>
+        <w:p>
+          <w:pPr>
+            <w:pStyle w:val="TDC3"/>
+            <w:tabs>
+              <w:tab w:val="left" w:pos="1200"/>
+              <w:tab w:val="right" w:leader="dot" w:pos="9060"/>
+            </w:tabs>
+            <w:rPr>
+              <w:rFonts w:asciiTheme="minorHAnsi" w:eastAsiaTheme="minorEastAsia" w:hAnsiTheme="minorHAnsi"/>
+              <w:color w:val="auto"/>
+              <w:kern w:val="2"/>
+              <w:lang w:eastAsia="es-ES"/>
+              <w14:ligatures w14:val="standardContextual"/>
+            </w:rPr>
+          </w:pPr>
+          <w:hyperlink w:anchor="_Toc242269346" w:history="1">
+            <w:r>
+              <w:rPr>
+                <w:rStyle w:val="Hipervnculo"/>
+              </w:rPr>
+              <w:t>1.7.4</w:t>
+            </w:r>
+            <w:r>
+              <w:rPr>
+                <w:rFonts w:asciiTheme="minorHAnsi" w:eastAsiaTheme="minorEastAsia" w:hAnsiTheme="minorHAnsi"/>
+                <w:color w:val="auto"/>
+                <w:kern w:val="2"/>
+                <w:lang w:eastAsia="es-ES"/>
+                <w14:ligatures w14:val="standardContextual"/>
+              </w:rPr>
+              <w:tab/>
+            </w:r>
+            <w:r>
+              <w:rPr>
+                <w:rStyle w:val="Hipervnculo"/>
+              </w:rPr>
+              <w:t>Galería</w:t>
+            </w:r>
+            <w:r>
+              <w:rPr>
+                <w:webHidden/>
+              </w:rPr>
+              <w:tab/>
+            </w:r>
+            <w:r>
+              <w:rPr>
+                <w:webHidden/>
+              </w:rPr>
+              <w:fldChar w:fldCharType="begin"/>
+            </w:r>
+            <w:r>
+              <w:rPr>
+                <w:webHidden/>
+              </w:rPr>
+              <w:instrText xml:space="preserve"> PAGEREF _Toc242269346 \h </w:instrText>
+            </w:r>
+            <w:r>
+              <w:rPr>
+                <w:webHidden/>
+              </w:rPr>
+            </w:r>
+            <w:r>
+              <w:rPr>
+                <w:webHidden/>
+              </w:rPr>
+              <w:fldChar w:fldCharType="separate"/>
+            </w:r>
+            <w:r>
+              <w:rPr>
+                <w:webHidden/>
+              </w:rPr>
+              <w:t>16</w:t>
+            </w:r>
+            <w:r>
+              <w:rPr>
+                <w:webHidden/>
+              </w:rPr>
+              <w:fldChar w:fldCharType="end"/>
+            </w:r>
+          </w:hyperlink>
+        </w:p>
+        <w:p>
+          <w:pPr>
+            <w:pStyle w:val="TDC2"/>
+            <w:tabs>
+              <w:tab w:val="left" w:pos="1200"/>
+              <w:tab w:val="right" w:leader="dot" w:pos="9060"/>
+            </w:tabs>
+            <w:rPr>
+              <w:rFonts w:asciiTheme="minorHAnsi" w:eastAsiaTheme="minorEastAsia" w:hAnsiTheme="minorHAnsi"/>
+              <w:color w:val="auto"/>
+              <w:kern w:val="2"/>
+              <w:sz w:val="24"/>
+              <w:szCs w:val="24"/>
+              <w:lang w:eastAsia="es-ES"/>
+              <w14:ligatures w14:val="standardContextual"/>
+            </w:rPr>
+          </w:pPr>
+          <w:hyperlink w:anchor="_Toc242269347" w:history="1">
+            <w:r>
+              <w:rPr>
+                <w:rStyle w:val="Hipervnculo"/>
+              </w:rPr>
+              <w:t>1.8</w:t>
+            </w:r>
+            <w:r>
+              <w:rPr>
+                <w:rFonts w:asciiTheme="minorHAnsi" w:eastAsiaTheme="minorEastAsia" w:hAnsiTheme="minorHAnsi"/>
+                <w:color w:val="auto"/>
+                <w:kern w:val="2"/>
+                <w:sz w:val="24"/>
+                <w:szCs w:val="24"/>
+                <w:lang w:eastAsia="es-ES"/>
+                <w14:ligatures w14:val="standardContextual"/>
+              </w:rPr>
+              <w:tab/>
+            </w:r>
+            <w:r>
+              <w:rPr>
+                <w:rStyle w:val="Hipervnculo"/>
+              </w:rPr>
+              <w:t>F6 — QA + documentación</w:t>
+            </w:r>
+            <w:r>
+              <w:rPr>
+                <w:webHidden/>
+              </w:rPr>
+              <w:tab/>
+            </w:r>
+            <w:r>
+              <w:rPr>
+                <w:webHidden/>
+              </w:rPr>
+              <w:fldChar w:fldCharType="begin"/>
+            </w:r>
+            <w:r>
+              <w:rPr>
+                <w:webHidden/>
+              </w:rPr>
+              <w:instrText xml:space="preserve"> PAGEREF _Toc242269347 \h </w:instrText>
+            </w:r>
+            <w:r>
+              <w:rPr>
+                <w:webHidden/>
+              </w:rPr>
+            </w:r>
+            <w:r>
+              <w:rPr>
+                <w:webHidden/>
+              </w:rPr>
+              <w:fldChar w:fldCharType="separate"/>
+            </w:r>
+            <w:r>
+              <w:rPr>
+                <w:webHidden/>
+              </w:rPr>
+              <w:t>16</w:t>
+            </w:r>
+            <w:r>
+              <w:rPr>
+                <w:webHidden/>
+              </w:rPr>
+              <w:fldChar w:fldCharType="end"/>
+            </w:r>
+          </w:hyperlink>
+        </w:p>
+        <w:p>
+          <w:pPr>
+            <w:pStyle w:val="TDC3"/>
+            <w:tabs>
+              <w:tab w:val="left" w:pos="1200"/>
+              <w:tab w:val="right" w:leader="dot" w:pos="9060"/>
+            </w:tabs>
+            <w:rPr>
+              <w:rFonts w:asciiTheme="minorHAnsi" w:eastAsiaTheme="minorEastAsia" w:hAnsiTheme="minorHAnsi"/>
+              <w:color w:val="auto"/>
+              <w:kern w:val="2"/>
+              <w:lang w:eastAsia="es-ES"/>
+              <w14:ligatures w14:val="standardContextual"/>
+            </w:rPr>
+          </w:pPr>
+          <w:hyperlink w:anchor="_Toc242269348" w:history="1">
+            <w:r>
+              <w:rPr>
+                <w:rStyle w:val="Hipervnculo"/>
+              </w:rPr>
+              <w:t>1.8.1</w:t>
+            </w:r>
+            <w:r>
+              <w:rPr>
+                <w:rFonts w:asciiTheme="minorHAnsi" w:eastAsiaTheme="minorEastAsia" w:hAnsiTheme="minorHAnsi"/>
+                <w:color w:val="auto"/>
+                <w:kern w:val="2"/>
+                <w:lang w:eastAsia="es-ES"/>
+                <w14:ligatures w14:val="standardContextual"/>
+              </w:rPr>
+              <w:tab/>
+            </w:r>
+            <w:r>
+              <w:rPr>
+                <w:rStyle w:val="Hipervnculo"/>
+              </w:rPr>
+              <w:t>QA</w:t>
+            </w:r>
+            <w:r>
+              <w:rPr>
+                <w:webHidden/>
+              </w:rPr>
+              <w:tab/>
+            </w:r>
+            <w:r>
+              <w:rPr>
+                <w:webHidden/>
+              </w:rPr>
+              <w:fldChar w:fldCharType="begin"/>
+            </w:r>
+            <w:r>
+              <w:rPr>
+                <w:webHidden/>
+              </w:rPr>
+              <w:instrText xml:space="preserve"> PAGEREF _Toc242269348 \h </w:instrText>
+            </w:r>
+            <w:r>
+              <w:rPr>
+                <w:webHidden/>
+              </w:rPr>
+            </w:r>
+            <w:r>
+              <w:rPr>
+                <w:webHidden/>
+              </w:rPr>
+              <w:fldChar w:fldCharType="separate"/>
+            </w:r>
+            <w:r>
+              <w:rPr>
+                <w:webHidden/>
+              </w:rPr>
+              <w:t>16</w:t>
+            </w:r>
+            <w:r>
+              <w:rPr>
+                <w:webHidden/>
+              </w:rPr>
+              <w:fldChar w:fldCharType="end"/>
+            </w:r>
+          </w:hyperlink>
+        </w:p>
+        <w:p>
+          <w:pPr>
+            <w:pStyle w:val="TDC3"/>
+            <w:tabs>
+              <w:tab w:val="left" w:pos="1200"/>
+              <w:tab w:val="right" w:leader="dot" w:pos="9060"/>
+            </w:tabs>
+            <w:rPr>
+              <w:rFonts w:asciiTheme="minorHAnsi" w:eastAsiaTheme="minorEastAsia" w:hAnsiTheme="minorHAnsi"/>
+              <w:color w:val="auto"/>
+              <w:kern w:val="2"/>
+              <w:lang w:eastAsia="es-ES"/>
+              <w14:ligatures w14:val="standardContextual"/>
+            </w:rPr>
+          </w:pPr>
+          <w:hyperlink w:anchor="_Toc242269349" w:history="1">
+            <w:r>
+              <w:rPr>
+                <w:rStyle w:val="Hipervnculo"/>
+              </w:rPr>
+              <w:t>1.8.2</w:t>
+            </w:r>
+            <w:r>
+              <w:rPr>
+                <w:rFonts w:asciiTheme="minorHAnsi" w:eastAsiaTheme="minorEastAsia" w:hAnsiTheme="minorHAnsi"/>
+                <w:color w:val="auto"/>
+                <w:kern w:val="2"/>
+                <w:lang w:eastAsia="es-ES"/>
+                <w14:ligatures w14:val="standardContextual"/>
+              </w:rPr>
+              <w:tab/>
+            </w:r>
+            <w:r>
+              <w:rPr>
+                <w:rStyle w:val="Hipervnculo"/>
+              </w:rPr>
               <w:t>Documentación mínima imprescindible</w:t>
             </w:r>
             <w:r>
@@ -1818,7 +2419,7 @@
               <w:rPr>
                 <w:webHidden/>
               </w:rPr>
-              <w:instrText xml:space="preserve"> PAGEREF _Toc242090596 \h </w:instrText>
+              <w:instrText xml:space="preserve"> PAGEREF _Toc242269349 \h </w:instrText>
             </w:r>
             <w:r>
               <w:rPr>
@@ -1835,7 +2436,7 @@
               <w:rPr>
                 <w:webHidden/>
               </w:rPr>
-              <w:t>10</w:t>
+              <w:t>16</w:t>
             </w:r>
             <w:r>
               <w:rPr>
@@ -1865,7 +2466,7 @@
               <w14:ligatures w14:val="standardContextual"/>
             </w:rPr>
           </w:pPr>
-          <w:hyperlink w:anchor="_Toc242090597" w:history="1">
+          <w:hyperlink w:anchor="_Toc242269350" w:history="1">
             <w:r>
               <w:rPr>
                 <w:rStyle w:val="Hipervnculo"/>
@@ -1909,7 +2510,7 @@
               <w:rPr>
                 <w:webHidden/>
               </w:rPr>
-              <w:instrText xml:space="preserve"> PAGEREF _Toc242090597 \h </w:instrText>
+              <w:instrText xml:space="preserve"> PAGEREF _Toc242269350 \h </w:instrText>
             </w:r>
             <w:r>
               <w:rPr>
@@ -1926,7 +2527,7 @@
               <w:rPr>
                 <w:webHidden/>
               </w:rPr>
-              <w:t>10</w:t>
+              <w:t>17</w:t>
             </w:r>
             <w:r>
               <w:rPr>
@@ -1949,7 +2550,6 @@
             </w:rPr>
           </w:pPr>
           <w:r>
-            <w:lastRenderedPageBreak/>
             <w:fldChar w:fldCharType="end"/>
           </w:r>
         </w:p>
@@ -2276,7 +2876,7 @@
       <w:pPr>
         <w:pStyle w:val="Ttulo1"/>
       </w:pPr>
-      <w:bookmarkStart w:id="3" w:name="_Toc242090579"/>
+      <w:bookmarkStart w:id="3" w:name="_Toc242269325"/>
       <w:r>
         <w:lastRenderedPageBreak/>
         <w:t>Desarrollo</w:t>
@@ -2287,7 +2887,7 @@
       <w:pPr>
         <w:pStyle w:val="Ttulo2"/>
       </w:pPr>
-      <w:bookmarkStart w:id="4" w:name="_Toc242090580"/>
+      <w:bookmarkStart w:id="4" w:name="_Toc242269326"/>
       <w:r>
         <w:t xml:space="preserve">CORE. </w:t>
       </w:r>
@@ -2300,7 +2900,7 @@
       <w:pPr>
         <w:pStyle w:val="Ttulo3"/>
       </w:pPr>
-      <w:bookmarkStart w:id="5" w:name="_Toc242090581"/>
+      <w:bookmarkStart w:id="5" w:name="_Toc242269327"/>
       <w:r>
         <w:t>Objetivo</w:t>
       </w:r>
@@ -2411,7 +3011,7 @@
       <w:pPr>
         <w:pStyle w:val="Ttulo3"/>
       </w:pPr>
-      <w:bookmarkStart w:id="6" w:name="_Toc242090582"/>
+      <w:bookmarkStart w:id="6" w:name="_Toc242269328"/>
       <w:r>
         <w:t>Arquitectura</w:t>
       </w:r>
@@ -2427,7 +3027,17 @@
         <w:jc w:val="left"/>
       </w:pPr>
       <w:r>
-        <w:t xml:space="preserve">La carpeta del proyecto en integración se encuentra en </w:t>
+        <w:t xml:space="preserve">La </w:t>
+      </w:r>
+      <w:r>
+        <w:rPr>
+          <w:b/>
+          <w:bCs/>
+        </w:rPr>
+        <w:t>carpeta del proyecto</w:t>
+      </w:r>
+      <w:r>
+        <w:t xml:space="preserve"> en integración se encuentra en </w:t>
       </w:r>
       <w:r>
         <w:t>Extentions\16\TEMPLATE\LAYOUTS\Turismo2013.Files\custom_web )</w:t>
@@ -2461,12 +3071,12 @@
       <w:pPr>
         <w:pStyle w:val="Prrafodelista"/>
         <w:numPr>
-          <w:ilvl w:val="1"/>
+          <w:ilvl w:val="2"/>
           <w:numId w:val="2"/>
         </w:numPr>
       </w:pPr>
       <w:r>
-        <w:t>Css</w:t>
+        <w:t>fuentes</w:t>
       </w:r>
     </w:p>
     <w:p>
@@ -2478,7 +3088,19 @@
         </w:numPr>
       </w:pPr>
       <w:r>
-        <w:t>Layout</w:t>
+        <w:t>imágenes</w:t>
+      </w:r>
+    </w:p>
+    <w:p>
+      <w:pPr>
+        <w:pStyle w:val="Prrafodelista"/>
+        <w:numPr>
+          <w:ilvl w:val="1"/>
+          <w:numId w:val="2"/>
+        </w:numPr>
+      </w:pPr>
+      <w:r>
+        <w:t>Css</w:t>
       </w:r>
     </w:p>
     <w:p>
@@ -2490,6 +3112,33 @@
         </w:numPr>
       </w:pPr>
       <w:r>
+        <w:t xml:space="preserve">Bootstrap </w:t>
+      </w:r>
+      <w:r>
+        <w:t>5.2.3</w:t>
+      </w:r>
+    </w:p>
+    <w:p>
+      <w:pPr>
+        <w:pStyle w:val="Prrafodelista"/>
+        <w:numPr>
+          <w:ilvl w:val="2"/>
+          <w:numId w:val="2"/>
+        </w:numPr>
+      </w:pPr>
+      <w:r>
+        <w:t>Layout</w:t>
+      </w:r>
+    </w:p>
+    <w:p>
+      <w:pPr>
+        <w:pStyle w:val="Prrafodelista"/>
+        <w:numPr>
+          <w:ilvl w:val="2"/>
+          <w:numId w:val="2"/>
+        </w:numPr>
+      </w:pPr>
+      <w:r>
         <w:t>componentes</w:t>
       </w:r>
     </w:p>
@@ -2561,7 +3210,68 @@
         </w:numPr>
       </w:pPr>
       <w:r>
-        <w:t>Laytout detalle</w:t>
+        <w:t>Layout detalle</w:t>
+      </w:r>
+    </w:p>
+    <w:p>
+      <w:pPr>
+        <w:pStyle w:val="Prrafodelista"/>
+        <w:numPr>
+          <w:ilvl w:val="2"/>
+          <w:numId w:val="2"/>
+        </w:numPr>
+      </w:pPr>
+      <w:r>
+        <w:t>Evento</w:t>
+      </w:r>
+    </w:p>
+    <w:p>
+      <w:pPr>
+        <w:pStyle w:val="Prrafodelista"/>
+        <w:numPr>
+          <w:ilvl w:val="2"/>
+          <w:numId w:val="2"/>
+        </w:numPr>
+      </w:pPr>
+      <w:r>
+        <w:t>Restaurantes</w:t>
+      </w:r>
+    </w:p>
+    <w:p>
+      <w:pPr>
+        <w:pStyle w:val="Prrafodelista"/>
+        <w:numPr>
+          <w:ilvl w:val="2"/>
+          <w:numId w:val="2"/>
+        </w:numPr>
+      </w:pPr>
+      <w:r>
+        <w:t>Bares</w:t>
+      </w:r>
+    </w:p>
+    <w:p>
+      <w:pPr>
+        <w:pStyle w:val="Prrafodelista"/>
+        <w:numPr>
+          <w:ilvl w:val="2"/>
+          <w:numId w:val="2"/>
+        </w:numPr>
+      </w:pPr>
+      <w:r>
+        <w:t>Patrimonio</w:t>
+      </w:r>
+    </w:p>
+    <w:p>
+      <w:pPr>
+        <w:pStyle w:val="Prrafodelista"/>
+        <w:numPr>
+          <w:ilvl w:val="2"/>
+          <w:numId w:val="2"/>
+        </w:numPr>
+      </w:pPr>
+      <w:r>
+        <w:lastRenderedPageBreak/>
+        <w:t>Alojamientos</w:t>
       </w:r>
     </w:p>
     <w:p>
@@ -2633,7 +3343,6 @@
         <w:rPr>
           <w:rFonts w:asciiTheme="minorHAnsi" w:hAnsiTheme="minorHAnsi" w:cs="Segoe UI Emoji"/>
         </w:rPr>
-        <w:lastRenderedPageBreak/>
         <w:t>Lo</w:t>
       </w:r>
       <w:r>
@@ -2671,7 +3380,7 @@
           <w:lang w:val="en-US"/>
         </w:rPr>
       </w:pPr>
-      <w:bookmarkStart w:id="7" w:name="_Toc242090583"/>
+      <w:bookmarkStart w:id="7" w:name="_Toc242269329"/>
       <w:r>
         <w:rPr>
           <w:lang w:val="en-US"/>
@@ -2793,7 +3502,7 @@
       <w:pPr>
         <w:pStyle w:val="Ttulo2"/>
       </w:pPr>
-      <w:bookmarkStart w:id="8" w:name="_Toc242090584"/>
+      <w:bookmarkStart w:id="8" w:name="_Toc242269330"/>
       <w:r>
         <w:rPr>
           <w:lang w:val="en-US"/>
@@ -2937,6 +3646,7 @@
     </w:p>
     <w:p>
       <w:r>
+        <w:lastRenderedPageBreak/>
         <w:t>Desde Frontend se crearán únicamente</w:t>
       </w:r>
       <w:r>
@@ -2990,7 +3700,7 @@
       <w:pPr>
         <w:pStyle w:val="Ttulo3"/>
       </w:pPr>
-      <w:bookmarkStart w:id="9" w:name="_Toc242090585"/>
+      <w:bookmarkStart w:id="9" w:name="_Toc242269331"/>
       <w:r>
         <w:t>HERRIZ_home</w:t>
       </w:r>
@@ -3013,9 +3723,8 @@
       <w:pPr>
         <w:pStyle w:val="Ttulo3"/>
       </w:pPr>
-      <w:bookmarkStart w:id="10" w:name="_Toc242090586"/>
-      <w:r>
-        <w:lastRenderedPageBreak/>
+      <w:bookmarkStart w:id="10" w:name="_Toc242269332"/>
+      <w:r>
         <w:t>Listado</w:t>
       </w:r>
       <w:bookmarkEnd w:id="10"/>
@@ -3043,7 +3752,7 @@
       <w:pPr>
         <w:pStyle w:val="Ttulo3"/>
       </w:pPr>
-      <w:bookmarkStart w:id="11" w:name="_Toc242090587"/>
+      <w:bookmarkStart w:id="11" w:name="_Toc242269333"/>
       <w:r>
         <w:t>Detalle Evento</w:t>
       </w:r>
@@ -3161,7 +3870,7 @@
       <w:pPr>
         <w:pStyle w:val="Ttulo2"/>
       </w:pPr>
-      <w:bookmarkStart w:id="12" w:name="_Toc242090588"/>
+      <w:bookmarkStart w:id="12" w:name="_Toc242269334"/>
       <w:r>
         <w:t>F</w:t>
       </w:r>
@@ -3207,7 +3916,6 @@
         <w:pStyle w:val="Citadestacada"/>
       </w:pPr>
       <w:r>
-        <w:lastRenderedPageBreak/>
         <w:t xml:space="preserve">Excel </w:t>
       </w:r>
       <w:r>
@@ -3247,7 +3955,7 @@
           <w:lang w:val="en-US"/>
         </w:rPr>
       </w:pPr>
-      <w:bookmarkStart w:id="13" w:name="_Toc242090589"/>
+      <w:bookmarkStart w:id="13" w:name="_Toc242269335"/>
       <w:r>
         <w:t>Slider → usa cards</w:t>
       </w:r>
@@ -3267,7 +3975,7 @@
       <w:pPr>
         <w:pStyle w:val="Ttulo3"/>
       </w:pPr>
-      <w:bookmarkStart w:id="14" w:name="_Toc242090590"/>
+      <w:bookmarkStart w:id="14" w:name="_Toc242269336"/>
       <w:r>
         <w:t>Card base → reutilizable en todo</w:t>
       </w:r>
@@ -3279,21 +3987,408 @@
       </w:r>
     </w:p>
     <w:p>
+      <w:r>
+        <w:rPr>
+          <w:noProof/>
+        </w:rPr>
+        <w:lastRenderedPageBreak/>
+        <w:drawing>
+          <wp:inline distT="0" distB="0" distL="0" distR="0" wp14:anchorId="15A3174A" wp14:editId="2CC134F2">
+            <wp:extent cx="5191850" cy="6630325"/>
+            <wp:effectExtent l="0" t="0" r="8890" b="0"/>
+            <wp:docPr id="1493342938" name="Imagen 1"/>
+            <wp:cNvGraphicFramePr>
+              <a:graphicFrameLocks xmlns:a="http://schemas.openxmlformats.org/drawingml/2006/main" noChangeAspect="1"/>
+            </wp:cNvGraphicFramePr>
+            <a:graphic xmlns:a="http://schemas.openxmlformats.org/drawingml/2006/main">
+              <a:graphicData uri="http://schemas.openxmlformats.org/drawingml/2006/picture">
+                <pic:pic xmlns:pic="http://schemas.openxmlformats.org/drawingml/2006/picture">
+                  <pic:nvPicPr>
+                    <pic:cNvPr id="1493342938" name=""/>
+                    <pic:cNvPicPr/>
+                  </pic:nvPicPr>
+                  <pic:blipFill>
+                    <a:blip r:embed="rId20"/>
+                    <a:stretch>
+                      <a:fillRect/>
+                    </a:stretch>
+                  </pic:blipFill>
+                  <pic:spPr>
+                    <a:xfrm>
+                      <a:off x="0" y="0"/>
+                      <a:ext cx="5191850" cy="6630325"/>
+                    </a:xfrm>
+                    <a:prstGeom prst="rect">
+                      <a:avLst/>
+                    </a:prstGeom>
+                  </pic:spPr>
+                </pic:pic>
+              </a:graphicData>
+            </a:graphic>
+          </wp:inline>
+        </w:drawing>
+      </w:r>
+    </w:p>
+    <w:p>
       <w:pPr>
         <w:pStyle w:val="Ttulo3"/>
       </w:pPr>
-      <w:bookmarkStart w:id="15" w:name="_Toc242090591"/>
-      <w:r>
+      <w:bookmarkStart w:id="15" w:name="_Toc242269337"/>
+      <w:r>
+        <w:lastRenderedPageBreak/>
         <w:t>Wrapper</w:t>
       </w:r>
       <w:r>
+        <w:t xml:space="preserve"> / Banner</w:t>
+      </w:r>
+      <w:r>
         <w:t xml:space="preserve"> → branding fuerte</w:t>
       </w:r>
       <w:bookmarkEnd w:id="15"/>
     </w:p>
     <w:p>
       <w:r>
-        <w:t>xxx</w:t>
+        <w:t>Posibles:</w:t>
+      </w:r>
+    </w:p>
+    <w:p>
+      <w:pPr>
+        <w:pStyle w:val="Prrafodelista"/>
+        <w:numPr>
+          <w:ilvl w:val="0"/>
+          <w:numId w:val="19"/>
+        </w:numPr>
+      </w:pPr>
+      <w:r>
+        <w:t>Solo img fondo</w:t>
+      </w:r>
+    </w:p>
+    <w:p>
+      <w:pPr>
+        <w:pStyle w:val="Prrafodelista"/>
+        <w:numPr>
+          <w:ilvl w:val="0"/>
+          <w:numId w:val="19"/>
+        </w:numPr>
+      </w:pPr>
+      <w:r>
+        <w:t>Img a la izquierda</w:t>
+      </w:r>
+    </w:p>
+    <w:p>
+      <w:pPr>
+        <w:pStyle w:val="Prrafodelista"/>
+        <w:numPr>
+          <w:ilvl w:val="0"/>
+          <w:numId w:val="19"/>
+        </w:numPr>
+      </w:pPr>
+      <w:r>
+        <w:t>Img a la derecha</w:t>
+      </w:r>
+    </w:p>
+    <w:p>
+      <w:pPr>
+        <w:ind w:left="360"/>
+      </w:pPr>
+      <w:r>
+        <w:t>Se ha incluido un ejemplo en la home en la parte inferior:</w:t>
+      </w:r>
+    </w:p>
+    <w:p>
+      <w:r>
+        <w:t> </w:t>
+      </w:r>
+    </w:p>
+    <w:p>
+      <w:r>
+        <w:rPr>
+          <w:noProof/>
+        </w:rPr>
+        <w:drawing>
+          <wp:inline distT="0" distB="0" distL="0" distR="0" wp14:anchorId="4DB8771C" wp14:editId="1D8C3996">
+            <wp:extent cx="5759450" cy="2181225"/>
+            <wp:effectExtent l="0" t="0" r="0" b="9525"/>
+            <wp:docPr id="1054423895" name="Imagen 15"/>
+            <wp:cNvGraphicFramePr>
+              <a:graphicFrameLocks xmlns:a="http://schemas.openxmlformats.org/drawingml/2006/main" noChangeAspect="1"/>
+            </wp:cNvGraphicFramePr>
+            <a:graphic xmlns:a="http://schemas.openxmlformats.org/drawingml/2006/main">
+              <a:graphicData uri="http://schemas.openxmlformats.org/drawingml/2006/picture">
+                <pic:pic xmlns:pic="http://schemas.openxmlformats.org/drawingml/2006/picture">
+                  <pic:nvPicPr>
+                    <pic:cNvPr id="0" name="Picture 46"/>
+                    <pic:cNvPicPr>
+                      <a:picLocks noChangeAspect="1" noChangeArrowheads="1"/>
+                    </pic:cNvPicPr>
+                  </pic:nvPicPr>
+                  <pic:blipFill>
+                    <a:blip r:embed="rId21" cstate="print">
+                      <a:extLst>
+                        <a:ext uri="{28A0092B-C50C-407E-A947-70E740481C1C}">
+                          <a14:useLocalDpi xmlns:a14="http://schemas.microsoft.com/office/drawing/2010/main" val="0"/>
+                        </a:ext>
+                      </a:extLst>
+                    </a:blip>
+                    <a:srcRect/>
+                    <a:stretch>
+                      <a:fillRect/>
+                    </a:stretch>
+                  </pic:blipFill>
+                  <pic:spPr bwMode="auto">
+                    <a:xfrm>
+                      <a:off x="0" y="0"/>
+                      <a:ext cx="5759450" cy="2181225"/>
+                    </a:xfrm>
+                    <a:prstGeom prst="rect">
+                      <a:avLst/>
+                    </a:prstGeom>
+                    <a:noFill/>
+                    <a:ln>
+                      <a:noFill/>
+                    </a:ln>
+                  </pic:spPr>
+                </pic:pic>
+              </a:graphicData>
+            </a:graphic>
+          </wp:inline>
+        </w:drawing>
+      </w:r>
+    </w:p>
+    <w:p>
+      <w:r>
+        <w:t> </w:t>
+      </w:r>
+    </w:p>
+    <w:p>
+      <w:r>
+        <w:t>Se puede añadir a un webpart desde este apartado:</w:t>
+      </w:r>
+    </w:p>
+    <w:p>
+      <w:r>
+        <w:rPr>
+          <w:noProof/>
+        </w:rPr>
+        <w:lastRenderedPageBreak/>
+        <w:drawing>
+          <wp:inline distT="0" distB="0" distL="0" distR="0" wp14:anchorId="38BE3E05" wp14:editId="4D28492E">
+            <wp:extent cx="5759450" cy="1568450"/>
+            <wp:effectExtent l="0" t="0" r="0" b="0"/>
+            <wp:docPr id="1862561904" name="Imagen 14"/>
+            <wp:cNvGraphicFramePr>
+              <a:graphicFrameLocks xmlns:a="http://schemas.openxmlformats.org/drawingml/2006/main" noChangeAspect="1"/>
+            </wp:cNvGraphicFramePr>
+            <a:graphic xmlns:a="http://schemas.openxmlformats.org/drawingml/2006/main">
+              <a:graphicData uri="http://schemas.openxmlformats.org/drawingml/2006/picture">
+                <pic:pic xmlns:pic="http://schemas.openxmlformats.org/drawingml/2006/picture">
+                  <pic:nvPicPr>
+                    <pic:cNvPr id="0" name="Picture 47"/>
+                    <pic:cNvPicPr>
+                      <a:picLocks noChangeAspect="1" noChangeArrowheads="1"/>
+                    </pic:cNvPicPr>
+                  </pic:nvPicPr>
+                  <pic:blipFill>
+                    <a:blip r:embed="rId22" cstate="print">
+                      <a:extLst>
+                        <a:ext uri="{28A0092B-C50C-407E-A947-70E740481C1C}">
+                          <a14:useLocalDpi xmlns:a14="http://schemas.microsoft.com/office/drawing/2010/main" val="0"/>
+                        </a:ext>
+                      </a:extLst>
+                    </a:blip>
+                    <a:srcRect/>
+                    <a:stretch>
+                      <a:fillRect/>
+                    </a:stretch>
+                  </pic:blipFill>
+                  <pic:spPr bwMode="auto">
+                    <a:xfrm>
+                      <a:off x="0" y="0"/>
+                      <a:ext cx="5759450" cy="1568450"/>
+                    </a:xfrm>
+                    <a:prstGeom prst="rect">
+                      <a:avLst/>
+                    </a:prstGeom>
+                    <a:noFill/>
+                    <a:ln>
+                      <a:noFill/>
+                    </a:ln>
+                  </pic:spPr>
+                </pic:pic>
+              </a:graphicData>
+            </a:graphic>
+          </wp:inline>
+        </w:drawing>
+      </w:r>
+    </w:p>
+    <w:p>
+      <w:r>
+        <w:t>Y configurarlo:</w:t>
+      </w:r>
+    </w:p>
+    <w:p>
+      <w:r>
+        <w:rPr>
+          <w:noProof/>
+        </w:rPr>
+        <w:lastRenderedPageBreak/>
+        <w:drawing>
+          <wp:inline distT="0" distB="0" distL="0" distR="0" wp14:anchorId="755E1F47" wp14:editId="00D6FC26">
+            <wp:extent cx="3779520" cy="4899660"/>
+            <wp:effectExtent l="0" t="0" r="0" b="0"/>
+            <wp:docPr id="738716339" name="Imagen 13"/>
+            <wp:cNvGraphicFramePr>
+              <a:graphicFrameLocks xmlns:a="http://schemas.openxmlformats.org/drawingml/2006/main" noChangeAspect="1"/>
+            </wp:cNvGraphicFramePr>
+            <a:graphic xmlns:a="http://schemas.openxmlformats.org/drawingml/2006/main">
+              <a:graphicData uri="http://schemas.openxmlformats.org/drawingml/2006/picture">
+                <pic:pic xmlns:pic="http://schemas.openxmlformats.org/drawingml/2006/picture">
+                  <pic:nvPicPr>
+                    <pic:cNvPr id="0" name="Picture 48"/>
+                    <pic:cNvPicPr>
+                      <a:picLocks noChangeAspect="1" noChangeArrowheads="1"/>
+                    </pic:cNvPicPr>
+                  </pic:nvPicPr>
+                  <pic:blipFill>
+                    <a:blip r:embed="rId23">
+                      <a:extLst>
+                        <a:ext uri="{28A0092B-C50C-407E-A947-70E740481C1C}">
+                          <a14:useLocalDpi xmlns:a14="http://schemas.microsoft.com/office/drawing/2010/main" val="0"/>
+                        </a:ext>
+                      </a:extLst>
+                    </a:blip>
+                    <a:srcRect/>
+                    <a:stretch>
+                      <a:fillRect/>
+                    </a:stretch>
+                  </pic:blipFill>
+                  <pic:spPr bwMode="auto">
+                    <a:xfrm>
+                      <a:off x="0" y="0"/>
+                      <a:ext cx="3779520" cy="4899660"/>
+                    </a:xfrm>
+                    <a:prstGeom prst="rect">
+                      <a:avLst/>
+                    </a:prstGeom>
+                    <a:noFill/>
+                    <a:ln>
+                      <a:noFill/>
+                    </a:ln>
+                  </pic:spPr>
+                </pic:pic>
+              </a:graphicData>
+            </a:graphic>
+          </wp:inline>
+        </w:drawing>
+      </w:r>
+    </w:p>
+    <w:p>
+      <w:r>
+        <w:t>Rrss</w:t>
+      </w:r>
+    </w:p>
+    <w:p>
+      <w:hyperlink r:id="rId24" w:history="1">
+        <w:r>
+          <w:rPr>
+            <w:rStyle w:val="Hipervnculo"/>
+          </w:rPr>
+          <w:t>http://turi.santurtzi.com/Lists/Social/AllItems.aspx</w:t>
+        </w:r>
+      </w:hyperlink>
+    </w:p>
+    <w:p>
+      <w:r>
+        <w:rPr>
+          <w:noProof/>
+        </w:rPr>
+        <w:lastRenderedPageBreak/>
+        <w:drawing>
+          <wp:inline distT="0" distB="0" distL="0" distR="0" wp14:anchorId="4234DE5D" wp14:editId="7DE5B3F8">
+            <wp:extent cx="5759450" cy="3279775"/>
+            <wp:effectExtent l="0" t="0" r="0" b="0"/>
+            <wp:docPr id="947380462" name="Imagen 1"/>
+            <wp:cNvGraphicFramePr>
+              <a:graphicFrameLocks xmlns:a="http://schemas.openxmlformats.org/drawingml/2006/main" noChangeAspect="1"/>
+            </wp:cNvGraphicFramePr>
+            <a:graphic xmlns:a="http://schemas.openxmlformats.org/drawingml/2006/main">
+              <a:graphicData uri="http://schemas.openxmlformats.org/drawingml/2006/picture">
+                <pic:pic xmlns:pic="http://schemas.openxmlformats.org/drawingml/2006/picture">
+                  <pic:nvPicPr>
+                    <pic:cNvPr id="947380462" name=""/>
+                    <pic:cNvPicPr/>
+                  </pic:nvPicPr>
+                  <pic:blipFill>
+                    <a:blip r:embed="rId25"/>
+                    <a:stretch>
+                      <a:fillRect/>
+                    </a:stretch>
+                  </pic:blipFill>
+                  <pic:spPr>
+                    <a:xfrm>
+                      <a:off x="0" y="0"/>
+                      <a:ext cx="5759450" cy="3279775"/>
+                    </a:xfrm>
+                    <a:prstGeom prst="rect">
+                      <a:avLst/>
+                    </a:prstGeom>
+                  </pic:spPr>
+                </pic:pic>
+              </a:graphicData>
+            </a:graphic>
+          </wp:inline>
+        </w:drawing>
+      </w:r>
+    </w:p>
+    <w:p>
+      <w:r>
+        <w:rPr>
+          <w:noProof/>
+        </w:rPr>
+        <w:lastRenderedPageBreak/>
+        <w:drawing>
+          <wp:inline distT="0" distB="0" distL="0" distR="0" wp14:anchorId="21BBF258" wp14:editId="653AAF6A">
+            <wp:extent cx="5759450" cy="2524760"/>
+            <wp:effectExtent l="0" t="0" r="0" b="8890"/>
+            <wp:docPr id="352801757" name="Imagen 1"/>
+            <wp:cNvGraphicFramePr>
+              <a:graphicFrameLocks xmlns:a="http://schemas.openxmlformats.org/drawingml/2006/main" noChangeAspect="1"/>
+            </wp:cNvGraphicFramePr>
+            <a:graphic xmlns:a="http://schemas.openxmlformats.org/drawingml/2006/main">
+              <a:graphicData uri="http://schemas.openxmlformats.org/drawingml/2006/picture">
+                <pic:pic xmlns:pic="http://schemas.openxmlformats.org/drawingml/2006/picture">
+                  <pic:nvPicPr>
+                    <pic:cNvPr id="352801757" name=""/>
+                    <pic:cNvPicPr/>
+                  </pic:nvPicPr>
+                  <pic:blipFill>
+                    <a:blip r:embed="rId26"/>
+                    <a:stretch>
+                      <a:fillRect/>
+                    </a:stretch>
+                  </pic:blipFill>
+                  <pic:spPr>
+                    <a:xfrm>
+                      <a:off x="0" y="0"/>
+                      <a:ext cx="5759450" cy="2524760"/>
+                    </a:xfrm>
+                    <a:prstGeom prst="rect">
+                      <a:avLst/>
+                    </a:prstGeom>
+                  </pic:spPr>
+                </pic:pic>
+              </a:graphicData>
+            </a:graphic>
+          </wp:inline>
+        </w:drawing>
+      </w:r>
+    </w:p>
+    <w:p>
+      <w:r>
+        <w:t>Ha de tenerse</w:t>
+      </w:r>
+      <w:r>
+        <w:t xml:space="preserve"> en cuenta que añade “fa-“ antes de lo que se añada en ese campo</w:t>
       </w:r>
     </w:p>
     <w:p>
@@ -3391,7 +4486,7 @@
           <w:lang w:val="en-US"/>
         </w:rPr>
       </w:pPr>
-      <w:bookmarkStart w:id="16" w:name="_Toc242090592"/>
+      <w:bookmarkStart w:id="16" w:name="_Toc242269338"/>
       <w:r>
         <w:rPr>
           <w:lang w:val="en-US"/>
@@ -3511,7 +4606,6 @@
         </w:numPr>
       </w:pPr>
       <w:r>
-        <w:lastRenderedPageBreak/>
         <w:t>Iconos</w:t>
       </w:r>
     </w:p>
@@ -3620,6 +4714,7 @@
         <w:rPr>
           <w:lang w:val="en-US"/>
         </w:rPr>
+        <w:lastRenderedPageBreak/>
         <w:t>$primary</w:t>
       </w:r>
     </w:p>
@@ -3833,7 +4928,7 @@
       <w:pPr>
         <w:pStyle w:val="Ttulo2"/>
       </w:pPr>
-      <w:bookmarkStart w:id="18" w:name="_Toc242090593"/>
+      <w:bookmarkStart w:id="18" w:name="_Toc242269339"/>
       <w:r>
         <w:t xml:space="preserve">F5 — </w:t>
       </w:r>
@@ -3856,46 +4951,80 @@
       <w:pPr>
         <w:pStyle w:val="Ttulo2"/>
       </w:pPr>
-      <w:bookmarkStart w:id="19" w:name="_Toc242090594"/>
+      <w:bookmarkStart w:id="19" w:name="_Toc242269340"/>
+      <w:r>
+        <w:t>Componentes</w:t>
+      </w:r>
+      <w:bookmarkEnd w:id="19"/>
+    </w:p>
+    <w:p>
+      <w:pPr>
+        <w:pStyle w:val="Ttulo3"/>
+      </w:pPr>
+      <w:bookmarkStart w:id="20" w:name="_Toc242269341"/>
+      <w:r>
+        <w:t>Común</w:t>
+      </w:r>
+      <w:r>
+        <w:t xml:space="preserve"> Configuración de wp</w:t>
+      </w:r>
+      <w:bookmarkEnd w:id="20"/>
+    </w:p>
+    <w:p>
+      <w:pPr>
+        <w:pStyle w:val="Ttulo4"/>
+      </w:pPr>
+      <w:bookmarkStart w:id="21" w:name="_Toc242269342"/>
+      <w:r>
+        <w:t>Título</w:t>
+      </w:r>
+      <w:bookmarkEnd w:id="21"/>
+    </w:p>
+    <w:p>
+      <w:r>
+        <w:t>Título= “Title;”</w:t>
+      </w:r>
+    </w:p>
+    <w:p>
+      <w:pPr>
+        <w:pStyle w:val="Ttulo4"/>
+      </w:pPr>
+      <w:bookmarkStart w:id="22" w:name="_Toc242269343"/>
       <w:r>
         <w:lastRenderedPageBreak/>
-        <w:t>Componentes</w:t>
+        <w:t>Mostrar más</w:t>
+      </w:r>
+      <w:bookmarkEnd w:id="22"/>
+    </w:p>
+    <w:p>
+      <w:r>
+        <w:t>xxx</w:t>
       </w:r>
     </w:p>
     <w:p>
       <w:pPr>
         <w:pStyle w:val="Ttulo3"/>
       </w:pPr>
-      <w:r>
-        <w:t>Común</w:t>
-      </w:r>
-      <w:r>
-        <w:t xml:space="preserve"> </w:t>
-      </w:r>
-      <w:r>
-        <w:t>Configuración de wp</w:t>
-      </w:r>
-    </w:p>
-    <w:p>
-      <w:pPr>
-        <w:pStyle w:val="Ttulo4"/>
-      </w:pPr>
-      <w:r>
-        <w:t>Título</w:t>
-      </w:r>
-    </w:p>
-    <w:p>
-      <w:r>
-        <w:t>Título= “Title;”</w:t>
-      </w:r>
-    </w:p>
-    <w:p>
-      <w:pPr>
-        <w:pStyle w:val="Ttulo4"/>
-      </w:pPr>
-      <w:r>
-        <w:t>Mostrar más</w:t>
-      </w:r>
+      <w:bookmarkStart w:id="23" w:name="_Toc242269344"/>
+      <w:r>
+        <w:t>Slider</w:t>
+      </w:r>
+      <w:bookmarkEnd w:id="23"/>
+    </w:p>
+    <w:p>
+      <w:r>
+        <w:t>Xx</w:t>
+      </w:r>
+    </w:p>
+    <w:p>
+      <w:pPr>
+        <w:pStyle w:val="Ttulo3"/>
+      </w:pPr>
+      <w:bookmarkStart w:id="24" w:name="_Toc242269345"/>
+      <w:r>
+        <w:t>Lista Cards</w:t>
+      </w:r>
+      <w:bookmarkEnd w:id="24"/>
     </w:p>
     <w:p>
       <w:r>
@@ -3906,70 +5035,47 @@
       <w:pPr>
         <w:pStyle w:val="Ttulo3"/>
       </w:pPr>
-      <w:r>
-        <w:t>Slider</w:t>
-      </w:r>
-    </w:p>
-    <w:p>
-      <w:r>
-        <w:t>Xx</w:t>
-      </w:r>
+      <w:bookmarkStart w:id="25" w:name="_Toc242269346"/>
+      <w:r>
+        <w:t>Galería</w:t>
+      </w:r>
+      <w:bookmarkEnd w:id="25"/>
+    </w:p>
+    <w:p>
+      <w:r>
+        <w:t>X</w:t>
+      </w:r>
+      <w:r>
+        <w:t>x</w:t>
+      </w:r>
+    </w:p>
+    <w:p>
+      <w:r>
+        <w:t>Simular masonry?</w:t>
+      </w:r>
+    </w:p>
+    <w:p>
+      <w:pPr>
+        <w:pStyle w:val="Ttulo2"/>
+      </w:pPr>
+      <w:bookmarkStart w:id="26" w:name="_Toc242269347"/>
+      <w:r>
+        <w:t xml:space="preserve">F6 — </w:t>
+      </w:r>
+      <w:r>
+        <w:t>QA + documentación</w:t>
+      </w:r>
+      <w:bookmarkEnd w:id="26"/>
     </w:p>
     <w:p>
       <w:pPr>
         <w:pStyle w:val="Ttulo3"/>
       </w:pPr>
-      <w:r>
-        <w:t>Lista Cards</w:t>
-      </w:r>
-    </w:p>
-    <w:p>
-      <w:r>
-        <w:t>xxx</w:t>
-      </w:r>
-    </w:p>
-    <w:p>
-      <w:pPr>
-        <w:pStyle w:val="Ttulo3"/>
-      </w:pPr>
-      <w:r>
-        <w:t>Galería</w:t>
-      </w:r>
-    </w:p>
-    <w:p>
-      <w:r>
-        <w:t>X</w:t>
-      </w:r>
-      <w:r>
-        <w:t>x</w:t>
-      </w:r>
-    </w:p>
-    <w:p>
-      <w:r>
-        <w:t>Simular masonry?</w:t>
-      </w:r>
-    </w:p>
-    <w:p>
-      <w:pPr>
-        <w:pStyle w:val="Ttulo2"/>
-      </w:pPr>
-      <w:r>
-        <w:t xml:space="preserve">F6 — </w:t>
-      </w:r>
-      <w:r>
-        <w:t>QA + documentación</w:t>
-      </w:r>
-      <w:bookmarkEnd w:id="19"/>
-    </w:p>
-    <w:p>
-      <w:pPr>
-        <w:pStyle w:val="Ttulo3"/>
-      </w:pPr>
-      <w:bookmarkStart w:id="20" w:name="_Toc242090595"/>
+      <w:bookmarkStart w:id="27" w:name="_Toc242269348"/>
       <w:r>
         <w:t>QA</w:t>
       </w:r>
-      <w:bookmarkEnd w:id="20"/>
+      <w:bookmarkEnd w:id="27"/>
     </w:p>
     <w:p>
       <w:r>
@@ -3987,7 +5093,7 @@
       <w:r>
         <w:t>A</w:t>
       </w:r>
-      <w:commentRangeStart w:id="21"/>
+      <w:commentRangeStart w:id="28"/>
       <w:r>
         <w:t xml:space="preserve">ccesibilidad </w:t>
       </w:r>
@@ -4021,14 +5127,14 @@
       <w:r>
         <w:t>onsistencia visual</w:t>
       </w:r>
-      <w:commentRangeEnd w:id="21"/>
+      <w:commentRangeEnd w:id="28"/>
       <w:r>
         <w:rPr>
           <w:rStyle w:val="Refdecomentario"/>
           <w:sz w:val="19"/>
           <w:szCs w:val="22"/>
         </w:rPr>
-        <w:commentReference w:id="21"/>
+        <w:commentReference w:id="28"/>
       </w:r>
     </w:p>
     <w:p>
@@ -4040,7 +5146,6 @@
         </w:numPr>
       </w:pPr>
       <w:r>
-        <w:lastRenderedPageBreak/>
         <w:t>Ajustes finales</w:t>
       </w:r>
       <w:r>
@@ -4059,14 +5164,14 @@
           <w:rStyle w:val="Ttulo3Car"/>
         </w:rPr>
       </w:pPr>
-      <w:bookmarkStart w:id="22" w:name="_Toc242090596"/>
+      <w:bookmarkStart w:id="29" w:name="_Toc242269349"/>
       <w:r>
         <w:rPr>
           <w:rStyle w:val="Ttulo3Car"/>
         </w:rPr>
         <w:t>Documentación mínima imprescindible</w:t>
       </w:r>
-      <w:bookmarkEnd w:id="22"/>
+      <w:bookmarkEnd w:id="29"/>
     </w:p>
     <w:p>
       <w:r>
@@ -4094,6 +5199,7 @@
         </w:numPr>
       </w:pPr>
       <w:r>
+        <w:lastRenderedPageBreak/>
         <w:t>Qué</w:t>
       </w:r>
       <w:r>
@@ -4253,11 +5359,11 @@
       <w:pPr>
         <w:pStyle w:val="Ttulo1"/>
       </w:pPr>
-      <w:bookmarkStart w:id="23" w:name="_Toc242090597"/>
+      <w:bookmarkStart w:id="30" w:name="_Toc242269350"/>
       <w:r>
         <w:t>Notas proceso</w:t>
       </w:r>
-      <w:bookmarkEnd w:id="23"/>
+      <w:bookmarkEnd w:id="30"/>
     </w:p>
     <w:p>
       <w:pPr>
@@ -4323,7 +5429,7 @@
       <w:r>
         <w:t xml:space="preserve">Los archivos old están en </w:t>
       </w:r>
-      <w:hyperlink r:id="rId24" w:history="1">
+      <w:hyperlink r:id="rId31" w:history="1">
         <w:r>
           <w:rPr>
             <w:rStyle w:val="Hipervnculo"/>
@@ -4397,7 +5503,6 @@
         <w:rPr>
           <w:lang w:val="en-US"/>
         </w:rPr>
-        <w:lastRenderedPageBreak/>
         <w:t>/ styles/</w:t>
       </w:r>
     </w:p>
@@ -4425,6 +5530,7 @@
           <w:noProof/>
           <w:lang w:val="en-US"/>
         </w:rPr>
+        <w:lastRenderedPageBreak/>
         <w:drawing>
           <wp:inline distT="0" distB="0" distL="0" distR="0" wp14:anchorId="7890E427" wp14:editId="4339B438">
             <wp:extent cx="5759450" cy="1866265"/>
@@ -4441,7 +5547,7 @@
                     <pic:cNvPicPr/>
                   </pic:nvPicPr>
                   <pic:blipFill>
-                    <a:blip r:embed="rId25"/>
+                    <a:blip r:embed="rId32"/>
                     <a:stretch>
                       <a:fillRect/>
                     </a:stretch>
@@ -4778,14 +5884,13 @@
         <w:rPr>
           <w:lang w:val="en-US"/>
         </w:rPr>
-        <w:lastRenderedPageBreak/>
         <w:t>assets</w:t>
       </w:r>
     </w:p>
     <w:sectPr>
-      <w:footerReference w:type="default" r:id="rId26"/>
-      <w:headerReference w:type="first" r:id="rId27"/>
-      <w:footerReference w:type="first" r:id="rId28"/>
+      <w:footerReference w:type="default" r:id="rId33"/>
+      <w:headerReference w:type="first" r:id="rId34"/>
+      <w:footerReference w:type="first" r:id="rId35"/>
       <w:pgSz w:w="11906" w:h="16838" w:code="9"/>
       <w:pgMar w:top="3459" w:right="1418" w:bottom="1985" w:left="1418" w:header="680" w:footer="340" w:gutter="0"/>
       <w:cols w:space="708"/>
@@ -4814,7 +5919,7 @@
       </w:r>
     </w:p>
   </w:comment>
-  <w:comment w:id="21" w:author="Susana Garcia Antolin" w:date="2026-05-18T08:34:00Z" w:initials="SG">
+  <w:comment w:id="28" w:author="Susana Garcia Antolin" w:date="2026-05-18T08:34:00Z" w:initials="SG">
     <w:p>
       <w:pPr>
         <w:pStyle w:val="Textocomentario"/>
@@ -5003,7 +6108,7 @@
           <w:szCs w:val="19"/>
           <w:lang w:eastAsia="es-ES"/>
         </w:rPr>
-        <w:t>05/10/2026</w:t>
+        <w:t>07/10/2026</w:t>
       </w:r>
     </w:fldSimple>
     <w:r>
@@ -5200,7 +6305,7 @@
               <w:rPr>
                 <w:rFonts w:eastAsiaTheme="minorEastAsia" w:cs="Times New Roman"/>
               </w:rPr>
-              <w:t>05/10/2026</w:t>
+              <w:t>07/10/2026</w:t>
             </w:r>
           </w:fldSimple>
         </w:p>
@@ -5445,7 +6550,7 @@
               <w:rPr>
                 <w:rFonts w:eastAsiaTheme="minorEastAsia" w:cs="Times New Roman"/>
               </w:rPr>
-              <w:t>05/10/2026</w:t>
+              <w:t>07/10/2026</w:t>
             </w:r>
           </w:fldSimple>
         </w:p>

</xml_diff>

<commit_message>
ajustes wp banner / wrapper, imágenes para qué ver, docus etc.
</commit_message>
<xml_diff>
--- a/src/Documentacion/BIS011APPSY-Themes_HERRIZ-2026_09_25-v1_00.docx
+++ b/src/Documentacion/BIS011APPSY-Themes_HERRIZ-2026_09_25-v1_00.docx
@@ -221,7 +221,7 @@
           <w:szCs w:val="24"/>
           <w:lang w:eastAsia="es-ES"/>
         </w:rPr>
-        <w:t>07/10/2026</w:t>
+        <w:t>08/10/2026</w:t>
       </w:r>
       <w:r>
         <w:rPr>
@@ -4986,42 +4986,166 @@
       </w:r>
     </w:p>
     <w:p>
+      <w:r>
+        <w:rPr>
+          <w:noProof/>
+        </w:rPr>
+        <w:lastRenderedPageBreak/>
+        <mc:AlternateContent>
+          <mc:Choice Requires="wps">
+            <w:drawing>
+              <wp:inline distT="0" distB="0" distL="0" distR="0" wp14:anchorId="45875681" wp14:editId="15070554">
+                <wp:extent cx="304800" cy="304800"/>
+                <wp:effectExtent l="0" t="0" r="0" b="0"/>
+                <wp:docPr id="1674786978" name="Rectángulo 4"/>
+                <wp:cNvGraphicFramePr>
+                  <a:graphicFrameLocks xmlns:a="http://schemas.openxmlformats.org/drawingml/2006/main" noChangeAspect="1"/>
+                </wp:cNvGraphicFramePr>
+                <a:graphic xmlns:a="http://schemas.openxmlformats.org/drawingml/2006/main">
+                  <a:graphicData uri="http://schemas.microsoft.com/office/word/2010/wordprocessingShape">
+                    <wps:wsp>
+                      <wps:cNvSpPr>
+                        <a:spLocks noChangeAspect="1" noChangeArrowheads="1"/>
+                      </wps:cNvSpPr>
+                      <wps:spPr bwMode="auto">
+                        <a:xfrm>
+                          <a:off x="0" y="0"/>
+                          <a:ext cx="304800" cy="304800"/>
+                        </a:xfrm>
+                        <a:prstGeom prst="rect">
+                          <a:avLst/>
+                        </a:prstGeom>
+                        <a:noFill/>
+                        <a:ln>
+                          <a:noFill/>
+                        </a:ln>
+                        <a:extLst>
+                          <a:ext uri="{909E8E84-426E-40DD-AFC4-6F175D3DCCD1}">
+                            <a14:hiddenFill xmlns:a14="http://schemas.microsoft.com/office/drawing/2010/main">
+                              <a:solidFill>
+                                <a:srgbClr val="FFFFFF"/>
+                              </a:solidFill>
+                            </a14:hiddenFill>
+                          </a:ext>
+                          <a:ext uri="{91240B29-F687-4F45-9708-019B960494DF}">
+                            <a14:hiddenLine xmlns:a14="http://schemas.microsoft.com/office/drawing/2010/main" w="9525">
+                              <a:solidFill>
+                                <a:srgbClr val="000000"/>
+                              </a:solidFill>
+                              <a:miter lim="800000"/>
+                              <a:headEnd/>
+                              <a:tailEnd/>
+                            </a14:hiddenLine>
+                          </a:ext>
+                        </a:extLst>
+                      </wps:spPr>
+                      <wps:bodyPr rot="0" vert="horz" wrap="square" lIns="91440" tIns="45720" rIns="91440" bIns="45720" anchor="t" anchorCtr="0" upright="1">
+                        <a:noAutofit/>
+                      </wps:bodyPr>
+                    </wps:wsp>
+                  </a:graphicData>
+                </a:graphic>
+              </wp:inline>
+            </w:drawing>
+          </mc:Choice>
+          <mc:Fallback>
+            <w:pict>
+              <v:rect w14:anchorId="4BBAFB51" id="Rectángulo 4" o:spid="_x0000_s1026" style="width:24pt;height:24pt;visibility:visible;mso-wrap-style:square;mso-left-percent:-10001;mso-top-percent:-10001;mso-position-horizontal:absolute;mso-position-horizontal-relative:char;mso-position-vertical:absolute;mso-position-vertical-relative:line;mso-left-percent:-10001;mso-top-percent:-10001;v-text-anchor:top" o:gfxdata="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" filled="f" stroked="f">
+                <o:lock v:ext="edit" aspectratio="t"/>
+                <w10:anchorlock/>
+              </v:rect>
+            </w:pict>
+          </mc:Fallback>
+        </mc:AlternateContent>
+      </w:r>
+      <w:r>
+        <w:rPr>
+          <w:noProof/>
+        </w:rPr>
+        <w:drawing>
+          <wp:inline distT="0" distB="0" distL="0" distR="0" wp14:anchorId="175F6580" wp14:editId="5F7E53D9">
+            <wp:extent cx="3524250" cy="4448175"/>
+            <wp:effectExtent l="0" t="0" r="0" b="9525"/>
+            <wp:docPr id="1007071718" name="Imagen 5"/>
+            <wp:cNvGraphicFramePr>
+              <a:graphicFrameLocks xmlns:a="http://schemas.openxmlformats.org/drawingml/2006/main" noChangeAspect="1"/>
+            </wp:cNvGraphicFramePr>
+            <a:graphic xmlns:a="http://schemas.openxmlformats.org/drawingml/2006/main">
+              <a:graphicData uri="http://schemas.openxmlformats.org/drawingml/2006/picture">
+                <pic:pic xmlns:pic="http://schemas.openxmlformats.org/drawingml/2006/picture">
+                  <pic:nvPicPr>
+                    <pic:cNvPr id="0" name="Picture 2"/>
+                    <pic:cNvPicPr>
+                      <a:picLocks noChangeAspect="1" noChangeArrowheads="1"/>
+                    </pic:cNvPicPr>
+                  </pic:nvPicPr>
+                  <pic:blipFill>
+                    <a:blip r:embed="rId31">
+                      <a:extLst>
+                        <a:ext uri="{28A0092B-C50C-407E-A947-70E740481C1C}">
+                          <a14:useLocalDpi xmlns:a14="http://schemas.microsoft.com/office/drawing/2010/main" val="0"/>
+                        </a:ext>
+                      </a:extLst>
+                    </a:blip>
+                    <a:srcRect/>
+                    <a:stretch>
+                      <a:fillRect/>
+                    </a:stretch>
+                  </pic:blipFill>
+                  <pic:spPr bwMode="auto">
+                    <a:xfrm>
+                      <a:off x="0" y="0"/>
+                      <a:ext cx="3524250" cy="4448175"/>
+                    </a:xfrm>
+                    <a:prstGeom prst="rect">
+                      <a:avLst/>
+                    </a:prstGeom>
+                    <a:noFill/>
+                  </pic:spPr>
+                </pic:pic>
+              </a:graphicData>
+            </a:graphic>
+          </wp:inline>
+        </w:drawing>
+      </w:r>
+    </w:p>
+    <w:p>
       <w:pPr>
         <w:pStyle w:val="Ttulo4"/>
       </w:pPr>
       <w:bookmarkStart w:id="22" w:name="_Toc242269343"/>
       <w:r>
+        <w:t>Mostrar más</w:t>
+      </w:r>
+      <w:bookmarkEnd w:id="22"/>
+    </w:p>
+    <w:p>
+      <w:r>
+        <w:t>xxx</w:t>
+      </w:r>
+    </w:p>
+    <w:p>
+      <w:pPr>
+        <w:pStyle w:val="Ttulo3"/>
+      </w:pPr>
+      <w:bookmarkStart w:id="23" w:name="_Toc242269344"/>
+      <w:r>
+        <w:t>Slider</w:t>
+      </w:r>
+      <w:bookmarkEnd w:id="23"/>
+    </w:p>
+    <w:p>
+      <w:r>
+        <w:t>Xx</w:t>
+      </w:r>
+    </w:p>
+    <w:p>
+      <w:pPr>
+        <w:pStyle w:val="Ttulo3"/>
+      </w:pPr>
+      <w:bookmarkStart w:id="24" w:name="_Toc242269345"/>
+      <w:r>
         <w:lastRenderedPageBreak/>
-        <w:t>Mostrar más</w:t>
-      </w:r>
-      <w:bookmarkEnd w:id="22"/>
-    </w:p>
-    <w:p>
-      <w:r>
-        <w:t>xxx</w:t>
-      </w:r>
-    </w:p>
-    <w:p>
-      <w:pPr>
-        <w:pStyle w:val="Ttulo3"/>
-      </w:pPr>
-      <w:bookmarkStart w:id="23" w:name="_Toc242269344"/>
-      <w:r>
-        <w:t>Slider</w:t>
-      </w:r>
-      <w:bookmarkEnd w:id="23"/>
-    </w:p>
-    <w:p>
-      <w:r>
-        <w:t>Xx</w:t>
-      </w:r>
-    </w:p>
-    <w:p>
-      <w:pPr>
-        <w:pStyle w:val="Ttulo3"/>
-      </w:pPr>
-      <w:bookmarkStart w:id="24" w:name="_Toc242269345"/>
-      <w:r>
         <w:t>Lista Cards</w:t>
       </w:r>
       <w:bookmarkEnd w:id="24"/>
@@ -5199,7 +5323,6 @@
         </w:numPr>
       </w:pPr>
       <w:r>
-        <w:lastRenderedPageBreak/>
         <w:t>Qué</w:t>
       </w:r>
       <w:r>
@@ -5361,6 +5484,7 @@
       </w:pPr>
       <w:bookmarkStart w:id="30" w:name="_Toc242269350"/>
       <w:r>
+        <w:lastRenderedPageBreak/>
         <w:t>Notas proceso</w:t>
       </w:r>
       <w:bookmarkEnd w:id="30"/>
@@ -5429,7 +5553,7 @@
       <w:r>
         <w:t xml:space="preserve">Los archivos old están en </w:t>
       </w:r>
-      <w:hyperlink r:id="rId31" w:history="1">
+      <w:hyperlink r:id="rId32" w:history="1">
         <w:r>
           <w:rPr>
             <w:rStyle w:val="Hipervnculo"/>
@@ -5547,7 +5671,7 @@
                     <pic:cNvPicPr/>
                   </pic:nvPicPr>
                   <pic:blipFill>
-                    <a:blip r:embed="rId32"/>
+                    <a:blip r:embed="rId33"/>
                     <a:stretch>
                       <a:fillRect/>
                     </a:stretch>
@@ -5888,9 +6012,9 @@
       </w:r>
     </w:p>
     <w:sectPr>
-      <w:footerReference w:type="default" r:id="rId33"/>
-      <w:headerReference w:type="first" r:id="rId34"/>
-      <w:footerReference w:type="first" r:id="rId35"/>
+      <w:footerReference w:type="default" r:id="rId34"/>
+      <w:headerReference w:type="first" r:id="rId35"/>
+      <w:footerReference w:type="first" r:id="rId36"/>
       <w:pgSz w:w="11906" w:h="16838" w:code="9"/>
       <w:pgMar w:top="3459" w:right="1418" w:bottom="1985" w:left="1418" w:header="680" w:footer="340" w:gutter="0"/>
       <w:cols w:space="708"/>
@@ -6108,7 +6232,7 @@
           <w:szCs w:val="19"/>
           <w:lang w:eastAsia="es-ES"/>
         </w:rPr>
-        <w:t>07/10/2026</w:t>
+        <w:t>08/10/2026</w:t>
       </w:r>
     </w:fldSimple>
     <w:r>
@@ -6305,7 +6429,7 @@
               <w:rPr>
                 <w:rFonts w:eastAsiaTheme="minorEastAsia" w:cs="Times New Roman"/>
               </w:rPr>
-              <w:t>07/10/2026</w:t>
+              <w:t>08/10/2026</w:t>
             </w:r>
           </w:fldSimple>
         </w:p>
@@ -6550,7 +6674,7 @@
               <w:rPr>
                 <w:rFonts w:eastAsiaTheme="minorEastAsia" w:cs="Times New Roman"/>
               </w:rPr>
-              <w:t>07/10/2026</w:t>
+              <w:t>08/10/2026</w:t>
             </w:r>
           </w:fldSimple>
         </w:p>
@@ -12072,15 +12196,6 @@
 </file>
 
 <file path=customXml/item1.xml><?xml version="1.0" encoding="utf-8"?>
-<?mso-contentType ?>
-<FormTemplates xmlns="http://schemas.microsoft.com/sharepoint/v3/contenttype/forms">
-  <Display>DocumentLibraryForm</Display>
-  <Edit>DocumentLibraryForm</Edit>
-  <New>DocumentLibraryForm</New>
-</FormTemplates>
-</file>
-
-<file path=customXml/item2.xml><?xml version="1.0" encoding="utf-8"?>
 <ct:contentTypeSchema xmlns:ct="http://schemas.microsoft.com/office/2006/metadata/contentType" xmlns:ma="http://schemas.microsoft.com/office/2006/metadata/properties/metaAttributes" ct:_="" ma:_="" ma:contentTypeName="Document" ma:contentTypeID="0x0101002A728C99327E314A9E3D8507B9892F0B" ma:contentTypeVersion="13" ma:contentTypeDescription="Create a new document." ma:contentTypeScope="" ma:versionID="b5fc1c0635d4e73da9275d771ca38336">
   <xsd:schema xmlns:xsd="http://www.w3.org/2001/XMLSchema" xmlns:xs="http://www.w3.org/2001/XMLSchema" xmlns:p="http://schemas.microsoft.com/office/2006/metadata/properties" xmlns:ns2="46feb8f5-d8ea-4df4-b5f6-409aa75778c2" xmlns:ns3="b8fa4ece-32bd-494d-92b0-3bc11d82a592" targetNamespace="http://schemas.microsoft.com/office/2006/metadata/properties" ma:root="true" ma:fieldsID="ac607f1556679ed7368537c7e370bd02" ns2:_="" ns3:_="">
     <xsd:import namespace="46feb8f5-d8ea-4df4-b5f6-409aa75778c2"/>
@@ -12303,7 +12418,20 @@
 </ct:contentTypeSchema>
 </file>
 
+<file path=customXml/item2.xml><?xml version="1.0" encoding="utf-8"?>
+<?mso-contentType ?>
+<FormTemplates xmlns="http://schemas.microsoft.com/sharepoint/v3/contenttype/forms">
+  <Display>DocumentLibraryForm</Display>
+  <Edit>DocumentLibraryForm</Edit>
+  <New>DocumentLibraryForm</New>
+</FormTemplates>
+</file>
+
 <file path=customXml/item3.xml><?xml version="1.0" encoding="utf-8"?>
+<b:Sources xmlns:b="http://schemas.openxmlformats.org/officeDocument/2006/bibliography" xmlns="http://schemas.openxmlformats.org/officeDocument/2006/bibliography" SelectedStyle="\IEEE2006OfficeOnline.xsl" StyleName="IEEE 2006"/>
+</file>
+
+<file path=customXml/item4.xml><?xml version="1.0" encoding="utf-8"?>
 <p:properties xmlns:p="http://schemas.microsoft.com/office/2006/metadata/properties" xmlns:xsi="http://www.w3.org/2001/XMLSchema-instance" xmlns:pc="http://schemas.microsoft.com/office/infopath/2007/PartnerControls">
   <documentManagement>
     <TaxCatchAll xmlns="b8fa4ece-32bd-494d-92b0-3bc11d82a592" xsi:nil="true"/>
@@ -12321,19 +12449,7 @@
 </p:properties>
 </file>
 
-<file path=customXml/item4.xml><?xml version="1.0" encoding="utf-8"?>
-<b:Sources xmlns:b="http://schemas.openxmlformats.org/officeDocument/2006/bibliography" xmlns="http://schemas.openxmlformats.org/officeDocument/2006/bibliography" SelectedStyle="\IEEE2006OfficeOnline.xsl" StyleName="IEEE 2006"/>
-</file>
-
 <file path=customXml/itemProps1.xml><?xml version="1.0" encoding="utf-8"?>
-<ds:datastoreItem xmlns:ds="http://schemas.openxmlformats.org/officeDocument/2006/customXml" ds:itemID="{E3963B16-0441-459F-953A-186BC3218329}">
-  <ds:schemaRefs>
-    <ds:schemaRef ds:uri="http://schemas.microsoft.com/sharepoint/v3/contenttype/forms"/>
-  </ds:schemaRefs>
-</ds:datastoreItem>
-</file>
-
-<file path=customXml/itemProps2.xml><?xml version="1.0" encoding="utf-8"?>
 <ds:datastoreItem xmlns:ds="http://schemas.openxmlformats.org/officeDocument/2006/customXml" ds:itemID="{5BD0AF32-4E47-430D-984B-E5355CDE6BD6}">
   <ds:schemaRefs>
     <ds:schemaRef ds:uri="http://schemas.microsoft.com/office/2006/metadata/contentType"/>
@@ -12352,7 +12468,23 @@
 </ds:datastoreItem>
 </file>
 
+<file path=customXml/itemProps2.xml><?xml version="1.0" encoding="utf-8"?>
+<ds:datastoreItem xmlns:ds="http://schemas.openxmlformats.org/officeDocument/2006/customXml" ds:itemID="{E3963B16-0441-459F-953A-186BC3218329}">
+  <ds:schemaRefs>
+    <ds:schemaRef ds:uri="http://schemas.microsoft.com/sharepoint/v3/contenttype/forms"/>
+  </ds:schemaRefs>
+</ds:datastoreItem>
+</file>
+
 <file path=customXml/itemProps3.xml><?xml version="1.0" encoding="utf-8"?>
+<ds:datastoreItem xmlns:ds="http://schemas.openxmlformats.org/officeDocument/2006/customXml" ds:itemID="{D5F18D91-3107-4E1C-8DD9-D0BC21D9FE26}">
+  <ds:schemaRefs>
+    <ds:schemaRef ds:uri="http://schemas.openxmlformats.org/officeDocument/2006/bibliography"/>
+  </ds:schemaRefs>
+</ds:datastoreItem>
+</file>
+
+<file path=customXml/itemProps4.xml><?xml version="1.0" encoding="utf-8"?>
 <ds:datastoreItem xmlns:ds="http://schemas.openxmlformats.org/officeDocument/2006/customXml" ds:itemID="{104AAB3F-039F-4529-A0CD-BBCC52A5D8C9}">
   <ds:schemaRefs>
     <ds:schemaRef ds:uri="http://schemas.microsoft.com/office/2006/metadata/properties"/>
@@ -12361,12 +12493,4 @@
     <ds:schemaRef ds:uri="46feb8f5-d8ea-4df4-b5f6-409aa75778c2"/>
   </ds:schemaRefs>
 </ds:datastoreItem>
-</file>
-
-<file path=customXml/itemProps4.xml><?xml version="1.0" encoding="utf-8"?>
-<ds:datastoreItem xmlns:ds="http://schemas.openxmlformats.org/officeDocument/2006/customXml" ds:itemID="{D5F18D91-3107-4E1C-8DD9-D0BC21D9FE26}">
-  <ds:schemaRefs>
-    <ds:schemaRef ds:uri="http://schemas.openxmlformats.org/officeDocument/2006/bibliography"/>
-  </ds:schemaRefs>
-</ds:datastoreItem>
 </file>
</xml_diff>

<commit_message>
ajustes dialog, nav, turi compartir y otros
</commit_message>
<xml_diff>
--- a/src/Documentacion/BIS011APPSY-Themes_HERRIZ-2026_09_25-v1_00.docx
+++ b/src/Documentacion/BIS011APPSY-Themes_HERRIZ-2026_09_25-v1_00.docx
@@ -84,7 +84,7 @@
       </w:pPr>
       <w:bookmarkStart w:id="0" w:name="_Toc382542072"/>
       <w:bookmarkStart w:id="1" w:name="_Toc225856305"/>
-      <w:bookmarkStart w:id="2" w:name="_Toc242269324"/>
+      <w:bookmarkStart w:id="2" w:name="_Toc242861540"/>
       <w:r>
         <w:rPr>
           <w:rFonts w:ascii="Arial" w:hAnsi="Arial" w:cs="Arial"/>
@@ -221,7 +221,7 @@
           <w:szCs w:val="24"/>
           <w:lang w:eastAsia="es-ES"/>
         </w:rPr>
-        <w:t>08/10/2026</w:t>
+        <w:t>14/10/2026</w:t>
       </w:r>
       <w:r>
         <w:rPr>
@@ -291,7 +291,7 @@
           <w:r>
             <w:fldChar w:fldCharType="separate"/>
           </w:r>
-          <w:hyperlink w:anchor="_Toc242269324" w:history="1">
+          <w:hyperlink w:anchor="_Toc242861540" w:history="1">
             <w:r>
               <w:rPr>
                 <w:rStyle w:val="Hipervnculo"/>
@@ -316,7 +316,7 @@
               <w:rPr>
                 <w:webHidden/>
               </w:rPr>
-              <w:instrText xml:space="preserve"> PAGEREF _Toc242269324 \h </w:instrText>
+              <w:instrText xml:space="preserve"> PAGEREF _Toc242861540 \h </w:instrText>
             </w:r>
             <w:r>
               <w:rPr>
@@ -363,7 +363,7 @@
               <w14:ligatures w14:val="standardContextual"/>
             </w:rPr>
           </w:pPr>
-          <w:hyperlink w:anchor="_Toc242269325" w:history="1">
+          <w:hyperlink w:anchor="_Toc242861541" w:history="1">
             <w:r>
               <w:rPr>
                 <w:rStyle w:val="Hipervnculo"/>
@@ -407,7 +407,7 @@
               <w:rPr>
                 <w:webHidden/>
               </w:rPr>
-              <w:instrText xml:space="preserve"> PAGEREF _Toc242269325 \h </w:instrText>
+              <w:instrText xml:space="preserve"> PAGEREF _Toc242861541 \h </w:instrText>
             </w:r>
             <w:r>
               <w:rPr>
@@ -451,7 +451,7 @@
               <w14:ligatures w14:val="standardContextual"/>
             </w:rPr>
           </w:pPr>
-          <w:hyperlink w:anchor="_Toc242269326" w:history="1">
+          <w:hyperlink w:anchor="_Toc242861542" w:history="1">
             <w:r>
               <w:rPr>
                 <w:rStyle w:val="Hipervnculo"/>
@@ -492,7 +492,7 @@
               <w:rPr>
                 <w:webHidden/>
               </w:rPr>
-              <w:instrText xml:space="preserve"> PAGEREF _Toc242269326 \h </w:instrText>
+              <w:instrText xml:space="preserve"> PAGEREF _Toc242861542 \h </w:instrText>
             </w:r>
             <w:r>
               <w:rPr>
@@ -534,7 +534,7 @@
               <w14:ligatures w14:val="standardContextual"/>
             </w:rPr>
           </w:pPr>
-          <w:hyperlink w:anchor="_Toc242269327" w:history="1">
+          <w:hyperlink w:anchor="_Toc242861543" w:history="1">
             <w:r>
               <w:rPr>
                 <w:rStyle w:val="Hipervnculo"/>
@@ -573,7 +573,7 @@
               <w:rPr>
                 <w:webHidden/>
               </w:rPr>
-              <w:instrText xml:space="preserve"> PAGEREF _Toc242269327 \h </w:instrText>
+              <w:instrText xml:space="preserve"> PAGEREF _Toc242861543 \h </w:instrText>
             </w:r>
             <w:r>
               <w:rPr>
@@ -615,7 +615,7 @@
               <w14:ligatures w14:val="standardContextual"/>
             </w:rPr>
           </w:pPr>
-          <w:hyperlink w:anchor="_Toc242269328" w:history="1">
+          <w:hyperlink w:anchor="_Toc242861544" w:history="1">
             <w:r>
               <w:rPr>
                 <w:rStyle w:val="Hipervnculo"/>
@@ -654,7 +654,7 @@
               <w:rPr>
                 <w:webHidden/>
               </w:rPr>
-              <w:instrText xml:space="preserve"> PAGEREF _Toc242269328 \h </w:instrText>
+              <w:instrText xml:space="preserve"> PAGEREF _Toc242861544 \h </w:instrText>
             </w:r>
             <w:r>
               <w:rPr>
@@ -698,7 +698,7 @@
               <w14:ligatures w14:val="standardContextual"/>
             </w:rPr>
           </w:pPr>
-          <w:hyperlink w:anchor="_Toc242269329" w:history="1">
+          <w:hyperlink w:anchor="_Toc242861545" w:history="1">
             <w:r>
               <w:rPr>
                 <w:rStyle w:val="Hipervnculo"/>
@@ -741,7 +741,7 @@
               <w:rPr>
                 <w:webHidden/>
               </w:rPr>
-              <w:instrText xml:space="preserve"> PAGEREF _Toc242269329 \h </w:instrText>
+              <w:instrText xml:space="preserve"> PAGEREF _Toc242861545 \h </w:instrText>
             </w:r>
             <w:r>
               <w:rPr>
@@ -785,7 +785,7 @@
               <w14:ligatures w14:val="standardContextual"/>
             </w:rPr>
           </w:pPr>
-          <w:hyperlink w:anchor="_Toc242269330" w:history="1">
+          <w:hyperlink w:anchor="_Toc242861546" w:history="1">
             <w:r>
               <w:rPr>
                 <w:rStyle w:val="Hipervnculo"/>
@@ -827,7 +827,7 @@
               <w:rPr>
                 <w:webHidden/>
               </w:rPr>
-              <w:instrText xml:space="preserve"> PAGEREF _Toc242269330 \h </w:instrText>
+              <w:instrText xml:space="preserve"> PAGEREF _Toc242861546 \h </w:instrText>
             </w:r>
             <w:r>
               <w:rPr>
@@ -869,7 +869,7 @@
               <w14:ligatures w14:val="standardContextual"/>
             </w:rPr>
           </w:pPr>
-          <w:hyperlink w:anchor="_Toc242269331" w:history="1">
+          <w:hyperlink w:anchor="_Toc242861547" w:history="1">
             <w:r>
               <w:rPr>
                 <w:rStyle w:val="Hipervnculo"/>
@@ -908,7 +908,7 @@
               <w:rPr>
                 <w:webHidden/>
               </w:rPr>
-              <w:instrText xml:space="preserve"> PAGEREF _Toc242269331 \h </w:instrText>
+              <w:instrText xml:space="preserve"> PAGEREF _Toc242861547 \h </w:instrText>
             </w:r>
             <w:r>
               <w:rPr>
@@ -925,7 +925,7 @@
               <w:rPr>
                 <w:webHidden/>
               </w:rPr>
-              <w:t>6</w:t>
+              <w:t>7</w:t>
             </w:r>
             <w:r>
               <w:rPr>
@@ -950,7 +950,7 @@
               <w14:ligatures w14:val="standardContextual"/>
             </w:rPr>
           </w:pPr>
-          <w:hyperlink w:anchor="_Toc242269332" w:history="1">
+          <w:hyperlink w:anchor="_Toc242861548" w:history="1">
             <w:r>
               <w:rPr>
                 <w:rStyle w:val="Hipervnculo"/>
@@ -989,7 +989,7 @@
               <w:rPr>
                 <w:webHidden/>
               </w:rPr>
-              <w:instrText xml:space="preserve"> PAGEREF _Toc242269332 \h </w:instrText>
+              <w:instrText xml:space="preserve"> PAGEREF _Toc242861548 \h </w:instrText>
             </w:r>
             <w:r>
               <w:rPr>
@@ -1031,7 +1031,7 @@
               <w14:ligatures w14:val="standardContextual"/>
             </w:rPr>
           </w:pPr>
-          <w:hyperlink w:anchor="_Toc242269333" w:history="1">
+          <w:hyperlink w:anchor="_Toc242861549" w:history="1">
             <w:r>
               <w:rPr>
                 <w:rStyle w:val="Hipervnculo"/>
@@ -1070,7 +1070,7 @@
               <w:rPr>
                 <w:webHidden/>
               </w:rPr>
-              <w:instrText xml:space="preserve"> PAGEREF _Toc242269333 \h </w:instrText>
+              <w:instrText xml:space="preserve"> PAGEREF _Toc242861549 \h </w:instrText>
             </w:r>
             <w:r>
               <w:rPr>
@@ -1114,7 +1114,7 @@
               <w14:ligatures w14:val="standardContextual"/>
             </w:rPr>
           </w:pPr>
-          <w:hyperlink w:anchor="_Toc242269334" w:history="1">
+          <w:hyperlink w:anchor="_Toc242861550" w:history="1">
             <w:r>
               <w:rPr>
                 <w:rStyle w:val="Hipervnculo"/>
@@ -1155,7 +1155,7 @@
               <w:rPr>
                 <w:webHidden/>
               </w:rPr>
-              <w:instrText xml:space="preserve"> PAGEREF _Toc242269334 \h </w:instrText>
+              <w:instrText xml:space="preserve"> PAGEREF _Toc242861550 \h </w:instrText>
             </w:r>
             <w:r>
               <w:rPr>
@@ -1172,7 +1172,7 @@
               <w:rPr>
                 <w:webHidden/>
               </w:rPr>
-              <w:t>7</w:t>
+              <w:t>8</w:t>
             </w:r>
             <w:r>
               <w:rPr>
@@ -1197,7 +1197,7 @@
               <w14:ligatures w14:val="standardContextual"/>
             </w:rPr>
           </w:pPr>
-          <w:hyperlink w:anchor="_Toc242269335" w:history="1">
+          <w:hyperlink w:anchor="_Toc242861551" w:history="1">
             <w:r>
               <w:rPr>
                 <w:rStyle w:val="Hipervnculo"/>
@@ -1237,7 +1237,7 @@
               <w:rPr>
                 <w:webHidden/>
               </w:rPr>
-              <w:instrText xml:space="preserve"> PAGEREF _Toc242269335 \h </w:instrText>
+              <w:instrText xml:space="preserve"> PAGEREF _Toc242861551 \h </w:instrText>
             </w:r>
             <w:r>
               <w:rPr>
@@ -1279,7 +1279,7 @@
               <w14:ligatures w14:val="standardContextual"/>
             </w:rPr>
           </w:pPr>
-          <w:hyperlink w:anchor="_Toc242269336" w:history="1">
+          <w:hyperlink w:anchor="_Toc242861552" w:history="1">
             <w:r>
               <w:rPr>
                 <w:rStyle w:val="Hipervnculo"/>
@@ -1318,7 +1318,7 @@
               <w:rPr>
                 <w:webHidden/>
               </w:rPr>
-              <w:instrText xml:space="preserve"> PAGEREF _Toc242269336 \h </w:instrText>
+              <w:instrText xml:space="preserve"> PAGEREF _Toc242861552 \h </w:instrText>
             </w:r>
             <w:r>
               <w:rPr>
@@ -1360,7 +1360,7 @@
               <w14:ligatures w14:val="standardContextual"/>
             </w:rPr>
           </w:pPr>
-          <w:hyperlink w:anchor="_Toc242269337" w:history="1">
+          <w:hyperlink w:anchor="_Toc242861553" w:history="1">
             <w:r>
               <w:rPr>
                 <w:rStyle w:val="Hipervnculo"/>
@@ -1399,7 +1399,7 @@
               <w:rPr>
                 <w:webHidden/>
               </w:rPr>
-              <w:instrText xml:space="preserve"> PAGEREF _Toc242269337 \h </w:instrText>
+              <w:instrText xml:space="preserve"> PAGEREF _Toc242861553 \h </w:instrText>
             </w:r>
             <w:r>
               <w:rPr>
@@ -1443,7 +1443,7 @@
               <w14:ligatures w14:val="standardContextual"/>
             </w:rPr>
           </w:pPr>
-          <w:hyperlink w:anchor="_Toc242269338" w:history="1">
+          <w:hyperlink w:anchor="_Toc242861554" w:history="1">
             <w:r>
               <w:rPr>
                 <w:rStyle w:val="Hipervnculo"/>
@@ -1486,7 +1486,7 @@
               <w:rPr>
                 <w:webHidden/>
               </w:rPr>
-              <w:instrText xml:space="preserve"> PAGEREF _Toc242269338 \h </w:instrText>
+              <w:instrText xml:space="preserve"> PAGEREF _Toc242861554 \h </w:instrText>
             </w:r>
             <w:r>
               <w:rPr>
@@ -1530,7 +1530,7 @@
               <w14:ligatures w14:val="standardContextual"/>
             </w:rPr>
           </w:pPr>
-          <w:hyperlink w:anchor="_Toc242269339" w:history="1">
+          <w:hyperlink w:anchor="_Toc242861555" w:history="1">
             <w:r>
               <w:rPr>
                 <w:rStyle w:val="Hipervnculo"/>
@@ -1571,7 +1571,7 @@
               <w:rPr>
                 <w:webHidden/>
               </w:rPr>
-              <w:instrText xml:space="preserve"> PAGEREF _Toc242269339 \h </w:instrText>
+              <w:instrText xml:space="preserve"> PAGEREF _Toc242861555 \h </w:instrText>
             </w:r>
             <w:r>
               <w:rPr>
@@ -1615,7 +1615,7 @@
               <w14:ligatures w14:val="standardContextual"/>
             </w:rPr>
           </w:pPr>
-          <w:hyperlink w:anchor="_Toc242269340" w:history="1">
+          <w:hyperlink w:anchor="_Toc242861556" w:history="1">
             <w:r>
               <w:rPr>
                 <w:rStyle w:val="Hipervnculo"/>
@@ -1656,7 +1656,7 @@
               <w:rPr>
                 <w:webHidden/>
               </w:rPr>
-              <w:instrText xml:space="preserve"> PAGEREF _Toc242269340 \h </w:instrText>
+              <w:instrText xml:space="preserve"> PAGEREF _Toc242861556 \h </w:instrText>
             </w:r>
             <w:r>
               <w:rPr>
@@ -1698,7 +1698,7 @@
               <w14:ligatures w14:val="standardContextual"/>
             </w:rPr>
           </w:pPr>
-          <w:hyperlink w:anchor="_Toc242269341" w:history="1">
+          <w:hyperlink w:anchor="_Toc242861557" w:history="1">
             <w:r>
               <w:rPr>
                 <w:rStyle w:val="Hipervnculo"/>
@@ -1737,7 +1737,7 @@
               <w:rPr>
                 <w:webHidden/>
               </w:rPr>
-              <w:instrText xml:space="preserve"> PAGEREF _Toc242269341 \h </w:instrText>
+              <w:instrText xml:space="preserve"> PAGEREF _Toc242861557 \h </w:instrText>
             </w:r>
             <w:r>
               <w:rPr>
@@ -1782,7 +1782,7 @@
               <w14:ligatures w14:val="standardContextual"/>
             </w:rPr>
           </w:pPr>
-          <w:hyperlink w:anchor="_Toc242269342" w:history="1">
+          <w:hyperlink w:anchor="_Toc242861558" w:history="1">
             <w:r>
               <w:rPr>
                 <w:rStyle w:val="Hipervnculo"/>
@@ -1829,7 +1829,7 @@
                 <w:noProof/>
                 <w:webHidden/>
               </w:rPr>
-              <w:instrText xml:space="preserve"> PAGEREF _Toc242269342 \h </w:instrText>
+              <w:instrText xml:space="preserve"> PAGEREF _Toc242861558 \h </w:instrText>
             </w:r>
             <w:r>
               <w:rPr>
@@ -1878,7 +1878,7 @@
               <w14:ligatures w14:val="standardContextual"/>
             </w:rPr>
           </w:pPr>
-          <w:hyperlink w:anchor="_Toc242269343" w:history="1">
+          <w:hyperlink w:anchor="_Toc242861559" w:history="1">
             <w:r>
               <w:rPr>
                 <w:rStyle w:val="Hipervnculo"/>
@@ -1925,7 +1925,7 @@
                 <w:noProof/>
                 <w:webHidden/>
               </w:rPr>
-              <w:instrText xml:space="preserve"> PAGEREF _Toc242269343 \h </w:instrText>
+              <w:instrText xml:space="preserve"> PAGEREF _Toc242861559 \h </w:instrText>
             </w:r>
             <w:r>
               <w:rPr>
@@ -1971,7 +1971,7 @@
               <w14:ligatures w14:val="standardContextual"/>
             </w:rPr>
           </w:pPr>
-          <w:hyperlink w:anchor="_Toc242269344" w:history="1">
+          <w:hyperlink w:anchor="_Toc242861560" w:history="1">
             <w:r>
               <w:rPr>
                 <w:rStyle w:val="Hipervnculo"/>
@@ -2010,7 +2010,7 @@
               <w:rPr>
                 <w:webHidden/>
               </w:rPr>
-              <w:instrText xml:space="preserve"> PAGEREF _Toc242269344 \h </w:instrText>
+              <w:instrText xml:space="preserve"> PAGEREF _Toc242861560 \h </w:instrText>
             </w:r>
             <w:r>
               <w:rPr>
@@ -2052,7 +2052,7 @@
               <w14:ligatures w14:val="standardContextual"/>
             </w:rPr>
           </w:pPr>
-          <w:hyperlink w:anchor="_Toc242269345" w:history="1">
+          <w:hyperlink w:anchor="_Toc242861561" w:history="1">
             <w:r>
               <w:rPr>
                 <w:rStyle w:val="Hipervnculo"/>
@@ -2091,7 +2091,7 @@
               <w:rPr>
                 <w:webHidden/>
               </w:rPr>
-              <w:instrText xml:space="preserve"> PAGEREF _Toc242269345 \h </w:instrText>
+              <w:instrText xml:space="preserve"> PAGEREF _Toc242861561 \h </w:instrText>
             </w:r>
             <w:r>
               <w:rPr>
@@ -2108,7 +2108,7 @@
               <w:rPr>
                 <w:webHidden/>
               </w:rPr>
-              <w:t>16</w:t>
+              <w:t>17</w:t>
             </w:r>
             <w:r>
               <w:rPr>
@@ -2133,7 +2133,7 @@
               <w14:ligatures w14:val="standardContextual"/>
             </w:rPr>
           </w:pPr>
-          <w:hyperlink w:anchor="_Toc242269346" w:history="1">
+          <w:hyperlink w:anchor="_Toc242861562" w:history="1">
             <w:r>
               <w:rPr>
                 <w:rStyle w:val="Hipervnculo"/>
@@ -2172,7 +2172,7 @@
               <w:rPr>
                 <w:webHidden/>
               </w:rPr>
-              <w:instrText xml:space="preserve"> PAGEREF _Toc242269346 \h </w:instrText>
+              <w:instrText xml:space="preserve"> PAGEREF _Toc242861562 \h </w:instrText>
             </w:r>
             <w:r>
               <w:rPr>
@@ -2189,7 +2189,7 @@
               <w:rPr>
                 <w:webHidden/>
               </w:rPr>
-              <w:t>16</w:t>
+              <w:t>17</w:t>
             </w:r>
             <w:r>
               <w:rPr>
@@ -2216,7 +2216,7 @@
               <w14:ligatures w14:val="standardContextual"/>
             </w:rPr>
           </w:pPr>
-          <w:hyperlink w:anchor="_Toc242269347" w:history="1">
+          <w:hyperlink w:anchor="_Toc242861563" w:history="1">
             <w:r>
               <w:rPr>
                 <w:rStyle w:val="Hipervnculo"/>
@@ -2239,6 +2239,91 @@
               <w:rPr>
                 <w:rStyle w:val="Hipervnculo"/>
               </w:rPr>
+              <w:t>Detalle</w:t>
+            </w:r>
+            <w:r>
+              <w:rPr>
+                <w:webHidden/>
+              </w:rPr>
+              <w:tab/>
+            </w:r>
+            <w:r>
+              <w:rPr>
+                <w:webHidden/>
+              </w:rPr>
+              <w:fldChar w:fldCharType="begin"/>
+            </w:r>
+            <w:r>
+              <w:rPr>
+                <w:webHidden/>
+              </w:rPr>
+              <w:instrText xml:space="preserve"> PAGEREF _Toc242861563 \h </w:instrText>
+            </w:r>
+            <w:r>
+              <w:rPr>
+                <w:webHidden/>
+              </w:rPr>
+            </w:r>
+            <w:r>
+              <w:rPr>
+                <w:webHidden/>
+              </w:rPr>
+              <w:fldChar w:fldCharType="separate"/>
+            </w:r>
+            <w:r>
+              <w:rPr>
+                <w:webHidden/>
+              </w:rPr>
+              <w:t>17</w:t>
+            </w:r>
+            <w:r>
+              <w:rPr>
+                <w:webHidden/>
+              </w:rPr>
+              <w:fldChar w:fldCharType="end"/>
+            </w:r>
+          </w:hyperlink>
+        </w:p>
+        <w:p>
+          <w:pPr>
+            <w:pStyle w:val="TDC2"/>
+            <w:tabs>
+              <w:tab w:val="left" w:pos="1200"/>
+              <w:tab w:val="right" w:leader="dot" w:pos="9060"/>
+            </w:tabs>
+            <w:rPr>
+              <w:rFonts w:asciiTheme="minorHAnsi" w:eastAsiaTheme="minorEastAsia" w:hAnsiTheme="minorHAnsi"/>
+              <w:color w:val="auto"/>
+              <w:kern w:val="2"/>
+              <w:sz w:val="24"/>
+              <w:szCs w:val="24"/>
+              <w:lang w:eastAsia="es-ES"/>
+              <w14:ligatures w14:val="standardContextual"/>
+            </w:rPr>
+          </w:pPr>
+          <w:hyperlink w:anchor="_Toc242861564" w:history="1">
+            <w:r>
+              <w:rPr>
+                <w:rStyle w:val="Hipervnculo"/>
+              </w:rPr>
+              <w:t>1.9</w:t>
+            </w:r>
+            <w:r>
+              <w:rPr>
+                <w:rFonts w:asciiTheme="minorHAnsi" w:eastAsiaTheme="minorEastAsia" w:hAnsiTheme="minorHAnsi"/>
+                <w:color w:val="auto"/>
+                <w:kern w:val="2"/>
+                <w:sz w:val="24"/>
+                <w:szCs w:val="24"/>
+                <w:lang w:eastAsia="es-ES"/>
+                <w14:ligatures w14:val="standardContextual"/>
+              </w:rPr>
+              <w:tab/>
+            </w:r>
+            <w:r>
+              <w:rPr>
+                <w:rStyle w:val="Hipervnculo"/>
+              </w:rPr>
               <w:t>F6 — QA + documentación</w:t>
             </w:r>
             <w:r>
@@ -2257,7 +2342,7 @@
               <w:rPr>
                 <w:webHidden/>
               </w:rPr>
-              <w:instrText xml:space="preserve"> PAGEREF _Toc242269347 \h </w:instrText>
+              <w:instrText xml:space="preserve"> PAGEREF _Toc242861564 \h </w:instrText>
             </w:r>
             <w:r>
               <w:rPr>
@@ -2274,7 +2359,7 @@
               <w:rPr>
                 <w:webHidden/>
               </w:rPr>
-              <w:t>16</w:t>
+              <w:t>17</w:t>
             </w:r>
             <w:r>
               <w:rPr>
@@ -2299,12 +2384,12 @@
               <w14:ligatures w14:val="standardContextual"/>
             </w:rPr>
           </w:pPr>
-          <w:hyperlink w:anchor="_Toc242269348" w:history="1">
+          <w:hyperlink w:anchor="_Toc242861565" w:history="1">
             <w:r>
               <w:rPr>
                 <w:rStyle w:val="Hipervnculo"/>
               </w:rPr>
-              <w:t>1.8.1</w:t>
+              <w:t>1.9.1</w:t>
             </w:r>
             <w:r>
               <w:rPr>
@@ -2338,7 +2423,7 @@
               <w:rPr>
                 <w:webHidden/>
               </w:rPr>
-              <w:instrText xml:space="preserve"> PAGEREF _Toc242269348 \h </w:instrText>
+              <w:instrText xml:space="preserve"> PAGEREF _Toc242861565 \h </w:instrText>
             </w:r>
             <w:r>
               <w:rPr>
@@ -2355,7 +2440,7 @@
               <w:rPr>
                 <w:webHidden/>
               </w:rPr>
-              <w:t>16</w:t>
+              <w:t>17</w:t>
             </w:r>
             <w:r>
               <w:rPr>
@@ -2380,12 +2465,12 @@
               <w14:ligatures w14:val="standardContextual"/>
             </w:rPr>
           </w:pPr>
-          <w:hyperlink w:anchor="_Toc242269349" w:history="1">
+          <w:hyperlink w:anchor="_Toc242861566" w:history="1">
             <w:r>
               <w:rPr>
                 <w:rStyle w:val="Hipervnculo"/>
               </w:rPr>
-              <w:t>1.8.2</w:t>
+              <w:t>1.9.2</w:t>
             </w:r>
             <w:r>
               <w:rPr>
@@ -2419,7 +2504,7 @@
               <w:rPr>
                 <w:webHidden/>
               </w:rPr>
-              <w:instrText xml:space="preserve"> PAGEREF _Toc242269349 \h </w:instrText>
+              <w:instrText xml:space="preserve"> PAGEREF _Toc242861566 \h </w:instrText>
             </w:r>
             <w:r>
               <w:rPr>
@@ -2436,7 +2521,7 @@
               <w:rPr>
                 <w:webHidden/>
               </w:rPr>
-              <w:t>16</w:t>
+              <w:t>17</w:t>
             </w:r>
             <w:r>
               <w:rPr>
@@ -2466,7 +2551,7 @@
               <w14:ligatures w14:val="standardContextual"/>
             </w:rPr>
           </w:pPr>
-          <w:hyperlink w:anchor="_Toc242269350" w:history="1">
+          <w:hyperlink w:anchor="_Toc242861567" w:history="1">
             <w:r>
               <w:rPr>
                 <w:rStyle w:val="Hipervnculo"/>
@@ -2510,7 +2595,7 @@
               <w:rPr>
                 <w:webHidden/>
               </w:rPr>
-              <w:instrText xml:space="preserve"> PAGEREF _Toc242269350 \h </w:instrText>
+              <w:instrText xml:space="preserve"> PAGEREF _Toc242861567 \h </w:instrText>
             </w:r>
             <w:r>
               <w:rPr>
@@ -2527,7 +2612,7 @@
               <w:rPr>
                 <w:webHidden/>
               </w:rPr>
-              <w:t>17</w:t>
+              <w:t>18</w:t>
             </w:r>
             <w:r>
               <w:rPr>
@@ -2876,7 +2961,7 @@
       <w:pPr>
         <w:pStyle w:val="Ttulo1"/>
       </w:pPr>
-      <w:bookmarkStart w:id="3" w:name="_Toc242269325"/>
+      <w:bookmarkStart w:id="3" w:name="_Toc242861541"/>
       <w:r>
         <w:lastRenderedPageBreak/>
         <w:t>Desarrollo</w:t>
@@ -2887,7 +2972,7 @@
       <w:pPr>
         <w:pStyle w:val="Ttulo2"/>
       </w:pPr>
-      <w:bookmarkStart w:id="4" w:name="_Toc242269326"/>
+      <w:bookmarkStart w:id="4" w:name="_Toc242861542"/>
       <w:r>
         <w:t xml:space="preserve">CORE. </w:t>
       </w:r>
@@ -2900,7 +2985,7 @@
       <w:pPr>
         <w:pStyle w:val="Ttulo3"/>
       </w:pPr>
-      <w:bookmarkStart w:id="5" w:name="_Toc242269327"/>
+      <w:bookmarkStart w:id="5" w:name="_Toc242861543"/>
       <w:r>
         <w:t>Objetivo</w:t>
       </w:r>
@@ -3011,7 +3096,7 @@
       <w:pPr>
         <w:pStyle w:val="Ttulo3"/>
       </w:pPr>
-      <w:bookmarkStart w:id="6" w:name="_Toc242269328"/>
+      <w:bookmarkStart w:id="6" w:name="_Toc242861544"/>
       <w:r>
         <w:t>Arquitectura</w:t>
       </w:r>
@@ -3380,7 +3465,7 @@
           <w:lang w:val="en-US"/>
         </w:rPr>
       </w:pPr>
-      <w:bookmarkStart w:id="7" w:name="_Toc242269329"/>
+      <w:bookmarkStart w:id="7" w:name="_Toc242861545"/>
       <w:r>
         <w:rPr>
           <w:lang w:val="en-US"/>
@@ -3502,7 +3587,7 @@
       <w:pPr>
         <w:pStyle w:val="Ttulo2"/>
       </w:pPr>
-      <w:bookmarkStart w:id="8" w:name="_Toc242269330"/>
+      <w:bookmarkStart w:id="8" w:name="_Toc242861546"/>
       <w:r>
         <w:rPr>
           <w:lang w:val="en-US"/>
@@ -3700,7 +3785,7 @@
       <w:pPr>
         <w:pStyle w:val="Ttulo3"/>
       </w:pPr>
-      <w:bookmarkStart w:id="9" w:name="_Toc242269331"/>
+      <w:bookmarkStart w:id="9" w:name="_Toc242861547"/>
       <w:r>
         <w:t>HERRIZ_home</w:t>
       </w:r>
@@ -3723,7 +3808,7 @@
       <w:pPr>
         <w:pStyle w:val="Ttulo3"/>
       </w:pPr>
-      <w:bookmarkStart w:id="10" w:name="_Toc242269332"/>
+      <w:bookmarkStart w:id="10" w:name="_Toc242861548"/>
       <w:r>
         <w:t>Listado</w:t>
       </w:r>
@@ -3752,7 +3837,7 @@
       <w:pPr>
         <w:pStyle w:val="Ttulo3"/>
       </w:pPr>
-      <w:bookmarkStart w:id="11" w:name="_Toc242269333"/>
+      <w:bookmarkStart w:id="11" w:name="_Toc242861549"/>
       <w:r>
         <w:t>Detalle Evento</w:t>
       </w:r>
@@ -3870,7 +3955,7 @@
       <w:pPr>
         <w:pStyle w:val="Ttulo2"/>
       </w:pPr>
-      <w:bookmarkStart w:id="12" w:name="_Toc242269334"/>
+      <w:bookmarkStart w:id="12" w:name="_Toc242861550"/>
       <w:r>
         <w:t>F</w:t>
       </w:r>
@@ -3955,7 +4040,7 @@
           <w:lang w:val="en-US"/>
         </w:rPr>
       </w:pPr>
-      <w:bookmarkStart w:id="13" w:name="_Toc242269335"/>
+      <w:bookmarkStart w:id="13" w:name="_Toc242861551"/>
       <w:r>
         <w:t>Slider → usa cards</w:t>
       </w:r>
@@ -3975,7 +4060,7 @@
       <w:pPr>
         <w:pStyle w:val="Ttulo3"/>
       </w:pPr>
-      <w:bookmarkStart w:id="14" w:name="_Toc242269336"/>
+      <w:bookmarkStart w:id="14" w:name="_Toc242861552"/>
       <w:r>
         <w:t>Card base → reutilizable en todo</w:t>
       </w:r>
@@ -4033,7 +4118,7 @@
       <w:pPr>
         <w:pStyle w:val="Ttulo3"/>
       </w:pPr>
-      <w:bookmarkStart w:id="15" w:name="_Toc242269337"/>
+      <w:bookmarkStart w:id="15" w:name="_Toc242861553"/>
       <w:r>
         <w:lastRenderedPageBreak/>
         <w:t>Wrapper</w:t>
@@ -4486,7 +4571,7 @@
           <w:lang w:val="en-US"/>
         </w:rPr>
       </w:pPr>
-      <w:bookmarkStart w:id="16" w:name="_Toc242269338"/>
+      <w:bookmarkStart w:id="16" w:name="_Toc242861554"/>
       <w:r>
         <w:rPr>
           <w:lang w:val="en-US"/>
@@ -4928,7 +5013,7 @@
       <w:pPr>
         <w:pStyle w:val="Ttulo2"/>
       </w:pPr>
-      <w:bookmarkStart w:id="18" w:name="_Toc242269339"/>
+      <w:bookmarkStart w:id="18" w:name="_Toc242861555"/>
       <w:r>
         <w:t xml:space="preserve">F5 — </w:t>
       </w:r>
@@ -4951,7 +5036,7 @@
       <w:pPr>
         <w:pStyle w:val="Ttulo2"/>
       </w:pPr>
-      <w:bookmarkStart w:id="19" w:name="_Toc242269340"/>
+      <w:bookmarkStart w:id="19" w:name="_Toc242861556"/>
       <w:r>
         <w:t>Componentes</w:t>
       </w:r>
@@ -4961,7 +5046,7 @@
       <w:pPr>
         <w:pStyle w:val="Ttulo3"/>
       </w:pPr>
-      <w:bookmarkStart w:id="20" w:name="_Toc242269341"/>
+      <w:bookmarkStart w:id="20" w:name="_Toc242861557"/>
       <w:r>
         <w:t>Común</w:t>
       </w:r>
@@ -4974,7 +5059,7 @@
       <w:pPr>
         <w:pStyle w:val="Ttulo4"/>
       </w:pPr>
-      <w:bookmarkStart w:id="21" w:name="_Toc242269342"/>
+      <w:bookmarkStart w:id="21" w:name="_Toc242861558"/>
       <w:r>
         <w:t>Título</w:t>
       </w:r>
@@ -5050,7 +5135,7 @@
           </mc:Choice>
           <mc:Fallback>
             <w:pict>
-              <v:rect w14:anchorId="4BBAFB51" id="Rectángulo 4" o:spid="_x0000_s1026" style="width:24pt;height:24pt;visibility:visible;mso-wrap-style:square;mso-left-percent:-10001;mso-top-percent:-10001;mso-position-horizontal:absolute;mso-position-horizontal-relative:char;mso-position-vertical:absolute;mso-position-vertical-relative:line;mso-left-percent:-10001;mso-top-percent:-10001;v-text-anchor:top" o:gfxdata="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" filled="f" stroked="f">
+              <v:rect w14:anchorId="52BDF41C" id="Rectángulo 4" o:spid="_x0000_s1026" style="width:24pt;height:24pt;visibility:visible;mso-wrap-style:square;mso-left-percent:-10001;mso-top-percent:-10001;mso-position-horizontal:absolute;mso-position-horizontal-relative:char;mso-position-vertical:absolute;mso-position-vertical-relative:line;mso-left-percent:-10001;mso-top-percent:-10001;v-text-anchor:top" o:gfxdata="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" filled="f" stroked="f">
                 <o:lock v:ext="edit" aspectratio="t"/>
                 <w10:anchorlock/>
               </v:rect>
@@ -5113,7 +5198,7 @@
       <w:pPr>
         <w:pStyle w:val="Ttulo4"/>
       </w:pPr>
-      <w:bookmarkStart w:id="22" w:name="_Toc242269343"/>
+      <w:bookmarkStart w:id="22" w:name="_Toc242861559"/>
       <w:r>
         <w:t>Mostrar más</w:t>
       </w:r>
@@ -5128,7 +5213,7 @@
       <w:pPr>
         <w:pStyle w:val="Ttulo3"/>
       </w:pPr>
-      <w:bookmarkStart w:id="23" w:name="_Toc242269344"/>
+      <w:bookmarkStart w:id="23" w:name="_Toc242861560"/>
       <w:r>
         <w:t>Slider</w:t>
       </w:r>
@@ -5143,7 +5228,7 @@
       <w:pPr>
         <w:pStyle w:val="Ttulo3"/>
       </w:pPr>
-      <w:bookmarkStart w:id="24" w:name="_Toc242269345"/>
+      <w:bookmarkStart w:id="24" w:name="_Toc242861561"/>
       <w:r>
         <w:lastRenderedPageBreak/>
         <w:t>Lista Cards</w:t>
@@ -5159,7 +5244,7 @@
       <w:pPr>
         <w:pStyle w:val="Ttulo3"/>
       </w:pPr>
-      <w:bookmarkStart w:id="25" w:name="_Toc242269346"/>
+      <w:bookmarkStart w:id="25" w:name="_Toc242861562"/>
       <w:r>
         <w:t>Galería</w:t>
       </w:r>
@@ -5182,24 +5267,62 @@
       <w:pPr>
         <w:pStyle w:val="Ttulo2"/>
       </w:pPr>
-      <w:bookmarkStart w:id="26" w:name="_Toc242269347"/>
+      <w:bookmarkStart w:id="26" w:name="_Toc242861563"/>
+      <w:r>
+        <w:t>Detalle</w:t>
+      </w:r>
+      <w:bookmarkEnd w:id="26"/>
+    </w:p>
+    <w:p>
+      <w:r>
+        <w:t>Layout WPZ (estructura base)</w:t>
+      </w:r>
+    </w:p>
+    <w:p>
+      <w:pPr>
+        <w:pStyle w:val="Ttulo3"/>
+      </w:pPr>
+      <w:r>
+        <w:t>Funcionalidades</w:t>
+      </w:r>
+    </w:p>
+    <w:p>
+      <w:r>
+        <w:t xml:space="preserve">Editor de HTML </w:t>
+      </w:r>
+    </w:p>
+    <w:p>
+      <w:r>
+        <w:t>Collapse</w:t>
+      </w:r>
+    </w:p>
+    <w:p>
+      <w:r>
+        <w:t>Galería (imágenes y vídeo)</w:t>
+      </w:r>
+    </w:p>
+    <w:p>
+      <w:pPr>
+        <w:pStyle w:val="Ttulo2"/>
+      </w:pPr>
+      <w:bookmarkStart w:id="27" w:name="_Toc242861564"/>
       <w:r>
         <w:t xml:space="preserve">F6 — </w:t>
       </w:r>
       <w:r>
         <w:t>QA + documentación</w:t>
       </w:r>
-      <w:bookmarkEnd w:id="26"/>
+      <w:bookmarkEnd w:id="27"/>
     </w:p>
     <w:p>
       <w:pPr>
         <w:pStyle w:val="Ttulo3"/>
       </w:pPr>
-      <w:bookmarkStart w:id="27" w:name="_Toc242269348"/>
+      <w:bookmarkStart w:id="28" w:name="_Toc242861565"/>
       <w:r>
         <w:t>QA</w:t>
       </w:r>
-      <w:bookmarkEnd w:id="27"/>
+      <w:bookmarkEnd w:id="28"/>
     </w:p>
     <w:p>
       <w:r>
@@ -5217,7 +5340,7 @@
       <w:r>
         <w:t>A</w:t>
       </w:r>
-      <w:commentRangeStart w:id="28"/>
+      <w:commentRangeStart w:id="29"/>
       <w:r>
         <w:t xml:space="preserve">ccesibilidad </w:t>
       </w:r>
@@ -5251,14 +5374,14 @@
       <w:r>
         <w:t>onsistencia visual</w:t>
       </w:r>
-      <w:commentRangeEnd w:id="28"/>
+      <w:commentRangeEnd w:id="29"/>
       <w:r>
         <w:rPr>
           <w:rStyle w:val="Refdecomentario"/>
           <w:sz w:val="19"/>
           <w:szCs w:val="22"/>
         </w:rPr>
-        <w:commentReference w:id="28"/>
+        <w:commentReference w:id="29"/>
       </w:r>
     </w:p>
     <w:p>
@@ -5288,14 +5411,15 @@
           <w:rStyle w:val="Ttulo3Car"/>
         </w:rPr>
       </w:pPr>
-      <w:bookmarkStart w:id="29" w:name="_Toc242269349"/>
+      <w:bookmarkStart w:id="30" w:name="_Toc242861566"/>
       <w:r>
         <w:rPr>
           <w:rStyle w:val="Ttulo3Car"/>
         </w:rPr>
+        <w:lastRenderedPageBreak/>
         <w:t>Documentación mínima imprescindible</w:t>
       </w:r>
-      <w:bookmarkEnd w:id="29"/>
+      <w:bookmarkEnd w:id="30"/>
     </w:p>
     <w:p>
       <w:r>
@@ -5482,12 +5606,11 @@
       <w:pPr>
         <w:pStyle w:val="Ttulo1"/>
       </w:pPr>
-      <w:bookmarkStart w:id="30" w:name="_Toc242269350"/>
-      <w:r>
-        <w:lastRenderedPageBreak/>
+      <w:bookmarkStart w:id="31" w:name="_Toc242861567"/>
+      <w:r>
         <w:t>Notas proceso</w:t>
       </w:r>
-      <w:bookmarkEnd w:id="30"/>
+      <w:bookmarkEnd w:id="31"/>
     </w:p>
     <w:p>
       <w:pPr>
@@ -5640,6 +5763,7 @@
         <w:rPr>
           <w:lang w:val="en-US"/>
         </w:rPr>
+        <w:lastRenderedPageBreak/>
         <w:t>En sharepoint</w:t>
       </w:r>
     </w:p>
@@ -5654,7 +5778,6 @@
           <w:noProof/>
           <w:lang w:val="en-US"/>
         </w:rPr>
-        <w:lastRenderedPageBreak/>
         <w:drawing>
           <wp:inline distT="0" distB="0" distL="0" distR="0" wp14:anchorId="7890E427" wp14:editId="4339B438">
             <wp:extent cx="5759450" cy="1866265"/>
@@ -6043,7 +6166,7 @@
       </w:r>
     </w:p>
   </w:comment>
-  <w:comment w:id="28" w:author="Susana Garcia Antolin" w:date="2026-05-18T08:34:00Z" w:initials="SG">
+  <w:comment w:id="29" w:author="Susana Garcia Antolin" w:date="2026-05-18T08:34:00Z" w:initials="SG">
     <w:p>
       <w:pPr>
         <w:pStyle w:val="Textocomentario"/>
@@ -6232,7 +6355,7 @@
           <w:szCs w:val="19"/>
           <w:lang w:eastAsia="es-ES"/>
         </w:rPr>
-        <w:t>08/10/2026</w:t>
+        <w:t>14/10/2026</w:t>
       </w:r>
     </w:fldSimple>
     <w:r>
@@ -6429,7 +6552,7 @@
               <w:rPr>
                 <w:rFonts w:eastAsiaTheme="minorEastAsia" w:cs="Times New Roman"/>
               </w:rPr>
-              <w:t>08/10/2026</w:t>
+              <w:t>14/10/2026</w:t>
             </w:r>
           </w:fldSimple>
         </w:p>
@@ -6674,7 +6797,7 @@
               <w:rPr>
                 <w:rFonts w:eastAsiaTheme="minorEastAsia" w:cs="Times New Roman"/>
               </w:rPr>
-              <w:t>08/10/2026</w:t>
+              <w:t>14/10/2026</w:t>
             </w:r>
           </w:fldSimple>
         </w:p>
@@ -7253,7 +7376,7 @@
         </mc:Choice>
         <mc:Fallback>
           <w:pict>
-            <v:line w14:anchorId="3BD248DE" id="Conector recto 8" o:spid="_x0000_s1026" style="position:absolute;z-index:251678720;visibility:visible;mso-wrap-style:square;mso-width-percent:0;mso-height-percent:0;mso-wrap-distance-left:9pt;mso-wrap-distance-top:-3e-5mm;mso-wrap-distance-right:9pt;mso-wrap-distance-bottom:-3e-5mm;mso-position-horizontal:absolute;mso-position-horizontal-relative:text;mso-position-vertical:absolute;mso-position-vertical-relative:text;mso-width-percent:0;mso-height-percent:0;mso-width-relative:page;mso-height-relative:page" from="1.1pt,4.3pt" to="481.1pt,4.3pt" o:gfxdata="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" strokecolor="#c00000">
+            <v:line w14:anchorId="0BF7E1C6" id="Conector recto 8" o:spid="_x0000_s1026" style="position:absolute;z-index:251678720;visibility:visible;mso-wrap-style:square;mso-width-percent:0;mso-height-percent:0;mso-wrap-distance-left:9pt;mso-wrap-distance-top:-3e-5mm;mso-wrap-distance-right:9pt;mso-wrap-distance-bottom:-3e-5mm;mso-position-horizontal:absolute;mso-position-horizontal-relative:text;mso-position-vertical:absolute;mso-position-vertical-relative:text;mso-width-percent:0;mso-height-percent:0;mso-width-relative:page;mso-height-relative:page" from="1.1pt,4.3pt" to="481.1pt,4.3pt" o:gfxdata="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" strokecolor="#c00000">
               <o:lock v:ext="edit" shapetype="f"/>
             </v:line>
           </w:pict>
@@ -7859,7 +7982,7 @@
         </mc:Choice>
         <mc:Fallback>
           <w:pict>
-            <v:line w14:anchorId="777FA1B2" id="1 Conector recto" o:spid="_x0000_s1026" style="position:absolute;flip:x;z-index:251659264;visibility:visible;mso-wrap-style:square;mso-width-percent:0;mso-height-percent:0;mso-wrap-distance-left:9pt;mso-wrap-distance-top:-3e-5mm;mso-wrap-distance-right:9pt;mso-wrap-distance-bottom:-3e-5mm;mso-position-horizontal:absolute;mso-position-horizontal-relative:text;mso-position-vertical:absolute;mso-position-vertical-relative:text;mso-width-percent:0;mso-height-percent:0;mso-width-relative:page;mso-height-relative:page" from="-.9pt,58.5pt" to="355.1pt,58.5pt" o:gfxdata="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" strokecolor="#c00000" strokeweight=".25pt">
+            <v:line w14:anchorId="0B5A0C9A" id="1 Conector recto" o:spid="_x0000_s1026" style="position:absolute;flip:x;z-index:251659264;visibility:visible;mso-wrap-style:square;mso-width-percent:0;mso-height-percent:0;mso-wrap-distance-left:9pt;mso-wrap-distance-top:-3e-5mm;mso-wrap-distance-right:9pt;mso-wrap-distance-bottom:-3e-5mm;mso-position-horizontal:absolute;mso-position-horizontal-relative:text;mso-position-vertical:absolute;mso-position-vertical-relative:text;mso-width-percent:0;mso-height-percent:0;mso-width-relative:page;mso-height-relative:page" from="-.9pt,58.5pt" to="355.1pt,58.5pt" o:gfxdata="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" strokecolor="#c00000" strokeweight=".25pt">
               <o:lock v:ext="edit" shapetype="f"/>
             </v:line>
           </w:pict>

</xml_diff>